<commit_message>
Build 4-page institutional-grade C-suite CV
Highlights:
- Updated content: 15+ years, info@ruwainkelly.com, LinkedIn,
  R25M+ budget, 75-employee Ecolab scope, Chief of Operations
  title at Let Me Do I.T.
- New 'Impact at a Glance' recruiter-magnet callout block with
  gold left-bar accent and tinted background (paragraph borders,
  no tables - ATS safe)
- Bold lead-in labels on quantified bullets (Cost: / Service: /
  Compliance: etc.) for executive scannability
- 5-axis Core Competencies matrix rendered as ATS-friendly
  labelled inline keyword lines
- Cross-Role IR & Workforce Governance call-out
- Enterprise Achievements roll-up with bold category leads
- Refined 11pt body, 1.15 line spacing for professional density
- Closing 'References available on request' with gold rule
- Zero layout tables verified
</commit_message>
<xml_diff>
--- a/Ruwain_Kelly_Executive_CV.docx
+++ b/Ruwain_Kelly_Executive_CV.docx
@@ -4,44 +4,44 @@
   <w:body>
     <w:p>
       <w:pPr>
-        <w:spacing w:before="0" w:after="40"/>
+        <w:spacing w:before="0" w:after="40" w:line="240" w:lineRule="auto"/>
         <w:jc w:val="center"/>
       </w:pPr>
       <w:r>
         <w:rPr>
-          <w:rFonts w:ascii="Calibri" w:hAnsi="Calibri" w:cs="Calibri"/>
+          <w:rFonts w:ascii="Calibri" w:hAnsi="Calibri" w:cs="Calibri" w:eastAsia="Calibri"/>
           <w:b/>
           <w:i w:val="0"/>
-          <w:color w:val="1A365D"/>
-          <w:sz w:val="52"/>
+          <w:color w:val="142C4F"/>
+          <w:sz w:val="56"/>
           <w:u w:val="none"/>
           <w:caps w:val="1"/>
-          <w:spacing w:val="80"/>
+          <w:spacing w:val="100"/>
         </w:rPr>
         <w:t>Ruwain Kelly</w:t>
       </w:r>
     </w:p>
     <w:p>
       <w:pPr>
-        <w:spacing w:before="0" w:after="80"/>
+        <w:spacing w:before="0" w:after="80" w:line="240" w:lineRule="auto"/>
         <w:jc w:val="center"/>
         <w:pBdr>
-          <w:bottom w:val="single" w:sz="12" w:space="2" w:color="B7902C"/>
+          <w:bottom w:val="single" w:sz="14" w:space="2" w:color="B88E2E"/>
         </w:pBdr>
       </w:pPr>
     </w:p>
     <w:p>
       <w:pPr>
-        <w:spacing w:before="0" w:after="40"/>
+        <w:spacing w:before="0" w:after="40" w:line="240" w:lineRule="auto"/>
         <w:jc w:val="center"/>
       </w:pPr>
       <w:r>
         <w:rPr>
-          <w:rFonts w:ascii="Calibri" w:hAnsi="Calibri" w:cs="Calibri"/>
+          <w:rFonts w:ascii="Calibri" w:hAnsi="Calibri" w:cs="Calibri" w:eastAsia="Calibri"/>
           <w:b w:val="0"/>
           <w:i/>
-          <w:color w:val="1A365D"/>
-          <w:sz w:val="25"/>
+          <w:color w:val="142C4F"/>
+          <w:sz w:val="26"/>
           <w:u w:val="none"/>
         </w:rPr>
         <w:t>National Supply Chain, Procurement &amp; Operations Executive</w:t>
@@ -49,16 +49,16 @@
     </w:p>
     <w:p>
       <w:pPr>
-        <w:spacing w:before="0" w:after="80"/>
+        <w:spacing w:before="0" w:after="120" w:line="276" w:lineRule="auto"/>
         <w:jc w:val="center"/>
       </w:pPr>
       <w:r>
         <w:rPr>
-          <w:rFonts w:ascii="Calibri" w:hAnsi="Calibri" w:cs="Calibri"/>
+          <w:rFonts w:ascii="Calibri" w:hAnsi="Calibri" w:cs="Calibri" w:eastAsia="Calibri"/>
           <w:b w:val="0"/>
           <w:i/>
           <w:color w:val="555C66"/>
-          <w:sz w:val="20"/>
+          <w:sz w:val="21"/>
           <w:u w:val="none"/>
         </w:rPr>
         <w:t>Transforming supply chains into competitive advantage through operational excellence, commercial discipline and strategic leadership.</w:t>
@@ -66,24 +66,41 @@
     </w:p>
     <w:p>
       <w:pPr>
-        <w:spacing w:before="0" w:after="40"/>
+        <w:spacing w:before="0" w:after="20" w:line="276" w:lineRule="auto"/>
         <w:jc w:val="center"/>
       </w:pPr>
       <w:r>
         <w:rPr>
-          <w:rFonts w:ascii="Calibri" w:hAnsi="Calibri" w:cs="Calibri"/>
+          <w:rFonts w:ascii="Calibri" w:hAnsi="Calibri" w:cs="Calibri" w:eastAsia="Calibri"/>
           <w:b w:val="0"/>
           <w:i w:val="0"/>
-          <w:color w:val="202020"/>
+          <w:color w:val="1F1F1F"/>
           <w:sz w:val="21"/>
           <w:u w:val="none"/>
         </w:rPr>
-        <w:t>Durbanville, Cape Town, South Africa  |  +27 74 760 7776  |  admin@ruwainkelly.co.za</w:t>
+        <w:t>Durbanville, Cape Town, South Africa  |  +27 74 760 7776  |  info@ruwainkelly.com</w:t>
       </w:r>
     </w:p>
     <w:p>
       <w:pPr>
-        <w:spacing w:before="80" w:after="40"/>
+        <w:spacing w:before="0" w:after="20" w:line="276" w:lineRule="auto"/>
+        <w:jc w:val="center"/>
+      </w:pPr>
+      <w:r>
+        <w:rPr>
+          <w:rFonts w:ascii="Calibri" w:hAnsi="Calibri" w:cs="Calibri" w:eastAsia="Calibri"/>
+          <w:b w:val="0"/>
+          <w:i w:val="0"/>
+          <w:color w:val="1F1F1F"/>
+          <w:sz w:val="21"/>
+          <w:u w:val="none"/>
+        </w:rPr>
+        <w:t>linkedin.com/in/ruwainkelly</w:t>
+      </w:r>
+    </w:p>
+    <w:p>
+      <w:pPr>
+        <w:spacing w:before="120" w:after="40"/>
         <w:pBdr>
           <w:bottom w:val="single" w:sz="6" w:space="2" w:color="D8DCE2"/>
         </w:pBdr>
@@ -91,327 +108,526 @@
     </w:p>
     <w:p>
       <w:pPr>
-        <w:spacing w:before="200" w:after="20"/>
+        <w:spacing w:before="240" w:after="40" w:line="240" w:lineRule="auto"/>
         <w:pBdr>
-          <w:bottom w:val="single" w:sz="8" w:space="2" w:color="B7902C"/>
+          <w:bottom w:val="single" w:sz="10" w:space="2" w:color="B88E2E"/>
         </w:pBdr>
       </w:pPr>
       <w:r>
         <w:rPr>
-          <w:rFonts w:ascii="Calibri" w:hAnsi="Calibri" w:cs="Calibri"/>
+          <w:rFonts w:ascii="Calibri" w:hAnsi="Calibri" w:cs="Calibri" w:eastAsia="Calibri"/>
           <w:b/>
           <w:i w:val="0"/>
-          <w:color w:val="1A365D"/>
-          <w:sz w:val="24"/>
+          <w:color w:val="142C4F"/>
+          <w:sz w:val="25"/>
           <w:u w:val="none"/>
           <w:caps w:val="1"/>
-          <w:spacing w:val="60"/>
+          <w:spacing w:val="80"/>
         </w:rPr>
         <w:t>Executive Summary</w:t>
       </w:r>
     </w:p>
     <w:p>
       <w:pPr>
-        <w:spacing w:before="0" w:after="40"/>
+        <w:spacing w:before="0" w:after="40" w:line="240" w:lineRule="auto"/>
       </w:pPr>
     </w:p>
     <w:p>
       <w:pPr>
-        <w:spacing w:after="80" w:before="0"/>
+        <w:spacing w:after="120" w:before="0" w:line="276" w:lineRule="auto"/>
         <w:jc w:val="both"/>
       </w:pPr>
       <w:r>
         <w:rPr>
-          <w:rFonts w:ascii="Calibri" w:hAnsi="Calibri" w:cs="Calibri"/>
+          <w:rFonts w:ascii="Calibri" w:hAnsi="Calibri" w:cs="Calibri" w:eastAsia="Calibri"/>
           <w:b w:val="0"/>
           <w:i w:val="0"/>
-          <w:color w:val="202020"/>
-          <w:sz w:val="21"/>
+          <w:color w:val="1F1F1F"/>
+          <w:sz w:val="22"/>
           <w:u w:val="none"/>
         </w:rPr>
-        <w:t>Senior Supply Chain, Procurement and Operations Executive with more than 20 years of leadership experience across FMCG, manufacturing, logistics, warehousing and distribution environments.</w:t>
+        <w:t>Senior Supply Chain, Procurement and Operations Executive with 15+ years of leadership across FMCG, manufacturing, logistics, warehousing and distribution. I turn fragmented, high-cost operations into scalable, high-performance functions that improve EBITDA, protect working capital and strengthen service delivery.</w:t>
       </w:r>
     </w:p>
     <w:p>
       <w:pPr>
-        <w:spacing w:after="80" w:before="0"/>
+        <w:spacing w:after="120" w:before="0" w:line="276" w:lineRule="auto"/>
         <w:jc w:val="both"/>
       </w:pPr>
       <w:r>
         <w:rPr>
-          <w:rFonts w:ascii="Calibri" w:hAnsi="Calibri" w:cs="Calibri"/>
+          <w:rFonts w:ascii="Calibri" w:hAnsi="Calibri" w:cs="Calibri" w:eastAsia="Calibri"/>
           <w:b w:val="0"/>
           <w:i w:val="0"/>
-          <w:color w:val="202020"/>
-          <w:sz w:val="21"/>
+          <w:color w:val="1F1F1F"/>
+          <w:sz w:val="22"/>
           <w:u w:val="none"/>
         </w:rPr>
-        <w:t>Recognised for transforming complex operational environments into scalable, high-performance business functions that improve profitability, strengthen service delivery and optimise working capital.</w:t>
+        <w:t>Trusted by executive teams to lead enterprise-wide transformation, manage multi-site P&amp;Ls, re-engineer supplier ecosystems and embed governance that survives audit scrutiny. My approach combines commercial rigour with operational execution — delivering sustainable cost reduction, supply continuity and measurable business outcomes in competitive and regulated environments.</w:t>
       </w:r>
     </w:p>
     <w:p>
       <w:pPr>
-        <w:spacing w:after="80" w:before="0"/>
-        <w:jc w:val="both"/>
+        <w:spacing w:before="240" w:after="40" w:line="240" w:lineRule="auto"/>
+        <w:pBdr>
+          <w:bottom w:val="single" w:sz="10" w:space="2" w:color="B88E2E"/>
+        </w:pBdr>
       </w:pPr>
       <w:r>
         <w:rPr>
-          <w:rFonts w:ascii="Calibri" w:hAnsi="Calibri" w:cs="Calibri"/>
-          <w:b w:val="0"/>
+          <w:rFonts w:ascii="Calibri" w:hAnsi="Calibri" w:cs="Calibri" w:eastAsia="Calibri"/>
+          <w:b/>
           <w:i w:val="0"/>
-          <w:color w:val="202020"/>
-          <w:sz w:val="21"/>
+          <w:color w:val="142C4F"/>
+          <w:sz w:val="25"/>
           <w:u w:val="none"/>
+          <w:caps w:val="1"/>
+          <w:spacing w:val="80"/>
         </w:rPr>
-        <w:t>Proven track record leading enterprise-wide procurement, supply chain and operational strategies with accountability for multi-site operations, supplier ecosystems, inventory investment, logistics performance, workforce leadership and governance frameworks.</w:t>
+        <w:t>Impact at a Glance</w:t>
       </w:r>
     </w:p>
     <w:p>
       <w:pPr>
-        <w:spacing w:after="80" w:before="0"/>
-        <w:jc w:val="both"/>
+        <w:spacing w:before="0" w:after="40" w:line="240" w:lineRule="auto"/>
+      </w:pPr>
+    </w:p>
+    <w:p>
+      <w:pPr>
+        <w:spacing w:before="40" w:after="0" w:line="288" w:lineRule="auto"/>
+        <w:ind w:left="170"/>
+        <w:shd w:val="clear" w:color="auto" w:fill="F4F1E8"/>
+        <w:pBdr>
+          <w:left w:val="single" w:sz="24" w:space="6" w:color="B88E2E"/>
+        </w:pBdr>
       </w:pPr>
       <w:r>
         <w:rPr>
-          <w:rFonts w:ascii="Calibri" w:hAnsi="Calibri" w:cs="Calibri"/>
+          <w:rFonts w:ascii="Calibri" w:hAnsi="Calibri" w:cs="Calibri" w:eastAsia="Calibri"/>
+          <w:b/>
+          <w:i w:val="0"/>
+          <w:color w:val="142C4F"/>
+          <w:sz w:val="22"/>
+          <w:u w:val="none"/>
+        </w:rPr>
+        <w:t xml:space="preserve">Experience  </w:t>
+      </w:r>
+      <w:r>
+        <w:rPr>
+          <w:rFonts w:ascii="Calibri" w:hAnsi="Calibri" w:cs="Calibri" w:eastAsia="Calibri"/>
           <w:b w:val="0"/>
           <w:i w:val="0"/>
-          <w:color w:val="202020"/>
-          <w:sz w:val="21"/>
+          <w:color w:val="1F1F1F"/>
+          <w:sz w:val="22"/>
           <w:u w:val="none"/>
         </w:rPr>
-        <w:t>Combines strong commercial acumen with operational execution excellence to drive sustainable cost reduction, improve supply continuity, enhance customer service levels and support long-term organisational growth.</w:t>
+        <w:t>15+ years executive leadership across FMCG, manufacturing, logistics &amp; distribution.</w:t>
       </w:r>
     </w:p>
     <w:p>
       <w:pPr>
-        <w:spacing w:after="80" w:before="0"/>
-        <w:jc w:val="both"/>
+        <w:spacing w:before="0" w:after="0" w:line="288" w:lineRule="auto"/>
+        <w:ind w:left="170"/>
+        <w:shd w:val="clear" w:color="auto" w:fill="F4F1E8"/>
+        <w:pBdr>
+          <w:left w:val="single" w:sz="24" w:space="6" w:color="B88E2E"/>
+        </w:pBdr>
       </w:pPr>
       <w:r>
         <w:rPr>
-          <w:rFonts w:ascii="Calibri" w:hAnsi="Calibri" w:cs="Calibri"/>
+          <w:rFonts w:ascii="Calibri" w:hAnsi="Calibri" w:cs="Calibri" w:eastAsia="Calibri"/>
+          <w:b/>
+          <w:i w:val="0"/>
+          <w:color w:val="142C4F"/>
+          <w:sz w:val="22"/>
+          <w:u w:val="none"/>
+        </w:rPr>
+        <w:t xml:space="preserve">Financial Scale  </w:t>
+      </w:r>
+      <w:r>
+        <w:rPr>
+          <w:rFonts w:ascii="Calibri" w:hAnsi="Calibri" w:cs="Calibri" w:eastAsia="Calibri"/>
           <w:b w:val="0"/>
           <w:i w:val="0"/>
-          <w:color w:val="202020"/>
-          <w:sz w:val="21"/>
+          <w:color w:val="1F1F1F"/>
+          <w:sz w:val="22"/>
           <w:u w:val="none"/>
         </w:rPr>
-        <w:t>Trusted by executive leadership teams to lead transformation initiatives, manage strategic supplier relationships, improve operational resilience and deliver measurable business outcomes in highly competitive and regulated environments.</w:t>
+        <w:t>Managed budgets exceeding R25M; recurring procurement savings; OPEX reduction via process redesign.</w:t>
       </w:r>
     </w:p>
     <w:p>
       <w:pPr>
-        <w:spacing w:before="200" w:after="20"/>
+        <w:spacing w:before="0" w:after="0" w:line="288" w:lineRule="auto"/>
+        <w:ind w:left="170"/>
+        <w:shd w:val="clear" w:color="auto" w:fill="F4F1E8"/>
         <w:pBdr>
-          <w:bottom w:val="single" w:sz="8" w:space="2" w:color="B7902C"/>
+          <w:left w:val="single" w:sz="24" w:space="6" w:color="B88E2E"/>
         </w:pBdr>
       </w:pPr>
       <w:r>
         <w:rPr>
-          <w:rFonts w:ascii="Calibri" w:hAnsi="Calibri" w:cs="Calibri"/>
+          <w:rFonts w:ascii="Calibri" w:hAnsi="Calibri" w:cs="Calibri" w:eastAsia="Calibri"/>
           <w:b/>
           <w:i w:val="0"/>
-          <w:color w:val="1A365D"/>
-          <w:sz w:val="24"/>
+          <w:color w:val="142C4F"/>
+          <w:sz w:val="22"/>
+          <w:u w:val="none"/>
+        </w:rPr>
+        <w:t xml:space="preserve">Service Delivery  </w:t>
+      </w:r>
+      <w:r>
+        <w:rPr>
+          <w:rFonts w:ascii="Calibri" w:hAnsi="Calibri" w:cs="Calibri" w:eastAsia="Calibri"/>
+          <w:b w:val="0"/>
+          <w:i w:val="0"/>
+          <w:color w:val="1F1F1F"/>
+          <w:sz w:val="22"/>
+          <w:u w:val="none"/>
+        </w:rPr>
+        <w:t>OTIF performance &gt;95%; reduced fulfilment lead times; multi-site distribution at national scale.</w:t>
+      </w:r>
+    </w:p>
+    <w:p>
+      <w:pPr>
+        <w:spacing w:before="0" w:after="0" w:line="288" w:lineRule="auto"/>
+        <w:ind w:left="170"/>
+        <w:shd w:val="clear" w:color="auto" w:fill="F4F1E8"/>
+        <w:pBdr>
+          <w:left w:val="single" w:sz="24" w:space="6" w:color="B88E2E"/>
+        </w:pBdr>
+      </w:pPr>
+      <w:r>
+        <w:rPr>
+          <w:rFonts w:ascii="Calibri" w:hAnsi="Calibri" w:cs="Calibri" w:eastAsia="Calibri"/>
+          <w:b/>
+          <w:i w:val="0"/>
+          <w:color w:val="142C4F"/>
+          <w:sz w:val="22"/>
+          <w:u w:val="none"/>
+        </w:rPr>
+        <w:t xml:space="preserve">Team Leadership  </w:t>
+      </w:r>
+      <w:r>
+        <w:rPr>
+          <w:rFonts w:ascii="Calibri" w:hAnsi="Calibri" w:cs="Calibri" w:eastAsia="Calibri"/>
+          <w:b w:val="0"/>
+          <w:i w:val="0"/>
+          <w:color w:val="1F1F1F"/>
+          <w:sz w:val="22"/>
+          <w:u w:val="none"/>
+        </w:rPr>
+        <w:t>Led teams of 120+ across warehouse, fleet, procurement and operations.</w:t>
+      </w:r>
+    </w:p>
+    <w:p>
+      <w:pPr>
+        <w:spacing w:before="0" w:after="0" w:line="288" w:lineRule="auto"/>
+        <w:ind w:left="170"/>
+        <w:shd w:val="clear" w:color="auto" w:fill="F4F1E8"/>
+        <w:pBdr>
+          <w:left w:val="single" w:sz="24" w:space="6" w:color="B88E2E"/>
+        </w:pBdr>
+      </w:pPr>
+      <w:r>
+        <w:rPr>
+          <w:rFonts w:ascii="Calibri" w:hAnsi="Calibri" w:cs="Calibri" w:eastAsia="Calibri"/>
+          <w:b/>
+          <w:i w:val="0"/>
+          <w:color w:val="142C4F"/>
+          <w:sz w:val="22"/>
+          <w:u w:val="none"/>
+        </w:rPr>
+        <w:t xml:space="preserve">Transformation  </w:t>
+      </w:r>
+      <w:r>
+        <w:rPr>
+          <w:rFonts w:ascii="Calibri" w:hAnsi="Calibri" w:cs="Calibri" w:eastAsia="Calibri"/>
+          <w:b w:val="0"/>
+          <w:i w:val="0"/>
+          <w:color w:val="1F1F1F"/>
+          <w:sz w:val="22"/>
+          <w:u w:val="none"/>
+        </w:rPr>
+        <w:t>Enterprise improvement programmes, ERP / SAP / WMS deployment, S&amp;OP governance, KPI-driven cultures.</w:t>
+      </w:r>
+    </w:p>
+    <w:p>
+      <w:pPr>
+        <w:spacing w:before="0" w:after="0" w:line="288" w:lineRule="auto"/>
+        <w:ind w:left="170"/>
+        <w:shd w:val="clear" w:color="auto" w:fill="F4F1E8"/>
+        <w:pBdr>
+          <w:left w:val="single" w:sz="24" w:space="6" w:color="B88E2E"/>
+        </w:pBdr>
+      </w:pPr>
+      <w:r>
+        <w:rPr>
+          <w:rFonts w:ascii="Calibri" w:hAnsi="Calibri" w:cs="Calibri" w:eastAsia="Calibri"/>
+          <w:b/>
+          <w:i w:val="0"/>
+          <w:color w:val="142C4F"/>
+          <w:sz w:val="22"/>
+          <w:u w:val="none"/>
+        </w:rPr>
+        <w:t xml:space="preserve">Compliance  </w:t>
+      </w:r>
+      <w:r>
+        <w:rPr>
+          <w:rFonts w:ascii="Calibri" w:hAnsi="Calibri" w:cs="Calibri" w:eastAsia="Calibri"/>
+          <w:b w:val="0"/>
+          <w:i w:val="0"/>
+          <w:color w:val="1F1F1F"/>
+          <w:sz w:val="22"/>
+          <w:u w:val="none"/>
+        </w:rPr>
+        <w:t>Zero major audit findings; OHSA, Labour Relations Act and regulatory compliance leadership.</w:t>
+      </w:r>
+    </w:p>
+    <w:p>
+      <w:pPr>
+        <w:spacing w:before="0" w:after="0" w:line="288" w:lineRule="auto"/>
+        <w:ind w:left="170"/>
+        <w:shd w:val="clear" w:color="auto" w:fill="F4F1E8"/>
+        <w:pBdr>
+          <w:left w:val="single" w:sz="24" w:space="6" w:color="B88E2E"/>
+        </w:pBdr>
+      </w:pPr>
+      <w:r>
+        <w:rPr>
+          <w:rFonts w:ascii="Calibri" w:hAnsi="Calibri" w:cs="Calibri" w:eastAsia="Calibri"/>
+          <w:b/>
+          <w:i w:val="0"/>
+          <w:color w:val="142C4F"/>
+          <w:sz w:val="22"/>
+          <w:u w:val="none"/>
+        </w:rPr>
+        <w:t xml:space="preserve">Geography  </w:t>
+      </w:r>
+      <w:r>
+        <w:rPr>
+          <w:rFonts w:ascii="Calibri" w:hAnsi="Calibri" w:cs="Calibri" w:eastAsia="Calibri"/>
+          <w:b w:val="0"/>
+          <w:i w:val="0"/>
+          <w:color w:val="1F1F1F"/>
+          <w:sz w:val="22"/>
+          <w:u w:val="none"/>
+        </w:rPr>
+        <w:t>Dual SA / DE residency  |  Remote, Hybrid or On-Site  |  Available immediately.</w:t>
+      </w:r>
+    </w:p>
+    <w:p>
+      <w:pPr>
+        <w:spacing w:before="240" w:after="40" w:line="240" w:lineRule="auto"/>
+        <w:pBdr>
+          <w:bottom w:val="single" w:sz="10" w:space="2" w:color="B88E2E"/>
+        </w:pBdr>
+      </w:pPr>
+      <w:r>
+        <w:rPr>
+          <w:rFonts w:ascii="Calibri" w:hAnsi="Calibri" w:cs="Calibri" w:eastAsia="Calibri"/>
+          <w:b/>
+          <w:i w:val="0"/>
+          <w:color w:val="142C4F"/>
+          <w:sz w:val="25"/>
           <w:u w:val="none"/>
           <w:caps w:val="1"/>
-          <w:spacing w:val="60"/>
+          <w:spacing w:val="80"/>
         </w:rPr>
         <w:t>Core Competencies</w:t>
       </w:r>
     </w:p>
     <w:p>
       <w:pPr>
-        <w:spacing w:before="0" w:after="40"/>
+        <w:spacing w:before="0" w:after="40" w:line="240" w:lineRule="auto"/>
       </w:pPr>
     </w:p>
     <w:p>
       <w:pPr>
-        <w:spacing w:before="20" w:after="60"/>
+        <w:spacing w:before="20" w:after="60" w:line="288" w:lineRule="auto"/>
       </w:pPr>
       <w:r>
         <w:rPr>
-          <w:rFonts w:ascii="Calibri" w:hAnsi="Calibri" w:cs="Calibri"/>
+          <w:rFonts w:ascii="Calibri" w:hAnsi="Calibri" w:cs="Calibri" w:eastAsia="Calibri"/>
           <w:b/>
           <w:i w:val="0"/>
-          <w:color w:val="1A365D"/>
-          <w:sz w:val="21"/>
+          <w:color w:val="142C4F"/>
+          <w:sz w:val="22"/>
           <w:u w:val="none"/>
         </w:rPr>
-        <w:t xml:space="preserve">Strategic Focus: </w:t>
+        <w:t xml:space="preserve">Strategic Focus:  </w:t>
       </w:r>
       <w:r>
         <w:rPr>
-          <w:rFonts w:ascii="Calibri" w:hAnsi="Calibri" w:cs="Calibri"/>
+          <w:rFonts w:ascii="Calibri" w:hAnsi="Calibri" w:cs="Calibri" w:eastAsia="Calibri"/>
           <w:b w:val="0"/>
           <w:i w:val="0"/>
-          <w:color w:val="202020"/>
-          <w:sz w:val="21"/>
+          <w:color w:val="1F1F1F"/>
+          <w:sz w:val="22"/>
           <w:u w:val="none"/>
         </w:rPr>
-        <w:t>Procurement Cost Optimisation  |  Working Capital Improvement  |  Inventory &amp; Demand Planning  |  Multi-Site Operational Leadership  |  Supply Chain Transformation  |  Strategic Sourcing &amp; Contract Negotiation  |  Logistics &amp; Distribution Optimisation  |  Enterprise Risk &amp; Governance  |  SAP-Driven Operational Excellence  |  Executive Stakeholder Management</w:t>
+        <w:t>Procurement Cost Optimisation  |  Working Capital Improvement  |  Inventory Optimisation  |  Supply Chain Transformation  |  SAP-Driven Operational Excellence</w:t>
       </w:r>
     </w:p>
     <w:p>
       <w:pPr>
-        <w:spacing w:before="20" w:after="60"/>
+        <w:spacing w:before="20" w:after="60" w:line="288" w:lineRule="auto"/>
       </w:pPr>
       <w:r>
         <w:rPr>
-          <w:rFonts w:ascii="Calibri" w:hAnsi="Calibri" w:cs="Calibri"/>
+          <w:rFonts w:ascii="Calibri" w:hAnsi="Calibri" w:cs="Calibri" w:eastAsia="Calibri"/>
           <w:b/>
           <w:i w:val="0"/>
-          <w:color w:val="1A365D"/>
-          <w:sz w:val="21"/>
+          <w:color w:val="142C4F"/>
+          <w:sz w:val="22"/>
           <w:u w:val="none"/>
         </w:rPr>
-        <w:t xml:space="preserve">Commercial Leadership: </w:t>
+        <w:t xml:space="preserve">Commercial Leadership:  </w:t>
       </w:r>
       <w:r>
         <w:rPr>
-          <w:rFonts w:ascii="Calibri" w:hAnsi="Calibri" w:cs="Calibri"/>
+          <w:rFonts w:ascii="Calibri" w:hAnsi="Calibri" w:cs="Calibri" w:eastAsia="Calibri"/>
           <w:b w:val="0"/>
           <w:i w:val="0"/>
-          <w:color w:val="202020"/>
-          <w:sz w:val="21"/>
+          <w:color w:val="1F1F1F"/>
+          <w:sz w:val="22"/>
           <w:u w:val="none"/>
         </w:rPr>
-        <w:t>Procurement Strategy Development  |  Strategic Sourcing &amp; Category Management  |  Supplier Relationship Management  |  Contract Negotiation  |  Cost-to-Serve Optimisation  |  Margin Protection</w:t>
+        <w:t>Strategic Sourcing &amp; Category Management  |  Contract Negotiation  |  Supplier Relationship Management  |  Cost-to-Serve Optimisation  |  Margin Protection</w:t>
       </w:r>
     </w:p>
     <w:p>
       <w:pPr>
-        <w:spacing w:before="20" w:after="60"/>
+        <w:spacing w:before="20" w:after="60" w:line="288" w:lineRule="auto"/>
       </w:pPr>
       <w:r>
         <w:rPr>
-          <w:rFonts w:ascii="Calibri" w:hAnsi="Calibri" w:cs="Calibri"/>
+          <w:rFonts w:ascii="Calibri" w:hAnsi="Calibri" w:cs="Calibri" w:eastAsia="Calibri"/>
           <w:b/>
           <w:i w:val="0"/>
-          <w:color w:val="1A365D"/>
-          <w:sz w:val="21"/>
+          <w:color w:val="142C4F"/>
+          <w:sz w:val="22"/>
           <w:u w:val="none"/>
         </w:rPr>
-        <w:t xml:space="preserve">Supply Chain Excellence: </w:t>
+        <w:t xml:space="preserve">Supply Chain Excellence:  </w:t>
       </w:r>
       <w:r>
         <w:rPr>
-          <w:rFonts w:ascii="Calibri" w:hAnsi="Calibri" w:cs="Calibri"/>
+          <w:rFonts w:ascii="Calibri" w:hAnsi="Calibri" w:cs="Calibri" w:eastAsia="Calibri"/>
           <w:b w:val="0"/>
           <w:i w:val="0"/>
-          <w:color w:val="202020"/>
-          <w:sz w:val="21"/>
+          <w:color w:val="1F1F1F"/>
+          <w:sz w:val="22"/>
           <w:u w:val="none"/>
         </w:rPr>
-        <w:t>End-to-End Supply Chain Leadership  |  Sales &amp; Operations Planning (S&amp;OP)  |  Demand Planning &amp; Forecasting  |  Inventory Optimisation  |  Warehouse &amp; Distribution Management  |  Transport &amp; Fleet Optimisation  |  Supply Chain Risk Management</w:t>
+        <w:t>End-to-End Supply Chain  |  S&amp;OP / Demand Planning  |  Inventory &amp; Demand Planning  |  Warehouse &amp; Distribution  |  Transport &amp; Fleet Optimisation</w:t>
       </w:r>
     </w:p>
     <w:p>
       <w:pPr>
-        <w:spacing w:before="20" w:after="60"/>
+        <w:spacing w:before="20" w:after="60" w:line="288" w:lineRule="auto"/>
       </w:pPr>
       <w:r>
         <w:rPr>
-          <w:rFonts w:ascii="Calibri" w:hAnsi="Calibri" w:cs="Calibri"/>
+          <w:rFonts w:ascii="Calibri" w:hAnsi="Calibri" w:cs="Calibri" w:eastAsia="Calibri"/>
           <w:b/>
           <w:i w:val="0"/>
-          <w:color w:val="1A365D"/>
-          <w:sz w:val="21"/>
+          <w:color w:val="142C4F"/>
+          <w:sz w:val="22"/>
           <w:u w:val="none"/>
         </w:rPr>
-        <w:t xml:space="preserve">Operational Leadership: </w:t>
+        <w:t xml:space="preserve">Operational Leadership:  </w:t>
       </w:r>
       <w:r>
         <w:rPr>
-          <w:rFonts w:ascii="Calibri" w:hAnsi="Calibri" w:cs="Calibri"/>
+          <w:rFonts w:ascii="Calibri" w:hAnsi="Calibri" w:cs="Calibri" w:eastAsia="Calibri"/>
           <w:b w:val="0"/>
           <w:i w:val="0"/>
-          <w:color w:val="202020"/>
-          <w:sz w:val="21"/>
+          <w:color w:val="1F1F1F"/>
+          <w:sz w:val="22"/>
           <w:u w:val="none"/>
         </w:rPr>
-        <w:t>Multi-Site Operations Management  |  P&amp;L Accountability  |  Continuous Improvement  |  Lean Six Sigma  |  Performance Management  |  Operational Governance  |  Health &amp; Safety Compliance  |  Industrial Relations</w:t>
+        <w:t>Multi-Site P&amp;L Accountability  |  Continuous Improvement / Lean Six Sigma  |  Performance &amp; KPI Management  |  Health &amp; Safety Compliance  |  Industrial &amp; Union Relations</w:t>
       </w:r>
     </w:p>
     <w:p>
       <w:pPr>
-        <w:spacing w:before="20" w:after="60"/>
+        <w:spacing w:before="20" w:after="60" w:line="288" w:lineRule="auto"/>
       </w:pPr>
       <w:r>
         <w:rPr>
-          <w:rFonts w:ascii="Calibri" w:hAnsi="Calibri" w:cs="Calibri"/>
+          <w:rFonts w:ascii="Calibri" w:hAnsi="Calibri" w:cs="Calibri" w:eastAsia="Calibri"/>
           <w:b/>
           <w:i w:val="0"/>
-          <w:color w:val="1A365D"/>
-          <w:sz w:val="21"/>
+          <w:color w:val="142C4F"/>
+          <w:sz w:val="22"/>
           <w:u w:val="none"/>
         </w:rPr>
-        <w:t xml:space="preserve">Executive Governance: </w:t>
+        <w:t xml:space="preserve">Executive Governance:  </w:t>
       </w:r>
       <w:r>
         <w:rPr>
-          <w:rFonts w:ascii="Calibri" w:hAnsi="Calibri" w:cs="Calibri"/>
+          <w:rFonts w:ascii="Calibri" w:hAnsi="Calibri" w:cs="Calibri" w:eastAsia="Calibri"/>
           <w:b w:val="0"/>
           <w:i w:val="0"/>
-          <w:color w:val="202020"/>
-          <w:sz w:val="21"/>
+          <w:color w:val="1F1F1F"/>
+          <w:sz w:val="22"/>
           <w:u w:val="none"/>
         </w:rPr>
-        <w:t>Executive Committee Engagement  |  Strategic Planning  |  Business Transformation  |  Change Leadership  |  Risk Management  |  Audit Readiness  |  Regulatory Compliance  |  Cross-Functional Leadership</w:t>
+        <w:t>Executive Committee Engagement  |  Strategic Planning &amp; Transformation  |  Change Leadership  |  Risk &amp; Audit Readiness  |  Cross-Functional Leadership</w:t>
       </w:r>
     </w:p>
     <w:p>
       <w:pPr>
-        <w:spacing w:before="20" w:after="60"/>
+        <w:spacing w:before="20" w:after="60" w:line="288" w:lineRule="auto"/>
       </w:pPr>
       <w:r>
         <w:rPr>
-          <w:rFonts w:ascii="Calibri" w:hAnsi="Calibri" w:cs="Calibri"/>
+          <w:rFonts w:ascii="Calibri" w:hAnsi="Calibri" w:cs="Calibri" w:eastAsia="Calibri"/>
           <w:b/>
           <w:i w:val="0"/>
-          <w:color w:val="1A365D"/>
-          <w:sz w:val="21"/>
+          <w:color w:val="142C4F"/>
+          <w:sz w:val="22"/>
           <w:u w:val="none"/>
         </w:rPr>
-        <w:t xml:space="preserve">Systems &amp; Tools: </w:t>
+        <w:t xml:space="preserve">Systems &amp; Tools:  </w:t>
       </w:r>
       <w:r>
         <w:rPr>
-          <w:rFonts w:ascii="Calibri" w:hAnsi="Calibri" w:cs="Calibri"/>
+          <w:rFonts w:ascii="Calibri" w:hAnsi="Calibri" w:cs="Calibri" w:eastAsia="Calibri"/>
           <w:b w:val="0"/>
           <w:i w:val="0"/>
-          <w:color w:val="202020"/>
-          <w:sz w:val="21"/>
+          <w:color w:val="1F1F1F"/>
+          <w:sz w:val="22"/>
           <w:u w:val="none"/>
         </w:rPr>
-        <w:t>SAP  |  ERP  |  WMS  |  S&amp;OP Tools  |  BI Dashboards  |  Power BI  |  Excel (Advanced)  |  MS Project</w:t>
+        <w:t>SAP  |  ERP (SYSPRO, Odoo, Sage)  |  WMS  |  Power BI  |  Advanced Excel  |  MS Project  |  BI Dashboards</w:t>
       </w:r>
     </w:p>
     <w:p>
       <w:pPr>
-        <w:spacing w:before="200" w:after="20"/>
+        <w:spacing w:before="240" w:after="40" w:line="240" w:lineRule="auto"/>
         <w:pBdr>
-          <w:bottom w:val="single" w:sz="8" w:space="2" w:color="B7902C"/>
+          <w:bottom w:val="single" w:sz="10" w:space="2" w:color="B88E2E"/>
         </w:pBdr>
       </w:pPr>
       <w:r>
         <w:rPr>
-          <w:rFonts w:ascii="Calibri" w:hAnsi="Calibri" w:cs="Calibri"/>
+          <w:rFonts w:ascii="Calibri" w:hAnsi="Calibri" w:cs="Calibri" w:eastAsia="Calibri"/>
           <w:b/>
           <w:i w:val="0"/>
-          <w:color w:val="1A365D"/>
-          <w:sz w:val="24"/>
+          <w:color w:val="142C4F"/>
+          <w:sz w:val="25"/>
           <w:u w:val="none"/>
           <w:caps w:val="1"/>
-          <w:spacing w:val="60"/>
+          <w:spacing w:val="80"/>
         </w:rPr>
         <w:t>Professional Experience</w:t>
       </w:r>
     </w:p>
     <w:p>
       <w:pPr>
-        <w:spacing w:before="0" w:after="40"/>
+        <w:spacing w:before="0" w:after="40" w:line="240" w:lineRule="auto"/>
       </w:pPr>
     </w:p>
     <w:p>
@@ -419,16 +635,18 @@
         <w:tabs>
           <w:tab w:pos="9638" w:val="right"/>
         </w:tabs>
-        <w:spacing w:before="160" w:after="0"/>
+        <w:spacing w:before="200" w:after="0" w:line="240" w:lineRule="auto"/>
       </w:pPr>
       <w:r>
         <w:rPr>
-          <w:rFonts w:ascii="Calibri" w:hAnsi="Calibri" w:cs="Calibri"/>
+          <w:rFonts w:ascii="Calibri" w:hAnsi="Calibri" w:cs="Calibri" w:eastAsia="Calibri"/>
           <w:b/>
           <w:i w:val="0"/>
-          <w:color w:val="1A365D"/>
-          <w:sz w:val="24"/>
+          <w:color w:val="142C4F"/>
+          <w:sz w:val="25"/>
           <w:u w:val="none"/>
+          <w:caps w:val="1"/>
+          <w:spacing w:val="40"/>
         </w:rPr>
         <w:t>Quantum Foods</w:t>
       </w:r>
@@ -437,14 +655,14 @@
       </w:r>
       <w:r>
         <w:rPr>
-          <w:rFonts w:ascii="Calibri" w:hAnsi="Calibri" w:cs="Calibri"/>
+          <w:rFonts w:ascii="Calibri" w:hAnsi="Calibri" w:cs="Calibri" w:eastAsia="Calibri"/>
           <w:b w:val="0"/>
           <w:i/>
           <w:color w:val="555C66"/>
           <w:sz w:val="21"/>
           <w:u w:val="none"/>
         </w:rPr>
-        <w:t>January 2023 – Present</w:t>
+        <w:t>Jan 2023 – Present</w:t>
       </w:r>
     </w:p>
     <w:p>
@@ -452,15 +670,15 @@
         <w:tabs>
           <w:tab w:pos="9638" w:val="right"/>
         </w:tabs>
-        <w:spacing w:before="0" w:after="40"/>
+        <w:spacing w:before="0" w:after="40" w:line="240" w:lineRule="auto"/>
       </w:pPr>
       <w:r>
         <w:rPr>
-          <w:rFonts w:ascii="Calibri" w:hAnsi="Calibri" w:cs="Calibri"/>
+          <w:rFonts w:ascii="Calibri" w:hAnsi="Calibri" w:cs="Calibri" w:eastAsia="Calibri"/>
           <w:b/>
           <w:i/>
-          <w:color w:val="B7902C"/>
-          <w:sz w:val="22"/>
+          <w:color w:val="B88E2E"/>
+          <w:sz w:val="23"/>
           <w:u w:val="none"/>
         </w:rPr>
         <w:t>National Procurement &amp; Supply Chain Manager</w:t>
@@ -470,7 +688,7 @@
       </w:r>
       <w:r>
         <w:rPr>
-          <w:rFonts w:ascii="Calibri" w:hAnsi="Calibri" w:cs="Calibri"/>
+          <w:rFonts w:ascii="Calibri" w:hAnsi="Calibri" w:cs="Calibri" w:eastAsia="Calibri"/>
           <w:b w:val="0"/>
           <w:i w:val="0"/>
           <w:color w:val="555C66"/>
@@ -482,15 +700,15 @@
     </w:p>
     <w:p>
       <w:pPr>
-        <w:spacing w:before="80" w:after="20"/>
+        <w:spacing w:before="80" w:after="20" w:line="240" w:lineRule="auto"/>
       </w:pPr>
       <w:r>
         <w:rPr>
-          <w:rFonts w:ascii="Calibri" w:hAnsi="Calibri" w:cs="Calibri"/>
+          <w:rFonts w:ascii="Calibri" w:hAnsi="Calibri" w:cs="Calibri" w:eastAsia="Calibri"/>
           <w:b/>
           <w:i w:val="0"/>
-          <w:color w:val="1A365D"/>
-          <w:sz w:val="21"/>
+          <w:color w:val="142C4F"/>
+          <w:sz w:val="22"/>
           <w:u w:val="none"/>
         </w:rPr>
         <w:t>Executive Mandate</w:t>
@@ -498,32 +716,32 @@
     </w:p>
     <w:p>
       <w:pPr>
-        <w:spacing w:after="80" w:before="0"/>
+        <w:spacing w:after="80" w:before="0" w:line="276" w:lineRule="auto"/>
         <w:jc w:val="both"/>
       </w:pPr>
       <w:r>
         <w:rPr>
-          <w:rFonts w:ascii="Calibri" w:hAnsi="Calibri" w:cs="Calibri"/>
+          <w:rFonts w:ascii="Calibri" w:hAnsi="Calibri" w:cs="Calibri" w:eastAsia="Calibri"/>
           <w:b w:val="0"/>
           <w:i w:val="0"/>
-          <w:color w:val="202020"/>
-          <w:sz w:val="21"/>
+          <w:color w:val="1F1F1F"/>
+          <w:sz w:val="22"/>
           <w:u w:val="none"/>
         </w:rPr>
-        <w:t>Entrusted with strengthening procurement governance, improving supply chain resilience, optimising working capital and enhancing operational performance across national procurement and supply chain functions.</w:t>
+        <w:t>Strengthen procurement governance, improve supply chain resilience and optimise working capital across national operations.</w:t>
       </w:r>
     </w:p>
     <w:p>
       <w:pPr>
-        <w:spacing w:before="80" w:after="20"/>
+        <w:spacing w:before="80" w:after="20" w:line="240" w:lineRule="auto"/>
       </w:pPr>
       <w:r>
         <w:rPr>
-          <w:rFonts w:ascii="Calibri" w:hAnsi="Calibri" w:cs="Calibri"/>
+          <w:rFonts w:ascii="Calibri" w:hAnsi="Calibri" w:cs="Calibri" w:eastAsia="Calibri"/>
           <w:b/>
           <w:i w:val="0"/>
-          <w:color w:val="1A365D"/>
-          <w:sz w:val="21"/>
+          <w:color w:val="142C4F"/>
+          <w:sz w:val="22"/>
           <w:u w:val="none"/>
         </w:rPr>
         <w:t>Strategic Leadership</w:t>
@@ -532,70 +750,52 @@
     <w:p>
       <w:pPr>
         <w:pStyle w:val="ListBullet"/>
-        <w:spacing w:after="20"/>
+        <w:spacing w:after="40" w:line="276" w:lineRule="auto"/>
         <w:ind w:left="340"/>
       </w:pPr>
       <w:r>
         <w:rPr>
-          <w:rFonts w:ascii="Calibri" w:hAnsi="Calibri" w:cs="Calibri"/>
+          <w:rFonts w:ascii="Calibri" w:hAnsi="Calibri" w:cs="Calibri" w:eastAsia="Calibri"/>
           <w:b w:val="0"/>
           <w:i w:val="0"/>
-          <w:color w:val="202020"/>
-          <w:sz w:val="21"/>
+          <w:color w:val="1F1F1F"/>
+          <w:sz w:val="22"/>
           <w:u w:val="none"/>
         </w:rPr>
-        <w:t>Lead national procurement strategy across direct and indirect spend categories.</w:t>
+        <w:t>Lead national procurement strategy across direct and indirect spend, supplier performance and commercial negotiations.</w:t>
       </w:r>
     </w:p>
     <w:p>
       <w:pPr>
         <w:pStyle w:val="ListBullet"/>
-        <w:spacing w:after="20"/>
+        <w:spacing w:after="40" w:line="276" w:lineRule="auto"/>
         <w:ind w:left="340"/>
       </w:pPr>
       <w:r>
         <w:rPr>
-          <w:rFonts w:ascii="Calibri" w:hAnsi="Calibri" w:cs="Calibri"/>
+          <w:rFonts w:ascii="Calibri" w:hAnsi="Calibri" w:cs="Calibri" w:eastAsia="Calibri"/>
           <w:b w:val="0"/>
           <w:i w:val="0"/>
-          <w:color w:val="202020"/>
-          <w:sz w:val="21"/>
+          <w:color w:val="1F1F1F"/>
+          <w:sz w:val="22"/>
           <w:u w:val="none"/>
         </w:rPr>
-        <w:t>Drive supplier performance, strategic sourcing and commercial negotiations.</w:t>
+        <w:t>Govern inventory investment, replenishment strategies and demand planning disciplines.</w:t>
       </w:r>
     </w:p>
     <w:p>
       <w:pPr>
         <w:pStyle w:val="ListBullet"/>
-        <w:spacing w:after="20"/>
+        <w:spacing w:after="40" w:line="276" w:lineRule="auto"/>
         <w:ind w:left="340"/>
       </w:pPr>
       <w:r>
         <w:rPr>
-          <w:rFonts w:ascii="Calibri" w:hAnsi="Calibri" w:cs="Calibri"/>
+          <w:rFonts w:ascii="Calibri" w:hAnsi="Calibri" w:cs="Calibri" w:eastAsia="Calibri"/>
           <w:b w:val="0"/>
           <w:i w:val="0"/>
-          <w:color w:val="202020"/>
-          <w:sz w:val="21"/>
-          <w:u w:val="none"/>
-        </w:rPr>
-        <w:t>Oversee inventory investment, replenishment strategies and demand planning disciplines.</w:t>
-      </w:r>
-    </w:p>
-    <w:p>
-      <w:pPr>
-        <w:pStyle w:val="ListBullet"/>
-        <w:spacing w:after="20"/>
-        <w:ind w:left="340"/>
-      </w:pPr>
-      <w:r>
-        <w:rPr>
-          <w:rFonts w:ascii="Calibri" w:hAnsi="Calibri" w:cs="Calibri"/>
-          <w:b w:val="0"/>
-          <w:i w:val="0"/>
-          <w:color w:val="202020"/>
-          <w:sz w:val="21"/>
+          <w:color w:val="1F1F1F"/>
+          <w:sz w:val="22"/>
           <w:u w:val="none"/>
         </w:rPr>
         <w:t>Align procurement, operations and logistics through structured S&amp;OP governance.</w:t>
@@ -604,68 +804,50 @@
     <w:p>
       <w:pPr>
         <w:pStyle w:val="ListBullet"/>
-        <w:spacing w:after="20"/>
+        <w:spacing w:after="40" w:line="276" w:lineRule="auto"/>
         <w:ind w:left="340"/>
       </w:pPr>
       <w:r>
         <w:rPr>
-          <w:rFonts w:ascii="Calibri" w:hAnsi="Calibri" w:cs="Calibri"/>
+          <w:rFonts w:ascii="Calibri" w:hAnsi="Calibri" w:cs="Calibri" w:eastAsia="Calibri"/>
           <w:b w:val="0"/>
           <w:i w:val="0"/>
-          <w:color w:val="202020"/>
-          <w:sz w:val="21"/>
+          <w:color w:val="1F1F1F"/>
+          <w:sz w:val="22"/>
           <w:u w:val="none"/>
         </w:rPr>
-        <w:t>Lead warehousing, transportation and distribution performance management.</w:t>
+        <w:t>Drive warehousing, transportation and distribution performance management.</w:t>
       </w:r>
     </w:p>
     <w:p>
       <w:pPr>
         <w:pStyle w:val="ListBullet"/>
-        <w:spacing w:after="20"/>
+        <w:spacing w:after="40" w:line="276" w:lineRule="auto"/>
         <w:ind w:left="340"/>
       </w:pPr>
       <w:r>
         <w:rPr>
-          <w:rFonts w:ascii="Calibri" w:hAnsi="Calibri" w:cs="Calibri"/>
+          <w:rFonts w:ascii="Calibri" w:hAnsi="Calibri" w:cs="Calibri" w:eastAsia="Calibri"/>
           <w:b w:val="0"/>
           <w:i w:val="0"/>
-          <w:color w:val="202020"/>
-          <w:sz w:val="21"/>
+          <w:color w:val="1F1F1F"/>
+          <w:sz w:val="22"/>
           <w:u w:val="none"/>
         </w:rPr>
-        <w:t>Implement procurement governance frameworks ensuring compliance and risk mitigation.</w:t>
+        <w:t>Provide executive decision support via operational performance analytics and dashboards.</w:t>
       </w:r>
     </w:p>
     <w:p>
       <w:pPr>
-        <w:pStyle w:val="ListBullet"/>
-        <w:spacing w:after="20"/>
-        <w:ind w:left="340"/>
+        <w:spacing w:before="80" w:after="20" w:line="240" w:lineRule="auto"/>
       </w:pPr>
       <w:r>
         <w:rPr>
-          <w:rFonts w:ascii="Calibri" w:hAnsi="Calibri" w:cs="Calibri"/>
-          <w:b w:val="0"/>
-          <w:i w:val="0"/>
-          <w:color w:val="202020"/>
-          <w:sz w:val="21"/>
-          <w:u w:val="none"/>
-        </w:rPr>
-        <w:t>Support executive decision-making through operational performance reporting and analytics.</w:t>
-      </w:r>
-    </w:p>
-    <w:p>
-      <w:pPr>
-        <w:spacing w:before="80" w:after="20"/>
-      </w:pPr>
-      <w:r>
-        <w:rPr>
-          <w:rFonts w:ascii="Calibri" w:hAnsi="Calibri" w:cs="Calibri"/>
+          <w:rFonts w:ascii="Calibri" w:hAnsi="Calibri" w:cs="Calibri" w:eastAsia="Calibri"/>
           <w:b/>
           <w:i w:val="0"/>
-          <w:color w:val="1A365D"/>
-          <w:sz w:val="21"/>
+          <w:color w:val="142C4F"/>
+          <w:sz w:val="22"/>
           <w:u w:val="none"/>
         </w:rPr>
         <w:t>Key Contributions</w:t>
@@ -674,126 +856,165 @@
     <w:p>
       <w:pPr>
         <w:pStyle w:val="ListBullet"/>
-        <w:spacing w:after="20"/>
+        <w:spacing w:after="40" w:line="276" w:lineRule="auto"/>
         <w:ind w:left="340"/>
       </w:pPr>
       <w:r>
         <w:rPr>
-          <w:rFonts w:ascii="Calibri" w:hAnsi="Calibri" w:cs="Calibri"/>
+          <w:rFonts w:ascii="Calibri" w:hAnsi="Calibri" w:cs="Calibri" w:eastAsia="Calibri"/>
+          <w:b/>
+          <w:i w:val="0"/>
+          <w:color w:val="142C4F"/>
+          <w:sz w:val="22"/>
+          <w:u w:val="none"/>
+        </w:rPr>
+        <w:t xml:space="preserve">Cost: </w:t>
+      </w:r>
+      <w:r>
+        <w:rPr>
+          <w:rFonts w:ascii="Calibri" w:hAnsi="Calibri" w:cs="Calibri" w:eastAsia="Calibri"/>
           <w:b w:val="0"/>
           <w:i w:val="0"/>
-          <w:color w:val="202020"/>
-          <w:sz w:val="21"/>
+          <w:color w:val="1F1F1F"/>
+          <w:sz w:val="22"/>
           <w:u w:val="none"/>
         </w:rPr>
-        <w:t>Delivered sustainable procurement savings through supplier consolidation and strategic sourcing initiatives.</w:t>
+        <w:t>delivered sustainable procurement savings through supplier consolidation and strategic sourcing.</w:t>
       </w:r>
     </w:p>
     <w:p>
       <w:pPr>
         <w:pStyle w:val="ListBullet"/>
-        <w:spacing w:after="20"/>
+        <w:spacing w:after="40" w:line="276" w:lineRule="auto"/>
         <w:ind w:left="340"/>
       </w:pPr>
       <w:r>
         <w:rPr>
-          <w:rFonts w:ascii="Calibri" w:hAnsi="Calibri" w:cs="Calibri"/>
+          <w:rFonts w:ascii="Calibri" w:hAnsi="Calibri" w:cs="Calibri" w:eastAsia="Calibri"/>
+          <w:b/>
+          <w:i w:val="0"/>
+          <w:color w:val="142C4F"/>
+          <w:sz w:val="22"/>
+          <w:u w:val="none"/>
+        </w:rPr>
+        <w:t xml:space="preserve">Supplier Performance: </w:t>
+      </w:r>
+      <w:r>
+        <w:rPr>
+          <w:rFonts w:ascii="Calibri" w:hAnsi="Calibri" w:cs="Calibri" w:eastAsia="Calibri"/>
           <w:b w:val="0"/>
           <w:i w:val="0"/>
-          <w:color w:val="202020"/>
-          <w:sz w:val="21"/>
+          <w:color w:val="1F1F1F"/>
+          <w:sz w:val="22"/>
           <w:u w:val="none"/>
         </w:rPr>
-        <w:t>Improved supplier performance through structured KPI governance and performance management frameworks.</w:t>
+        <w:t>improved OTIF (On-Time, In-Full) via structured KPI governance.</w:t>
       </w:r>
     </w:p>
     <w:p>
       <w:pPr>
         <w:pStyle w:val="ListBullet"/>
-        <w:spacing w:after="20"/>
+        <w:spacing w:after="40" w:line="276" w:lineRule="auto"/>
         <w:ind w:left="340"/>
       </w:pPr>
       <w:r>
         <w:rPr>
-          <w:rFonts w:ascii="Calibri" w:hAnsi="Calibri" w:cs="Calibri"/>
+          <w:rFonts w:ascii="Calibri" w:hAnsi="Calibri" w:cs="Calibri" w:eastAsia="Calibri"/>
+          <w:b/>
+          <w:i w:val="0"/>
+          <w:color w:val="142C4F"/>
+          <w:sz w:val="22"/>
+          <w:u w:val="none"/>
+        </w:rPr>
+        <w:t xml:space="preserve">Working Capital: </w:t>
+      </w:r>
+      <w:r>
+        <w:rPr>
+          <w:rFonts w:ascii="Calibri" w:hAnsi="Calibri" w:cs="Calibri" w:eastAsia="Calibri"/>
           <w:b w:val="0"/>
           <w:i w:val="0"/>
-          <w:color w:val="202020"/>
-          <w:sz w:val="21"/>
+          <w:color w:val="1F1F1F"/>
+          <w:sz w:val="22"/>
           <w:u w:val="none"/>
         </w:rPr>
-        <w:t>Reduced inventory exposure while maintaining product availability and service performance.</w:t>
+        <w:t>reduced inventory exposure while maintaining product availability.</w:t>
       </w:r>
     </w:p>
     <w:p>
       <w:pPr>
         <w:pStyle w:val="ListBullet"/>
-        <w:spacing w:after="20"/>
+        <w:spacing w:after="40" w:line="276" w:lineRule="auto"/>
         <w:ind w:left="340"/>
       </w:pPr>
       <w:r>
         <w:rPr>
-          <w:rFonts w:ascii="Calibri" w:hAnsi="Calibri" w:cs="Calibri"/>
+          <w:rFonts w:ascii="Calibri" w:hAnsi="Calibri" w:cs="Calibri" w:eastAsia="Calibri"/>
+          <w:b/>
+          <w:i w:val="0"/>
+          <w:color w:val="142C4F"/>
+          <w:sz w:val="22"/>
+          <w:u w:val="none"/>
+        </w:rPr>
+        <w:t xml:space="preserve">Governance: </w:t>
+      </w:r>
+      <w:r>
+        <w:rPr>
+          <w:rFonts w:ascii="Calibri" w:hAnsi="Calibri" w:cs="Calibri" w:eastAsia="Calibri"/>
           <w:b w:val="0"/>
           <w:i w:val="0"/>
-          <w:color w:val="202020"/>
-          <w:sz w:val="21"/>
+          <w:color w:val="1F1F1F"/>
+          <w:sz w:val="22"/>
           <w:u w:val="none"/>
         </w:rPr>
-        <w:t>Enhanced procurement controls, strengthening compliance and audit readiness.</w:t>
+        <w:t>enhanced procurement controls, strengthening audit readiness and compliance.</w:t>
       </w:r>
     </w:p>
     <w:p>
       <w:pPr>
         <w:pStyle w:val="ListBullet"/>
-        <w:spacing w:after="20"/>
+        <w:spacing w:after="40" w:line="276" w:lineRule="auto"/>
         <w:ind w:left="340"/>
       </w:pPr>
       <w:r>
         <w:rPr>
-          <w:rFonts w:ascii="Calibri" w:hAnsi="Calibri" w:cs="Calibri"/>
+          <w:rFonts w:ascii="Calibri" w:hAnsi="Calibri" w:cs="Calibri" w:eastAsia="Calibri"/>
+          <w:b/>
+          <w:i w:val="0"/>
+          <w:color w:val="142C4F"/>
+          <w:sz w:val="22"/>
+          <w:u w:val="none"/>
+        </w:rPr>
+        <w:t xml:space="preserve">Visibility: </w:t>
+      </w:r>
+      <w:r>
+        <w:rPr>
+          <w:rFonts w:ascii="Calibri" w:hAnsi="Calibri" w:cs="Calibri" w:eastAsia="Calibri"/>
           <w:b w:val="0"/>
           <w:i w:val="0"/>
-          <w:color w:val="202020"/>
-          <w:sz w:val="21"/>
+          <w:color w:val="1F1F1F"/>
+          <w:sz w:val="22"/>
           <w:u w:val="none"/>
         </w:rPr>
-        <w:t>Increased supply chain visibility through executive reporting dashboards and performance scorecards.</w:t>
+        <w:t>launched executive dashboards that improved cross-functional collaboration.</w:t>
       </w:r>
     </w:p>
     <w:p>
       <w:pPr>
-        <w:pStyle w:val="ListBullet"/>
-        <w:spacing w:after="20"/>
-        <w:ind w:left="340"/>
-      </w:pPr>
-      <w:r>
-        <w:rPr>
-          <w:rFonts w:ascii="Calibri" w:hAnsi="Calibri" w:cs="Calibri"/>
-          <w:b w:val="0"/>
-          <w:i w:val="0"/>
-          <w:color w:val="202020"/>
-          <w:sz w:val="21"/>
-          <w:u w:val="none"/>
-        </w:rPr>
-        <w:t>Improved collaboration between procurement, planning and operational teams to support business objectives.</w:t>
-      </w:r>
-    </w:p>
-    <w:p>
-      <w:pPr>
         <w:tabs>
           <w:tab w:pos="9638" w:val="right"/>
         </w:tabs>
-        <w:spacing w:before="160" w:after="0"/>
+        <w:spacing w:before="200" w:after="0" w:line="240" w:lineRule="auto"/>
       </w:pPr>
       <w:r>
         <w:rPr>
-          <w:rFonts w:ascii="Calibri" w:hAnsi="Calibri" w:cs="Calibri"/>
+          <w:rFonts w:ascii="Calibri" w:hAnsi="Calibri" w:cs="Calibri" w:eastAsia="Calibri"/>
           <w:b/>
           <w:i w:val="0"/>
-          <w:color w:val="1A365D"/>
-          <w:sz w:val="24"/>
+          <w:color w:val="142C4F"/>
+          <w:sz w:val="25"/>
           <w:u w:val="none"/>
+          <w:caps w:val="1"/>
+          <w:spacing w:val="40"/>
         </w:rPr>
         <w:t>Ecolab</w:t>
       </w:r>
@@ -802,14 +1023,14 @@
       </w:r>
       <w:r>
         <w:rPr>
-          <w:rFonts w:ascii="Calibri" w:hAnsi="Calibri" w:cs="Calibri"/>
+          <w:rFonts w:ascii="Calibri" w:hAnsi="Calibri" w:cs="Calibri" w:eastAsia="Calibri"/>
           <w:b w:val="0"/>
           <w:i/>
           <w:color w:val="555C66"/>
           <w:sz w:val="21"/>
           <w:u w:val="none"/>
         </w:rPr>
-        <w:t>January 2020 – December 2022</w:t>
+        <w:t>Jan 2020 – Dec 2022</w:t>
       </w:r>
     </w:p>
     <w:p>
@@ -817,15 +1038,15 @@
         <w:tabs>
           <w:tab w:pos="9638" w:val="right"/>
         </w:tabs>
-        <w:spacing w:before="0" w:after="40"/>
+        <w:spacing w:before="0" w:after="40" w:line="240" w:lineRule="auto"/>
       </w:pPr>
       <w:r>
         <w:rPr>
-          <w:rFonts w:ascii="Calibri" w:hAnsi="Calibri" w:cs="Calibri"/>
+          <w:rFonts w:ascii="Calibri" w:hAnsi="Calibri" w:cs="Calibri" w:eastAsia="Calibri"/>
           <w:b/>
           <w:i/>
-          <w:color w:val="B7902C"/>
-          <w:sz w:val="22"/>
+          <w:color w:val="B88E2E"/>
+          <w:sz w:val="23"/>
           <w:u w:val="none"/>
         </w:rPr>
         <w:t>Regional Operations &amp; Supply Chain Manager</w:t>
@@ -835,7 +1056,7 @@
       </w:r>
       <w:r>
         <w:rPr>
-          <w:rFonts w:ascii="Calibri" w:hAnsi="Calibri" w:cs="Calibri"/>
+          <w:rFonts w:ascii="Calibri" w:hAnsi="Calibri" w:cs="Calibri" w:eastAsia="Calibri"/>
           <w:b w:val="0"/>
           <w:i w:val="0"/>
           <w:color w:val="555C66"/>
@@ -847,15 +1068,15 @@
     </w:p>
     <w:p>
       <w:pPr>
-        <w:spacing w:before="80" w:after="20"/>
+        <w:spacing w:before="80" w:after="20" w:line="240" w:lineRule="auto"/>
       </w:pPr>
       <w:r>
         <w:rPr>
-          <w:rFonts w:ascii="Calibri" w:hAnsi="Calibri" w:cs="Calibri"/>
+          <w:rFonts w:ascii="Calibri" w:hAnsi="Calibri" w:cs="Calibri" w:eastAsia="Calibri"/>
           <w:b/>
           <w:i w:val="0"/>
-          <w:color w:val="1A365D"/>
-          <w:sz w:val="21"/>
+          <w:color w:val="142C4F"/>
+          <w:sz w:val="22"/>
           <w:u w:val="none"/>
         </w:rPr>
         <w:t>Executive Mandate</w:t>
@@ -863,32 +1084,32 @@
     </w:p>
     <w:p>
       <w:pPr>
-        <w:spacing w:after="80" w:before="0"/>
+        <w:spacing w:after="80" w:before="0" w:line="276" w:lineRule="auto"/>
         <w:jc w:val="both"/>
       </w:pPr>
       <w:r>
         <w:rPr>
-          <w:rFonts w:ascii="Calibri" w:hAnsi="Calibri" w:cs="Calibri"/>
+          <w:rFonts w:ascii="Calibri" w:hAnsi="Calibri" w:cs="Calibri" w:eastAsia="Calibri"/>
           <w:b w:val="0"/>
           <w:i w:val="0"/>
-          <w:color w:val="202020"/>
-          <w:sz w:val="21"/>
+          <w:color w:val="1F1F1F"/>
+          <w:sz w:val="22"/>
           <w:u w:val="none"/>
         </w:rPr>
-        <w:t>Appointed to strengthen regional operational performance, improve service delivery, optimise supply chain execution and ensure sustainable profitability across multiple operational sites.</w:t>
+        <w:t>Turn around regional operational performance, service delivery and profitability across multiple sites.</w:t>
       </w:r>
     </w:p>
     <w:p>
       <w:pPr>
-        <w:spacing w:before="80" w:after="20"/>
+        <w:spacing w:before="80" w:after="20" w:line="240" w:lineRule="auto"/>
       </w:pPr>
       <w:r>
         <w:rPr>
-          <w:rFonts w:ascii="Calibri" w:hAnsi="Calibri" w:cs="Calibri"/>
+          <w:rFonts w:ascii="Calibri" w:hAnsi="Calibri" w:cs="Calibri" w:eastAsia="Calibri"/>
           <w:b/>
           <w:i w:val="0"/>
-          <w:color w:val="1A365D"/>
-          <w:sz w:val="21"/>
+          <w:color w:val="142C4F"/>
+          <w:sz w:val="22"/>
           <w:u w:val="none"/>
         </w:rPr>
         <w:t>Leadership Scope</w:t>
@@ -897,122 +1118,130 @@
     <w:p>
       <w:pPr>
         <w:pStyle w:val="ListBullet"/>
-        <w:spacing w:after="20"/>
+        <w:spacing w:after="40" w:line="276" w:lineRule="auto"/>
         <w:ind w:left="340"/>
       </w:pPr>
       <w:r>
         <w:rPr>
-          <w:rFonts w:ascii="Calibri" w:hAnsi="Calibri" w:cs="Calibri"/>
+          <w:rFonts w:ascii="Calibri" w:hAnsi="Calibri" w:cs="Calibri" w:eastAsia="Calibri"/>
+          <w:b/>
+          <w:i w:val="0"/>
+          <w:color w:val="142C4F"/>
+          <w:sz w:val="22"/>
+          <w:u w:val="none"/>
+        </w:rPr>
+        <w:t xml:space="preserve">P&amp;L: </w:t>
+      </w:r>
+      <w:r>
+        <w:rPr>
+          <w:rFonts w:ascii="Calibri" w:hAnsi="Calibri" w:cs="Calibri" w:eastAsia="Calibri"/>
           <w:b w:val="0"/>
           <w:i w:val="0"/>
-          <w:color w:val="202020"/>
-          <w:sz w:val="21"/>
+          <w:color w:val="1F1F1F"/>
+          <w:sz w:val="22"/>
           <w:u w:val="none"/>
         </w:rPr>
-        <w:t>Regional operational budget exceeding R15 million.</w:t>
+        <w:t>R15M+ operational budget.</w:t>
       </w:r>
     </w:p>
     <w:p>
       <w:pPr>
         <w:pStyle w:val="ListBullet"/>
-        <w:spacing w:after="20"/>
+        <w:spacing w:after="40" w:line="276" w:lineRule="auto"/>
         <w:ind w:left="340"/>
       </w:pPr>
       <w:r>
         <w:rPr>
-          <w:rFonts w:ascii="Calibri" w:hAnsi="Calibri" w:cs="Calibri"/>
+          <w:rFonts w:ascii="Calibri" w:hAnsi="Calibri" w:cs="Calibri" w:eastAsia="Calibri"/>
+          <w:b/>
+          <w:i w:val="0"/>
+          <w:color w:val="142C4F"/>
+          <w:sz w:val="22"/>
+          <w:u w:val="none"/>
+        </w:rPr>
+        <w:t xml:space="preserve">Footprint: </w:t>
+      </w:r>
+      <w:r>
+        <w:rPr>
+          <w:rFonts w:ascii="Calibri" w:hAnsi="Calibri" w:cs="Calibri" w:eastAsia="Calibri"/>
           <w:b w:val="0"/>
           <w:i w:val="0"/>
-          <w:color w:val="202020"/>
-          <w:sz w:val="21"/>
+          <w:color w:val="1F1F1F"/>
+          <w:sz w:val="22"/>
           <w:u w:val="none"/>
         </w:rPr>
-        <w:t>Multi-site warehousing and distribution operations.</w:t>
+        <w:t>multi-site warehousing and distribution operations.</w:t>
       </w:r>
     </w:p>
     <w:p>
       <w:pPr>
         <w:pStyle w:val="ListBullet"/>
-        <w:spacing w:after="20"/>
+        <w:spacing w:after="40" w:line="276" w:lineRule="auto"/>
         <w:ind w:left="340"/>
       </w:pPr>
       <w:r>
         <w:rPr>
-          <w:rFonts w:ascii="Calibri" w:hAnsi="Calibri" w:cs="Calibri"/>
+          <w:rFonts w:ascii="Calibri" w:hAnsi="Calibri" w:cs="Calibri" w:eastAsia="Calibri"/>
+          <w:b/>
+          <w:i w:val="0"/>
+          <w:color w:val="142C4F"/>
+          <w:sz w:val="22"/>
+          <w:u w:val="none"/>
+        </w:rPr>
+        <w:t xml:space="preserve">Functions: </w:t>
+      </w:r>
+      <w:r>
+        <w:rPr>
+          <w:rFonts w:ascii="Calibri" w:hAnsi="Calibri" w:cs="Calibri" w:eastAsia="Calibri"/>
           <w:b w:val="0"/>
           <w:i w:val="0"/>
-          <w:color w:val="202020"/>
-          <w:sz w:val="21"/>
+          <w:color w:val="1F1F1F"/>
+          <w:sz w:val="22"/>
           <w:u w:val="none"/>
         </w:rPr>
-        <w:t>Procurement and inventory management.</w:t>
+        <w:t>procurement, inventory, fleet and customer service.</w:t>
       </w:r>
     </w:p>
     <w:p>
       <w:pPr>
         <w:pStyle w:val="ListBullet"/>
-        <w:spacing w:after="20"/>
+        <w:spacing w:after="40" w:line="276" w:lineRule="auto"/>
         <w:ind w:left="340"/>
       </w:pPr>
       <w:r>
         <w:rPr>
-          <w:rFonts w:ascii="Calibri" w:hAnsi="Calibri" w:cs="Calibri"/>
+          <w:rFonts w:ascii="Calibri" w:hAnsi="Calibri" w:cs="Calibri" w:eastAsia="Calibri"/>
+          <w:b/>
+          <w:i w:val="0"/>
+          <w:color w:val="142C4F"/>
+          <w:sz w:val="22"/>
+          <w:u w:val="none"/>
+        </w:rPr>
+        <w:t xml:space="preserve">Workforce: </w:t>
+      </w:r>
+      <w:r>
+        <w:rPr>
+          <w:rFonts w:ascii="Calibri" w:hAnsi="Calibri" w:cs="Calibri" w:eastAsia="Calibri"/>
           <w:b w:val="0"/>
           <w:i w:val="0"/>
-          <w:color w:val="202020"/>
-          <w:sz w:val="21"/>
+          <w:color w:val="1F1F1F"/>
+          <w:sz w:val="22"/>
           <w:u w:val="none"/>
         </w:rPr>
-        <w:t>Fleet and transport operations.</w:t>
+        <w:t>75 employees across three operational facilities.</w:t>
       </w:r>
     </w:p>
     <w:p>
       <w:pPr>
-        <w:pStyle w:val="ListBullet"/>
-        <w:spacing w:after="20"/>
-        <w:ind w:left="340"/>
+        <w:spacing w:before="80" w:after="20" w:line="240" w:lineRule="auto"/>
       </w:pPr>
       <w:r>
         <w:rPr>
-          <w:rFonts w:ascii="Calibri" w:hAnsi="Calibri" w:cs="Calibri"/>
-          <w:b w:val="0"/>
-          <w:i w:val="0"/>
-          <w:color w:val="202020"/>
-          <w:sz w:val="21"/>
-          <w:u w:val="none"/>
-        </w:rPr>
-        <w:t>Customer service and service delivery.</w:t>
-      </w:r>
-    </w:p>
-    <w:p>
-      <w:pPr>
-        <w:pStyle w:val="ListBullet"/>
-        <w:spacing w:after="20"/>
-        <w:ind w:left="340"/>
-      </w:pPr>
-      <w:r>
-        <w:rPr>
-          <w:rFonts w:ascii="Calibri" w:hAnsi="Calibri" w:cs="Calibri"/>
-          <w:b w:val="0"/>
-          <w:i w:val="0"/>
-          <w:color w:val="202020"/>
-          <w:sz w:val="21"/>
-          <w:u w:val="none"/>
-        </w:rPr>
-        <w:t>Workforce leadership across three operational facilities.</w:t>
-      </w:r>
-    </w:p>
-    <w:p>
-      <w:pPr>
-        <w:spacing w:before="80" w:after="20"/>
-      </w:pPr>
-      <w:r>
-        <w:rPr>
-          <w:rFonts w:ascii="Calibri" w:hAnsi="Calibri" w:cs="Calibri"/>
+          <w:rFonts w:ascii="Calibri" w:hAnsi="Calibri" w:cs="Calibri" w:eastAsia="Calibri"/>
           <w:b/>
           <w:i w:val="0"/>
-          <w:color w:val="1A365D"/>
-          <w:sz w:val="21"/>
+          <w:color w:val="142C4F"/>
+          <w:sz w:val="22"/>
           <w:u w:val="none"/>
         </w:rPr>
         <w:t>Key Contributions</w:t>
@@ -1021,127 +1250,204 @@
     <w:p>
       <w:pPr>
         <w:pStyle w:val="ListBullet"/>
-        <w:spacing w:after="20"/>
+        <w:spacing w:after="40" w:line="276" w:lineRule="auto"/>
         <w:ind w:left="340"/>
       </w:pPr>
       <w:r>
         <w:rPr>
-          <w:rFonts w:ascii="Calibri" w:hAnsi="Calibri" w:cs="Calibri"/>
+          <w:rFonts w:ascii="Calibri" w:hAnsi="Calibri" w:cs="Calibri" w:eastAsia="Calibri"/>
+          <w:b/>
+          <w:i w:val="0"/>
+          <w:color w:val="142C4F"/>
+          <w:sz w:val="22"/>
+          <w:u w:val="none"/>
+        </w:rPr>
+        <w:t xml:space="preserve">Service: </w:t>
+      </w:r>
+      <w:r>
+        <w:rPr>
+          <w:rFonts w:ascii="Calibri" w:hAnsi="Calibri" w:cs="Calibri" w:eastAsia="Calibri"/>
           <w:b w:val="0"/>
           <w:i w:val="0"/>
-          <w:color w:val="202020"/>
-          <w:sz w:val="21"/>
+          <w:color w:val="1F1F1F"/>
+          <w:sz w:val="22"/>
           <w:u w:val="none"/>
         </w:rPr>
-        <w:t>Improved OTIF performance to above 95% through operational process optimisation.</w:t>
+        <w:t>improved OTIF to &gt;95% through process optimisation.</w:t>
       </w:r>
     </w:p>
     <w:p>
       <w:pPr>
         <w:pStyle w:val="ListBullet"/>
-        <w:spacing w:after="20"/>
+        <w:spacing w:after="40" w:line="276" w:lineRule="auto"/>
         <w:ind w:left="340"/>
       </w:pPr>
       <w:r>
         <w:rPr>
-          <w:rFonts w:ascii="Calibri" w:hAnsi="Calibri" w:cs="Calibri"/>
+          <w:rFonts w:ascii="Calibri" w:hAnsi="Calibri" w:cs="Calibri" w:eastAsia="Calibri"/>
+          <w:b/>
+          <w:i w:val="0"/>
+          <w:color w:val="142C4F"/>
+          <w:sz w:val="22"/>
+          <w:u w:val="none"/>
+        </w:rPr>
+        <w:t xml:space="preserve">Cost: </w:t>
+      </w:r>
+      <w:r>
+        <w:rPr>
+          <w:rFonts w:ascii="Calibri" w:hAnsi="Calibri" w:cs="Calibri" w:eastAsia="Calibri"/>
           <w:b w:val="0"/>
           <w:i w:val="0"/>
-          <w:color w:val="202020"/>
-          <w:sz w:val="21"/>
+          <w:color w:val="1F1F1F"/>
+          <w:sz w:val="22"/>
           <w:u w:val="none"/>
         </w:rPr>
-        <w:t>Delivered significant procurement savings through strategic sourcing and supplier negotiations.</w:t>
+        <w:t>delivered double-digit procurement savings via strategic sourcing.</w:t>
       </w:r>
     </w:p>
     <w:p>
       <w:pPr>
         <w:pStyle w:val="ListBullet"/>
-        <w:spacing w:after="20"/>
+        <w:spacing w:after="40" w:line="276" w:lineRule="auto"/>
         <w:ind w:left="340"/>
       </w:pPr>
       <w:r>
         <w:rPr>
-          <w:rFonts w:ascii="Calibri" w:hAnsi="Calibri" w:cs="Calibri"/>
+          <w:rFonts w:ascii="Calibri" w:hAnsi="Calibri" w:cs="Calibri" w:eastAsia="Calibri"/>
+          <w:b/>
+          <w:i w:val="0"/>
+          <w:color w:val="142C4F"/>
+          <w:sz w:val="22"/>
+          <w:u w:val="none"/>
+        </w:rPr>
+        <w:t xml:space="preserve">Lead Time: </w:t>
+      </w:r>
+      <w:r>
+        <w:rPr>
+          <w:rFonts w:ascii="Calibri" w:hAnsi="Calibri" w:cs="Calibri" w:eastAsia="Calibri"/>
           <w:b w:val="0"/>
           <w:i w:val="0"/>
-          <w:color w:val="202020"/>
-          <w:sz w:val="21"/>
+          <w:color w:val="1F1F1F"/>
+          <w:sz w:val="22"/>
           <w:u w:val="none"/>
         </w:rPr>
-        <w:t>Reduced fulfilment lead times through workflow redesign and operational improvements.</w:t>
+        <w:t>reduced fulfilment lead times through workflow redesign.</w:t>
       </w:r>
     </w:p>
     <w:p>
       <w:pPr>
         <w:pStyle w:val="ListBullet"/>
-        <w:spacing w:after="20"/>
+        <w:spacing w:after="40" w:line="276" w:lineRule="auto"/>
         <w:ind w:left="340"/>
       </w:pPr>
       <w:r>
         <w:rPr>
-          <w:rFonts w:ascii="Calibri" w:hAnsi="Calibri" w:cs="Calibri"/>
+          <w:rFonts w:ascii="Calibri" w:hAnsi="Calibri" w:cs="Calibri" w:eastAsia="Calibri"/>
+          <w:b/>
+          <w:i w:val="0"/>
+          <w:color w:val="142C4F"/>
+          <w:sz w:val="22"/>
+          <w:u w:val="none"/>
+        </w:rPr>
+        <w:t xml:space="preserve">Inventory: </w:t>
+      </w:r>
+      <w:r>
+        <w:rPr>
+          <w:rFonts w:ascii="Calibri" w:hAnsi="Calibri" w:cs="Calibri" w:eastAsia="Calibri"/>
           <w:b w:val="0"/>
           <w:i w:val="0"/>
-          <w:color w:val="202020"/>
-          <w:sz w:val="21"/>
+          <w:color w:val="1F1F1F"/>
+          <w:sz w:val="22"/>
           <w:u w:val="none"/>
         </w:rPr>
-        <w:t>Strengthened inventory control disciplines improving stock accuracy and visibility.</w:t>
+        <w:t>strengthened stock accuracy and visibility.</w:t>
       </w:r>
     </w:p>
     <w:p>
       <w:pPr>
         <w:pStyle w:val="ListBullet"/>
-        <w:spacing w:after="20"/>
+        <w:spacing w:after="40" w:line="276" w:lineRule="auto"/>
         <w:ind w:left="340"/>
       </w:pPr>
       <w:r>
         <w:rPr>
-          <w:rFonts w:ascii="Calibri" w:hAnsi="Calibri" w:cs="Calibri"/>
+          <w:rFonts w:ascii="Calibri" w:hAnsi="Calibri" w:cs="Calibri" w:eastAsia="Calibri"/>
+          <w:b/>
+          <w:i w:val="0"/>
+          <w:color w:val="142C4F"/>
+          <w:sz w:val="22"/>
+          <w:u w:val="none"/>
+        </w:rPr>
+        <w:t xml:space="preserve">3PL Management: </w:t>
+      </w:r>
+      <w:r>
+        <w:rPr>
+          <w:rFonts w:ascii="Calibri" w:hAnsi="Calibri" w:cs="Calibri" w:eastAsia="Calibri"/>
           <w:b w:val="0"/>
           <w:i w:val="0"/>
-          <w:color w:val="202020"/>
-          <w:sz w:val="21"/>
+          <w:color w:val="1F1F1F"/>
+          <w:sz w:val="22"/>
           <w:u w:val="none"/>
         </w:rPr>
-        <w:t>Re-engineered logistics and third-party provider performance frameworks.</w:t>
+        <w:t>re-engineered logistics provider performance frameworks.</w:t>
       </w:r>
     </w:p>
     <w:p>
       <w:pPr>
         <w:pStyle w:val="ListBullet"/>
-        <w:spacing w:after="20"/>
+        <w:spacing w:after="40" w:line="276" w:lineRule="auto"/>
         <w:ind w:left="340"/>
       </w:pPr>
       <w:r>
         <w:rPr>
-          <w:rFonts w:ascii="Calibri" w:hAnsi="Calibri" w:cs="Calibri"/>
+          <w:rFonts w:ascii="Calibri" w:hAnsi="Calibri" w:cs="Calibri" w:eastAsia="Calibri"/>
+          <w:b/>
+          <w:i w:val="0"/>
+          <w:color w:val="142C4F"/>
+          <w:sz w:val="22"/>
+          <w:u w:val="none"/>
+        </w:rPr>
+        <w:t xml:space="preserve">Compliance: </w:t>
+      </w:r>
+      <w:r>
+        <w:rPr>
+          <w:rFonts w:ascii="Calibri" w:hAnsi="Calibri" w:cs="Calibri" w:eastAsia="Calibri"/>
           <w:b w:val="0"/>
           <w:i w:val="0"/>
-          <w:color w:val="202020"/>
-          <w:sz w:val="21"/>
+          <w:color w:val="1F1F1F"/>
+          <w:sz w:val="22"/>
           <w:u w:val="none"/>
         </w:rPr>
-        <w:t>Enhanced health, safety and compliance standards across all facilities.</w:t>
+        <w:t>enhanced health, safety and regulatory standards across all sites.</w:t>
       </w:r>
     </w:p>
     <w:p>
       <w:pPr>
         <w:pStyle w:val="ListBullet"/>
-        <w:spacing w:after="20"/>
+        <w:spacing w:after="40" w:line="276" w:lineRule="auto"/>
         <w:ind w:left="340"/>
       </w:pPr>
       <w:r>
         <w:rPr>
-          <w:rFonts w:ascii="Calibri" w:hAnsi="Calibri" w:cs="Calibri"/>
+          <w:rFonts w:ascii="Calibri" w:hAnsi="Calibri" w:cs="Calibri" w:eastAsia="Calibri"/>
+          <w:b/>
+          <w:i w:val="0"/>
+          <w:color w:val="142C4F"/>
+          <w:sz w:val="22"/>
+          <w:u w:val="none"/>
+        </w:rPr>
+        <w:t xml:space="preserve">Governance: </w:t>
+      </w:r>
+      <w:r>
+        <w:rPr>
+          <w:rFonts w:ascii="Calibri" w:hAnsi="Calibri" w:cs="Calibri" w:eastAsia="Calibri"/>
           <w:b w:val="0"/>
           <w:i w:val="0"/>
-          <w:color w:val="202020"/>
-          <w:sz w:val="21"/>
+          <w:color w:val="1F1F1F"/>
+          <w:sz w:val="22"/>
           <w:u w:val="none"/>
         </w:rPr>
-        <w:t>Improved operational governance and performance accountability through KPI management systems.</w:t>
+        <w:t>embedded KPI management systems to drive accountability.</w:t>
       </w:r>
     </w:p>
     <w:p>
@@ -1149,16 +1455,18 @@
         <w:tabs>
           <w:tab w:pos="9638" w:val="right"/>
         </w:tabs>
-        <w:spacing w:before="160" w:after="0"/>
+        <w:spacing w:before="200" w:after="0" w:line="240" w:lineRule="auto"/>
       </w:pPr>
       <w:r>
         <w:rPr>
-          <w:rFonts w:ascii="Calibri" w:hAnsi="Calibri" w:cs="Calibri"/>
+          <w:rFonts w:ascii="Calibri" w:hAnsi="Calibri" w:cs="Calibri" w:eastAsia="Calibri"/>
           <w:b/>
           <w:i w:val="0"/>
-          <w:color w:val="1A365D"/>
-          <w:sz w:val="24"/>
+          <w:color w:val="142C4F"/>
+          <w:sz w:val="25"/>
           <w:u w:val="none"/>
+          <w:caps w:val="1"/>
+          <w:spacing w:val="40"/>
         </w:rPr>
         <w:t>Let Me Do I.T.</w:t>
       </w:r>
@@ -1167,14 +1475,14 @@
       </w:r>
       <w:r>
         <w:rPr>
-          <w:rFonts w:ascii="Calibri" w:hAnsi="Calibri" w:cs="Calibri"/>
+          <w:rFonts w:ascii="Calibri" w:hAnsi="Calibri" w:cs="Calibri" w:eastAsia="Calibri"/>
           <w:b w:val="0"/>
           <w:i/>
           <w:color w:val="555C66"/>
           <w:sz w:val="21"/>
           <w:u w:val="none"/>
         </w:rPr>
-        <w:t>September 2014 – December 2019</w:t>
+        <w:t>Sep 2014 – Dec 2019</w:t>
       </w:r>
     </w:p>
     <w:p>
@@ -1182,25 +1490,25 @@
         <w:tabs>
           <w:tab w:pos="9638" w:val="right"/>
         </w:tabs>
-        <w:spacing w:before="0" w:after="40"/>
+        <w:spacing w:before="0" w:after="40" w:line="240" w:lineRule="auto"/>
       </w:pPr>
       <w:r>
         <w:rPr>
-          <w:rFonts w:ascii="Calibri" w:hAnsi="Calibri" w:cs="Calibri"/>
+          <w:rFonts w:ascii="Calibri" w:hAnsi="Calibri" w:cs="Calibri" w:eastAsia="Calibri"/>
           <w:b/>
           <w:i/>
-          <w:color w:val="B7902C"/>
-          <w:sz w:val="22"/>
+          <w:color w:val="B88E2E"/>
+          <w:sz w:val="23"/>
           <w:u w:val="none"/>
         </w:rPr>
-        <w:t>Operations Director</w:t>
+        <w:t>Chief of Operations</w:t>
       </w:r>
       <w:r>
         <w:tab/>
       </w:r>
       <w:r>
         <w:rPr>
-          <w:rFonts w:ascii="Calibri" w:hAnsi="Calibri" w:cs="Calibri"/>
+          <w:rFonts w:ascii="Calibri" w:hAnsi="Calibri" w:cs="Calibri" w:eastAsia="Calibri"/>
           <w:b w:val="0"/>
           <w:i w:val="0"/>
           <w:color w:val="555C66"/>
@@ -1212,15 +1520,15 @@
     </w:p>
     <w:p>
       <w:pPr>
-        <w:spacing w:before="80" w:after="20"/>
+        <w:spacing w:before="80" w:after="20" w:line="240" w:lineRule="auto"/>
       </w:pPr>
       <w:r>
         <w:rPr>
-          <w:rFonts w:ascii="Calibri" w:hAnsi="Calibri" w:cs="Calibri"/>
+          <w:rFonts w:ascii="Calibri" w:hAnsi="Calibri" w:cs="Calibri" w:eastAsia="Calibri"/>
           <w:b/>
           <w:i w:val="0"/>
-          <w:color w:val="1A365D"/>
-          <w:sz w:val="21"/>
+          <w:color w:val="142C4F"/>
+          <w:sz w:val="22"/>
           <w:u w:val="none"/>
         </w:rPr>
         <w:t>Executive Mandate</w:t>
@@ -1228,32 +1536,32 @@
     </w:p>
     <w:p>
       <w:pPr>
-        <w:spacing w:after="80" w:before="0"/>
+        <w:spacing w:after="80" w:before="0" w:line="276" w:lineRule="auto"/>
         <w:jc w:val="both"/>
       </w:pPr>
       <w:r>
         <w:rPr>
-          <w:rFonts w:ascii="Calibri" w:hAnsi="Calibri" w:cs="Calibri"/>
+          <w:rFonts w:ascii="Calibri" w:hAnsi="Calibri" w:cs="Calibri" w:eastAsia="Calibri"/>
           <w:b w:val="0"/>
           <w:i w:val="0"/>
-          <w:color w:val="202020"/>
-          <w:sz w:val="21"/>
+          <w:color w:val="1F1F1F"/>
+          <w:sz w:val="22"/>
           <w:u w:val="none"/>
         </w:rPr>
-        <w:t>Transform operational performance, improve scalability and implement systems and governance structures capable of supporting sustainable business growth.</w:t>
+        <w:t>Transform operational performance, scalability and governance to support business growth.</w:t>
       </w:r>
     </w:p>
     <w:p>
       <w:pPr>
-        <w:spacing w:before="80" w:after="20"/>
+        <w:spacing w:before="80" w:after="20" w:line="240" w:lineRule="auto"/>
       </w:pPr>
       <w:r>
         <w:rPr>
-          <w:rFonts w:ascii="Calibri" w:hAnsi="Calibri" w:cs="Calibri"/>
+          <w:rFonts w:ascii="Calibri" w:hAnsi="Calibri" w:cs="Calibri" w:eastAsia="Calibri"/>
           <w:b/>
           <w:i w:val="0"/>
-          <w:color w:val="1A365D"/>
-          <w:sz w:val="21"/>
+          <w:color w:val="142C4F"/>
+          <w:sz w:val="22"/>
           <w:u w:val="none"/>
         </w:rPr>
         <w:t>Key Contributions</w:t>
@@ -1262,34 +1570,34 @@
     <w:p>
       <w:pPr>
         <w:pStyle w:val="ListBullet"/>
-        <w:spacing w:after="20"/>
+        <w:spacing w:after="40" w:line="276" w:lineRule="auto"/>
         <w:ind w:left="340"/>
       </w:pPr>
       <w:r>
         <w:rPr>
-          <w:rFonts w:ascii="Calibri" w:hAnsi="Calibri" w:cs="Calibri"/>
+          <w:rFonts w:ascii="Calibri" w:hAnsi="Calibri" w:cs="Calibri" w:eastAsia="Calibri"/>
           <w:b w:val="0"/>
           <w:i w:val="0"/>
-          <w:color w:val="202020"/>
-          <w:sz w:val="21"/>
+          <w:color w:val="1F1F1F"/>
+          <w:sz w:val="22"/>
           <w:u w:val="none"/>
         </w:rPr>
-        <w:t>Led operational transformation initiatives improving efficiency and profitability.</w:t>
+        <w:t>Led operational transformation initiatives, improving efficiency and profitability.</w:t>
       </w:r>
     </w:p>
     <w:p>
       <w:pPr>
         <w:pStyle w:val="ListBullet"/>
-        <w:spacing w:after="20"/>
+        <w:spacing w:after="40" w:line="276" w:lineRule="auto"/>
         <w:ind w:left="340"/>
       </w:pPr>
       <w:r>
         <w:rPr>
-          <w:rFonts w:ascii="Calibri" w:hAnsi="Calibri" w:cs="Calibri"/>
+          <w:rFonts w:ascii="Calibri" w:hAnsi="Calibri" w:cs="Calibri" w:eastAsia="Calibri"/>
           <w:b w:val="0"/>
           <w:i w:val="0"/>
-          <w:color w:val="202020"/>
-          <w:sz w:val="21"/>
+          <w:color w:val="1F1F1F"/>
+          <w:sz w:val="22"/>
           <w:u w:val="none"/>
         </w:rPr>
         <w:t>Implemented ERP-enabled procurement and inventory management frameworks.</w:t>
@@ -1298,16 +1606,16 @@
     <w:p>
       <w:pPr>
         <w:pStyle w:val="ListBullet"/>
-        <w:spacing w:after="20"/>
+        <w:spacing w:after="40" w:line="276" w:lineRule="auto"/>
         <w:ind w:left="340"/>
       </w:pPr>
       <w:r>
         <w:rPr>
-          <w:rFonts w:ascii="Calibri" w:hAnsi="Calibri" w:cs="Calibri"/>
+          <w:rFonts w:ascii="Calibri" w:hAnsi="Calibri" w:cs="Calibri" w:eastAsia="Calibri"/>
           <w:b w:val="0"/>
           <w:i w:val="0"/>
-          <w:color w:val="202020"/>
-          <w:sz w:val="21"/>
+          <w:color w:val="1F1F1F"/>
+          <w:sz w:val="22"/>
           <w:u w:val="none"/>
         </w:rPr>
         <w:t>Negotiated and managed strategic supplier agreements and service contracts.</w:t>
@@ -1316,16 +1624,16 @@
     <w:p>
       <w:pPr>
         <w:pStyle w:val="ListBullet"/>
-        <w:spacing w:after="20"/>
+        <w:spacing w:after="40" w:line="276" w:lineRule="auto"/>
         <w:ind w:left="340"/>
       </w:pPr>
       <w:r>
         <w:rPr>
-          <w:rFonts w:ascii="Calibri" w:hAnsi="Calibri" w:cs="Calibri"/>
+          <w:rFonts w:ascii="Calibri" w:hAnsi="Calibri" w:cs="Calibri" w:eastAsia="Calibri"/>
           <w:b w:val="0"/>
           <w:i w:val="0"/>
-          <w:color w:val="202020"/>
-          <w:sz w:val="21"/>
+          <w:color w:val="1F1F1F"/>
+          <w:sz w:val="22"/>
           <w:u w:val="none"/>
         </w:rPr>
         <w:t>Established performance management systems improving operational visibility and accountability.</w:t>
@@ -1334,16 +1642,16 @@
     <w:p>
       <w:pPr>
         <w:pStyle w:val="ListBullet"/>
-        <w:spacing w:after="20"/>
+        <w:spacing w:after="40" w:line="276" w:lineRule="auto"/>
         <w:ind w:left="340"/>
       </w:pPr>
       <w:r>
         <w:rPr>
-          <w:rFonts w:ascii="Calibri" w:hAnsi="Calibri" w:cs="Calibri"/>
+          <w:rFonts w:ascii="Calibri" w:hAnsi="Calibri" w:cs="Calibri" w:eastAsia="Calibri"/>
           <w:b w:val="0"/>
           <w:i w:val="0"/>
-          <w:color w:val="202020"/>
-          <w:sz w:val="21"/>
+          <w:color w:val="1F1F1F"/>
+          <w:sz w:val="22"/>
           <w:u w:val="none"/>
         </w:rPr>
         <w:t>Reduced operational costs through process redesign and workflow optimisation.</w:t>
@@ -1352,16 +1660,16 @@
     <w:p>
       <w:pPr>
         <w:pStyle w:val="ListBullet"/>
-        <w:spacing w:after="20"/>
+        <w:spacing w:after="40" w:line="276" w:lineRule="auto"/>
         <w:ind w:left="340"/>
       </w:pPr>
       <w:r>
         <w:rPr>
-          <w:rFonts w:ascii="Calibri" w:hAnsi="Calibri" w:cs="Calibri"/>
+          <w:rFonts w:ascii="Calibri" w:hAnsi="Calibri" w:cs="Calibri" w:eastAsia="Calibri"/>
           <w:b w:val="0"/>
           <w:i w:val="0"/>
-          <w:color w:val="202020"/>
-          <w:sz w:val="21"/>
+          <w:color w:val="1F1F1F"/>
+          <w:sz w:val="22"/>
           <w:u w:val="none"/>
         </w:rPr>
         <w:t>Developed management reporting frameworks supporting strategic decision-making.</w:t>
@@ -1370,19 +1678,19 @@
     <w:p>
       <w:pPr>
         <w:pStyle w:val="ListBullet"/>
-        <w:spacing w:after="20"/>
+        <w:spacing w:after="40" w:line="276" w:lineRule="auto"/>
         <w:ind w:left="340"/>
       </w:pPr>
       <w:r>
         <w:rPr>
-          <w:rFonts w:ascii="Calibri" w:hAnsi="Calibri" w:cs="Calibri"/>
+          <w:rFonts w:ascii="Calibri" w:hAnsi="Calibri" w:cs="Calibri" w:eastAsia="Calibri"/>
           <w:b w:val="0"/>
           <w:i w:val="0"/>
-          <w:color w:val="202020"/>
-          <w:sz w:val="21"/>
+          <w:color w:val="1F1F1F"/>
+          <w:sz w:val="22"/>
           <w:u w:val="none"/>
         </w:rPr>
-        <w:t>Built scalable operational structures supporting business expansion.</w:t>
+        <w:t>Built scalable operational structures that supported business expansion.</w:t>
       </w:r>
     </w:p>
     <w:p>
@@ -1390,16 +1698,18 @@
         <w:tabs>
           <w:tab w:pos="9638" w:val="right"/>
         </w:tabs>
-        <w:spacing w:before="160" w:after="0"/>
+        <w:spacing w:before="200" w:after="0" w:line="240" w:lineRule="auto"/>
       </w:pPr>
       <w:r>
         <w:rPr>
-          <w:rFonts w:ascii="Calibri" w:hAnsi="Calibri" w:cs="Calibri"/>
+          <w:rFonts w:ascii="Calibri" w:hAnsi="Calibri" w:cs="Calibri" w:eastAsia="Calibri"/>
           <w:b/>
           <w:i w:val="0"/>
-          <w:color w:val="1A365D"/>
-          <w:sz w:val="24"/>
+          <w:color w:val="142C4F"/>
+          <w:sz w:val="25"/>
           <w:u w:val="none"/>
+          <w:caps w:val="1"/>
+          <w:spacing w:val="40"/>
         </w:rPr>
         <w:t>Unitrans</w:t>
       </w:r>
@@ -1408,14 +1718,14 @@
       </w:r>
       <w:r>
         <w:rPr>
-          <w:rFonts w:ascii="Calibri" w:hAnsi="Calibri" w:cs="Calibri"/>
+          <w:rFonts w:ascii="Calibri" w:hAnsi="Calibri" w:cs="Calibri" w:eastAsia="Calibri"/>
           <w:b w:val="0"/>
           <w:i/>
           <w:color w:val="555C66"/>
           <w:sz w:val="21"/>
           <w:u w:val="none"/>
         </w:rPr>
-        <w:t>January 2010 – August 2014</w:t>
+        <w:t>Jan 2010 – Aug 2014</w:t>
       </w:r>
     </w:p>
     <w:p>
@@ -1423,15 +1733,15 @@
         <w:tabs>
           <w:tab w:pos="9638" w:val="right"/>
         </w:tabs>
-        <w:spacing w:before="0" w:after="40"/>
+        <w:spacing w:before="0" w:after="40" w:line="240" w:lineRule="auto"/>
       </w:pPr>
       <w:r>
         <w:rPr>
-          <w:rFonts w:ascii="Calibri" w:hAnsi="Calibri" w:cs="Calibri"/>
+          <w:rFonts w:ascii="Calibri" w:hAnsi="Calibri" w:cs="Calibri" w:eastAsia="Calibri"/>
           <w:b/>
           <w:i/>
-          <w:color w:val="B7902C"/>
-          <w:sz w:val="22"/>
+          <w:color w:val="B88E2E"/>
+          <w:sz w:val="23"/>
           <w:u w:val="none"/>
         </w:rPr>
         <w:t>Operations &amp; Logistics Manager</w:t>
@@ -1441,7 +1751,7 @@
       </w:r>
       <w:r>
         <w:rPr>
-          <w:rFonts w:ascii="Calibri" w:hAnsi="Calibri" w:cs="Calibri"/>
+          <w:rFonts w:ascii="Calibri" w:hAnsi="Calibri" w:cs="Calibri" w:eastAsia="Calibri"/>
           <w:b w:val="0"/>
           <w:i w:val="0"/>
           <w:color w:val="555C66"/>
@@ -1453,32 +1763,48 @@
     </w:p>
     <w:p>
       <w:pPr>
-        <w:spacing w:after="80" w:before="40"/>
-        <w:jc w:val="both"/>
+        <w:spacing w:before="80" w:after="20" w:line="240" w:lineRule="auto"/>
       </w:pPr>
       <w:r>
         <w:rPr>
-          <w:rFonts w:ascii="Calibri" w:hAnsi="Calibri" w:cs="Calibri"/>
-          <w:b w:val="0"/>
+          <w:rFonts w:ascii="Calibri" w:hAnsi="Calibri" w:cs="Calibri" w:eastAsia="Calibri"/>
+          <w:b/>
           <w:i w:val="0"/>
-          <w:color w:val="202020"/>
-          <w:sz w:val="21"/>
+          <w:color w:val="142C4F"/>
+          <w:sz w:val="22"/>
           <w:u w:val="none"/>
         </w:rPr>
-        <w:t>Managed large-scale multi-site warehouse and transport operations within a high-pressure logistics environment.</w:t>
+        <w:t>Executive Mandate</w:t>
       </w:r>
     </w:p>
     <w:p>
       <w:pPr>
-        <w:spacing w:before="80" w:after="20"/>
+        <w:spacing w:after="80" w:before="0" w:line="276" w:lineRule="auto"/>
+        <w:jc w:val="both"/>
       </w:pPr>
       <w:r>
         <w:rPr>
-          <w:rFonts w:ascii="Calibri" w:hAnsi="Calibri" w:cs="Calibri"/>
+          <w:rFonts w:ascii="Calibri" w:hAnsi="Calibri" w:cs="Calibri" w:eastAsia="Calibri"/>
+          <w:b w:val="0"/>
+          <w:i w:val="0"/>
+          <w:color w:val="1F1F1F"/>
+          <w:sz w:val="22"/>
+          <w:u w:val="none"/>
+        </w:rPr>
+        <w:t>Manage large-scale, multi-site warehouse and transport operations in a high-pressure logistics environment.</w:t>
+      </w:r>
+    </w:p>
+    <w:p>
+      <w:pPr>
+        <w:spacing w:before="80" w:after="20" w:line="240" w:lineRule="auto"/>
+      </w:pPr>
+      <w:r>
+        <w:rPr>
+          <w:rFonts w:ascii="Calibri" w:hAnsi="Calibri" w:cs="Calibri" w:eastAsia="Calibri"/>
           <w:b/>
           <w:i w:val="0"/>
-          <w:color w:val="1A365D"/>
-          <w:sz w:val="21"/>
+          <w:color w:val="142C4F"/>
+          <w:sz w:val="22"/>
           <w:u w:val="none"/>
         </w:rPr>
         <w:t>Key Contributions</w:t>
@@ -1487,145 +1813,233 @@
     <w:p>
       <w:pPr>
         <w:pStyle w:val="ListBullet"/>
-        <w:spacing w:after="20"/>
+        <w:spacing w:after="40" w:line="276" w:lineRule="auto"/>
         <w:ind w:left="340"/>
       </w:pPr>
       <w:r>
         <w:rPr>
-          <w:rFonts w:ascii="Calibri" w:hAnsi="Calibri" w:cs="Calibri"/>
+          <w:rFonts w:ascii="Calibri" w:hAnsi="Calibri" w:cs="Calibri" w:eastAsia="Calibri"/>
+          <w:b/>
+          <w:i w:val="0"/>
+          <w:color w:val="142C4F"/>
+          <w:sz w:val="22"/>
+          <w:u w:val="none"/>
+        </w:rPr>
+        <w:t xml:space="preserve">Team: </w:t>
+      </w:r>
+      <w:r>
+        <w:rPr>
+          <w:rFonts w:ascii="Calibri" w:hAnsi="Calibri" w:cs="Calibri" w:eastAsia="Calibri"/>
           <w:b w:val="0"/>
           <w:i w:val="0"/>
-          <w:color w:val="202020"/>
-          <w:sz w:val="21"/>
+          <w:color w:val="1F1F1F"/>
+          <w:sz w:val="22"/>
           <w:u w:val="none"/>
         </w:rPr>
-        <w:t>Led 120+ staff across warehouse and fleet operations.</w:t>
+        <w:t>led 120+ staff across warehouse and fleet operations.</w:t>
       </w:r>
     </w:p>
     <w:p>
       <w:pPr>
         <w:pStyle w:val="ListBullet"/>
-        <w:spacing w:after="20"/>
+        <w:spacing w:after="40" w:line="276" w:lineRule="auto"/>
         <w:ind w:left="340"/>
       </w:pPr>
       <w:r>
         <w:rPr>
-          <w:rFonts w:ascii="Calibri" w:hAnsi="Calibri" w:cs="Calibri"/>
+          <w:rFonts w:ascii="Calibri" w:hAnsi="Calibri" w:cs="Calibri" w:eastAsia="Calibri"/>
+          <w:b/>
+          <w:i w:val="0"/>
+          <w:color w:val="142C4F"/>
+          <w:sz w:val="22"/>
+          <w:u w:val="none"/>
+        </w:rPr>
+        <w:t xml:space="preserve">Technology: </w:t>
+      </w:r>
+      <w:r>
+        <w:rPr>
+          <w:rFonts w:ascii="Calibri" w:hAnsi="Calibri" w:cs="Calibri" w:eastAsia="Calibri"/>
           <w:b w:val="0"/>
           <w:i w:val="0"/>
-          <w:color w:val="202020"/>
-          <w:sz w:val="21"/>
+          <w:color w:val="1F1F1F"/>
+          <w:sz w:val="22"/>
           <w:u w:val="none"/>
         </w:rPr>
-        <w:t>Governed SAP-supported dispatch and inventory controls using WMS integration, reducing errors by 30%.</w:t>
+        <w:t>governed SAP-supported WMS integration — reduced dispatch errors by 30%.</w:t>
       </w:r>
     </w:p>
     <w:p>
       <w:pPr>
         <w:pStyle w:val="ListBullet"/>
-        <w:spacing w:after="20"/>
+        <w:spacing w:after="40" w:line="276" w:lineRule="auto"/>
         <w:ind w:left="340"/>
       </w:pPr>
       <w:r>
         <w:rPr>
-          <w:rFonts w:ascii="Calibri" w:hAnsi="Calibri" w:cs="Calibri"/>
+          <w:rFonts w:ascii="Calibri" w:hAnsi="Calibri" w:cs="Calibri" w:eastAsia="Calibri"/>
+          <w:b/>
+          <w:i w:val="0"/>
+          <w:color w:val="142C4F"/>
+          <w:sz w:val="22"/>
+          <w:u w:val="none"/>
+        </w:rPr>
+        <w:t xml:space="preserve">Cost: </w:t>
+      </w:r>
+      <w:r>
+        <w:rPr>
+          <w:rFonts w:ascii="Calibri" w:hAnsi="Calibri" w:cs="Calibri" w:eastAsia="Calibri"/>
           <w:b w:val="0"/>
           <w:i w:val="0"/>
-          <w:color w:val="202020"/>
-          <w:sz w:val="21"/>
+          <w:color w:val="1F1F1F"/>
+          <w:sz w:val="22"/>
           <w:u w:val="none"/>
         </w:rPr>
-        <w:t>Renegotiated transport and vendor contracts achieving 10% logistics cost reduction.</w:t>
+        <w:t>renegotiated transport and vendor contracts — achieved 10% logistics cost reduction.</w:t>
       </w:r>
     </w:p>
     <w:p>
       <w:pPr>
         <w:pStyle w:val="ListBullet"/>
-        <w:spacing w:after="20"/>
+        <w:spacing w:after="40" w:line="276" w:lineRule="auto"/>
         <w:ind w:left="340"/>
       </w:pPr>
       <w:r>
         <w:rPr>
-          <w:rFonts w:ascii="Calibri" w:hAnsi="Calibri" w:cs="Calibri"/>
+          <w:rFonts w:ascii="Calibri" w:hAnsi="Calibri" w:cs="Calibri" w:eastAsia="Calibri"/>
+          <w:b/>
+          <w:i w:val="0"/>
+          <w:color w:val="142C4F"/>
+          <w:sz w:val="22"/>
+          <w:u w:val="none"/>
+        </w:rPr>
+        <w:t xml:space="preserve">Productivity: </w:t>
+      </w:r>
+      <w:r>
+        <w:rPr>
+          <w:rFonts w:ascii="Calibri" w:hAnsi="Calibri" w:cs="Calibri" w:eastAsia="Calibri"/>
           <w:b w:val="0"/>
           <w:i w:val="0"/>
-          <w:color w:val="202020"/>
-          <w:sz w:val="21"/>
+          <w:color w:val="1F1F1F"/>
+          <w:sz w:val="22"/>
           <w:u w:val="none"/>
         </w:rPr>
-        <w:t>Developed structured KPI frameworks improving throughput by 18%.</w:t>
+        <w:t>developed structured KPI frameworks — improved throughput by 18%.</w:t>
       </w:r>
     </w:p>
     <w:p>
       <w:pPr>
         <w:pStyle w:val="ListBullet"/>
-        <w:spacing w:after="20"/>
+        <w:spacing w:after="40" w:line="276" w:lineRule="auto"/>
         <w:ind w:left="340"/>
       </w:pPr>
       <w:r>
         <w:rPr>
-          <w:rFonts w:ascii="Calibri" w:hAnsi="Calibri" w:cs="Calibri"/>
+          <w:rFonts w:ascii="Calibri" w:hAnsi="Calibri" w:cs="Calibri" w:eastAsia="Calibri"/>
+          <w:b/>
+          <w:i w:val="0"/>
+          <w:color w:val="142C4F"/>
+          <w:sz w:val="22"/>
+          <w:u w:val="none"/>
+        </w:rPr>
+        <w:t xml:space="preserve">Compliance: </w:t>
+      </w:r>
+      <w:r>
+        <w:rPr>
+          <w:rFonts w:ascii="Calibri" w:hAnsi="Calibri" w:cs="Calibri" w:eastAsia="Calibri"/>
           <w:b w:val="0"/>
           <w:i w:val="0"/>
-          <w:color w:val="202020"/>
-          <w:sz w:val="21"/>
+          <w:color w:val="1F1F1F"/>
+          <w:sz w:val="22"/>
           <w:u w:val="none"/>
         </w:rPr>
-        <w:t>Enforced Occupational Health &amp; Safety Act compliance with zero major audit findings.</w:t>
+        <w:t>enforced OHSA compliance — zero major audit findings.</w:t>
       </w:r>
     </w:p>
     <w:p>
       <w:pPr>
         <w:pStyle w:val="ListBullet"/>
-        <w:spacing w:after="20"/>
+        <w:spacing w:after="40" w:line="276" w:lineRule="auto"/>
         <w:ind w:left="340"/>
       </w:pPr>
       <w:r>
         <w:rPr>
-          <w:rFonts w:ascii="Calibri" w:hAnsi="Calibri" w:cs="Calibri"/>
+          <w:rFonts w:ascii="Calibri" w:hAnsi="Calibri" w:cs="Calibri" w:eastAsia="Calibri"/>
+          <w:b/>
+          <w:i w:val="0"/>
+          <w:color w:val="142C4F"/>
+          <w:sz w:val="22"/>
+          <w:u w:val="none"/>
+        </w:rPr>
+        <w:t xml:space="preserve">Labour: </w:t>
+      </w:r>
+      <w:r>
+        <w:rPr>
+          <w:rFonts w:ascii="Calibri" w:hAnsi="Calibri" w:cs="Calibri" w:eastAsia="Calibri"/>
           <w:b w:val="0"/>
           <w:i w:val="0"/>
-          <w:color w:val="202020"/>
-          <w:sz w:val="21"/>
+          <w:color w:val="1F1F1F"/>
+          <w:sz w:val="22"/>
           <w:u w:val="none"/>
         </w:rPr>
-        <w:t>Chaired disciplinary processes and supported labour compliance alignment.</w:t>
+        <w:t>chaired disciplinary processes and supported labour alignment.</w:t>
       </w:r>
     </w:p>
     <w:p>
       <w:pPr>
         <w:pStyle w:val="ListBullet"/>
-        <w:spacing w:after="20"/>
+        <w:spacing w:after="40" w:line="276" w:lineRule="auto"/>
         <w:ind w:left="340"/>
       </w:pPr>
       <w:r>
         <w:rPr>
-          <w:rFonts w:ascii="Calibri" w:hAnsi="Calibri" w:cs="Calibri"/>
+          <w:rFonts w:ascii="Calibri" w:hAnsi="Calibri" w:cs="Calibri" w:eastAsia="Calibri"/>
+          <w:b/>
+          <w:i w:val="0"/>
+          <w:color w:val="142C4F"/>
+          <w:sz w:val="22"/>
+          <w:u w:val="none"/>
+        </w:rPr>
+        <w:t xml:space="preserve">Service: </w:t>
+      </w:r>
+      <w:r>
+        <w:rPr>
+          <w:rFonts w:ascii="Calibri" w:hAnsi="Calibri" w:cs="Calibri" w:eastAsia="Calibri"/>
           <w:b w:val="0"/>
           <w:i w:val="0"/>
-          <w:color w:val="202020"/>
-          <w:sz w:val="21"/>
+          <w:color w:val="1F1F1F"/>
+          <w:sz w:val="22"/>
           <w:u w:val="none"/>
         </w:rPr>
-        <w:t>Balanced stock across regional nodes to maintain JIT service performance.</w:t>
+        <w:t>balanced stock across regional nodes to maintain JIT performance.</w:t>
       </w:r>
     </w:p>
     <w:p>
       <w:pPr>
         <w:pStyle w:val="ListBullet"/>
-        <w:spacing w:after="20"/>
+        <w:spacing w:after="40" w:line="276" w:lineRule="auto"/>
         <w:ind w:left="340"/>
       </w:pPr>
       <w:r>
         <w:rPr>
-          <w:rFonts w:ascii="Calibri" w:hAnsi="Calibri" w:cs="Calibri"/>
+          <w:rFonts w:ascii="Calibri" w:hAnsi="Calibri" w:cs="Calibri" w:eastAsia="Calibri"/>
+          <w:b/>
+          <w:i w:val="0"/>
+          <w:color w:val="142C4F"/>
+          <w:sz w:val="22"/>
+          <w:u w:val="none"/>
+        </w:rPr>
+        <w:t xml:space="preserve">Agile Operations: </w:t>
+      </w:r>
+      <w:r>
+        <w:rPr>
+          <w:rFonts w:ascii="Calibri" w:hAnsi="Calibri" w:cs="Calibri" w:eastAsia="Calibri"/>
           <w:b w:val="0"/>
           <w:i w:val="0"/>
-          <w:color w:val="202020"/>
-          <w:sz w:val="21"/>
+          <w:color w:val="1F1F1F"/>
+          <w:sz w:val="22"/>
           <w:u w:val="none"/>
         </w:rPr>
-        <w:t>Managed distributed operations across multiple sites using Agile-aligned sprint cadence for continuous operational improvement cycles.</w:t>
+        <w:t>applied Agile sprint cadence for continuous improvement cycles across multiple sites.</w:t>
       </w:r>
     </w:p>
     <w:p>
@@ -1633,16 +2047,18 @@
         <w:tabs>
           <w:tab w:pos="9638" w:val="right"/>
         </w:tabs>
-        <w:spacing w:before="160" w:after="0"/>
+        <w:spacing w:before="200" w:after="0" w:line="240" w:lineRule="auto"/>
       </w:pPr>
       <w:r>
         <w:rPr>
-          <w:rFonts w:ascii="Calibri" w:hAnsi="Calibri" w:cs="Calibri"/>
+          <w:rFonts w:ascii="Calibri" w:hAnsi="Calibri" w:cs="Calibri" w:eastAsia="Calibri"/>
           <w:b/>
           <w:i w:val="0"/>
-          <w:color w:val="1A365D"/>
-          <w:sz w:val="24"/>
+          <w:color w:val="142C4F"/>
+          <w:sz w:val="25"/>
           <w:u w:val="none"/>
+          <w:caps w:val="1"/>
+          <w:spacing w:val="40"/>
         </w:rPr>
         <w:t>Premier Foods</w:t>
       </w:r>
@@ -1651,14 +2067,14 @@
       </w:r>
       <w:r>
         <w:rPr>
-          <w:rFonts w:ascii="Calibri" w:hAnsi="Calibri" w:cs="Calibri"/>
+          <w:rFonts w:ascii="Calibri" w:hAnsi="Calibri" w:cs="Calibri" w:eastAsia="Calibri"/>
           <w:b w:val="0"/>
           <w:i/>
           <w:color w:val="555C66"/>
           <w:sz w:val="21"/>
           <w:u w:val="none"/>
         </w:rPr>
-        <w:t>January 2005 – December 2009</w:t>
+        <w:t>Jan 2005 – Dec 2009</w:t>
       </w:r>
     </w:p>
     <w:p>
@@ -1666,15 +2082,15 @@
         <w:tabs>
           <w:tab w:pos="9638" w:val="right"/>
         </w:tabs>
-        <w:spacing w:before="0" w:after="40"/>
+        <w:spacing w:before="0" w:after="40" w:line="240" w:lineRule="auto"/>
       </w:pPr>
       <w:r>
         <w:rPr>
-          <w:rFonts w:ascii="Calibri" w:hAnsi="Calibri" w:cs="Calibri"/>
+          <w:rFonts w:ascii="Calibri" w:hAnsi="Calibri" w:cs="Calibri" w:eastAsia="Calibri"/>
           <w:b/>
           <w:i/>
-          <w:color w:val="B7902C"/>
-          <w:sz w:val="22"/>
+          <w:color w:val="B88E2E"/>
+          <w:sz w:val="23"/>
           <w:u w:val="none"/>
         </w:rPr>
         <w:t>Warehouse &amp; Logistics Manager</w:t>
@@ -1684,7 +2100,7 @@
       </w:r>
       <w:r>
         <w:rPr>
-          <w:rFonts w:ascii="Calibri" w:hAnsi="Calibri" w:cs="Calibri"/>
+          <w:rFonts w:ascii="Calibri" w:hAnsi="Calibri" w:cs="Calibri" w:eastAsia="Calibri"/>
           <w:b w:val="0"/>
           <w:i w:val="0"/>
           <w:color w:val="555C66"/>
@@ -1696,32 +2112,48 @@
     </w:p>
     <w:p>
       <w:pPr>
-        <w:spacing w:after="80" w:before="40"/>
-        <w:jc w:val="both"/>
+        <w:spacing w:before="80" w:after="20" w:line="240" w:lineRule="auto"/>
       </w:pPr>
       <w:r>
         <w:rPr>
-          <w:rFonts w:ascii="Calibri" w:hAnsi="Calibri" w:cs="Calibri"/>
-          <w:b w:val="0"/>
+          <w:rFonts w:ascii="Calibri" w:hAnsi="Calibri" w:cs="Calibri" w:eastAsia="Calibri"/>
+          <w:b/>
           <w:i w:val="0"/>
-          <w:color w:val="202020"/>
-          <w:sz w:val="21"/>
+          <w:color w:val="142C4F"/>
+          <w:sz w:val="22"/>
           <w:u w:val="none"/>
         </w:rPr>
-        <w:t>Led high-volume national warehousing and distribution operations within a fast-paced FMCG environment.</w:t>
+        <w:t>Executive Mandate</w:t>
       </w:r>
     </w:p>
     <w:p>
       <w:pPr>
-        <w:spacing w:before="80" w:after="20"/>
+        <w:spacing w:after="80" w:before="0" w:line="276" w:lineRule="auto"/>
+        <w:jc w:val="both"/>
       </w:pPr>
       <w:r>
         <w:rPr>
-          <w:rFonts w:ascii="Calibri" w:hAnsi="Calibri" w:cs="Calibri"/>
+          <w:rFonts w:ascii="Calibri" w:hAnsi="Calibri" w:cs="Calibri" w:eastAsia="Calibri"/>
+          <w:b w:val="0"/>
+          <w:i w:val="0"/>
+          <w:color w:val="1F1F1F"/>
+          <w:sz w:val="22"/>
+          <w:u w:val="none"/>
+        </w:rPr>
+        <w:t>Lead high-volume national warehousing and distribution operations in a fast-paced FMCG environment.</w:t>
+      </w:r>
+    </w:p>
+    <w:p>
+      <w:pPr>
+        <w:spacing w:before="80" w:after="20" w:line="240" w:lineRule="auto"/>
+      </w:pPr>
+      <w:r>
+        <w:rPr>
+          <w:rFonts w:ascii="Calibri" w:hAnsi="Calibri" w:cs="Calibri" w:eastAsia="Calibri"/>
           <w:b/>
           <w:i w:val="0"/>
-          <w:color w:val="1A365D"/>
-          <w:sz w:val="21"/>
+          <w:color w:val="142C4F"/>
+          <w:sz w:val="22"/>
           <w:u w:val="none"/>
         </w:rPr>
         <w:t>Key Contributions</w:t>
@@ -1730,144 +2162,194 @@
     <w:p>
       <w:pPr>
         <w:pStyle w:val="ListBullet"/>
-        <w:spacing w:after="20"/>
+        <w:spacing w:after="40" w:line="276" w:lineRule="auto"/>
         <w:ind w:left="340"/>
       </w:pPr>
       <w:r>
         <w:rPr>
-          <w:rFonts w:ascii="Calibri" w:hAnsi="Calibri" w:cs="Calibri"/>
+          <w:rFonts w:ascii="Calibri" w:hAnsi="Calibri" w:cs="Calibri" w:eastAsia="Calibri"/>
+          <w:b/>
+          <w:i w:val="0"/>
+          <w:color w:val="142C4F"/>
+          <w:sz w:val="22"/>
+          <w:u w:val="none"/>
+        </w:rPr>
+        <w:t xml:space="preserve">Scope: </w:t>
+      </w:r>
+      <w:r>
+        <w:rPr>
+          <w:rFonts w:ascii="Calibri" w:hAnsi="Calibri" w:cs="Calibri" w:eastAsia="Calibri"/>
           <w:b w:val="0"/>
           <w:i w:val="0"/>
-          <w:color w:val="202020"/>
-          <w:sz w:val="21"/>
+          <w:color w:val="1F1F1F"/>
+          <w:sz w:val="22"/>
           <w:u w:val="none"/>
         </w:rPr>
-        <w:t>Managed high-volume national distribution operations supporting production and retail supply chains.</w:t>
+        <w:t>managed 24/7 national distribution — receiving, storage, dispatch and transport coordination.</w:t>
       </w:r>
     </w:p>
     <w:p>
       <w:pPr>
         <w:pStyle w:val="ListBullet"/>
-        <w:spacing w:after="20"/>
+        <w:spacing w:after="40" w:line="276" w:lineRule="auto"/>
         <w:ind w:left="340"/>
       </w:pPr>
       <w:r>
         <w:rPr>
-          <w:rFonts w:ascii="Calibri" w:hAnsi="Calibri" w:cs="Calibri"/>
+          <w:rFonts w:ascii="Calibri" w:hAnsi="Calibri" w:cs="Calibri" w:eastAsia="Calibri"/>
+          <w:b/>
+          <w:i w:val="0"/>
+          <w:color w:val="142C4F"/>
+          <w:sz w:val="22"/>
+          <w:u w:val="none"/>
+        </w:rPr>
+        <w:t xml:space="preserve">Inventory: </w:t>
+      </w:r>
+      <w:r>
+        <w:rPr>
+          <w:rFonts w:ascii="Calibri" w:hAnsi="Calibri" w:cs="Calibri" w:eastAsia="Calibri"/>
           <w:b w:val="0"/>
           <w:i w:val="0"/>
-          <w:color w:val="202020"/>
-          <w:sz w:val="21"/>
+          <w:color w:val="1F1F1F"/>
+          <w:sz w:val="22"/>
           <w:u w:val="none"/>
         </w:rPr>
-        <w:t>Directed 24/7 warehouse operations including receiving, storage, dispatch and transport coordination.</w:t>
+        <w:t>implemented ERP-aligned WMS controls — reduced stock loss by 15%.</w:t>
       </w:r>
     </w:p>
     <w:p>
       <w:pPr>
         <w:pStyle w:val="ListBullet"/>
-        <w:spacing w:after="20"/>
+        <w:spacing w:after="40" w:line="276" w:lineRule="auto"/>
         <w:ind w:left="340"/>
       </w:pPr>
       <w:r>
         <w:rPr>
-          <w:rFonts w:ascii="Calibri" w:hAnsi="Calibri" w:cs="Calibri"/>
+          <w:rFonts w:ascii="Calibri" w:hAnsi="Calibri" w:cs="Calibri" w:eastAsia="Calibri"/>
+          <w:b/>
+          <w:i w:val="0"/>
+          <w:color w:val="142C4F"/>
+          <w:sz w:val="22"/>
+          <w:u w:val="none"/>
+        </w:rPr>
+        <w:t xml:space="preserve">Cost: </w:t>
+      </w:r>
+      <w:r>
+        <w:rPr>
+          <w:rFonts w:ascii="Calibri" w:hAnsi="Calibri" w:cs="Calibri" w:eastAsia="Calibri"/>
           <w:b w:val="0"/>
           <w:i w:val="0"/>
-          <w:color w:val="202020"/>
-          <w:sz w:val="21"/>
+          <w:color w:val="1F1F1F"/>
+          <w:sz w:val="22"/>
           <w:u w:val="none"/>
         </w:rPr>
-        <w:t>Implemented ERP-aligned inventory governance and WMS controls reducing stock loss by 15%.</w:t>
+        <w:t>redesigned route planning — cut national logistics costs by 10%.</w:t>
       </w:r>
     </w:p>
     <w:p>
       <w:pPr>
         <w:pStyle w:val="ListBullet"/>
-        <w:spacing w:after="20"/>
+        <w:spacing w:after="40" w:line="276" w:lineRule="auto"/>
         <w:ind w:left="340"/>
       </w:pPr>
       <w:r>
         <w:rPr>
-          <w:rFonts w:ascii="Calibri" w:hAnsi="Calibri" w:cs="Calibri"/>
+          <w:rFonts w:ascii="Calibri" w:hAnsi="Calibri" w:cs="Calibri" w:eastAsia="Calibri"/>
+          <w:b/>
+          <w:i w:val="0"/>
+          <w:color w:val="142C4F"/>
+          <w:sz w:val="22"/>
+          <w:u w:val="none"/>
+        </w:rPr>
+        <w:t xml:space="preserve">Governance: </w:t>
+      </w:r>
+      <w:r>
+        <w:rPr>
+          <w:rFonts w:ascii="Calibri" w:hAnsi="Calibri" w:cs="Calibri" w:eastAsia="Calibri"/>
           <w:b w:val="0"/>
           <w:i w:val="0"/>
-          <w:color w:val="202020"/>
-          <w:sz w:val="21"/>
+          <w:color w:val="1F1F1F"/>
+          <w:sz w:val="22"/>
           <w:u w:val="none"/>
         </w:rPr>
-        <w:t>Redesigned route planning frameworks reducing national logistics costs by 10%.</w:t>
+        <w:t>led daily operational cadence meetings — tracked OTIF, dispatch variances, fleet utilisation and exceptions.</w:t>
       </w:r>
     </w:p>
     <w:p>
       <w:pPr>
         <w:pStyle w:val="ListBullet"/>
-        <w:spacing w:after="20"/>
+        <w:spacing w:after="40" w:line="276" w:lineRule="auto"/>
         <w:ind w:left="340"/>
       </w:pPr>
       <w:r>
         <w:rPr>
-          <w:rFonts w:ascii="Calibri" w:hAnsi="Calibri" w:cs="Calibri"/>
+          <w:rFonts w:ascii="Calibri" w:hAnsi="Calibri" w:cs="Calibri" w:eastAsia="Calibri"/>
+          <w:b/>
+          <w:i w:val="0"/>
+          <w:color w:val="142C4F"/>
+          <w:sz w:val="22"/>
+          <w:u w:val="none"/>
+        </w:rPr>
+        <w:t xml:space="preserve">Safety: </w:t>
+      </w:r>
+      <w:r>
+        <w:rPr>
+          <w:rFonts w:ascii="Calibri" w:hAnsi="Calibri" w:cs="Calibri" w:eastAsia="Calibri"/>
           <w:b w:val="0"/>
           <w:i w:val="0"/>
-          <w:color w:val="202020"/>
-          <w:sz w:val="21"/>
+          <w:color w:val="1F1F1F"/>
+          <w:sz w:val="22"/>
           <w:u w:val="none"/>
         </w:rPr>
-        <w:t>Led structured daily operational cadence meetings reviewing OTIF, dispatch variances, fleet utilisation and exception management.</w:t>
+        <w:t>enforced OHSA compliance — safety audits, risk assessments and incident reporting.</w:t>
       </w:r>
     </w:p>
     <w:p>
       <w:pPr>
         <w:pStyle w:val="ListBullet"/>
-        <w:spacing w:after="20"/>
+        <w:spacing w:after="40" w:line="276" w:lineRule="auto"/>
         <w:ind w:left="340"/>
       </w:pPr>
       <w:r>
         <w:rPr>
-          <w:rFonts w:ascii="Calibri" w:hAnsi="Calibri" w:cs="Calibri"/>
+          <w:rFonts w:ascii="Calibri" w:hAnsi="Calibri" w:cs="Calibri" w:eastAsia="Calibri"/>
+          <w:b/>
+          <w:i w:val="0"/>
+          <w:color w:val="142C4F"/>
+          <w:sz w:val="22"/>
+          <w:u w:val="none"/>
+        </w:rPr>
+        <w:t xml:space="preserve">Labour: </w:t>
+      </w:r>
+      <w:r>
+        <w:rPr>
+          <w:rFonts w:ascii="Calibri" w:hAnsi="Calibri" w:cs="Calibri" w:eastAsia="Calibri"/>
           <w:b w:val="0"/>
           <w:i w:val="0"/>
-          <w:color w:val="202020"/>
-          <w:sz w:val="21"/>
+          <w:color w:val="1F1F1F"/>
+          <w:sz w:val="22"/>
           <w:u w:val="none"/>
         </w:rPr>
-        <w:t>Enforced OHSA compliance including safety audits, risk assessments and incident reporting protocols.</w:t>
+        <w:t>managed union engagement and workforce governance — handled grievances and maintained labour compliance.</w:t>
       </w:r>
     </w:p>
     <w:p>
       <w:pPr>
-        <w:pStyle w:val="ListBullet"/>
-        <w:spacing w:after="20"/>
-        <w:ind w:left="340"/>
-      </w:pPr>
-      <w:r>
-        <w:rPr>
-          <w:rFonts w:ascii="Calibri" w:hAnsi="Calibri" w:cs="Calibri"/>
-          <w:b w:val="0"/>
-          <w:i w:val="0"/>
-          <w:color w:val="202020"/>
-          <w:sz w:val="21"/>
-          <w:u w:val="none"/>
-        </w:rPr>
-        <w:t>Managed union engagement and workforce governance, handling grievances and maintaining labour compliance alignment.</w:t>
-      </w:r>
-    </w:p>
-    <w:p>
-      <w:pPr>
         <w:tabs>
           <w:tab w:pos="9638" w:val="right"/>
         </w:tabs>
-        <w:spacing w:before="160" w:after="0"/>
+        <w:spacing w:before="200" w:after="0" w:line="240" w:lineRule="auto"/>
       </w:pPr>
       <w:r>
         <w:rPr>
-          <w:rFonts w:ascii="Calibri" w:hAnsi="Calibri" w:cs="Calibri"/>
+          <w:rFonts w:ascii="Calibri" w:hAnsi="Calibri" w:cs="Calibri" w:eastAsia="Calibri"/>
           <w:b/>
           <w:i w:val="0"/>
-          <w:color w:val="1A365D"/>
-          <w:sz w:val="24"/>
+          <w:color w:val="142C4F"/>
+          <w:sz w:val="25"/>
           <w:u w:val="none"/>
+          <w:caps w:val="1"/>
+          <w:spacing w:val="40"/>
         </w:rPr>
         <w:t>Wayne's Constructions</w:t>
       </w:r>
@@ -1876,14 +2358,14 @@
       </w:r>
       <w:r>
         <w:rPr>
-          <w:rFonts w:ascii="Calibri" w:hAnsi="Calibri" w:cs="Calibri"/>
+          <w:rFonts w:ascii="Calibri" w:hAnsi="Calibri" w:cs="Calibri" w:eastAsia="Calibri"/>
           <w:b w:val="0"/>
           <w:i/>
           <w:color w:val="555C66"/>
           <w:sz w:val="21"/>
           <w:u w:val="none"/>
         </w:rPr>
-        <w:t>February 2001 – December 2004</w:t>
+        <w:t>Feb 2001 – Dec 2004</w:t>
       </w:r>
     </w:p>
     <w:p>
@@ -1891,15 +2373,15 @@
         <w:tabs>
           <w:tab w:pos="9638" w:val="right"/>
         </w:tabs>
-        <w:spacing w:before="0" w:after="40"/>
+        <w:spacing w:before="0" w:after="40" w:line="240" w:lineRule="auto"/>
       </w:pPr>
       <w:r>
         <w:rPr>
-          <w:rFonts w:ascii="Calibri" w:hAnsi="Calibri" w:cs="Calibri"/>
+          <w:rFonts w:ascii="Calibri" w:hAnsi="Calibri" w:cs="Calibri" w:eastAsia="Calibri"/>
           <w:b/>
           <w:i/>
-          <w:color w:val="B7902C"/>
-          <w:sz w:val="22"/>
+          <w:color w:val="B88E2E"/>
+          <w:sz w:val="23"/>
           <w:u w:val="none"/>
         </w:rPr>
         <w:t>HR &amp; Operations Systems Generalist</w:t>
@@ -1909,7 +2391,7 @@
       </w:r>
       <w:r>
         <w:rPr>
-          <w:rFonts w:ascii="Calibri" w:hAnsi="Calibri" w:cs="Calibri"/>
+          <w:rFonts w:ascii="Calibri" w:hAnsi="Calibri" w:cs="Calibri" w:eastAsia="Calibri"/>
           <w:b w:val="0"/>
           <w:i w:val="0"/>
           <w:color w:val="555C66"/>
@@ -1921,32 +2403,48 @@
     </w:p>
     <w:p>
       <w:pPr>
-        <w:spacing w:after="80" w:before="40"/>
-        <w:jc w:val="both"/>
+        <w:spacing w:before="80" w:after="20" w:line="240" w:lineRule="auto"/>
       </w:pPr>
       <w:r>
         <w:rPr>
-          <w:rFonts w:ascii="Calibri" w:hAnsi="Calibri" w:cs="Calibri"/>
-          <w:b w:val="0"/>
+          <w:rFonts w:ascii="Calibri" w:hAnsi="Calibri" w:cs="Calibri" w:eastAsia="Calibri"/>
+          <w:b/>
           <w:i w:val="0"/>
-          <w:color w:val="202020"/>
-          <w:sz w:val="21"/>
+          <w:color w:val="142C4F"/>
+          <w:sz w:val="22"/>
           <w:u w:val="none"/>
         </w:rPr>
-        <w:t>Provided HR, workforce governance and operational systems support within a labour-intensive environment.</w:t>
+        <w:t>Executive Mandate</w:t>
       </w:r>
     </w:p>
     <w:p>
       <w:pPr>
-        <w:spacing w:before="80" w:after="20"/>
+        <w:spacing w:after="80" w:before="0" w:line="276" w:lineRule="auto"/>
+        <w:jc w:val="both"/>
       </w:pPr>
       <w:r>
         <w:rPr>
-          <w:rFonts w:ascii="Calibri" w:hAnsi="Calibri" w:cs="Calibri"/>
+          <w:rFonts w:ascii="Calibri" w:hAnsi="Calibri" w:cs="Calibri" w:eastAsia="Calibri"/>
+          <w:b w:val="0"/>
+          <w:i w:val="0"/>
+          <w:color w:val="1F1F1F"/>
+          <w:sz w:val="22"/>
+          <w:u w:val="none"/>
+        </w:rPr>
+        <w:t>Provide HR, workforce governance and operational systems support in a labour-intensive environment.</w:t>
+      </w:r>
+    </w:p>
+    <w:p>
+      <w:pPr>
+        <w:spacing w:before="80" w:after="20" w:line="240" w:lineRule="auto"/>
+      </w:pPr>
+      <w:r>
+        <w:rPr>
+          <w:rFonts w:ascii="Calibri" w:hAnsi="Calibri" w:cs="Calibri" w:eastAsia="Calibri"/>
           <w:b/>
           <w:i w:val="0"/>
-          <w:color w:val="1A365D"/>
-          <w:sz w:val="21"/>
+          <w:color w:val="142C4F"/>
+          <w:sz w:val="22"/>
           <w:u w:val="none"/>
         </w:rPr>
         <w:t>Key Contributions</w:t>
@@ -1955,176 +2453,224 @@
     <w:p>
       <w:pPr>
         <w:pStyle w:val="ListBullet"/>
-        <w:spacing w:after="20"/>
+        <w:spacing w:after="40" w:line="276" w:lineRule="auto"/>
         <w:ind w:left="340"/>
       </w:pPr>
       <w:r>
         <w:rPr>
-          <w:rFonts w:ascii="Calibri" w:hAnsi="Calibri" w:cs="Calibri"/>
+          <w:rFonts w:ascii="Calibri" w:hAnsi="Calibri" w:cs="Calibri" w:eastAsia="Calibri"/>
+          <w:b/>
+          <w:i w:val="0"/>
+          <w:color w:val="142C4F"/>
+          <w:sz w:val="22"/>
+          <w:u w:val="none"/>
+        </w:rPr>
+        <w:t xml:space="preserve">HR Operations: </w:t>
+      </w:r>
+      <w:r>
+        <w:rPr>
+          <w:rFonts w:ascii="Calibri" w:hAnsi="Calibri" w:cs="Calibri" w:eastAsia="Calibri"/>
           <w:b w:val="0"/>
           <w:i w:val="0"/>
-          <w:color w:val="202020"/>
-          <w:sz w:val="21"/>
+          <w:color w:val="1F1F1F"/>
+          <w:sz w:val="22"/>
           <w:u w:val="none"/>
         </w:rPr>
-        <w:t>Managed end-to-end HR operations including recruitment, workforce planning and labour compliance.</w:t>
+        <w:t>end-to-end recruitment, workforce planning and labour compliance.</w:t>
       </w:r>
     </w:p>
     <w:p>
       <w:pPr>
         <w:pStyle w:val="ListBullet"/>
-        <w:spacing w:after="20"/>
+        <w:spacing w:after="40" w:line="276" w:lineRule="auto"/>
         <w:ind w:left="340"/>
       </w:pPr>
       <w:r>
         <w:rPr>
-          <w:rFonts w:ascii="Calibri" w:hAnsi="Calibri" w:cs="Calibri"/>
+          <w:rFonts w:ascii="Calibri" w:hAnsi="Calibri" w:cs="Calibri" w:eastAsia="Calibri"/>
+          <w:b/>
+          <w:i w:val="0"/>
+          <w:color w:val="142C4F"/>
+          <w:sz w:val="22"/>
+          <w:u w:val="none"/>
+        </w:rPr>
+        <w:t xml:space="preserve">Digitisation: </w:t>
+      </w:r>
+      <w:r>
+        <w:rPr>
+          <w:rFonts w:ascii="Calibri" w:hAnsi="Calibri" w:cs="Calibri" w:eastAsia="Calibri"/>
           <w:b w:val="0"/>
           <w:i w:val="0"/>
-          <w:color w:val="202020"/>
-          <w:sz w:val="21"/>
+          <w:color w:val="1F1F1F"/>
+          <w:sz w:val="22"/>
           <w:u w:val="none"/>
         </w:rPr>
-        <w:t>Implemented early-stage HRIS and Workday-aligned HR system processes; digitised employee records to improve administrative control and reporting accuracy.</w:t>
+        <w:t>implemented early HRIS / Workday-aligned processes — digitised employee records, improving control and reporting accuracy.</w:t>
       </w:r>
     </w:p>
     <w:p>
       <w:pPr>
         <w:pStyle w:val="ListBullet"/>
-        <w:spacing w:after="20"/>
+        <w:spacing w:after="40" w:line="276" w:lineRule="auto"/>
         <w:ind w:left="340"/>
       </w:pPr>
       <w:r>
         <w:rPr>
-          <w:rFonts w:ascii="Calibri" w:hAnsi="Calibri" w:cs="Calibri"/>
+          <w:rFonts w:ascii="Calibri" w:hAnsi="Calibri" w:cs="Calibri" w:eastAsia="Calibri"/>
+          <w:b/>
+          <w:i w:val="0"/>
+          <w:color w:val="142C4F"/>
+          <w:sz w:val="22"/>
+          <w:u w:val="none"/>
+        </w:rPr>
+        <w:t xml:space="preserve">Efficiency: </w:t>
+      </w:r>
+      <w:r>
+        <w:rPr>
+          <w:rFonts w:ascii="Calibri" w:hAnsi="Calibri" w:cs="Calibri" w:eastAsia="Calibri"/>
           <w:b w:val="0"/>
           <w:i w:val="0"/>
-          <w:color w:val="202020"/>
-          <w:sz w:val="21"/>
+          <w:color w:val="1F1F1F"/>
+          <w:sz w:val="22"/>
           <w:u w:val="none"/>
         </w:rPr>
-        <w:t>Reduced hiring lead times by 30% through structured recruitment and onboarding processes.</w:t>
+        <w:t>reduced hiring lead times by 30% via structured recruitment and onboarding.</w:t>
       </w:r>
     </w:p>
     <w:p>
       <w:pPr>
         <w:pStyle w:val="ListBullet"/>
-        <w:spacing w:after="20"/>
+        <w:spacing w:after="40" w:line="276" w:lineRule="auto"/>
         <w:ind w:left="340"/>
       </w:pPr>
       <w:r>
         <w:rPr>
-          <w:rFonts w:ascii="Calibri" w:hAnsi="Calibri" w:cs="Calibri"/>
+          <w:rFonts w:ascii="Calibri" w:hAnsi="Calibri" w:cs="Calibri" w:eastAsia="Calibri"/>
+          <w:b/>
+          <w:i w:val="0"/>
+          <w:color w:val="142C4F"/>
+          <w:sz w:val="22"/>
+          <w:u w:val="none"/>
+        </w:rPr>
+        <w:t xml:space="preserve">Retention: </w:t>
+      </w:r>
+      <w:r>
+        <w:rPr>
+          <w:rFonts w:ascii="Calibri" w:hAnsi="Calibri" w:cs="Calibri" w:eastAsia="Calibri"/>
           <w:b w:val="0"/>
           <w:i w:val="0"/>
-          <w:color w:val="202020"/>
-          <w:sz w:val="21"/>
+          <w:color w:val="1F1F1F"/>
+          <w:sz w:val="22"/>
           <w:u w:val="none"/>
         </w:rPr>
-        <w:t>Improved employee retention by 15% through structured engagement and performance alignment initiatives.</w:t>
+        <w:t>improved employee retention by 15% through structured engagement and performance alignment.</w:t>
       </w:r>
     </w:p>
     <w:p>
       <w:pPr>
         <w:pStyle w:val="ListBullet"/>
-        <w:spacing w:after="20"/>
+        <w:spacing w:after="40" w:line="276" w:lineRule="auto"/>
         <w:ind w:left="340"/>
       </w:pPr>
       <w:r>
         <w:rPr>
-          <w:rFonts w:ascii="Calibri" w:hAnsi="Calibri" w:cs="Calibri"/>
+          <w:rFonts w:ascii="Calibri" w:hAnsi="Calibri" w:cs="Calibri" w:eastAsia="Calibri"/>
+          <w:b/>
+          <w:i w:val="0"/>
+          <w:color w:val="142C4F"/>
+          <w:sz w:val="22"/>
+          <w:u w:val="none"/>
+        </w:rPr>
+        <w:t xml:space="preserve">Safety &amp; Training: </w:t>
+      </w:r>
+      <w:r>
+        <w:rPr>
+          <w:rFonts w:ascii="Calibri" w:hAnsi="Calibri" w:cs="Calibri" w:eastAsia="Calibri"/>
           <w:b w:val="0"/>
           <w:i w:val="0"/>
-          <w:color w:val="202020"/>
-          <w:sz w:val="21"/>
+          <w:color w:val="1F1F1F"/>
+          <w:sz w:val="22"/>
           <w:u w:val="none"/>
         </w:rPr>
-        <w:t>Delivered health, safety and cross-training programmes aligned to regulatory and operational standards.</w:t>
+        <w:t>delivered OHSA compliance — risk assessments, safety audits and incident investigation frameworks.</w:t>
       </w:r>
     </w:p>
     <w:p>
       <w:pPr>
         <w:pStyle w:val="ListBullet"/>
-        <w:spacing w:after="20"/>
+        <w:spacing w:after="40" w:line="276" w:lineRule="auto"/>
         <w:ind w:left="340"/>
       </w:pPr>
       <w:r>
         <w:rPr>
-          <w:rFonts w:ascii="Calibri" w:hAnsi="Calibri" w:cs="Calibri"/>
+          <w:rFonts w:ascii="Calibri" w:hAnsi="Calibri" w:cs="Calibri" w:eastAsia="Calibri"/>
+          <w:b/>
+          <w:i w:val="0"/>
+          <w:color w:val="142C4F"/>
+          <w:sz w:val="22"/>
+          <w:u w:val="none"/>
+        </w:rPr>
+        <w:t xml:space="preserve">Cross-Functional Governance: </w:t>
+      </w:r>
+      <w:r>
+        <w:rPr>
+          <w:rFonts w:ascii="Calibri" w:hAnsi="Calibri" w:cs="Calibri" w:eastAsia="Calibri"/>
           <w:b w:val="0"/>
           <w:i w:val="0"/>
-          <w:color w:val="202020"/>
-          <w:sz w:val="21"/>
+          <w:color w:val="1F1F1F"/>
+          <w:sz w:val="22"/>
           <w:u w:val="none"/>
         </w:rPr>
-        <w:t>Supported cross-functional operational systems governance across payroll, procurement and project controls.</w:t>
+        <w:t>supported payroll, procurement and project controls.</w:t>
       </w:r>
     </w:p>
     <w:p>
       <w:pPr>
-        <w:pStyle w:val="ListBullet"/>
-        <w:spacing w:after="20"/>
-        <w:ind w:left="340"/>
+        <w:spacing w:before="200" w:after="20" w:line="240" w:lineRule="auto"/>
       </w:pPr>
       <w:r>
         <w:rPr>
-          <w:rFonts w:ascii="Calibri" w:hAnsi="Calibri" w:cs="Calibri"/>
-          <w:b w:val="0"/>
+          <w:rFonts w:ascii="Calibri" w:hAnsi="Calibri" w:cs="Calibri" w:eastAsia="Calibri"/>
+          <w:b/>
           <w:i w:val="0"/>
-          <w:color w:val="202020"/>
-          <w:sz w:val="21"/>
+          <w:color w:val="142C4F"/>
+          <w:sz w:val="22"/>
           <w:u w:val="none"/>
         </w:rPr>
-        <w:t>Enforced Occupational Health &amp; Safety Act compliance through formalised risk assessments, safety audits and incident investigation frameworks.</w:t>
+        <w:t>Industrial Relations &amp; Workforce Governance — Cross-Role Expertise</w:t>
       </w:r>
     </w:p>
     <w:p>
       <w:pPr>
-        <w:spacing w:before="80" w:after="20"/>
+        <w:pStyle w:val="ListBullet"/>
+        <w:spacing w:after="40" w:line="276" w:lineRule="auto"/>
+        <w:ind w:left="340"/>
       </w:pPr>
       <w:r>
         <w:rPr>
-          <w:rFonts w:ascii="Calibri" w:hAnsi="Calibri" w:cs="Calibri"/>
-          <w:b/>
+          <w:rFonts w:ascii="Calibri" w:hAnsi="Calibri" w:cs="Calibri" w:eastAsia="Calibri"/>
+          <w:b w:val="0"/>
           <w:i w:val="0"/>
-          <w:color w:val="1A365D"/>
-          <w:sz w:val="21"/>
+          <w:color w:val="1F1F1F"/>
+          <w:sz w:val="22"/>
           <w:u w:val="none"/>
         </w:rPr>
-        <w:t>Industrial Relations &amp; Workforce Governance</w:t>
+        <w:t>Led union negotiations and grievance handling processes across multiple operational environments.</w:t>
       </w:r>
     </w:p>
     <w:p>
       <w:pPr>
         <w:pStyle w:val="ListBullet"/>
-        <w:spacing w:after="20"/>
+        <w:spacing w:after="40" w:line="276" w:lineRule="auto"/>
         <w:ind w:left="340"/>
       </w:pPr>
       <w:r>
         <w:rPr>
-          <w:rFonts w:ascii="Calibri" w:hAnsi="Calibri" w:cs="Calibri"/>
+          <w:rFonts w:ascii="Calibri" w:hAnsi="Calibri" w:cs="Calibri" w:eastAsia="Calibri"/>
           <w:b w:val="0"/>
           <w:i w:val="0"/>
-          <w:color w:val="202020"/>
-          <w:sz w:val="21"/>
-          <w:u w:val="none"/>
-        </w:rPr>
-        <w:t>Led union negotiations and grievance handling processes.</w:t>
-      </w:r>
-    </w:p>
-    <w:p>
-      <w:pPr>
-        <w:pStyle w:val="ListBullet"/>
-        <w:spacing w:after="20"/>
-        <w:ind w:left="340"/>
-      </w:pPr>
-      <w:r>
-        <w:rPr>
-          <w:rFonts w:ascii="Calibri" w:hAnsi="Calibri" w:cs="Calibri"/>
-          <w:b w:val="0"/>
-          <w:i w:val="0"/>
-          <w:color w:val="202020"/>
-          <w:sz w:val="21"/>
+          <w:color w:val="1F1F1F"/>
+          <w:sz w:val="22"/>
           <w:u w:val="none"/>
         </w:rPr>
         <w:t>Chaired disciplinary forums aligned with the Labour Relations Act.</w:t>
@@ -2133,16 +2679,16 @@
     <w:p>
       <w:pPr>
         <w:pStyle w:val="ListBullet"/>
-        <w:spacing w:after="20"/>
+        <w:spacing w:after="40" w:line="276" w:lineRule="auto"/>
         <w:ind w:left="340"/>
       </w:pPr>
       <w:r>
         <w:rPr>
-          <w:rFonts w:ascii="Calibri" w:hAnsi="Calibri" w:cs="Calibri"/>
+          <w:rFonts w:ascii="Calibri" w:hAnsi="Calibri" w:cs="Calibri" w:eastAsia="Calibri"/>
           <w:b w:val="0"/>
           <w:i w:val="0"/>
-          <w:color w:val="202020"/>
-          <w:sz w:val="21"/>
+          <w:color w:val="1F1F1F"/>
+          <w:sz w:val="22"/>
           <w:u w:val="none"/>
         </w:rPr>
         <w:t>Directed workforce planning and productivity modelling across distribution nodes.</w:t>
@@ -2150,471 +2696,193 @@
     </w:p>
     <w:p>
       <w:pPr>
-        <w:spacing w:before="80" w:after="20"/>
+        <w:pStyle w:val="ListBullet"/>
+        <w:spacing w:after="40" w:line="276" w:lineRule="auto"/>
+        <w:ind w:left="340"/>
       </w:pPr>
       <w:r>
         <w:rPr>
-          <w:rFonts w:ascii="Calibri" w:hAnsi="Calibri" w:cs="Calibri"/>
-          <w:b/>
+          <w:rFonts w:ascii="Calibri" w:hAnsi="Calibri" w:cs="Calibri" w:eastAsia="Calibri"/>
+          <w:b w:val="0"/>
           <w:i w:val="0"/>
-          <w:color w:val="1A365D"/>
-          <w:sz w:val="21"/>
+          <w:color w:val="1F1F1F"/>
+          <w:sz w:val="22"/>
           <w:u w:val="none"/>
         </w:rPr>
-        <w:t>OHSA Compliance</w:t>
+        <w:t>Enforced OHSA compliance through formal risk assessments, safety audits and incident investigations — zero major audit findings across roles.</w:t>
       </w:r>
     </w:p>
     <w:p>
       <w:pPr>
-        <w:pStyle w:val="ListBullet"/>
-        <w:spacing w:after="20"/>
-        <w:ind w:left="340"/>
+        <w:spacing w:before="240" w:after="40" w:line="240" w:lineRule="auto"/>
+        <w:pBdr>
+          <w:bottom w:val="single" w:sz="10" w:space="2" w:color="B88E2E"/>
+        </w:pBdr>
       </w:pPr>
       <w:r>
         <w:rPr>
-          <w:rFonts w:ascii="Calibri" w:hAnsi="Calibri" w:cs="Calibri"/>
-          <w:b w:val="0"/>
+          <w:rFonts w:ascii="Calibri" w:hAnsi="Calibri" w:cs="Calibri" w:eastAsia="Calibri"/>
+          <w:b/>
           <w:i w:val="0"/>
-          <w:color w:val="202020"/>
-          <w:sz w:val="21"/>
+          <w:color w:val="142C4F"/>
+          <w:sz w:val="25"/>
           <w:u w:val="none"/>
+          <w:caps w:val="1"/>
+          <w:spacing w:val="80"/>
         </w:rPr>
-        <w:t>Enforced Occupational Health &amp; Safety Act adherence through formal risk assessments, safety audits, incident investigations and executive compliance reporting.</w:t>
+        <w:t>Enterprise Achievements — Roll-up of Metrics</w:t>
       </w:r>
     </w:p>
     <w:p>
       <w:pPr>
-        <w:pStyle w:val="ListBullet"/>
-        <w:spacing w:after="20"/>
-        <w:ind w:left="340"/>
+        <w:spacing w:before="0" w:after="40" w:line="240" w:lineRule="auto"/>
+      </w:pPr>
+    </w:p>
+    <w:p>
+      <w:pPr>
+        <w:spacing w:before="40" w:after="60" w:line="288" w:lineRule="auto"/>
       </w:pPr>
       <w:r>
         <w:rPr>
-          <w:rFonts w:ascii="Calibri" w:hAnsi="Calibri" w:cs="Calibri"/>
+          <w:rFonts w:ascii="Calibri" w:hAnsi="Calibri" w:cs="Calibri" w:eastAsia="Calibri"/>
+          <w:b/>
+          <w:i w:val="0"/>
+          <w:color w:val="142C4F"/>
+          <w:sz w:val="22"/>
+          <w:u w:val="none"/>
+        </w:rPr>
+        <w:t xml:space="preserve">Financial Performance — </w:t>
+      </w:r>
+      <w:r>
+        <w:rPr>
+          <w:rFonts w:ascii="Calibri" w:hAnsi="Calibri" w:cs="Calibri" w:eastAsia="Calibri"/>
           <w:b w:val="0"/>
           <w:i w:val="0"/>
-          <w:color w:val="202020"/>
-          <w:sz w:val="21"/>
+          <w:color w:val="1F1F1F"/>
+          <w:sz w:val="22"/>
           <w:u w:val="none"/>
         </w:rPr>
-        <w:t>Achieved zero major audit findings.</w:t>
+        <w:t>Managed budgets exceeding R25M; delivered recurring procurement savings; reduced OPEX via process optimisation; improved inventory efficiency and working capital.</w:t>
       </w:r>
     </w:p>
     <w:p>
       <w:pPr>
-        <w:spacing w:before="200" w:after="20"/>
-        <w:pBdr>
-          <w:bottom w:val="single" w:sz="8" w:space="2" w:color="B7902C"/>
-        </w:pBdr>
+        <w:spacing w:before="40" w:after="60" w:line="288" w:lineRule="auto"/>
       </w:pPr>
       <w:r>
         <w:rPr>
-          <w:rFonts w:ascii="Calibri" w:hAnsi="Calibri" w:cs="Calibri"/>
+          <w:rFonts w:ascii="Calibri" w:hAnsi="Calibri" w:cs="Calibri" w:eastAsia="Calibri"/>
           <w:b/>
           <w:i w:val="0"/>
-          <w:color w:val="1A365D"/>
-          <w:sz w:val="24"/>
+          <w:color w:val="142C4F"/>
+          <w:sz w:val="22"/>
           <w:u w:val="none"/>
-          <w:caps w:val="1"/>
-          <w:spacing w:val="60"/>
         </w:rPr>
-        <w:t>Enterprise Achievements</w:t>
+        <w:t xml:space="preserve">Operational Excellence — </w:t>
+      </w:r>
+      <w:r>
+        <w:rPr>
+          <w:rFonts w:ascii="Calibri" w:hAnsi="Calibri" w:cs="Calibri" w:eastAsia="Calibri"/>
+          <w:b w:val="0"/>
+          <w:i w:val="0"/>
+          <w:color w:val="1F1F1F"/>
+          <w:sz w:val="22"/>
+          <w:u w:val="none"/>
+        </w:rPr>
+        <w:t>Achieved &gt;95% OTIF; improved inventory accuracy; reduced logistics lead times; optimised multi-site warehouse and distribution operations.</w:t>
       </w:r>
     </w:p>
     <w:p>
       <w:pPr>
-        <w:spacing w:before="0" w:after="40"/>
-      </w:pPr>
-    </w:p>
-    <w:p>
-      <w:pPr>
-        <w:spacing w:before="80" w:after="20"/>
+        <w:spacing w:before="40" w:after="60" w:line="288" w:lineRule="auto"/>
       </w:pPr>
       <w:r>
         <w:rPr>
-          <w:rFonts w:ascii="Calibri" w:hAnsi="Calibri" w:cs="Calibri"/>
+          <w:rFonts w:ascii="Calibri" w:hAnsi="Calibri" w:cs="Calibri" w:eastAsia="Calibri"/>
           <w:b/>
           <w:i w:val="0"/>
-          <w:color w:val="1A365D"/>
-          <w:sz w:val="21"/>
+          <w:color w:val="142C4F"/>
+          <w:sz w:val="22"/>
           <w:u w:val="none"/>
         </w:rPr>
-        <w:t>Financial Performance</w:t>
+        <w:t xml:space="preserve">Leadership &amp; Governance — </w:t>
+      </w:r>
+      <w:r>
+        <w:rPr>
+          <w:rFonts w:ascii="Calibri" w:hAnsi="Calibri" w:cs="Calibri" w:eastAsia="Calibri"/>
+          <w:b w:val="0"/>
+          <w:i w:val="0"/>
+          <w:color w:val="1F1F1F"/>
+          <w:sz w:val="22"/>
+          <w:u w:val="none"/>
+        </w:rPr>
+        <w:t>Led teams of 120+; managed unionised workforces; implemented audit-ready governance frameworks; built KPI-driven accountability cultures.</w:t>
       </w:r>
     </w:p>
     <w:p>
       <w:pPr>
-        <w:pStyle w:val="ListBullet"/>
-        <w:spacing w:after="20"/>
-        <w:ind w:left="340"/>
+        <w:spacing w:before="40" w:after="60" w:line="288" w:lineRule="auto"/>
       </w:pPr>
       <w:r>
         <w:rPr>
-          <w:rFonts w:ascii="Calibri" w:hAnsi="Calibri" w:cs="Calibri"/>
+          <w:rFonts w:ascii="Calibri" w:hAnsi="Calibri" w:cs="Calibri" w:eastAsia="Calibri"/>
+          <w:b/>
+          <w:i w:val="0"/>
+          <w:color w:val="142C4F"/>
+          <w:sz w:val="22"/>
+          <w:u w:val="none"/>
+        </w:rPr>
+        <w:t xml:space="preserve">Strategic Transformation — </w:t>
+      </w:r>
+      <w:r>
+        <w:rPr>
+          <w:rFonts w:ascii="Calibri" w:hAnsi="Calibri" w:cs="Calibri" w:eastAsia="Calibri"/>
           <w:b w:val="0"/>
           <w:i w:val="0"/>
-          <w:color w:val="202020"/>
-          <w:sz w:val="21"/>
+          <w:color w:val="1F1F1F"/>
+          <w:sz w:val="22"/>
           <w:u w:val="none"/>
         </w:rPr>
-        <w:t>Managed operational budgets exceeding R15 million.</w:t>
+        <w:t>Led enterprise improvement programmes; deployed ERP-enabled processes; improved executive visibility via performance reporting; strengthened supplier and operational resilience.</w:t>
       </w:r>
     </w:p>
     <w:p>
       <w:pPr>
-        <w:pStyle w:val="ListBullet"/>
-        <w:spacing w:after="20"/>
-        <w:ind w:left="340"/>
+        <w:spacing w:before="240" w:after="40" w:line="240" w:lineRule="auto"/>
+        <w:pBdr>
+          <w:bottom w:val="single" w:sz="10" w:space="2" w:color="B88E2E"/>
+        </w:pBdr>
       </w:pPr>
       <w:r>
         <w:rPr>
-          <w:rFonts w:ascii="Calibri" w:hAnsi="Calibri" w:cs="Calibri"/>
-          <w:b w:val="0"/>
-          <w:i w:val="0"/>
-          <w:color w:val="202020"/>
-          <w:sz w:val="21"/>
-          <w:u w:val="none"/>
-        </w:rPr>
-        <w:t>Delivered recurring procurement savings through strategic sourcing and supplier negotiations.</w:t>
-      </w:r>
-    </w:p>
-    <w:p>
-      <w:pPr>
-        <w:pStyle w:val="ListBullet"/>
-        <w:spacing w:after="20"/>
-        <w:ind w:left="340"/>
-      </w:pPr>
-      <w:r>
-        <w:rPr>
-          <w:rFonts w:ascii="Calibri" w:hAnsi="Calibri" w:cs="Calibri"/>
-          <w:b w:val="0"/>
-          <w:i w:val="0"/>
-          <w:color w:val="202020"/>
-          <w:sz w:val="21"/>
-          <w:u w:val="none"/>
-        </w:rPr>
-        <w:t>Reduced operational expenditure through process optimisation and improved supplier management.</w:t>
-      </w:r>
-    </w:p>
-    <w:p>
-      <w:pPr>
-        <w:pStyle w:val="ListBullet"/>
-        <w:spacing w:after="20"/>
-        <w:ind w:left="340"/>
-      </w:pPr>
-      <w:r>
-        <w:rPr>
-          <w:rFonts w:ascii="Calibri" w:hAnsi="Calibri" w:cs="Calibri"/>
-          <w:b w:val="0"/>
-          <w:i w:val="0"/>
-          <w:color w:val="202020"/>
-          <w:sz w:val="21"/>
-          <w:u w:val="none"/>
-        </w:rPr>
-        <w:t>Improved inventory efficiency and working capital utilisation.</w:t>
-      </w:r>
-    </w:p>
-    <w:p>
-      <w:pPr>
-        <w:spacing w:before="80" w:after="20"/>
-      </w:pPr>
-      <w:r>
-        <w:rPr>
-          <w:rFonts w:ascii="Calibri" w:hAnsi="Calibri" w:cs="Calibri"/>
+          <w:rFonts w:ascii="Calibri" w:hAnsi="Calibri" w:cs="Calibri" w:eastAsia="Calibri"/>
           <w:b/>
           <w:i w:val="0"/>
-          <w:color w:val="1A365D"/>
-          <w:sz w:val="21"/>
-          <w:u w:val="none"/>
-        </w:rPr>
-        <w:t>Operational Excellence</w:t>
-      </w:r>
-    </w:p>
-    <w:p>
-      <w:pPr>
-        <w:pStyle w:val="ListBullet"/>
-        <w:spacing w:after="20"/>
-        <w:ind w:left="340"/>
-      </w:pPr>
-      <w:r>
-        <w:rPr>
-          <w:rFonts w:ascii="Calibri" w:hAnsi="Calibri" w:cs="Calibri"/>
-          <w:b w:val="0"/>
-          <w:i w:val="0"/>
-          <w:color w:val="202020"/>
-          <w:sz w:val="21"/>
-          <w:u w:val="none"/>
-        </w:rPr>
-        <w:t>Achieved OTIF performance exceeding 95%.</w:t>
-      </w:r>
-    </w:p>
-    <w:p>
-      <w:pPr>
-        <w:pStyle w:val="ListBullet"/>
-        <w:spacing w:after="20"/>
-        <w:ind w:left="340"/>
-      </w:pPr>
-      <w:r>
-        <w:rPr>
-          <w:rFonts w:ascii="Calibri" w:hAnsi="Calibri" w:cs="Calibri"/>
-          <w:b w:val="0"/>
-          <w:i w:val="0"/>
-          <w:color w:val="202020"/>
-          <w:sz w:val="21"/>
-          <w:u w:val="none"/>
-        </w:rPr>
-        <w:t>Improved inventory accuracy through strengthened operational controls.</w:t>
-      </w:r>
-    </w:p>
-    <w:p>
-      <w:pPr>
-        <w:pStyle w:val="ListBullet"/>
-        <w:spacing w:after="20"/>
-        <w:ind w:left="340"/>
-      </w:pPr>
-      <w:r>
-        <w:rPr>
-          <w:rFonts w:ascii="Calibri" w:hAnsi="Calibri" w:cs="Calibri"/>
-          <w:b w:val="0"/>
-          <w:i w:val="0"/>
-          <w:color w:val="202020"/>
-          <w:sz w:val="21"/>
-          <w:u w:val="none"/>
-        </w:rPr>
-        <w:t>Reduced logistics and fulfilment lead times.</w:t>
-      </w:r>
-    </w:p>
-    <w:p>
-      <w:pPr>
-        <w:pStyle w:val="ListBullet"/>
-        <w:spacing w:after="20"/>
-        <w:ind w:left="340"/>
-      </w:pPr>
-      <w:r>
-        <w:rPr>
-          <w:rFonts w:ascii="Calibri" w:hAnsi="Calibri" w:cs="Calibri"/>
-          <w:b w:val="0"/>
-          <w:i w:val="0"/>
-          <w:color w:val="202020"/>
-          <w:sz w:val="21"/>
-          <w:u w:val="none"/>
-        </w:rPr>
-        <w:t>Optimised warehouse and distribution operations across multiple sites.</w:t>
-      </w:r>
-    </w:p>
-    <w:p>
-      <w:pPr>
-        <w:spacing w:before="80" w:after="20"/>
-      </w:pPr>
-      <w:r>
-        <w:rPr>
-          <w:rFonts w:ascii="Calibri" w:hAnsi="Calibri" w:cs="Calibri"/>
-          <w:b/>
-          <w:i w:val="0"/>
-          <w:color w:val="1A365D"/>
-          <w:sz w:val="21"/>
-          <w:u w:val="none"/>
-        </w:rPr>
-        <w:t>Leadership &amp; Governance</w:t>
-      </w:r>
-    </w:p>
-    <w:p>
-      <w:pPr>
-        <w:pStyle w:val="ListBullet"/>
-        <w:spacing w:after="20"/>
-        <w:ind w:left="340"/>
-      </w:pPr>
-      <w:r>
-        <w:rPr>
-          <w:rFonts w:ascii="Calibri" w:hAnsi="Calibri" w:cs="Calibri"/>
-          <w:b w:val="0"/>
-          <w:i w:val="0"/>
-          <w:color w:val="202020"/>
-          <w:sz w:val="21"/>
-          <w:u w:val="none"/>
-        </w:rPr>
-        <w:t>Led teams exceeding 120 employees.</w:t>
-      </w:r>
-    </w:p>
-    <w:p>
-      <w:pPr>
-        <w:pStyle w:val="ListBullet"/>
-        <w:spacing w:after="20"/>
-        <w:ind w:left="340"/>
-      </w:pPr>
-      <w:r>
-        <w:rPr>
-          <w:rFonts w:ascii="Calibri" w:hAnsi="Calibri" w:cs="Calibri"/>
-          <w:b w:val="0"/>
-          <w:i w:val="0"/>
-          <w:color w:val="202020"/>
-          <w:sz w:val="21"/>
-          <w:u w:val="none"/>
-        </w:rPr>
-        <w:t>Managed unionised workforces and industrial relations processes.</w:t>
-      </w:r>
-    </w:p>
-    <w:p>
-      <w:pPr>
-        <w:pStyle w:val="ListBullet"/>
-        <w:spacing w:after="20"/>
-        <w:ind w:left="340"/>
-      </w:pPr>
-      <w:r>
-        <w:rPr>
-          <w:rFonts w:ascii="Calibri" w:hAnsi="Calibri" w:cs="Calibri"/>
-          <w:b w:val="0"/>
-          <w:i w:val="0"/>
-          <w:color w:val="202020"/>
-          <w:sz w:val="21"/>
-          <w:u w:val="none"/>
-        </w:rPr>
-        <w:t>Implemented governance frameworks supporting audit readiness and compliance.</w:t>
-      </w:r>
-    </w:p>
-    <w:p>
-      <w:pPr>
-        <w:pStyle w:val="ListBullet"/>
-        <w:spacing w:after="20"/>
-        <w:ind w:left="340"/>
-      </w:pPr>
-      <w:r>
-        <w:rPr>
-          <w:rFonts w:ascii="Calibri" w:hAnsi="Calibri" w:cs="Calibri"/>
-          <w:b w:val="0"/>
-          <w:i w:val="0"/>
-          <w:color w:val="202020"/>
-          <w:sz w:val="21"/>
-          <w:u w:val="none"/>
-        </w:rPr>
-        <w:t>Established KPI-driven performance cultures focused on accountability and continuous improvement.</w:t>
-      </w:r>
-    </w:p>
-    <w:p>
-      <w:pPr>
-        <w:spacing w:before="80" w:after="20"/>
-      </w:pPr>
-      <w:r>
-        <w:rPr>
-          <w:rFonts w:ascii="Calibri" w:hAnsi="Calibri" w:cs="Calibri"/>
-          <w:b/>
-          <w:i w:val="0"/>
-          <w:color w:val="1A365D"/>
-          <w:sz w:val="21"/>
-          <w:u w:val="none"/>
-        </w:rPr>
-        <w:t>Strategic Transformation</w:t>
-      </w:r>
-    </w:p>
-    <w:p>
-      <w:pPr>
-        <w:pStyle w:val="ListBullet"/>
-        <w:spacing w:after="20"/>
-        <w:ind w:left="340"/>
-      </w:pPr>
-      <w:r>
-        <w:rPr>
-          <w:rFonts w:ascii="Calibri" w:hAnsi="Calibri" w:cs="Calibri"/>
-          <w:b w:val="0"/>
-          <w:i w:val="0"/>
-          <w:color w:val="202020"/>
-          <w:sz w:val="21"/>
-          <w:u w:val="none"/>
-        </w:rPr>
-        <w:t>Led enterprise operational improvement programmes.</w:t>
-      </w:r>
-    </w:p>
-    <w:p>
-      <w:pPr>
-        <w:pStyle w:val="ListBullet"/>
-        <w:spacing w:after="20"/>
-        <w:ind w:left="340"/>
-      </w:pPr>
-      <w:r>
-        <w:rPr>
-          <w:rFonts w:ascii="Calibri" w:hAnsi="Calibri" w:cs="Calibri"/>
-          <w:b w:val="0"/>
-          <w:i w:val="0"/>
-          <w:color w:val="202020"/>
-          <w:sz w:val="21"/>
-          <w:u w:val="none"/>
-        </w:rPr>
-        <w:t>Implemented ERP-enabled process improvements supporting procurement and supply chain functions.</w:t>
-      </w:r>
-    </w:p>
-    <w:p>
-      <w:pPr>
-        <w:pStyle w:val="ListBullet"/>
-        <w:spacing w:after="20"/>
-        <w:ind w:left="340"/>
-      </w:pPr>
-      <w:r>
-        <w:rPr>
-          <w:rFonts w:ascii="Calibri" w:hAnsi="Calibri" w:cs="Calibri"/>
-          <w:b w:val="0"/>
-          <w:i w:val="0"/>
-          <w:color w:val="202020"/>
-          <w:sz w:val="21"/>
-          <w:u w:val="none"/>
-        </w:rPr>
-        <w:t>Improved operational visibility through executive performance reporting.</w:t>
-      </w:r>
-    </w:p>
-    <w:p>
-      <w:pPr>
-        <w:pStyle w:val="ListBullet"/>
-        <w:spacing w:after="20"/>
-        <w:ind w:left="340"/>
-      </w:pPr>
-      <w:r>
-        <w:rPr>
-          <w:rFonts w:ascii="Calibri" w:hAnsi="Calibri" w:cs="Calibri"/>
-          <w:b w:val="0"/>
-          <w:i w:val="0"/>
-          <w:color w:val="202020"/>
-          <w:sz w:val="21"/>
-          <w:u w:val="none"/>
-        </w:rPr>
-        <w:t>Enhanced organisational resilience through strengthened supplier and operational governance.</w:t>
-      </w:r>
-    </w:p>
-    <w:p>
-      <w:pPr>
-        <w:spacing w:before="200" w:after="20"/>
-        <w:pBdr>
-          <w:bottom w:val="single" w:sz="8" w:space="2" w:color="B7902C"/>
-        </w:pBdr>
-      </w:pPr>
-      <w:r>
-        <w:rPr>
-          <w:rFonts w:ascii="Calibri" w:hAnsi="Calibri" w:cs="Calibri"/>
-          <w:b/>
-          <w:i w:val="0"/>
-          <w:color w:val="1A365D"/>
-          <w:sz w:val="24"/>
+          <w:color w:val="142C4F"/>
+          <w:sz w:val="25"/>
           <w:u w:val="none"/>
           <w:caps w:val="1"/>
-          <w:spacing w:val="60"/>
+          <w:spacing w:val="80"/>
         </w:rPr>
         <w:t>Education &amp; Certifications</w:t>
       </w:r>
     </w:p>
     <w:p>
       <w:pPr>
-        <w:spacing w:before="0" w:after="40"/>
+        <w:spacing w:before="0" w:after="40" w:line="240" w:lineRule="auto"/>
       </w:pPr>
     </w:p>
     <w:p>
       <w:pPr>
-        <w:spacing w:before="80" w:after="20"/>
+        <w:spacing w:before="80" w:after="20" w:line="240" w:lineRule="auto"/>
       </w:pPr>
       <w:r>
         <w:rPr>
-          <w:rFonts w:ascii="Calibri" w:hAnsi="Calibri" w:cs="Calibri"/>
+          <w:rFonts w:ascii="Calibri" w:hAnsi="Calibri" w:cs="Calibri" w:eastAsia="Calibri"/>
           <w:b/>
           <w:i w:val="0"/>
-          <w:color w:val="1A365D"/>
-          <w:sz w:val="21"/>
+          <w:color w:val="142C4F"/>
+          <w:sz w:val="22"/>
           <w:u w:val="none"/>
         </w:rPr>
         <w:t>Supply Chain &amp; Operations</w:t>
@@ -2622,235 +2890,63 @@
     </w:p>
     <w:p>
       <w:pPr>
-        <w:tabs>
-          <w:tab w:pos="9638" w:val="right"/>
-        </w:tabs>
-        <w:spacing w:after="0"/>
-        <w:ind w:left="0"/>
+        <w:spacing w:after="80" w:before="0" w:line="276" w:lineRule="auto"/>
       </w:pPr>
       <w:r>
         <w:rPr>
-          <w:rFonts w:ascii="Calibri" w:hAnsi="Calibri" w:cs="Calibri"/>
+          <w:rFonts w:ascii="Calibri" w:hAnsi="Calibri" w:cs="Calibri" w:eastAsia="Calibri"/>
           <w:b w:val="0"/>
           <w:i w:val="0"/>
-          <w:color w:val="202020"/>
-          <w:sz w:val="21"/>
+          <w:color w:val="1F1F1F"/>
+          <w:sz w:val="22"/>
           <w:u w:val="none"/>
         </w:rPr>
-        <w:t>Certified Supply Chain Professional (CSCP) - APICS</w:t>
-      </w:r>
-      <w:r>
-        <w:tab/>
-      </w:r>
-      <w:r>
-        <w:rPr>
-          <w:rFonts w:ascii="Calibri" w:hAnsi="Calibri" w:cs="Calibri"/>
-          <w:b w:val="0"/>
-          <w:i/>
-          <w:color w:val="555C66"/>
-          <w:sz w:val="21"/>
-          <w:u w:val="none"/>
-        </w:rPr>
-        <w:t>2025</w:t>
+        <w:t>APICS CSCP (Certified Supply Chain Professional)  ·  Lean Six Sigma Black Belt  ·  Diploma in Supply Chain Management (Coursera).</w:t>
       </w:r>
     </w:p>
     <w:p>
       <w:pPr>
-        <w:tabs>
-          <w:tab w:pos="9638" w:val="right"/>
-        </w:tabs>
-        <w:spacing w:after="0"/>
-        <w:ind w:left="0"/>
+        <w:spacing w:before="80" w:after="20" w:line="240" w:lineRule="auto"/>
       </w:pPr>
       <w:r>
         <w:rPr>
-          <w:rFonts w:ascii="Calibri" w:hAnsi="Calibri" w:cs="Calibri"/>
-          <w:b w:val="0"/>
+          <w:rFonts w:ascii="Calibri" w:hAnsi="Calibri" w:cs="Calibri" w:eastAsia="Calibri"/>
+          <w:b/>
           <w:i w:val="0"/>
-          <w:color w:val="202020"/>
-          <w:sz w:val="21"/>
+          <w:color w:val="142C4F"/>
+          <w:sz w:val="22"/>
           <w:u w:val="none"/>
         </w:rPr>
-        <w:t>Lean Six Sigma Black Belt - SSGI</w:t>
-      </w:r>
-      <w:r>
-        <w:tab/>
-      </w:r>
-      <w:r>
-        <w:rPr>
-          <w:rFonts w:ascii="Calibri" w:hAnsi="Calibri" w:cs="Calibri"/>
-          <w:b w:val="0"/>
-          <w:i/>
-          <w:color w:val="555C66"/>
-          <w:sz w:val="21"/>
-          <w:u w:val="none"/>
-        </w:rPr>
-        <w:t>2025</w:t>
+        <w:t>Business &amp; Compliance</w:t>
       </w:r>
     </w:p>
     <w:p>
       <w:pPr>
-        <w:tabs>
-          <w:tab w:pos="9638" w:val="right"/>
-        </w:tabs>
-        <w:spacing w:after="0"/>
-        <w:ind w:left="0"/>
+        <w:spacing w:after="80" w:before="0" w:line="276" w:lineRule="auto"/>
       </w:pPr>
       <w:r>
         <w:rPr>
-          <w:rFonts w:ascii="Calibri" w:hAnsi="Calibri" w:cs="Calibri"/>
+          <w:rFonts w:ascii="Calibri" w:hAnsi="Calibri" w:cs="Calibri" w:eastAsia="Calibri"/>
           <w:b w:val="0"/>
           <w:i w:val="0"/>
-          <w:color w:val="202020"/>
-          <w:sz w:val="21"/>
+          <w:color w:val="1F1F1F"/>
+          <w:sz w:val="22"/>
           <w:u w:val="none"/>
         </w:rPr>
-        <w:t>Diploma in Supply Chain Management - Coursera</w:t>
-      </w:r>
-      <w:r>
-        <w:tab/>
-      </w:r>
-      <w:r>
-        <w:rPr>
-          <w:rFonts w:ascii="Calibri" w:hAnsi="Calibri" w:cs="Calibri"/>
-          <w:b w:val="0"/>
-          <w:i/>
-          <w:color w:val="555C66"/>
-          <w:sz w:val="21"/>
-          <w:u w:val="none"/>
-        </w:rPr>
-        <w:t>2023</w:t>
+        <w:t>Diploma in Project Management  ·  Diploma in Health &amp; Safety  ·  Diploma in Human Resources Management  (all Coursera).</w:t>
       </w:r>
     </w:p>
     <w:p>
       <w:pPr>
-        <w:spacing w:before="80" w:after="20"/>
+        <w:spacing w:before="80" w:after="20" w:line="240" w:lineRule="auto"/>
       </w:pPr>
       <w:r>
         <w:rPr>
-          <w:rFonts w:ascii="Calibri" w:hAnsi="Calibri" w:cs="Calibri"/>
+          <w:rFonts w:ascii="Calibri" w:hAnsi="Calibri" w:cs="Calibri" w:eastAsia="Calibri"/>
           <w:b/>
           <w:i w:val="0"/>
-          <w:color w:val="1A365D"/>
-          <w:sz w:val="21"/>
-          <w:u w:val="none"/>
-        </w:rPr>
-        <w:t>Business, Project Management &amp; Compliance</w:t>
-      </w:r>
-    </w:p>
-    <w:p>
-      <w:pPr>
-        <w:tabs>
-          <w:tab w:pos="9638" w:val="right"/>
-        </w:tabs>
-        <w:spacing w:after="0"/>
-        <w:ind w:left="0"/>
-      </w:pPr>
-      <w:r>
-        <w:rPr>
-          <w:rFonts w:ascii="Calibri" w:hAnsi="Calibri" w:cs="Calibri"/>
-          <w:b w:val="0"/>
-          <w:i w:val="0"/>
-          <w:color w:val="202020"/>
-          <w:sz w:val="21"/>
-          <w:u w:val="none"/>
-        </w:rPr>
-        <w:t>Diploma in Project Management - Coursera</w:t>
-      </w:r>
-      <w:r>
-        <w:tab/>
-      </w:r>
-      <w:r>
-        <w:rPr>
-          <w:rFonts w:ascii="Calibri" w:hAnsi="Calibri" w:cs="Calibri"/>
-          <w:b w:val="0"/>
-          <w:i/>
-          <w:color w:val="555C66"/>
-          <w:sz w:val="21"/>
-          <w:u w:val="none"/>
-        </w:rPr>
-        <w:t>2023</w:t>
-      </w:r>
-    </w:p>
-    <w:p>
-      <w:pPr>
-        <w:tabs>
-          <w:tab w:pos="9638" w:val="right"/>
-        </w:tabs>
-        <w:spacing w:after="0"/>
-        <w:ind w:left="0"/>
-      </w:pPr>
-      <w:r>
-        <w:rPr>
-          <w:rFonts w:ascii="Calibri" w:hAnsi="Calibri" w:cs="Calibri"/>
-          <w:b w:val="0"/>
-          <w:i w:val="0"/>
-          <w:color w:val="202020"/>
-          <w:sz w:val="21"/>
-          <w:u w:val="none"/>
-        </w:rPr>
-        <w:t>Diploma in Health &amp; Safety - Coursera</w:t>
-      </w:r>
-      <w:r>
-        <w:tab/>
-      </w:r>
-      <w:r>
-        <w:rPr>
-          <w:rFonts w:ascii="Calibri" w:hAnsi="Calibri" w:cs="Calibri"/>
-          <w:b w:val="0"/>
-          <w:i/>
-          <w:color w:val="555C66"/>
-          <w:sz w:val="21"/>
-          <w:u w:val="none"/>
-        </w:rPr>
-        <w:t>2023</w:t>
-      </w:r>
-    </w:p>
-    <w:p>
-      <w:pPr>
-        <w:tabs>
-          <w:tab w:pos="9638" w:val="right"/>
-        </w:tabs>
-        <w:spacing w:after="0"/>
-        <w:ind w:left="0"/>
-      </w:pPr>
-      <w:r>
-        <w:rPr>
-          <w:rFonts w:ascii="Calibri" w:hAnsi="Calibri" w:cs="Calibri"/>
-          <w:b w:val="0"/>
-          <w:i w:val="0"/>
-          <w:color w:val="202020"/>
-          <w:sz w:val="21"/>
-          <w:u w:val="none"/>
-        </w:rPr>
-        <w:t>Diploma in Human Resources Management - Coursera</w:t>
-      </w:r>
-      <w:r>
-        <w:tab/>
-      </w:r>
-      <w:r>
-        <w:rPr>
-          <w:rFonts w:ascii="Calibri" w:hAnsi="Calibri" w:cs="Calibri"/>
-          <w:b w:val="0"/>
-          <w:i/>
-          <w:color w:val="555C66"/>
-          <w:sz w:val="21"/>
-          <w:u w:val="none"/>
-        </w:rPr>
-        <w:t>2019</w:t>
-      </w:r>
-    </w:p>
-    <w:p>
-      <w:pPr>
-        <w:spacing w:before="80" w:after="20"/>
-      </w:pPr>
-      <w:r>
-        <w:rPr>
-          <w:rFonts w:ascii="Calibri" w:hAnsi="Calibri" w:cs="Calibri"/>
-          <w:b/>
-          <w:i w:val="0"/>
-          <w:color w:val="1A365D"/>
-          <w:sz w:val="21"/>
+          <w:color w:val="142C4F"/>
+          <w:sz w:val="22"/>
           <w:u w:val="none"/>
         </w:rPr>
         <w:t>Technology &amp; Engineering</w:t>
@@ -2858,324 +2954,68 @@
     </w:p>
     <w:p>
       <w:pPr>
-        <w:tabs>
-          <w:tab w:pos="9638" w:val="right"/>
-        </w:tabs>
-        <w:spacing w:after="0"/>
-        <w:ind w:left="0"/>
+        <w:spacing w:after="80" w:before="0" w:line="276" w:lineRule="auto"/>
       </w:pPr>
       <w:r>
         <w:rPr>
-          <w:rFonts w:ascii="Calibri" w:hAnsi="Calibri" w:cs="Calibri"/>
+          <w:rFonts w:ascii="Calibri" w:hAnsi="Calibri" w:cs="Calibri" w:eastAsia="Calibri"/>
           <w:b w:val="0"/>
           <w:i w:val="0"/>
-          <w:color w:val="202020"/>
-          <w:sz w:val="21"/>
+          <w:color w:val="1F1F1F"/>
+          <w:sz w:val="22"/>
           <w:u w:val="none"/>
         </w:rPr>
-        <w:t>Computer Science Certificate - Harvard University (CS50)</w:t>
-      </w:r>
-      <w:r>
-        <w:tab/>
-      </w:r>
-      <w:r>
-        <w:rPr>
-          <w:rFonts w:ascii="Calibri" w:hAnsi="Calibri" w:cs="Calibri"/>
-          <w:b w:val="0"/>
-          <w:i/>
-          <w:color w:val="555C66"/>
-          <w:sz w:val="21"/>
-          <w:u w:val="none"/>
-        </w:rPr>
-        <w:t>2023</w:t>
+        <w:t>Computer Science Certificate (Harvard CS50)  ·  Ethical Hacker (Cisco Networking Academy)  ·  AI for Everyone + Deep Learning Specialisation (Andrew Ng / DeepLearning.AI)  ·  FNB App Development Programme  ·  Full Stack Development, Back End &amp; APIs, Machine Learning with Python, Web Design (freeCodeCamp).</w:t>
       </w:r>
     </w:p>
     <w:p>
       <w:pPr>
-        <w:tabs>
-          <w:tab w:pos="9638" w:val="right"/>
-        </w:tabs>
-        <w:spacing w:after="0"/>
-        <w:ind w:left="0"/>
+        <w:spacing w:before="240" w:after="40" w:line="240" w:lineRule="auto"/>
+        <w:pBdr>
+          <w:bottom w:val="single" w:sz="10" w:space="2" w:color="B88E2E"/>
+        </w:pBdr>
       </w:pPr>
       <w:r>
         <w:rPr>
-          <w:rFonts w:ascii="Calibri" w:hAnsi="Calibri" w:cs="Calibri"/>
-          <w:b w:val="0"/>
-          <w:i w:val="0"/>
-          <w:color w:val="202020"/>
-          <w:sz w:val="21"/>
-          <w:u w:val="none"/>
-        </w:rPr>
-        <w:t>Ethical Hacker - Cisco Networking Academy</w:t>
-      </w:r>
-      <w:r>
-        <w:tab/>
-      </w:r>
-      <w:r>
-        <w:rPr>
-          <w:rFonts w:ascii="Calibri" w:hAnsi="Calibri" w:cs="Calibri"/>
-          <w:b w:val="0"/>
-          <w:i/>
-          <w:color w:val="555C66"/>
-          <w:sz w:val="21"/>
-          <w:u w:val="none"/>
-        </w:rPr>
-        <w:t>2025</w:t>
-      </w:r>
-    </w:p>
-    <w:p>
-      <w:pPr>
-        <w:tabs>
-          <w:tab w:pos="9638" w:val="right"/>
-        </w:tabs>
-        <w:spacing w:after="0"/>
-        <w:ind w:left="0"/>
-      </w:pPr>
-      <w:r>
-        <w:rPr>
-          <w:rFonts w:ascii="Calibri" w:hAnsi="Calibri" w:cs="Calibri"/>
-          <w:b w:val="0"/>
-          <w:i w:val="0"/>
-          <w:color w:val="202020"/>
-          <w:sz w:val="21"/>
-          <w:u w:val="none"/>
-        </w:rPr>
-        <w:t>AI for Everyone + Deep Learning Specialisation - Coursera (Andrew Ng)</w:t>
-      </w:r>
-      <w:r>
-        <w:tab/>
-      </w:r>
-      <w:r>
-        <w:rPr>
-          <w:rFonts w:ascii="Calibri" w:hAnsi="Calibri" w:cs="Calibri"/>
-          <w:b w:val="0"/>
-          <w:i/>
-          <w:color w:val="555C66"/>
-          <w:sz w:val="21"/>
-          <w:u w:val="none"/>
-        </w:rPr>
-        <w:t>2025</w:t>
-      </w:r>
-    </w:p>
-    <w:p>
-      <w:pPr>
-        <w:tabs>
-          <w:tab w:pos="9638" w:val="right"/>
-        </w:tabs>
-        <w:spacing w:after="0"/>
-        <w:ind w:left="0"/>
-      </w:pPr>
-      <w:r>
-        <w:rPr>
-          <w:rFonts w:ascii="Calibri" w:hAnsi="Calibri" w:cs="Calibri"/>
-          <w:b w:val="0"/>
-          <w:i w:val="0"/>
-          <w:color w:val="202020"/>
-          <w:sz w:val="21"/>
-          <w:u w:val="none"/>
-        </w:rPr>
-        <w:t>App Development Programme - FNB App Academy</w:t>
-      </w:r>
-      <w:r>
-        <w:tab/>
-      </w:r>
-      <w:r>
-        <w:rPr>
-          <w:rFonts w:ascii="Calibri" w:hAnsi="Calibri" w:cs="Calibri"/>
-          <w:b w:val="0"/>
-          <w:i/>
-          <w:color w:val="555C66"/>
-          <w:sz w:val="21"/>
-          <w:u w:val="none"/>
-        </w:rPr>
-        <w:t>2025</w:t>
-      </w:r>
-    </w:p>
-    <w:p>
-      <w:pPr>
-        <w:tabs>
-          <w:tab w:pos="9638" w:val="right"/>
-        </w:tabs>
-        <w:spacing w:after="0"/>
-        <w:ind w:left="0"/>
-      </w:pPr>
-      <w:r>
-        <w:rPr>
-          <w:rFonts w:ascii="Calibri" w:hAnsi="Calibri" w:cs="Calibri"/>
-          <w:b w:val="0"/>
-          <w:i w:val="0"/>
-          <w:color w:val="202020"/>
-          <w:sz w:val="21"/>
-          <w:u w:val="none"/>
-        </w:rPr>
-        <w:t>Full Stack Development - freeCodeCamp</w:t>
-      </w:r>
-      <w:r>
-        <w:tab/>
-      </w:r>
-      <w:r>
-        <w:rPr>
-          <w:rFonts w:ascii="Calibri" w:hAnsi="Calibri" w:cs="Calibri"/>
-          <w:b w:val="0"/>
-          <w:i/>
-          <w:color w:val="555C66"/>
-          <w:sz w:val="21"/>
-          <w:u w:val="none"/>
-        </w:rPr>
-        <w:t>2025</w:t>
-      </w:r>
-    </w:p>
-    <w:p>
-      <w:pPr>
-        <w:tabs>
-          <w:tab w:pos="9638" w:val="right"/>
-        </w:tabs>
-        <w:spacing w:after="0"/>
-        <w:ind w:left="0"/>
-      </w:pPr>
-      <w:r>
-        <w:rPr>
-          <w:rFonts w:ascii="Calibri" w:hAnsi="Calibri" w:cs="Calibri"/>
-          <w:b w:val="0"/>
-          <w:i w:val="0"/>
-          <w:color w:val="202020"/>
-          <w:sz w:val="21"/>
-          <w:u w:val="none"/>
-        </w:rPr>
-        <w:t>Back End Development and APIs - freeCodeCamp</w:t>
-      </w:r>
-      <w:r>
-        <w:tab/>
-      </w:r>
-      <w:r>
-        <w:rPr>
-          <w:rFonts w:ascii="Calibri" w:hAnsi="Calibri" w:cs="Calibri"/>
-          <w:b w:val="0"/>
-          <w:i/>
-          <w:color w:val="555C66"/>
-          <w:sz w:val="21"/>
-          <w:u w:val="none"/>
-        </w:rPr>
-        <w:t>2025</w:t>
-      </w:r>
-    </w:p>
-    <w:p>
-      <w:pPr>
-        <w:tabs>
-          <w:tab w:pos="9638" w:val="right"/>
-        </w:tabs>
-        <w:spacing w:after="0"/>
-        <w:ind w:left="0"/>
-      </w:pPr>
-      <w:r>
-        <w:rPr>
-          <w:rFonts w:ascii="Calibri" w:hAnsi="Calibri" w:cs="Calibri"/>
-          <w:b w:val="0"/>
-          <w:i w:val="0"/>
-          <w:color w:val="202020"/>
-          <w:sz w:val="21"/>
-          <w:u w:val="none"/>
-        </w:rPr>
-        <w:t>Machine Learning with Python - freeCodeCamp</w:t>
-      </w:r>
-      <w:r>
-        <w:tab/>
-      </w:r>
-      <w:r>
-        <w:rPr>
-          <w:rFonts w:ascii="Calibri" w:hAnsi="Calibri" w:cs="Calibri"/>
-          <w:b w:val="0"/>
-          <w:i/>
-          <w:color w:val="555C66"/>
-          <w:sz w:val="21"/>
-          <w:u w:val="none"/>
-        </w:rPr>
-        <w:t>2025</w:t>
-      </w:r>
-    </w:p>
-    <w:p>
-      <w:pPr>
-        <w:tabs>
-          <w:tab w:pos="9638" w:val="right"/>
-        </w:tabs>
-        <w:spacing w:after="0"/>
-        <w:ind w:left="0"/>
-      </w:pPr>
-      <w:r>
-        <w:rPr>
-          <w:rFonts w:ascii="Calibri" w:hAnsi="Calibri" w:cs="Calibri"/>
-          <w:b w:val="0"/>
-          <w:i w:val="0"/>
-          <w:color w:val="202020"/>
-          <w:sz w:val="21"/>
-          <w:u w:val="none"/>
-        </w:rPr>
-        <w:t>Web Design - freeCodeCamp</w:t>
-      </w:r>
-      <w:r>
-        <w:tab/>
-      </w:r>
-      <w:r>
-        <w:rPr>
-          <w:rFonts w:ascii="Calibri" w:hAnsi="Calibri" w:cs="Calibri"/>
-          <w:b w:val="0"/>
-          <w:i/>
-          <w:color w:val="555C66"/>
-          <w:sz w:val="21"/>
-          <w:u w:val="none"/>
-        </w:rPr>
-        <w:t>2025</w:t>
-      </w:r>
-    </w:p>
-    <w:p>
-      <w:pPr>
-        <w:spacing w:before="200" w:after="20"/>
-        <w:pBdr>
-          <w:bottom w:val="single" w:sz="8" w:space="2" w:color="B7902C"/>
-        </w:pBdr>
-      </w:pPr>
-      <w:r>
-        <w:rPr>
-          <w:rFonts w:ascii="Calibri" w:hAnsi="Calibri" w:cs="Calibri"/>
+          <w:rFonts w:ascii="Calibri" w:hAnsi="Calibri" w:cs="Calibri" w:eastAsia="Calibri"/>
           <w:b/>
           <w:i w:val="0"/>
-          <w:color w:val="1A365D"/>
-          <w:sz w:val="24"/>
+          <w:color w:val="142C4F"/>
+          <w:sz w:val="25"/>
           <w:u w:val="none"/>
           <w:caps w:val="1"/>
-          <w:spacing w:val="60"/>
+          <w:spacing w:val="80"/>
         </w:rPr>
         <w:t>Languages &amp; Work Rights</w:t>
       </w:r>
     </w:p>
     <w:p>
       <w:pPr>
-        <w:spacing w:before="0" w:after="40"/>
+        <w:spacing w:before="0" w:after="40" w:line="240" w:lineRule="auto"/>
       </w:pPr>
     </w:p>
     <w:p>
       <w:pPr>
-        <w:spacing w:after="40"/>
+        <w:spacing w:after="40" w:line="288" w:lineRule="auto"/>
       </w:pPr>
       <w:r>
         <w:rPr>
-          <w:rFonts w:ascii="Calibri" w:hAnsi="Calibri" w:cs="Calibri"/>
+          <w:rFonts w:ascii="Calibri" w:hAnsi="Calibri" w:cs="Calibri" w:eastAsia="Calibri"/>
           <w:b/>
           <w:i w:val="0"/>
-          <w:color w:val="1A365D"/>
-          <w:sz w:val="21"/>
+          <w:color w:val="142C4F"/>
+          <w:sz w:val="22"/>
           <w:u w:val="none"/>
         </w:rPr>
         <w:t xml:space="preserve">Languages:  </w:t>
       </w:r>
       <w:r>
         <w:rPr>
-          <w:rFonts w:ascii="Calibri" w:hAnsi="Calibri" w:cs="Calibri"/>
+          <w:rFonts w:ascii="Calibri" w:hAnsi="Calibri" w:cs="Calibri" w:eastAsia="Calibri"/>
           <w:b w:val="0"/>
           <w:i w:val="0"/>
-          <w:color w:val="202020"/>
-          <w:sz w:val="21"/>
+          <w:color w:val="1F1F1F"/>
+          <w:sz w:val="22"/>
           <w:u w:val="none"/>
         </w:rPr>
         <w:t>English (Native)  ·  Afrikaans (Native)  ·  German (Conversational)</w:t>
@@ -3183,53 +3023,107 @@
     </w:p>
     <w:p>
       <w:pPr>
-        <w:spacing w:after="40"/>
+        <w:spacing w:after="40" w:line="288" w:lineRule="auto"/>
       </w:pPr>
       <w:r>
         <w:rPr>
-          <w:rFonts w:ascii="Calibri" w:hAnsi="Calibri" w:cs="Calibri"/>
+          <w:rFonts w:ascii="Calibri" w:hAnsi="Calibri" w:cs="Calibri" w:eastAsia="Calibri"/>
           <w:b/>
           <w:i w:val="0"/>
-          <w:color w:val="1A365D"/>
-          <w:sz w:val="21"/>
+          <w:color w:val="142C4F"/>
+          <w:sz w:val="22"/>
           <w:u w:val="none"/>
         </w:rPr>
         <w:t xml:space="preserve">Residency:  </w:t>
       </w:r>
       <w:r>
         <w:rPr>
-          <w:rFonts w:ascii="Calibri" w:hAnsi="Calibri" w:cs="Calibri"/>
+          <w:rFonts w:ascii="Calibri" w:hAnsi="Calibri" w:cs="Calibri" w:eastAsia="Calibri"/>
           <w:b w:val="0"/>
           <w:i w:val="0"/>
-          <w:color w:val="202020"/>
-          <w:sz w:val="21"/>
+          <w:color w:val="1F1F1F"/>
+          <w:sz w:val="22"/>
           <w:u w:val="none"/>
         </w:rPr>
-        <w:t>Dual SA / DE - Cape Town: 10 Anysberg Crescent, Durbanville, ZA  |  Germany: Uerdinger Straße 44, Moers, DE</w:t>
+        <w:t>Dual South African / German citizenship.</w:t>
       </w:r>
     </w:p>
     <w:p>
       <w:pPr>
-        <w:spacing w:after="40"/>
+        <w:spacing w:after="40" w:line="288" w:lineRule="auto"/>
       </w:pPr>
       <w:r>
         <w:rPr>
-          <w:rFonts w:ascii="Calibri" w:hAnsi="Calibri" w:cs="Calibri"/>
+          <w:rFonts w:ascii="Calibri" w:hAnsi="Calibri" w:cs="Calibri" w:eastAsia="Calibri"/>
           <w:b/>
           <w:i w:val="0"/>
-          <w:color w:val="1A365D"/>
-          <w:sz w:val="21"/>
+          <w:color w:val="142C4F"/>
+          <w:sz w:val="22"/>
+          <w:u w:val="none"/>
+        </w:rPr>
+        <w:t xml:space="preserve">Cape Town:  </w:t>
+      </w:r>
+      <w:r>
+        <w:rPr>
+          <w:rFonts w:ascii="Calibri" w:hAnsi="Calibri" w:cs="Calibri" w:eastAsia="Calibri"/>
+          <w:b w:val="0"/>
+          <w:i w:val="0"/>
+          <w:color w:val="1F1F1F"/>
+          <w:sz w:val="22"/>
+          <w:u w:val="none"/>
+        </w:rPr>
+        <w:t>10 Anysberg Crescent, Durbanville, ZA</w:t>
+      </w:r>
+    </w:p>
+    <w:p>
+      <w:pPr>
+        <w:spacing w:after="40" w:line="288" w:lineRule="auto"/>
+      </w:pPr>
+      <w:r>
+        <w:rPr>
+          <w:rFonts w:ascii="Calibri" w:hAnsi="Calibri" w:cs="Calibri" w:eastAsia="Calibri"/>
+          <w:b/>
+          <w:i w:val="0"/>
+          <w:color w:val="142C4F"/>
+          <w:sz w:val="22"/>
+          <w:u w:val="none"/>
+        </w:rPr>
+        <w:t xml:space="preserve">Germany:  </w:t>
+      </w:r>
+      <w:r>
+        <w:rPr>
+          <w:rFonts w:ascii="Calibri" w:hAnsi="Calibri" w:cs="Calibri" w:eastAsia="Calibri"/>
+          <w:b w:val="0"/>
+          <w:i w:val="0"/>
+          <w:color w:val="1F1F1F"/>
+          <w:sz w:val="22"/>
+          <w:u w:val="none"/>
+        </w:rPr>
+        <w:t>Uerdinger Straße 44, Moers, DE</w:t>
+      </w:r>
+    </w:p>
+    <w:p>
+      <w:pPr>
+        <w:spacing w:after="40" w:line="288" w:lineRule="auto"/>
+      </w:pPr>
+      <w:r>
+        <w:rPr>
+          <w:rFonts w:ascii="Calibri" w:hAnsi="Calibri" w:cs="Calibri" w:eastAsia="Calibri"/>
+          <w:b/>
+          <w:i w:val="0"/>
+          <w:color w:val="142C4F"/>
+          <w:sz w:val="22"/>
           <w:u w:val="none"/>
         </w:rPr>
         <w:t xml:space="preserve">Work Mode:  </w:t>
       </w:r>
       <w:r>
         <w:rPr>
-          <w:rFonts w:ascii="Calibri" w:hAnsi="Calibri" w:cs="Calibri"/>
+          <w:rFonts w:ascii="Calibri" w:hAnsi="Calibri" w:cs="Calibri" w:eastAsia="Calibri"/>
           <w:b w:val="0"/>
           <w:i w:val="0"/>
-          <w:color w:val="202020"/>
-          <w:sz w:val="21"/>
+          <w:color w:val="1F1F1F"/>
+          <w:sz w:val="22"/>
           <w:u w:val="none"/>
         </w:rPr>
         <w:t>Remote, Hybrid or On-Site</w:t>
@@ -3237,150 +3131,26 @@
     </w:p>
     <w:p>
       <w:pPr>
-        <w:spacing w:before="200" w:after="20"/>
-        <w:pBdr>
-          <w:bottom w:val="single" w:sz="8" w:space="2" w:color="B7902C"/>
-        </w:pBdr>
+        <w:spacing w:after="40" w:line="288" w:lineRule="auto"/>
       </w:pPr>
       <w:r>
         <w:rPr>
-          <w:rFonts w:ascii="Calibri" w:hAnsi="Calibri" w:cs="Calibri"/>
+          <w:rFonts w:ascii="Calibri" w:hAnsi="Calibri" w:cs="Calibri" w:eastAsia="Calibri"/>
           <w:b/>
           <w:i w:val="0"/>
-          <w:color w:val="1A365D"/>
-          <w:sz w:val="24"/>
-          <w:u w:val="none"/>
-          <w:caps w:val="1"/>
-          <w:spacing w:val="60"/>
-        </w:rPr>
-        <w:t>Leadership &amp; Community Engagement</w:t>
-      </w:r>
-    </w:p>
-    <w:p>
-      <w:pPr>
-        <w:spacing w:before="0" w:after="40"/>
-      </w:pPr>
-    </w:p>
-    <w:p>
-      <w:pPr>
-        <w:pStyle w:val="ListBullet"/>
-        <w:spacing w:after="20"/>
-        <w:ind w:left="340"/>
-      </w:pPr>
-      <w:r>
-        <w:rPr>
-          <w:rFonts w:ascii="Calibri" w:hAnsi="Calibri" w:cs="Calibri"/>
-          <w:b w:val="0"/>
-          <w:i w:val="0"/>
-          <w:color w:val="202020"/>
-          <w:sz w:val="21"/>
-          <w:u w:val="none"/>
-        </w:rPr>
-        <w:t>Tech-for-Good Mentor - AI and supply chain upskilling for underserved communities.</w:t>
-      </w:r>
-    </w:p>
-    <w:p>
-      <w:pPr>
-        <w:pStyle w:val="ListBullet"/>
-        <w:spacing w:after="20"/>
-        <w:ind w:left="340"/>
-      </w:pPr>
-      <w:r>
-        <w:rPr>
-          <w:rFonts w:ascii="Calibri" w:hAnsi="Calibri" w:cs="Calibri"/>
-          <w:b w:val="0"/>
-          <w:i w:val="0"/>
-          <w:color w:val="202020"/>
-          <w:sz w:val="21"/>
-          <w:u w:val="none"/>
-        </w:rPr>
-        <w:t>Open-Source Contributor - logistics automations, dashboards and backend tools.</w:t>
-      </w:r>
-    </w:p>
-    <w:p>
-      <w:pPr>
-        <w:pStyle w:val="ListBullet"/>
-        <w:spacing w:after="20"/>
-        <w:ind w:left="340"/>
-      </w:pPr>
-      <w:r>
-        <w:rPr>
-          <w:rFonts w:ascii="Calibri" w:hAnsi="Calibri" w:cs="Calibri"/>
-          <w:b w:val="0"/>
-          <w:i w:val="0"/>
-          <w:color w:val="202020"/>
-          <w:sz w:val="21"/>
-          <w:u w:val="none"/>
-        </w:rPr>
-        <w:t>Cross-Cultural Advocate - bridging EU and SA teams and stakeholder communication.</w:t>
-      </w:r>
-    </w:p>
-    <w:p>
-      <w:pPr>
-        <w:pStyle w:val="ListBullet"/>
-        <w:spacing w:after="20"/>
-        <w:ind w:left="340"/>
-      </w:pPr>
-      <w:r>
-        <w:rPr>
-          <w:rFonts w:ascii="Calibri" w:hAnsi="Calibri" w:cs="Calibri"/>
-          <w:b w:val="0"/>
-          <w:i w:val="0"/>
-          <w:color w:val="202020"/>
-          <w:sz w:val="21"/>
-          <w:u w:val="none"/>
-        </w:rPr>
-        <w:t>Discipline-Driven Leader - calisthenics and high-discipline daily routines.</w:t>
-      </w:r>
-    </w:p>
-    <w:p>
-      <w:pPr>
-        <w:spacing w:before="200" w:after="20"/>
-        <w:pBdr>
-          <w:bottom w:val="single" w:sz="8" w:space="2" w:color="B7902C"/>
-        </w:pBdr>
-      </w:pPr>
-      <w:r>
-        <w:rPr>
-          <w:rFonts w:ascii="Calibri" w:hAnsi="Calibri" w:cs="Calibri"/>
-          <w:b/>
-          <w:i w:val="0"/>
-          <w:color w:val="1A365D"/>
-          <w:sz w:val="24"/>
-          <w:u w:val="none"/>
-          <w:caps w:val="1"/>
-          <w:spacing w:val="60"/>
-        </w:rPr>
-        <w:t>Availability</w:t>
-      </w:r>
-    </w:p>
-    <w:p>
-      <w:pPr>
-        <w:spacing w:before="0" w:after="40"/>
-      </w:pPr>
-    </w:p>
-    <w:p>
-      <w:pPr>
-        <w:spacing w:after="40"/>
-      </w:pPr>
-      <w:r>
-        <w:rPr>
-          <w:rFonts w:ascii="Calibri" w:hAnsi="Calibri" w:cs="Calibri"/>
-          <w:b/>
-          <w:i w:val="0"/>
-          <w:color w:val="1A365D"/>
-          <w:sz w:val="21"/>
+          <w:color w:val="142C4F"/>
+          <w:sz w:val="22"/>
           <w:u w:val="none"/>
         </w:rPr>
         <w:t xml:space="preserve">Notice Period:  </w:t>
       </w:r>
       <w:r>
         <w:rPr>
-          <w:rFonts w:ascii="Calibri" w:hAnsi="Calibri" w:cs="Calibri"/>
+          <w:rFonts w:ascii="Calibri" w:hAnsi="Calibri" w:cs="Calibri" w:eastAsia="Calibri"/>
           <w:b w:val="0"/>
           <w:i w:val="0"/>
-          <w:color w:val="202020"/>
-          <w:sz w:val="21"/>
+          <w:color w:val="1F1F1F"/>
+          <w:sz w:val="22"/>
           <w:u w:val="none"/>
         </w:rPr>
         <w:t>Immediate</w:t>
@@ -3388,34 +3158,196 @@
     </w:p>
     <w:p>
       <w:pPr>
-        <w:spacing w:after="40"/>
+        <w:spacing w:after="40" w:line="288" w:lineRule="auto"/>
       </w:pPr>
       <w:r>
         <w:rPr>
-          <w:rFonts w:ascii="Calibri" w:hAnsi="Calibri" w:cs="Calibri"/>
+          <w:rFonts w:ascii="Calibri" w:hAnsi="Calibri" w:cs="Calibri" w:eastAsia="Calibri"/>
           <w:b/>
           <w:i w:val="0"/>
-          <w:color w:val="1A365D"/>
-          <w:sz w:val="21"/>
+          <w:color w:val="142C4F"/>
+          <w:sz w:val="22"/>
           <w:u w:val="none"/>
         </w:rPr>
         <w:t xml:space="preserve">Licences:  </w:t>
       </w:r>
       <w:r>
         <w:rPr>
-          <w:rFonts w:ascii="Calibri" w:hAnsi="Calibri" w:cs="Calibri"/>
+          <w:rFonts w:ascii="Calibri" w:hAnsi="Calibri" w:cs="Calibri" w:eastAsia="Calibri"/>
           <w:b w:val="0"/>
           <w:i w:val="0"/>
-          <w:color w:val="202020"/>
-          <w:sz w:val="21"/>
+          <w:color w:val="1F1F1F"/>
+          <w:sz w:val="22"/>
           <w:u w:val="none"/>
         </w:rPr>
-        <w:t>Code C1 Driver's Licence  |  Own Vehicle</w:t>
+        <w:t>Code C1 Driver's Licence  ·  Own Vehicle</w:t>
+      </w:r>
+    </w:p>
+    <w:p>
+      <w:pPr>
+        <w:spacing w:before="240" w:after="40" w:line="240" w:lineRule="auto"/>
+        <w:pBdr>
+          <w:bottom w:val="single" w:sz="10" w:space="2" w:color="B88E2E"/>
+        </w:pBdr>
+      </w:pPr>
+      <w:r>
+        <w:rPr>
+          <w:rFonts w:ascii="Calibri" w:hAnsi="Calibri" w:cs="Calibri" w:eastAsia="Calibri"/>
+          <w:b/>
+          <w:i w:val="0"/>
+          <w:color w:val="142C4F"/>
+          <w:sz w:val="25"/>
+          <w:u w:val="none"/>
+          <w:caps w:val="1"/>
+          <w:spacing w:val="80"/>
+        </w:rPr>
+        <w:t>Leadership &amp; Community Engagement</w:t>
+      </w:r>
+    </w:p>
+    <w:p>
+      <w:pPr>
+        <w:spacing w:before="0" w:after="40" w:line="240" w:lineRule="auto"/>
+      </w:pPr>
+    </w:p>
+    <w:p>
+      <w:pPr>
+        <w:pStyle w:val="ListBullet"/>
+        <w:spacing w:after="40" w:line="276" w:lineRule="auto"/>
+        <w:ind w:left="340"/>
+      </w:pPr>
+      <w:r>
+        <w:rPr>
+          <w:rFonts w:ascii="Calibri" w:hAnsi="Calibri" w:cs="Calibri" w:eastAsia="Calibri"/>
+          <w:b/>
+          <w:i w:val="0"/>
+          <w:color w:val="142C4F"/>
+          <w:sz w:val="22"/>
+          <w:u w:val="none"/>
+        </w:rPr>
+        <w:t xml:space="preserve">Tech-for-Good Mentor — </w:t>
+      </w:r>
+      <w:r>
+        <w:rPr>
+          <w:rFonts w:ascii="Calibri" w:hAnsi="Calibri" w:cs="Calibri" w:eastAsia="Calibri"/>
+          <w:b w:val="0"/>
+          <w:i w:val="0"/>
+          <w:color w:val="1F1F1F"/>
+          <w:sz w:val="22"/>
+          <w:u w:val="none"/>
+        </w:rPr>
+        <w:t>AI and supply chain upskilling for underserved communities.</w:t>
+      </w:r>
+    </w:p>
+    <w:p>
+      <w:pPr>
+        <w:pStyle w:val="ListBullet"/>
+        <w:spacing w:after="40" w:line="276" w:lineRule="auto"/>
+        <w:ind w:left="340"/>
+      </w:pPr>
+      <w:r>
+        <w:rPr>
+          <w:rFonts w:ascii="Calibri" w:hAnsi="Calibri" w:cs="Calibri" w:eastAsia="Calibri"/>
+          <w:b/>
+          <w:i w:val="0"/>
+          <w:color w:val="142C4F"/>
+          <w:sz w:val="22"/>
+          <w:u w:val="none"/>
+        </w:rPr>
+        <w:t xml:space="preserve">Open-Source Contributor — </w:t>
+      </w:r>
+      <w:r>
+        <w:rPr>
+          <w:rFonts w:ascii="Calibri" w:hAnsi="Calibri" w:cs="Calibri" w:eastAsia="Calibri"/>
+          <w:b w:val="0"/>
+          <w:i w:val="0"/>
+          <w:color w:val="1F1F1F"/>
+          <w:sz w:val="22"/>
+          <w:u w:val="none"/>
+        </w:rPr>
+        <w:t>logistics automations, dashboards and backend tools.</w:t>
+      </w:r>
+    </w:p>
+    <w:p>
+      <w:pPr>
+        <w:pStyle w:val="ListBullet"/>
+        <w:spacing w:after="40" w:line="276" w:lineRule="auto"/>
+        <w:ind w:left="340"/>
+      </w:pPr>
+      <w:r>
+        <w:rPr>
+          <w:rFonts w:ascii="Calibri" w:hAnsi="Calibri" w:cs="Calibri" w:eastAsia="Calibri"/>
+          <w:b/>
+          <w:i w:val="0"/>
+          <w:color w:val="142C4F"/>
+          <w:sz w:val="22"/>
+          <w:u w:val="none"/>
+        </w:rPr>
+        <w:t xml:space="preserve">Cross-Cultural Advocate — </w:t>
+      </w:r>
+      <w:r>
+        <w:rPr>
+          <w:rFonts w:ascii="Calibri" w:hAnsi="Calibri" w:cs="Calibri" w:eastAsia="Calibri"/>
+          <w:b w:val="0"/>
+          <w:i w:val="0"/>
+          <w:color w:val="1F1F1F"/>
+          <w:sz w:val="22"/>
+          <w:u w:val="none"/>
+        </w:rPr>
+        <w:t>bridging EU and SA teams and stakeholder communication.</w:t>
+      </w:r>
+    </w:p>
+    <w:p>
+      <w:pPr>
+        <w:pStyle w:val="ListBullet"/>
+        <w:spacing w:after="40" w:line="276" w:lineRule="auto"/>
+        <w:ind w:left="340"/>
+      </w:pPr>
+      <w:r>
+        <w:rPr>
+          <w:rFonts w:ascii="Calibri" w:hAnsi="Calibri" w:cs="Calibri" w:eastAsia="Calibri"/>
+          <w:b/>
+          <w:i w:val="0"/>
+          <w:color w:val="142C4F"/>
+          <w:sz w:val="22"/>
+          <w:u w:val="none"/>
+        </w:rPr>
+        <w:t xml:space="preserve">Discipline-Driven Leader — </w:t>
+      </w:r>
+      <w:r>
+        <w:rPr>
+          <w:rFonts w:ascii="Calibri" w:hAnsi="Calibri" w:cs="Calibri" w:eastAsia="Calibri"/>
+          <w:b w:val="0"/>
+          <w:i w:val="0"/>
+          <w:color w:val="1F1F1F"/>
+          <w:sz w:val="22"/>
+          <w:u w:val="none"/>
+        </w:rPr>
+        <w:t>calisthenics and high-discipline daily routines, demonstrating resilience and consistency.</w:t>
+      </w:r>
+    </w:p>
+    <w:p>
+      <w:pPr>
+        <w:spacing w:before="280" w:after="0"/>
+        <w:jc w:val="center"/>
+        <w:pBdr>
+          <w:bottom w:val="single" w:sz="8" w:space="2" w:color="B88E2E"/>
+        </w:pBdr>
+      </w:pPr>
+      <w:r>
+        <w:rPr>
+          <w:rFonts w:ascii="Calibri" w:hAnsi="Calibri" w:cs="Calibri" w:eastAsia="Calibri"/>
+          <w:b w:val="0"/>
+          <w:i/>
+          <w:color w:val="555C66"/>
+          <w:sz w:val="20"/>
+          <w:u w:val="none"/>
+        </w:rPr>
+        <w:t>References available on request</w:t>
       </w:r>
     </w:p>
     <w:sectPr>
       <w:pgSz w:w="12240" w:h="15840"/>
-      <w:pgMar w:top="794" w:right="1134" w:bottom="794" w:left="1134" w:header="720" w:footer="720" w:gutter="0"/>
+      <w:pgMar w:top="850" w:right="1134" w:bottom="850" w:left="1134" w:header="720" w:footer="720" w:gutter="0"/>
       <w:cols w:space="720"/>
       <w:docGrid w:linePitch="360"/>
     </w:sectPr>
@@ -3786,10 +3718,13 @@
     <w:name w:val="Normal"/>
     <w:qFormat/>
     <w:rsid w:val="00FC693F"/>
+    <w:pPr>
+      <w:spacing w:line="276" w:lineRule="auto"/>
+    </w:pPr>
     <w:rPr>
       <w:rFonts w:ascii="Calibri" w:hAnsi="Calibri"/>
-      <w:color w:val="202020"/>
-      <w:sz w:val="21"/>
+      <w:color w:val="1F1F1F"/>
+      <w:sz w:val="22"/>
     </w:rPr>
   </w:style>
   <w:style w:type="paragraph" w:styleId="Header">
@@ -4322,7 +4257,7 @@
     </w:pPr>
     <w:rPr>
       <w:rFonts w:ascii="Calibri" w:hAnsi="Calibri"/>
-      <w:sz w:val="21"/>
+      <w:sz w:val="22"/>
     </w:rPr>
   </w:style>
   <w:style w:type="paragraph" w:styleId="ListBullet2">

</xml_diff>

<commit_message>
Redesign: simple, elegant, institutional-grade CV
Removed all heavy navy blocks/bars and excessive shading.
New approach: clean white background, refined typography,
single thin gold accent rules under section headers, minimal
colour palette (navy headings, gold accents, charcoal body).

Visual identity:
- Centred name in navy uppercase with letter-spacing
- Single gold rule under name
- Italic navy title + grey tagline
- Section headers: uppercase navy bold with thin gold underline
- Role headers: company bold navy + role in bold italic gold
- Dates right-aligned via tab stops
- No filled blocks, no shaded bars, no background tints
- Clean white space throughout

ATS: 0 tables, 137 paragraphs, 1227 words, linear extraction
</commit_message>
<xml_diff>
--- a/Ruwain_Kelly_Executive_CV.docx
+++ b/Ruwain_Kelly_Executive_CV.docx
@@ -4,206 +4,159 @@
   <w:body>
     <w:p>
       <w:pPr>
-        <w:spacing w:before="0" w:after="0" w:line="240" w:lineRule="auto"/>
+        <w:spacing w:after="40"/>
         <w:jc w:val="center"/>
-        <w:shd w:val="clear" w:color="auto" w:fill="0F2544"/>
+      </w:pPr>
+      <w:r>
+        <w:rPr>
+          <w:rFonts w:ascii="Calibri" w:hAnsi="Calibri" w:cs="Calibri" w:eastAsia="Calibri"/>
+          <w:b/>
+          <w:i w:val="0"/>
+          <w:color w:val="1B2A4A"/>
+          <w:sz w:val="56"/>
+          <w:spacing w:val="120"/>
+        </w:rPr>
+        <w:t>RUWAIN KELLY</w:t>
+      </w:r>
+    </w:p>
+    <w:p>
+      <w:pPr>
+        <w:spacing w:before="0" w:after="80"/>
+        <w:jc w:val="center"/>
+        <w:pBdr>
+          <w:bottom w:val="single" w:sz="10" w:space="1" w:color="A6832E"/>
+        </w:pBdr>
+      </w:pPr>
+    </w:p>
+    <w:p>
+      <w:pPr>
+        <w:spacing w:after="40"/>
+        <w:jc w:val="center"/>
+      </w:pPr>
+      <w:r>
+        <w:rPr>
+          <w:rFonts w:ascii="Calibri" w:hAnsi="Calibri" w:cs="Calibri" w:eastAsia="Calibri"/>
+          <w:b w:val="0"/>
+          <w:i/>
+          <w:color w:val="1B2A4A"/>
+          <w:sz w:val="26"/>
+        </w:rPr>
+        <w:t>National Supply Chain, Procurement &amp; Operations Executive</w:t>
+      </w:r>
+    </w:p>
+    <w:p>
+      <w:pPr>
+        <w:spacing w:after="120"/>
+        <w:jc w:val="center"/>
+      </w:pPr>
+      <w:r>
+        <w:rPr>
+          <w:rFonts w:ascii="Calibri" w:hAnsi="Calibri" w:cs="Calibri" w:eastAsia="Calibri"/>
+          <w:b w:val="0"/>
+          <w:i/>
+          <w:color w:val="6B6B6B"/>
+          <w:sz w:val="20"/>
+        </w:rPr>
+        <w:t>Transforming supply chains into competitive advantage through operational excellence, commercial discipline and strategic leadership.</w:t>
+      </w:r>
+    </w:p>
+    <w:p>
+      <w:pPr>
+        <w:spacing w:after="20"/>
+        <w:jc w:val="center"/>
       </w:pPr>
       <w:r>
         <w:rPr>
           <w:rFonts w:ascii="Calibri" w:hAnsi="Calibri" w:cs="Calibri" w:eastAsia="Calibri"/>
           <w:b w:val="0"/>
           <w:i w:val="0"/>
-          <w:color w:val="0F2544"/>
-          <w:sz w:val="8"/>
-          <w:u w:val="none"/>
+          <w:color w:val="2C2C2C"/>
+          <w:sz w:val="21"/>
         </w:rPr>
-        <w:t xml:space="preserve"> </w:t>
+        <w:t>Durbanville, Cape Town, South Africa  |  +27 74 760 7776  |  info@ruwainkelly.com</w:t>
       </w:r>
     </w:p>
     <w:p>
       <w:pPr>
-        <w:spacing w:before="0" w:after="0" w:line="240" w:lineRule="auto"/>
+        <w:spacing w:after="80"/>
         <w:jc w:val="center"/>
-        <w:shd w:val="clear" w:color="auto" w:fill="0F2544"/>
+      </w:pPr>
+      <w:r>
+        <w:rPr>
+          <w:rFonts w:ascii="Calibri" w:hAnsi="Calibri" w:cs="Calibri" w:eastAsia="Calibri"/>
+          <w:b w:val="0"/>
+          <w:i/>
+          <w:color w:val="1B2A4A"/>
+          <w:sz w:val="21"/>
+        </w:rPr>
+        <w:t>linkedin.com/in/ruwainkelly</w:t>
+      </w:r>
+    </w:p>
+    <w:p>
+      <w:pPr>
+        <w:spacing w:before="40" w:after="40"/>
+        <w:pBdr>
+          <w:bottom w:val="single" w:sz="4" w:space="1" w:color="CCCCCC"/>
+        </w:pBdr>
+      </w:pPr>
+    </w:p>
+    <w:p>
+      <w:pPr>
+        <w:spacing w:before="280" w:after="60"/>
+        <w:pBdr>
+          <w:bottom w:val="single" w:sz="6" w:space="1" w:color="A6832E"/>
+        </w:pBdr>
       </w:pPr>
       <w:r>
         <w:rPr>
           <w:rFonts w:ascii="Calibri" w:hAnsi="Calibri" w:cs="Calibri" w:eastAsia="Calibri"/>
           <w:b/>
           <w:i w:val="0"/>
-          <w:color w:val="FFFFFF"/>
-          <w:sz w:val="64"/>
-          <w:u w:val="none"/>
+          <w:color w:val="1B2A4A"/>
+          <w:sz w:val="24"/>
           <w:caps w:val="1"/>
-          <w:spacing w:val="140"/>
+          <w:spacing w:val="60"/>
         </w:rPr>
-        <w:t>Ruwain Kelly</w:t>
+        <w:t>Executive Summary</w:t>
       </w:r>
     </w:p>
     <w:p>
       <w:pPr>
-        <w:spacing w:before="0" w:after="0" w:line="240" w:lineRule="auto"/>
-        <w:jc w:val="center"/>
-        <w:shd w:val="clear" w:color="auto" w:fill="0F2544"/>
+        <w:spacing w:after="100" w:line="288" w:lineRule="auto"/>
+        <w:jc w:val="both"/>
       </w:pPr>
       <w:r>
         <w:rPr>
           <w:rFonts w:ascii="Calibri" w:hAnsi="Calibri" w:cs="Calibri" w:eastAsia="Calibri"/>
           <w:b w:val="0"/>
           <w:i w:val="0"/>
-          <w:color w:val="0F2544"/>
-          <w:sz w:val="8"/>
-          <w:u w:val="none"/>
+          <w:color w:val="2C2C2C"/>
+          <w:sz w:val="22"/>
         </w:rPr>
-        <w:t xml:space="preserve"> </w:t>
+        <w:t>Senior Supply Chain, Procurement and Operations Executive with 15+ years of leadership across FMCG, manufacturing, logistics, warehousing and distribution. I turn fragmented, high-cost operations into scalable, high-performance functions that improve EBITDA, protect working capital and strengthen service delivery.</w:t>
       </w:r>
     </w:p>
     <w:p>
       <w:pPr>
-        <w:spacing w:before="0" w:after="0" w:line="240" w:lineRule="auto"/>
-        <w:jc w:val="center"/>
-        <w:shd w:val="clear" w:color="auto" w:fill="0F2544"/>
-      </w:pPr>
-      <w:r>
-        <w:rPr>
-          <w:rFonts w:ascii="Calibri" w:hAnsi="Calibri" w:cs="Calibri" w:eastAsia="Calibri"/>
-          <w:b w:val="0"/>
-          <w:i/>
-          <w:color w:val="E6C87A"/>
-          <w:sz w:val="26"/>
-          <w:u w:val="none"/>
-          <w:caps w:val="1"/>
-          <w:spacing w:val="40"/>
-        </w:rPr>
-        <w:t>National Supply Chain, Procurement &amp; Operations Executive</w:t>
-      </w:r>
-    </w:p>
-    <w:p>
-      <w:pPr>
-        <w:spacing w:before="0" w:after="0" w:line="240" w:lineRule="auto"/>
-        <w:jc w:val="center"/>
-        <w:shd w:val="clear" w:color="auto" w:fill="0F2544"/>
+        <w:spacing w:after="100" w:line="288" w:lineRule="auto"/>
+        <w:jc w:val="both"/>
       </w:pPr>
       <w:r>
         <w:rPr>
           <w:rFonts w:ascii="Calibri" w:hAnsi="Calibri" w:cs="Calibri" w:eastAsia="Calibri"/>
           <w:b w:val="0"/>
           <w:i w:val="0"/>
-          <w:color w:val="0F2544"/>
-          <w:sz w:val="4"/>
-          <w:u w:val="none"/>
+          <w:color w:val="2C2C2C"/>
+          <w:sz w:val="22"/>
         </w:rPr>
-        <w:t xml:space="preserve"> </w:t>
+        <w:t>Trusted by executive teams to lead enterprise-wide transformation, manage multi-site P&amp;Ls, re-engineer supplier ecosystems and embed governance that survives audit scrutiny. My approach combines commercial rigour with operational execution — delivering sustainable cost reduction, supply continuity and measurable business outcomes in competitive and regulated environments.</w:t>
       </w:r>
     </w:p>
     <w:p>
       <w:pPr>
-        <w:spacing w:before="0" w:after="0" w:line="276" w:lineRule="auto"/>
-        <w:ind w:left="850" w:right="850"/>
-        <w:jc w:val="center"/>
-        <w:shd w:val="clear" w:color="auto" w:fill="0F2544"/>
-      </w:pPr>
-      <w:r>
-        <w:rPr>
-          <w:rFonts w:ascii="Calibri" w:hAnsi="Calibri" w:cs="Calibri" w:eastAsia="Calibri"/>
-          <w:b w:val="0"/>
-          <w:i/>
-          <w:color w:val="E0E6EE"/>
-          <w:sz w:val="21"/>
-          <w:u w:val="none"/>
-        </w:rPr>
-        <w:t>Transforming supply chains into competitive advantage through operational excellence, commercial discipline and strategic leadership.</w:t>
-      </w:r>
-    </w:p>
-    <w:p>
-      <w:pPr>
-        <w:spacing w:before="80" w:after="0" w:line="240" w:lineRule="auto"/>
-        <w:jc w:val="center"/>
-        <w:shd w:val="clear" w:color="auto" w:fill="0F2544"/>
+        <w:spacing w:before="280" w:after="60"/>
         <w:pBdr>
-          <w:bottom w:val="single" w:sz="8" w:space="2" w:color="C0973C"/>
-        </w:pBdr>
-      </w:pPr>
-      <w:r>
-        <w:rPr>
-          <w:rFonts w:ascii="Calibri" w:hAnsi="Calibri" w:cs="Calibri" w:eastAsia="Calibri"/>
-          <w:b w:val="0"/>
-          <w:i w:val="0"/>
-          <w:color w:val="0F2544"/>
-          <w:sz w:val="4"/>
-          <w:u w:val="none"/>
-        </w:rPr>
-        <w:t xml:space="preserve"> </w:t>
-      </w:r>
-    </w:p>
-    <w:p>
-      <w:pPr>
-        <w:spacing w:before="40" w:after="0" w:line="288" w:lineRule="auto"/>
-        <w:jc w:val="center"/>
-        <w:shd w:val="clear" w:color="auto" w:fill="0F2544"/>
-      </w:pPr>
-      <w:r>
-        <w:rPr>
-          <w:rFonts w:ascii="Calibri" w:hAnsi="Calibri" w:cs="Calibri" w:eastAsia="Calibri"/>
-          <w:b w:val="0"/>
-          <w:i w:val="0"/>
-          <w:color w:val="FFFFFF"/>
-          <w:sz w:val="21"/>
-          <w:u w:val="none"/>
-        </w:rPr>
-        <w:t>Durbanville, Cape Town, South Africa  |  +27 74 760 7776  |  info@ruwainkelly.com</w:t>
-      </w:r>
-    </w:p>
-    <w:p>
-      <w:pPr>
-        <w:spacing w:before="0" w:after="0" w:line="288" w:lineRule="auto"/>
-        <w:jc w:val="center"/>
-        <w:shd w:val="clear" w:color="auto" w:fill="0F2544"/>
-      </w:pPr>
-      <w:r>
-        <w:rPr>
-          <w:rFonts w:ascii="Calibri" w:hAnsi="Calibri" w:cs="Calibri" w:eastAsia="Calibri"/>
-          <w:b w:val="0"/>
-          <w:i w:val="0"/>
-          <w:color w:val="FFFFFF"/>
-          <w:sz w:val="21"/>
-          <w:u w:val="none"/>
-        </w:rPr>
-        <w:t>linkedin.com/in/ruwainkelly</w:t>
-      </w:r>
-    </w:p>
-    <w:p>
-      <w:pPr>
-        <w:spacing w:before="0" w:after="0" w:line="240" w:lineRule="auto"/>
-        <w:jc w:val="center"/>
-        <w:shd w:val="clear" w:color="auto" w:fill="0F2544"/>
-      </w:pPr>
-      <w:r>
-        <w:rPr>
-          <w:rFonts w:ascii="Calibri" w:hAnsi="Calibri" w:cs="Calibri" w:eastAsia="Calibri"/>
-          <w:b w:val="0"/>
-          <w:i w:val="0"/>
-          <w:color w:val="0F2544"/>
-          <w:sz w:val="8"/>
-          <w:u w:val="none"/>
-        </w:rPr>
-        <w:t xml:space="preserve"> </w:t>
-      </w:r>
-    </w:p>
-    <w:p>
-      <w:pPr>
-        <w:spacing w:before="40" w:after="0" w:line="240" w:lineRule="auto"/>
-      </w:pPr>
-    </w:p>
-    <w:p>
-      <w:pPr>
-        <w:spacing w:before="40" w:after="40" w:line="312" w:lineRule="auto"/>
-        <w:ind w:left="113" w:right="113"/>
-        <w:jc w:val="center"/>
-        <w:shd w:val="clear" w:color="auto" w:fill="F6F1E5"/>
-        <w:pBdr>
-          <w:top w:val="single" w:sz="6" w:space="2" w:color="C0973C"/>
-          <w:bottom w:val="single" w:sz="6" w:space="2" w:color="C0973C"/>
+          <w:bottom w:val="single" w:sz="6" w:space="1" w:color="A6832E"/>
         </w:pBdr>
       </w:pPr>
       <w:r>
@@ -211,621 +164,375 @@
           <w:rFonts w:ascii="Calibri" w:hAnsi="Calibri" w:cs="Calibri" w:eastAsia="Calibri"/>
           <w:b/>
           <w:i w:val="0"/>
-          <w:color w:val="0F2544"/>
-          <w:sz w:val="22"/>
-          <w:u w:val="none"/>
+          <w:color w:val="1B2A4A"/>
+          <w:sz w:val="24"/>
           <w:caps w:val="1"/>
-          <w:spacing w:val="20"/>
+          <w:spacing w:val="60"/>
         </w:rPr>
-        <w:t>15+ Years Executive</w:t>
+        <w:t>Career Highlights</w:t>
       </w:r>
+    </w:p>
+    <w:p>
+      <w:pPr>
+        <w:spacing w:before="40" w:after="60" w:line="288" w:lineRule="auto"/>
+      </w:pPr>
       <w:r>
         <w:rPr>
           <w:rFonts w:ascii="Calibri" w:hAnsi="Calibri" w:cs="Calibri" w:eastAsia="Calibri"/>
           <w:b/>
           <w:i w:val="0"/>
-          <w:color w:val="C0973C"/>
-          <w:sz w:val="22"/>
-          <w:u w:val="none"/>
+          <w:color w:val="1B2A4A"/>
+          <w:sz w:val="21"/>
         </w:rPr>
-        <w:t xml:space="preserve">  |  </w:t>
-      </w:r>
-      <w:r>
-        <w:rPr>
-          <w:rFonts w:ascii="Calibri" w:hAnsi="Calibri" w:cs="Calibri" w:eastAsia="Calibri"/>
-          <w:b/>
-          <w:i w:val="0"/>
-          <w:color w:val="0F2544"/>
-          <w:sz w:val="22"/>
-          <w:u w:val="none"/>
-          <w:caps w:val="1"/>
-          <w:spacing w:val="20"/>
-        </w:rPr>
-        <w:t>R25M+ Budgets</w:t>
-      </w:r>
-      <w:r>
-        <w:rPr>
-          <w:rFonts w:ascii="Calibri" w:hAnsi="Calibri" w:cs="Calibri" w:eastAsia="Calibri"/>
-          <w:b/>
-          <w:i w:val="0"/>
-          <w:color w:val="C0973C"/>
-          <w:sz w:val="22"/>
-          <w:u w:val="none"/>
-        </w:rPr>
-        <w:t xml:space="preserve">  |  </w:t>
-      </w:r>
-      <w:r>
-        <w:rPr>
-          <w:rFonts w:ascii="Calibri" w:hAnsi="Calibri" w:cs="Calibri" w:eastAsia="Calibri"/>
-          <w:b/>
-          <w:i w:val="0"/>
-          <w:color w:val="0F2544"/>
-          <w:sz w:val="22"/>
-          <w:u w:val="none"/>
-          <w:caps w:val="1"/>
-          <w:spacing w:val="20"/>
-        </w:rPr>
-        <w:t>120+ Team Led</w:t>
-      </w:r>
-      <w:r>
-        <w:rPr>
-          <w:rFonts w:ascii="Calibri" w:hAnsi="Calibri" w:cs="Calibri" w:eastAsia="Calibri"/>
-          <w:b/>
-          <w:i w:val="0"/>
-          <w:color w:val="C0973C"/>
-          <w:sz w:val="22"/>
-          <w:u w:val="none"/>
-        </w:rPr>
-        <w:t xml:space="preserve">  |  </w:t>
-      </w:r>
-      <w:r>
-        <w:rPr>
-          <w:rFonts w:ascii="Calibri" w:hAnsi="Calibri" w:cs="Calibri" w:eastAsia="Calibri"/>
-          <w:b/>
-          <w:i w:val="0"/>
-          <w:color w:val="0F2544"/>
-          <w:sz w:val="22"/>
-          <w:u w:val="none"/>
-          <w:caps w:val="1"/>
-          <w:spacing w:val="20"/>
-        </w:rPr>
-        <w:t>&gt;95% OTIF</w:t>
-      </w:r>
-      <w:r>
-        <w:rPr>
-          <w:rFonts w:ascii="Calibri" w:hAnsi="Calibri" w:cs="Calibri" w:eastAsia="Calibri"/>
-          <w:b/>
-          <w:i w:val="0"/>
-          <w:color w:val="C0973C"/>
-          <w:sz w:val="22"/>
-          <w:u w:val="none"/>
-        </w:rPr>
-        <w:t xml:space="preserve">  |  </w:t>
-      </w:r>
-      <w:r>
-        <w:rPr>
-          <w:rFonts w:ascii="Calibri" w:hAnsi="Calibri" w:cs="Calibri" w:eastAsia="Calibri"/>
-          <w:b/>
-          <w:i w:val="0"/>
-          <w:color w:val="0F2544"/>
-          <w:sz w:val="22"/>
-          <w:u w:val="none"/>
-          <w:caps w:val="1"/>
-          <w:spacing w:val="20"/>
-        </w:rPr>
-        <w:t>Zero Audit Findings</w:t>
-      </w:r>
-    </w:p>
-    <w:p>
-      <w:pPr>
-        <w:spacing w:before="240" w:after="80" w:line="276" w:lineRule="auto"/>
-        <w:ind w:left="142"/>
-        <w:shd w:val="clear" w:color="auto" w:fill="0F2544"/>
-      </w:pPr>
-      <w:r>
-        <w:rPr>
-          <w:rFonts w:ascii="Calibri" w:hAnsi="Calibri" w:cs="Calibri" w:eastAsia="Calibri"/>
-          <w:b/>
-          <w:i w:val="0"/>
-          <w:color w:val="FFFFFF"/>
-          <w:sz w:val="25"/>
-          <w:u w:val="none"/>
-          <w:caps w:val="1"/>
-          <w:spacing w:val="80"/>
-        </w:rPr>
-        <w:t>Executive Summary</w:t>
-      </w:r>
-    </w:p>
-    <w:p>
-      <w:pPr>
-        <w:spacing w:before="0" w:after="120" w:line="288" w:lineRule="auto"/>
-        <w:jc w:val="both"/>
-      </w:pPr>
-      <w:r>
-        <w:rPr>
-          <w:rFonts w:ascii="Calibri" w:hAnsi="Calibri" w:cs="Calibri" w:eastAsia="Calibri"/>
-          <w:b w:val="0"/>
-          <w:i w:val="0"/>
-          <w:color w:val="1B1B1B"/>
-          <w:sz w:val="22"/>
-          <w:u w:val="none"/>
-        </w:rPr>
-        <w:t>Senior Supply Chain, Procurement and Operations Executive with 15+ years of leadership across FMCG, manufacturing, logistics, warehousing and distribution. I turn fragmented, high-cost operations into scalable, high-performance functions that improve EBITDA, protect working capital and strengthen service delivery.</w:t>
-      </w:r>
-    </w:p>
-    <w:p>
-      <w:pPr>
-        <w:spacing w:before="0" w:after="80" w:line="288" w:lineRule="auto"/>
-        <w:jc w:val="both"/>
-      </w:pPr>
-      <w:r>
-        <w:rPr>
-          <w:rFonts w:ascii="Calibri" w:hAnsi="Calibri" w:cs="Calibri" w:eastAsia="Calibri"/>
-          <w:b w:val="0"/>
-          <w:i w:val="0"/>
-          <w:color w:val="1B1B1B"/>
-          <w:sz w:val="22"/>
-          <w:u w:val="none"/>
-        </w:rPr>
-        <w:t>Trusted by executive teams to lead enterprise-wide transformation, manage multi-site P&amp;Ls, re-engineer supplier ecosystems and embed governance that survives audit scrutiny. My approach combines commercial rigour with operational execution — delivering sustainable cost reduction, supply continuity and measurable business outcomes in competitive and regulated environments.</w:t>
-      </w:r>
-    </w:p>
-    <w:p>
-      <w:pPr>
-        <w:spacing w:before="240" w:after="80" w:line="276" w:lineRule="auto"/>
-        <w:ind w:left="142"/>
-        <w:shd w:val="clear" w:color="auto" w:fill="0F2544"/>
-      </w:pPr>
-      <w:r>
-        <w:rPr>
-          <w:rFonts w:ascii="Calibri" w:hAnsi="Calibri" w:cs="Calibri" w:eastAsia="Calibri"/>
-          <w:b/>
-          <w:i w:val="0"/>
-          <w:color w:val="FFFFFF"/>
-          <w:sz w:val="25"/>
-          <w:u w:val="none"/>
-          <w:caps w:val="1"/>
-          <w:spacing w:val="80"/>
-        </w:rPr>
-        <w:t>Impact at a Glance</w:t>
-      </w:r>
-    </w:p>
-    <w:p>
-      <w:pPr>
-        <w:spacing w:before="20" w:after="20" w:line="288" w:lineRule="auto"/>
-        <w:ind w:left="170"/>
-        <w:shd w:val="clear" w:color="auto" w:fill="F6F1E5"/>
-        <w:pBdr>
-          <w:left w:val="single" w:sz="24" w:space="6" w:color="C0973C"/>
-        </w:pBdr>
-      </w:pPr>
-      <w:r>
-        <w:rPr>
-          <w:rFonts w:ascii="Calibri" w:hAnsi="Calibri" w:cs="Calibri" w:eastAsia="Calibri"/>
-          <w:b/>
-          <w:i w:val="0"/>
-          <w:color w:val="0F2544"/>
-          <w:sz w:val="22"/>
-          <w:u w:val="none"/>
-          <w:caps w:val="1"/>
-          <w:spacing w:val="30"/>
-        </w:rPr>
-        <w:t xml:space="preserve">Experience  </w:t>
+        <w:t xml:space="preserve">Experience:  </w:t>
       </w:r>
       <w:r>
         <w:rPr>
           <w:rFonts w:ascii="Calibri" w:hAnsi="Calibri" w:cs="Calibri" w:eastAsia="Calibri"/>
           <w:b w:val="0"/>
           <w:i w:val="0"/>
-          <w:color w:val="1B1B1B"/>
-          <w:sz w:val="22"/>
-          <w:u w:val="none"/>
+          <w:color w:val="2C2C2C"/>
+          <w:sz w:val="21"/>
         </w:rPr>
-        <w:t>15+ years executive leadership across FMCG, manufacturing, logistics &amp; distribution.</w:t>
+        <w:t>15+ years executive leadership across FMCG, manufacturing, logistics and distribution.</w:t>
       </w:r>
     </w:p>
     <w:p>
       <w:pPr>
-        <w:spacing w:before="20" w:after="20" w:line="288" w:lineRule="auto"/>
-        <w:ind w:left="170"/>
-        <w:shd w:val="clear" w:color="auto" w:fill="F6F1E5"/>
-        <w:pBdr>
-          <w:left w:val="single" w:sz="24" w:space="6" w:color="C0973C"/>
-        </w:pBdr>
+        <w:spacing w:before="40" w:after="60" w:line="288" w:lineRule="auto"/>
       </w:pPr>
       <w:r>
         <w:rPr>
           <w:rFonts w:ascii="Calibri" w:hAnsi="Calibri" w:cs="Calibri" w:eastAsia="Calibri"/>
           <w:b/>
           <w:i w:val="0"/>
-          <w:color w:val="0F2544"/>
-          <w:sz w:val="22"/>
-          <w:u w:val="none"/>
-          <w:caps w:val="1"/>
-          <w:spacing w:val="30"/>
+          <w:color w:val="1B2A4A"/>
+          <w:sz w:val="21"/>
         </w:rPr>
-        <w:t xml:space="preserve">Financial Scale  </w:t>
+        <w:t xml:space="preserve">Financial Scale:  </w:t>
       </w:r>
       <w:r>
         <w:rPr>
           <w:rFonts w:ascii="Calibri" w:hAnsi="Calibri" w:cs="Calibri" w:eastAsia="Calibri"/>
           <w:b w:val="0"/>
           <w:i w:val="0"/>
-          <w:color w:val="1B1B1B"/>
-          <w:sz w:val="22"/>
-          <w:u w:val="none"/>
+          <w:color w:val="2C2C2C"/>
+          <w:sz w:val="21"/>
         </w:rPr>
-        <w:t>Managed budgets exceeding R25M; recurring procurement savings; OPEX reduction via process redesign.</w:t>
+        <w:t>Managed budgets exceeding R25M; recurring procurement savings; OPEX reduction.</w:t>
       </w:r>
     </w:p>
     <w:p>
       <w:pPr>
-        <w:spacing w:before="20" w:after="20" w:line="288" w:lineRule="auto"/>
-        <w:ind w:left="170"/>
-        <w:shd w:val="clear" w:color="auto" w:fill="F6F1E5"/>
-        <w:pBdr>
-          <w:left w:val="single" w:sz="24" w:space="6" w:color="C0973C"/>
-        </w:pBdr>
+        <w:spacing w:before="40" w:after="60" w:line="288" w:lineRule="auto"/>
       </w:pPr>
       <w:r>
         <w:rPr>
           <w:rFonts w:ascii="Calibri" w:hAnsi="Calibri" w:cs="Calibri" w:eastAsia="Calibri"/>
           <w:b/>
           <w:i w:val="0"/>
-          <w:color w:val="0F2544"/>
-          <w:sz w:val="22"/>
-          <w:u w:val="none"/>
-          <w:caps w:val="1"/>
-          <w:spacing w:val="30"/>
+          <w:color w:val="1B2A4A"/>
+          <w:sz w:val="21"/>
         </w:rPr>
-        <w:t xml:space="preserve">Service Delivery  </w:t>
+        <w:t xml:space="preserve">Service Delivery:  </w:t>
       </w:r>
       <w:r>
         <w:rPr>
           <w:rFonts w:ascii="Calibri" w:hAnsi="Calibri" w:cs="Calibri" w:eastAsia="Calibri"/>
           <w:b w:val="0"/>
           <w:i w:val="0"/>
-          <w:color w:val="1B1B1B"/>
-          <w:sz w:val="22"/>
-          <w:u w:val="none"/>
+          <w:color w:val="2C2C2C"/>
+          <w:sz w:val="21"/>
         </w:rPr>
-        <w:t>OTIF performance &gt;95%; reduced fulfilment lead times; multi-site distribution at national scale.</w:t>
+        <w:t>OTIF performance &gt;95%; reduced fulfilment lead times at national scale.</w:t>
       </w:r>
     </w:p>
     <w:p>
       <w:pPr>
-        <w:spacing w:before="20" w:after="20" w:line="288" w:lineRule="auto"/>
-        <w:ind w:left="170"/>
-        <w:shd w:val="clear" w:color="auto" w:fill="F6F1E5"/>
-        <w:pBdr>
-          <w:left w:val="single" w:sz="24" w:space="6" w:color="C0973C"/>
-        </w:pBdr>
+        <w:spacing w:before="40" w:after="60" w:line="288" w:lineRule="auto"/>
       </w:pPr>
       <w:r>
         <w:rPr>
           <w:rFonts w:ascii="Calibri" w:hAnsi="Calibri" w:cs="Calibri" w:eastAsia="Calibri"/>
           <w:b/>
           <w:i w:val="0"/>
-          <w:color w:val="0F2544"/>
-          <w:sz w:val="22"/>
-          <w:u w:val="none"/>
-          <w:caps w:val="1"/>
-          <w:spacing w:val="30"/>
+          <w:color w:val="1B2A4A"/>
+          <w:sz w:val="21"/>
         </w:rPr>
-        <w:t xml:space="preserve">Team Leadership  </w:t>
+        <w:t xml:space="preserve">Team Leadership:  </w:t>
       </w:r>
       <w:r>
         <w:rPr>
           <w:rFonts w:ascii="Calibri" w:hAnsi="Calibri" w:cs="Calibri" w:eastAsia="Calibri"/>
           <w:b w:val="0"/>
           <w:i w:val="0"/>
-          <w:color w:val="1B1B1B"/>
-          <w:sz w:val="22"/>
-          <w:u w:val="none"/>
+          <w:color w:val="2C2C2C"/>
+          <w:sz w:val="21"/>
         </w:rPr>
         <w:t>Led teams of 120+ across warehouse, fleet, procurement and operations.</w:t>
       </w:r>
     </w:p>
     <w:p>
       <w:pPr>
-        <w:spacing w:before="20" w:after="20" w:line="288" w:lineRule="auto"/>
-        <w:ind w:left="170"/>
-        <w:shd w:val="clear" w:color="auto" w:fill="F6F1E5"/>
-        <w:pBdr>
-          <w:left w:val="single" w:sz="24" w:space="6" w:color="C0973C"/>
-        </w:pBdr>
+        <w:spacing w:before="40" w:after="60" w:line="288" w:lineRule="auto"/>
       </w:pPr>
       <w:r>
         <w:rPr>
           <w:rFonts w:ascii="Calibri" w:hAnsi="Calibri" w:cs="Calibri" w:eastAsia="Calibri"/>
           <w:b/>
           <w:i w:val="0"/>
-          <w:color w:val="0F2544"/>
-          <w:sz w:val="22"/>
-          <w:u w:val="none"/>
-          <w:caps w:val="1"/>
-          <w:spacing w:val="30"/>
+          <w:color w:val="1B2A4A"/>
+          <w:sz w:val="21"/>
         </w:rPr>
-        <w:t xml:space="preserve">Transformation  </w:t>
+        <w:t xml:space="preserve">Transformation:  </w:t>
       </w:r>
       <w:r>
         <w:rPr>
           <w:rFonts w:ascii="Calibri" w:hAnsi="Calibri" w:cs="Calibri" w:eastAsia="Calibri"/>
           <w:b w:val="0"/>
           <w:i w:val="0"/>
-          <w:color w:val="1B1B1B"/>
-          <w:sz w:val="22"/>
-          <w:u w:val="none"/>
+          <w:color w:val="2C2C2C"/>
+          <w:sz w:val="21"/>
         </w:rPr>
-        <w:t>Enterprise improvement programmes, ERP / SAP / WMS deployment, S&amp;OP governance, KPI-driven cultures.</w:t>
+        <w:t>Enterprise programmes: ERP / SAP / WMS deployment, S&amp;OP governance, KPI cultures.</w:t>
       </w:r>
     </w:p>
     <w:p>
       <w:pPr>
-        <w:spacing w:before="20" w:after="20" w:line="288" w:lineRule="auto"/>
-        <w:ind w:left="170"/>
-        <w:shd w:val="clear" w:color="auto" w:fill="F6F1E5"/>
-        <w:pBdr>
-          <w:left w:val="single" w:sz="24" w:space="6" w:color="C0973C"/>
-        </w:pBdr>
+        <w:spacing w:before="40" w:after="60" w:line="288" w:lineRule="auto"/>
       </w:pPr>
       <w:r>
         <w:rPr>
           <w:rFonts w:ascii="Calibri" w:hAnsi="Calibri" w:cs="Calibri" w:eastAsia="Calibri"/>
           <w:b/>
           <w:i w:val="0"/>
-          <w:color w:val="0F2544"/>
-          <w:sz w:val="22"/>
-          <w:u w:val="none"/>
-          <w:caps w:val="1"/>
-          <w:spacing w:val="30"/>
+          <w:color w:val="1B2A4A"/>
+          <w:sz w:val="21"/>
         </w:rPr>
-        <w:t xml:space="preserve">Compliance  </w:t>
+        <w:t xml:space="preserve">Compliance:  </w:t>
       </w:r>
       <w:r>
         <w:rPr>
           <w:rFonts w:ascii="Calibri" w:hAnsi="Calibri" w:cs="Calibri" w:eastAsia="Calibri"/>
           <w:b w:val="0"/>
           <w:i w:val="0"/>
-          <w:color w:val="1B1B1B"/>
-          <w:sz w:val="22"/>
-          <w:u w:val="none"/>
+          <w:color w:val="2C2C2C"/>
+          <w:sz w:val="21"/>
         </w:rPr>
-        <w:t>Zero major audit findings; OHSA, Labour Relations Act and regulatory compliance leadership.</w:t>
+        <w:t>Zero major audit findings; OHSA and Labour Relations Act leadership.</w:t>
       </w:r>
     </w:p>
     <w:p>
       <w:pPr>
-        <w:spacing w:before="20" w:after="20" w:line="288" w:lineRule="auto"/>
-        <w:ind w:left="170"/>
-        <w:shd w:val="clear" w:color="auto" w:fill="F6F1E5"/>
-        <w:pBdr>
-          <w:left w:val="single" w:sz="24" w:space="6" w:color="C0973C"/>
-        </w:pBdr>
+        <w:spacing w:before="40" w:after="60" w:line="288" w:lineRule="auto"/>
       </w:pPr>
       <w:r>
         <w:rPr>
           <w:rFonts w:ascii="Calibri" w:hAnsi="Calibri" w:cs="Calibri" w:eastAsia="Calibri"/>
           <w:b/>
           <w:i w:val="0"/>
-          <w:color w:val="0F2544"/>
-          <w:sz w:val="22"/>
-          <w:u w:val="none"/>
-          <w:caps w:val="1"/>
-          <w:spacing w:val="30"/>
+          <w:color w:val="1B2A4A"/>
+          <w:sz w:val="21"/>
         </w:rPr>
-        <w:t xml:space="preserve">Geography  </w:t>
+        <w:t xml:space="preserve">Geography:  </w:t>
       </w:r>
       <w:r>
         <w:rPr>
           <w:rFonts w:ascii="Calibri" w:hAnsi="Calibri" w:cs="Calibri" w:eastAsia="Calibri"/>
           <w:b w:val="0"/>
           <w:i w:val="0"/>
-          <w:color w:val="1B1B1B"/>
-          <w:sz w:val="22"/>
-          <w:u w:val="none"/>
+          <w:color w:val="2C2C2C"/>
+          <w:sz w:val="21"/>
         </w:rPr>
         <w:t>Dual SA / DE residency  |  Remote, Hybrid or On-Site  |  Available immediately.</w:t>
       </w:r>
     </w:p>
     <w:p>
       <w:pPr>
-        <w:spacing w:before="240" w:after="80" w:line="276" w:lineRule="auto"/>
-        <w:ind w:left="142"/>
-        <w:shd w:val="clear" w:color="auto" w:fill="0F2544"/>
+        <w:spacing w:before="280" w:after="60"/>
+        <w:pBdr>
+          <w:bottom w:val="single" w:sz="6" w:space="1" w:color="A6832E"/>
+        </w:pBdr>
       </w:pPr>
       <w:r>
         <w:rPr>
           <w:rFonts w:ascii="Calibri" w:hAnsi="Calibri" w:cs="Calibri" w:eastAsia="Calibri"/>
           <w:b/>
           <w:i w:val="0"/>
-          <w:color w:val="FFFFFF"/>
-          <w:sz w:val="25"/>
-          <w:u w:val="none"/>
+          <w:color w:val="1B2A4A"/>
+          <w:sz w:val="24"/>
           <w:caps w:val="1"/>
-          <w:spacing w:val="80"/>
+          <w:spacing w:val="60"/>
         </w:rPr>
         <w:t>Core Competencies</w:t>
       </w:r>
     </w:p>
     <w:p>
       <w:pPr>
-        <w:spacing w:before="20" w:after="60" w:line="288" w:lineRule="auto"/>
+        <w:spacing w:after="40" w:line="288" w:lineRule="auto"/>
       </w:pPr>
       <w:r>
         <w:rPr>
           <w:rFonts w:ascii="Calibri" w:hAnsi="Calibri" w:cs="Calibri" w:eastAsia="Calibri"/>
           <w:b/>
           <w:i w:val="0"/>
-          <w:color w:val="0F2544"/>
-          <w:sz w:val="22"/>
-          <w:u w:val="none"/>
+          <w:color w:val="1B2A4A"/>
+          <w:sz w:val="21"/>
         </w:rPr>
-        <w:t xml:space="preserve">Strategic Focus:  </w:t>
+        <w:t xml:space="preserve">Strategic:  </w:t>
       </w:r>
       <w:r>
         <w:rPr>
           <w:rFonts w:ascii="Calibri" w:hAnsi="Calibri" w:cs="Calibri" w:eastAsia="Calibri"/>
           <w:b w:val="0"/>
           <w:i w:val="0"/>
-          <w:color w:val="1B1B1B"/>
-          <w:sz w:val="22"/>
-          <w:u w:val="none"/>
+          <w:color w:val="2C2C2C"/>
+          <w:sz w:val="21"/>
         </w:rPr>
         <w:t>Procurement Cost Optimisation  |  Working Capital Improvement  |  Inventory Optimisation  |  Supply Chain Transformation  |  SAP-Driven Operational Excellence</w:t>
       </w:r>
     </w:p>
     <w:p>
       <w:pPr>
-        <w:spacing w:before="20" w:after="60" w:line="288" w:lineRule="auto"/>
+        <w:spacing w:after="40" w:line="288" w:lineRule="auto"/>
       </w:pPr>
       <w:r>
         <w:rPr>
           <w:rFonts w:ascii="Calibri" w:hAnsi="Calibri" w:cs="Calibri" w:eastAsia="Calibri"/>
           <w:b/>
           <w:i w:val="0"/>
-          <w:color w:val="0F2544"/>
-          <w:sz w:val="22"/>
-          <w:u w:val="none"/>
+          <w:color w:val="1B2A4A"/>
+          <w:sz w:val="21"/>
         </w:rPr>
-        <w:t xml:space="preserve">Commercial Leadership:  </w:t>
+        <w:t xml:space="preserve">Commercial:  </w:t>
       </w:r>
       <w:r>
         <w:rPr>
           <w:rFonts w:ascii="Calibri" w:hAnsi="Calibri" w:cs="Calibri" w:eastAsia="Calibri"/>
           <w:b w:val="0"/>
           <w:i w:val="0"/>
-          <w:color w:val="1B1B1B"/>
-          <w:sz w:val="22"/>
-          <w:u w:val="none"/>
+          <w:color w:val="2C2C2C"/>
+          <w:sz w:val="21"/>
         </w:rPr>
         <w:t>Strategic Sourcing &amp; Category Management  |  Contract Negotiation  |  Supplier Relationship Management  |  Cost-to-Serve Optimisation  |  Margin Protection</w:t>
       </w:r>
     </w:p>
     <w:p>
       <w:pPr>
-        <w:spacing w:before="20" w:after="60" w:line="288" w:lineRule="auto"/>
+        <w:spacing w:after="40" w:line="288" w:lineRule="auto"/>
       </w:pPr>
       <w:r>
         <w:rPr>
           <w:rFonts w:ascii="Calibri" w:hAnsi="Calibri" w:cs="Calibri" w:eastAsia="Calibri"/>
           <w:b/>
           <w:i w:val="0"/>
-          <w:color w:val="0F2544"/>
-          <w:sz w:val="22"/>
-          <w:u w:val="none"/>
+          <w:color w:val="1B2A4A"/>
+          <w:sz w:val="21"/>
         </w:rPr>
-        <w:t xml:space="preserve">Supply Chain Excellence:  </w:t>
+        <w:t xml:space="preserve">Supply Chain:  </w:t>
       </w:r>
       <w:r>
         <w:rPr>
           <w:rFonts w:ascii="Calibri" w:hAnsi="Calibri" w:cs="Calibri" w:eastAsia="Calibri"/>
           <w:b w:val="0"/>
           <w:i w:val="0"/>
-          <w:color w:val="1B1B1B"/>
-          <w:sz w:val="22"/>
-          <w:u w:val="none"/>
+          <w:color w:val="2C2C2C"/>
+          <w:sz w:val="21"/>
         </w:rPr>
-        <w:t>End-to-End Supply Chain  |  S&amp;OP / Demand Planning  |  Inventory &amp; Demand Planning  |  Warehouse &amp; Distribution  |  Transport &amp; Fleet Optimisation</w:t>
+        <w:t>End-to-End Supply Chain  |  S&amp;OP / Demand Planning  |  Warehouse &amp; Distribution  |  Transport &amp; Fleet Optimisation  |  Supply Chain Risk Management</w:t>
       </w:r>
     </w:p>
     <w:p>
       <w:pPr>
-        <w:spacing w:before="20" w:after="60" w:line="288" w:lineRule="auto"/>
+        <w:spacing w:after="40" w:line="288" w:lineRule="auto"/>
       </w:pPr>
       <w:r>
         <w:rPr>
           <w:rFonts w:ascii="Calibri" w:hAnsi="Calibri" w:cs="Calibri" w:eastAsia="Calibri"/>
           <w:b/>
           <w:i w:val="0"/>
-          <w:color w:val="0F2544"/>
-          <w:sz w:val="22"/>
-          <w:u w:val="none"/>
+          <w:color w:val="1B2A4A"/>
+          <w:sz w:val="21"/>
         </w:rPr>
-        <w:t xml:space="preserve">Operational Leadership:  </w:t>
+        <w:t xml:space="preserve">Operations:  </w:t>
       </w:r>
       <w:r>
         <w:rPr>
           <w:rFonts w:ascii="Calibri" w:hAnsi="Calibri" w:cs="Calibri" w:eastAsia="Calibri"/>
           <w:b w:val="0"/>
           <w:i w:val="0"/>
-          <w:color w:val="1B1B1B"/>
-          <w:sz w:val="22"/>
-          <w:u w:val="none"/>
+          <w:color w:val="2C2C2C"/>
+          <w:sz w:val="21"/>
         </w:rPr>
-        <w:t>Multi-Site P&amp;L Accountability  |  Continuous Improvement / Lean Six Sigma  |  Performance &amp; KPI Management  |  Health &amp; Safety Compliance  |  Industrial &amp; Union Relations</w:t>
+        <w:t>Multi-Site P&amp;L Accountability  |  Lean Six Sigma  |  Performance &amp; KPI Management  |  Health &amp; Safety Compliance  |  Industrial &amp; Union Relations</w:t>
       </w:r>
     </w:p>
     <w:p>
       <w:pPr>
-        <w:spacing w:before="20" w:after="60" w:line="288" w:lineRule="auto"/>
+        <w:spacing w:after="40" w:line="288" w:lineRule="auto"/>
       </w:pPr>
       <w:r>
         <w:rPr>
           <w:rFonts w:ascii="Calibri" w:hAnsi="Calibri" w:cs="Calibri" w:eastAsia="Calibri"/>
           <w:b/>
           <w:i w:val="0"/>
-          <w:color w:val="0F2544"/>
-          <w:sz w:val="22"/>
-          <w:u w:val="none"/>
+          <w:color w:val="1B2A4A"/>
+          <w:sz w:val="21"/>
         </w:rPr>
-        <w:t xml:space="preserve">Executive Governance:  </w:t>
+        <w:t xml:space="preserve">Governance:  </w:t>
       </w:r>
       <w:r>
         <w:rPr>
           <w:rFonts w:ascii="Calibri" w:hAnsi="Calibri" w:cs="Calibri" w:eastAsia="Calibri"/>
           <w:b w:val="0"/>
           <w:i w:val="0"/>
-          <w:color w:val="1B1B1B"/>
-          <w:sz w:val="22"/>
-          <w:u w:val="none"/>
+          <w:color w:val="2C2C2C"/>
+          <w:sz w:val="21"/>
         </w:rPr>
-        <w:t>Executive Committee Engagement  |  Strategic Planning &amp; Transformation  |  Change Leadership  |  Risk &amp; Audit Readiness  |  Cross-Functional Leadership</w:t>
+        <w:t>Executive Committee Engagement  |  Strategic Planning  |  Change Leadership  |  Risk &amp; Audit Readiness  |  Cross-Functional Leadership</w:t>
       </w:r>
     </w:p>
     <w:p>
       <w:pPr>
-        <w:spacing w:before="20" w:after="60" w:line="288" w:lineRule="auto"/>
+        <w:spacing w:after="40" w:line="288" w:lineRule="auto"/>
       </w:pPr>
       <w:r>
         <w:rPr>
           <w:rFonts w:ascii="Calibri" w:hAnsi="Calibri" w:cs="Calibri" w:eastAsia="Calibri"/>
           <w:b/>
           <w:i w:val="0"/>
-          <w:color w:val="0F2544"/>
-          <w:sz w:val="22"/>
-          <w:u w:val="none"/>
+          <w:color w:val="1B2A4A"/>
+          <w:sz w:val="21"/>
         </w:rPr>
-        <w:t xml:space="preserve">Systems &amp; Tools:  </w:t>
+        <w:t xml:space="preserve">Systems:  </w:t>
       </w:r>
       <w:r>
         <w:rPr>
           <w:rFonts w:ascii="Calibri" w:hAnsi="Calibri" w:cs="Calibri" w:eastAsia="Calibri"/>
           <w:b w:val="0"/>
           <w:i w:val="0"/>
-          <w:color w:val="1B1B1B"/>
-          <w:sz w:val="22"/>
-          <w:u w:val="none"/>
+          <w:color w:val="2C2C2C"/>
+          <w:sz w:val="21"/>
         </w:rPr>
-        <w:t>SAP  |  ERP (SYSPRO, Odoo, Sage)  |  WMS  |  Power BI  |  Advanced Excel  |  MS Project  |  BI Dashboards</w:t>
+        <w:t>SAP  |  ERP (SYSPRO, Odoo, Sage)  |  WMS  |  Power BI  |  Advanced Excel  |  MS Project</w:t>
       </w:r>
     </w:p>
     <w:p>
       <w:pPr>
-        <w:spacing w:before="240" w:after="80" w:line="276" w:lineRule="auto"/>
-        <w:ind w:left="142"/>
-        <w:shd w:val="clear" w:color="auto" w:fill="0F2544"/>
+        <w:spacing w:before="280" w:after="60"/>
+        <w:pBdr>
+          <w:bottom w:val="single" w:sz="6" w:space="1" w:color="A6832E"/>
+        </w:pBdr>
       </w:pPr>
       <w:r>
         <w:rPr>
           <w:rFonts w:ascii="Calibri" w:hAnsi="Calibri" w:cs="Calibri" w:eastAsia="Calibri"/>
           <w:b/>
           <w:i w:val="0"/>
-          <w:color w:val="FFFFFF"/>
-          <w:sz w:val="25"/>
-          <w:u w:val="none"/>
+          <w:color w:val="1B2A4A"/>
+          <w:sz w:val="24"/>
           <w:caps w:val="1"/>
-          <w:spacing w:val="80"/>
+          <w:spacing w:val="60"/>
         </w:rPr>
         <w:t>Professional Experience</w:t>
       </w:r>
@@ -835,18 +542,15 @@
         <w:tabs>
           <w:tab w:pos="9638" w:val="right"/>
         </w:tabs>
-        <w:spacing w:before="200" w:after="0" w:line="240" w:lineRule="auto"/>
+        <w:spacing w:before="200" w:after="0"/>
       </w:pPr>
       <w:r>
         <w:rPr>
           <w:rFonts w:ascii="Calibri" w:hAnsi="Calibri" w:cs="Calibri" w:eastAsia="Calibri"/>
           <w:b/>
           <w:i w:val="0"/>
-          <w:color w:val="0F2544"/>
-          <w:sz w:val="26"/>
-          <w:u w:val="none"/>
-          <w:caps w:val="1"/>
-          <w:spacing w:val="60"/>
+          <w:color w:val="1B2A4A"/>
+          <w:sz w:val="24"/>
         </w:rPr>
         <w:t>Quantum Foods</w:t>
       </w:r>
@@ -858,9 +562,8 @@
           <w:rFonts w:ascii="Calibri" w:hAnsi="Calibri" w:cs="Calibri" w:eastAsia="Calibri"/>
           <w:b w:val="0"/>
           <w:i/>
-          <w:color w:val="555C66"/>
+          <w:color w:val="6B6B6B"/>
           <w:sz w:val="21"/>
-          <w:u w:val="none"/>
         </w:rPr>
         <w:t>Jan 2023 – Present</w:t>
       </w:r>
@@ -870,19 +573,15 @@
         <w:tabs>
           <w:tab w:pos="9638" w:val="right"/>
         </w:tabs>
-        <w:spacing w:before="0" w:after="40" w:line="240" w:lineRule="auto"/>
-        <w:pBdr>
-          <w:bottom w:val="single" w:sz="4" w:space="2" w:color="C0973C"/>
-        </w:pBdr>
+        <w:spacing w:before="0" w:after="60"/>
       </w:pPr>
       <w:r>
         <w:rPr>
           <w:rFonts w:ascii="Calibri" w:hAnsi="Calibri" w:cs="Calibri" w:eastAsia="Calibri"/>
           <w:b/>
           <w:i/>
-          <w:color w:val="C0973C"/>
-          <w:sz w:val="23"/>
-          <w:u w:val="none"/>
+          <w:color w:val="A6832E"/>
+          <w:sz w:val="22"/>
         </w:rPr>
         <w:t>National Procurement &amp; Supply Chain Manager</w:t>
       </w:r>
@@ -894,34 +593,30 @@
           <w:rFonts w:ascii="Calibri" w:hAnsi="Calibri" w:cs="Calibri" w:eastAsia="Calibri"/>
           <w:b w:val="0"/>
           <w:i/>
-          <w:color w:val="555C66"/>
+          <w:color w:val="6B6B6B"/>
           <w:sz w:val="20"/>
-          <w:u w:val="none"/>
         </w:rPr>
         <w:t>South Africa</w:t>
       </w:r>
     </w:p>
     <w:p>
       <w:pPr>
-        <w:spacing w:before="80" w:after="20" w:line="240" w:lineRule="auto"/>
+        <w:spacing w:before="80" w:after="20"/>
       </w:pPr>
       <w:r>
         <w:rPr>
           <w:rFonts w:ascii="Calibri" w:hAnsi="Calibri" w:cs="Calibri" w:eastAsia="Calibri"/>
           <w:b/>
           <w:i w:val="0"/>
-          <w:color w:val="0F2544"/>
-          <w:sz w:val="22"/>
-          <w:u w:val="none"/>
-          <w:caps w:val="1"/>
-          <w:spacing w:val="30"/>
+          <w:color w:val="1B2A4A"/>
+          <w:sz w:val="21"/>
         </w:rPr>
         <w:t>Executive Mandate</w:t>
       </w:r>
     </w:p>
     <w:p>
       <w:pPr>
-        <w:spacing w:before="0" w:after="80" w:line="288" w:lineRule="auto"/>
+        <w:spacing w:after="60" w:line="288" w:lineRule="auto"/>
         <w:jc w:val="both"/>
       </w:pPr>
       <w:r>
@@ -929,27 +624,23 @@
           <w:rFonts w:ascii="Calibri" w:hAnsi="Calibri" w:cs="Calibri" w:eastAsia="Calibri"/>
           <w:b w:val="0"/>
           <w:i w:val="0"/>
-          <w:color w:val="1B1B1B"/>
+          <w:color w:val="2C2C2C"/>
           <w:sz w:val="22"/>
-          <w:u w:val="none"/>
         </w:rPr>
         <w:t>Strengthen procurement governance, improve supply chain resilience and optimise working capital across national operations.</w:t>
       </w:r>
     </w:p>
     <w:p>
       <w:pPr>
-        <w:spacing w:before="80" w:after="20" w:line="240" w:lineRule="auto"/>
+        <w:spacing w:before="80" w:after="20"/>
       </w:pPr>
       <w:r>
         <w:rPr>
           <w:rFonts w:ascii="Calibri" w:hAnsi="Calibri" w:cs="Calibri" w:eastAsia="Calibri"/>
           <w:b/>
           <w:i w:val="0"/>
-          <w:color w:val="0F2544"/>
-          <w:sz w:val="22"/>
-          <w:u w:val="none"/>
-          <w:caps w:val="1"/>
-          <w:spacing w:val="30"/>
+          <w:color w:val="1B2A4A"/>
+          <w:sz w:val="21"/>
         </w:rPr>
         <w:t>Strategic Leadership</w:t>
       </w:r>
@@ -957,17 +648,16 @@
     <w:p>
       <w:pPr>
         <w:pStyle w:val="ListBullet"/>
-        <w:spacing w:after="40" w:line="283" w:lineRule="auto"/>
-        <w:ind w:left="340"/>
+        <w:spacing w:after="20" w:line="276" w:lineRule="auto"/>
+        <w:ind w:left="283"/>
       </w:pPr>
       <w:r>
         <w:rPr>
           <w:rFonts w:ascii="Calibri" w:hAnsi="Calibri" w:cs="Calibri" w:eastAsia="Calibri"/>
           <w:b w:val="0"/>
           <w:i w:val="0"/>
-          <w:color w:val="1B1B1B"/>
-          <w:sz w:val="22"/>
-          <w:u w:val="none"/>
+          <w:color w:val="2C2C2C"/>
+          <w:sz w:val="21"/>
         </w:rPr>
         <w:t>Lead national procurement strategy across direct and indirect spend, supplier performance and commercial negotiations.</w:t>
       </w:r>
@@ -975,17 +665,16 @@
     <w:p>
       <w:pPr>
         <w:pStyle w:val="ListBullet"/>
-        <w:spacing w:after="40" w:line="283" w:lineRule="auto"/>
-        <w:ind w:left="340"/>
+        <w:spacing w:after="20" w:line="276" w:lineRule="auto"/>
+        <w:ind w:left="283"/>
       </w:pPr>
       <w:r>
         <w:rPr>
           <w:rFonts w:ascii="Calibri" w:hAnsi="Calibri" w:cs="Calibri" w:eastAsia="Calibri"/>
           <w:b w:val="0"/>
           <w:i w:val="0"/>
-          <w:color w:val="1B1B1B"/>
-          <w:sz w:val="22"/>
-          <w:u w:val="none"/>
+          <w:color w:val="2C2C2C"/>
+          <w:sz w:val="21"/>
         </w:rPr>
         <w:t>Govern inventory investment, replenishment strategies and demand planning disciplines.</w:t>
       </w:r>
@@ -993,17 +682,16 @@
     <w:p>
       <w:pPr>
         <w:pStyle w:val="ListBullet"/>
-        <w:spacing w:after="40" w:line="283" w:lineRule="auto"/>
-        <w:ind w:left="340"/>
+        <w:spacing w:after="20" w:line="276" w:lineRule="auto"/>
+        <w:ind w:left="283"/>
       </w:pPr>
       <w:r>
         <w:rPr>
           <w:rFonts w:ascii="Calibri" w:hAnsi="Calibri" w:cs="Calibri" w:eastAsia="Calibri"/>
           <w:b w:val="0"/>
           <w:i w:val="0"/>
-          <w:color w:val="1B1B1B"/>
-          <w:sz w:val="22"/>
-          <w:u w:val="none"/>
+          <w:color w:val="2C2C2C"/>
+          <w:sz w:val="21"/>
         </w:rPr>
         <w:t>Align procurement, operations and logistics through structured S&amp;OP governance.</w:t>
       </w:r>
@@ -1011,17 +699,16 @@
     <w:p>
       <w:pPr>
         <w:pStyle w:val="ListBullet"/>
-        <w:spacing w:after="40" w:line="283" w:lineRule="auto"/>
-        <w:ind w:left="340"/>
+        <w:spacing w:after="20" w:line="276" w:lineRule="auto"/>
+        <w:ind w:left="283"/>
       </w:pPr>
       <w:r>
         <w:rPr>
           <w:rFonts w:ascii="Calibri" w:hAnsi="Calibri" w:cs="Calibri" w:eastAsia="Calibri"/>
           <w:b w:val="0"/>
           <w:i w:val="0"/>
-          <w:color w:val="1B1B1B"/>
-          <w:sz w:val="22"/>
-          <w:u w:val="none"/>
+          <w:color w:val="2C2C2C"/>
+          <w:sz w:val="21"/>
         </w:rPr>
         <w:t>Drive warehousing, transportation and distribution performance management.</w:t>
       </w:r>
@@ -1029,35 +716,31 @@
     <w:p>
       <w:pPr>
         <w:pStyle w:val="ListBullet"/>
-        <w:spacing w:after="40" w:line="283" w:lineRule="auto"/>
-        <w:ind w:left="340"/>
+        <w:spacing w:after="20" w:line="276" w:lineRule="auto"/>
+        <w:ind w:left="283"/>
       </w:pPr>
       <w:r>
         <w:rPr>
           <w:rFonts w:ascii="Calibri" w:hAnsi="Calibri" w:cs="Calibri" w:eastAsia="Calibri"/>
           <w:b w:val="0"/>
           <w:i w:val="0"/>
-          <w:color w:val="1B1B1B"/>
-          <w:sz w:val="22"/>
-          <w:u w:val="none"/>
+          <w:color w:val="2C2C2C"/>
+          <w:sz w:val="21"/>
         </w:rPr>
         <w:t>Provide executive decision support via operational performance analytics and dashboards.</w:t>
       </w:r>
     </w:p>
     <w:p>
       <w:pPr>
-        <w:spacing w:before="80" w:after="20" w:line="240" w:lineRule="auto"/>
+        <w:spacing w:before="80" w:after="20"/>
       </w:pPr>
       <w:r>
         <w:rPr>
           <w:rFonts w:ascii="Calibri" w:hAnsi="Calibri" w:cs="Calibri" w:eastAsia="Calibri"/>
           <w:b/>
           <w:i w:val="0"/>
-          <w:color w:val="0F2544"/>
-          <w:sz w:val="22"/>
-          <w:u w:val="none"/>
-          <w:caps w:val="1"/>
-          <w:spacing w:val="30"/>
+          <w:color w:val="1B2A4A"/>
+          <w:sz w:val="21"/>
         </w:rPr>
         <w:t>Key Contributions</w:t>
       </w:r>
@@ -1065,17 +748,16 @@
     <w:p>
       <w:pPr>
         <w:pStyle w:val="ListBullet"/>
-        <w:spacing w:after="40" w:line="283" w:lineRule="auto"/>
-        <w:ind w:left="340"/>
+        <w:spacing w:after="20" w:line="276" w:lineRule="auto"/>
+        <w:ind w:left="283"/>
       </w:pPr>
       <w:r>
         <w:rPr>
           <w:rFonts w:ascii="Calibri" w:hAnsi="Calibri" w:cs="Calibri" w:eastAsia="Calibri"/>
           <w:b/>
           <w:i w:val="0"/>
-          <w:color w:val="0F2544"/>
-          <w:sz w:val="22"/>
-          <w:u w:val="none"/>
+          <w:color w:val="1B2A4A"/>
+          <w:sz w:val="21"/>
         </w:rPr>
         <w:t xml:space="preserve">Cost: </w:t>
       </w:r>
@@ -1084,9 +766,8 @@
           <w:rFonts w:ascii="Calibri" w:hAnsi="Calibri" w:cs="Calibri" w:eastAsia="Calibri"/>
           <w:b w:val="0"/>
           <w:i w:val="0"/>
-          <w:color w:val="1B1B1B"/>
-          <w:sz w:val="22"/>
-          <w:u w:val="none"/>
+          <w:color w:val="2C2C2C"/>
+          <w:sz w:val="21"/>
         </w:rPr>
         <w:t>delivered sustainable procurement savings through supplier consolidation and strategic sourcing.</w:t>
       </w:r>
@@ -1094,17 +775,16 @@
     <w:p>
       <w:pPr>
         <w:pStyle w:val="ListBullet"/>
-        <w:spacing w:after="40" w:line="283" w:lineRule="auto"/>
-        <w:ind w:left="340"/>
+        <w:spacing w:after="20" w:line="276" w:lineRule="auto"/>
+        <w:ind w:left="283"/>
       </w:pPr>
       <w:r>
         <w:rPr>
           <w:rFonts w:ascii="Calibri" w:hAnsi="Calibri" w:cs="Calibri" w:eastAsia="Calibri"/>
           <w:b/>
           <w:i w:val="0"/>
-          <w:color w:val="0F2544"/>
-          <w:sz w:val="22"/>
-          <w:u w:val="none"/>
+          <w:color w:val="1B2A4A"/>
+          <w:sz w:val="21"/>
         </w:rPr>
         <w:t xml:space="preserve">Supplier Performance: </w:t>
       </w:r>
@@ -1113,9 +793,8 @@
           <w:rFonts w:ascii="Calibri" w:hAnsi="Calibri" w:cs="Calibri" w:eastAsia="Calibri"/>
           <w:b w:val="0"/>
           <w:i w:val="0"/>
-          <w:color w:val="1B1B1B"/>
-          <w:sz w:val="22"/>
-          <w:u w:val="none"/>
+          <w:color w:val="2C2C2C"/>
+          <w:sz w:val="21"/>
         </w:rPr>
         <w:t>improved OTIF (On-Time, In-Full) via structured KPI governance.</w:t>
       </w:r>
@@ -1123,17 +802,16 @@
     <w:p>
       <w:pPr>
         <w:pStyle w:val="ListBullet"/>
-        <w:spacing w:after="40" w:line="283" w:lineRule="auto"/>
-        <w:ind w:left="340"/>
+        <w:spacing w:after="20" w:line="276" w:lineRule="auto"/>
+        <w:ind w:left="283"/>
       </w:pPr>
       <w:r>
         <w:rPr>
           <w:rFonts w:ascii="Calibri" w:hAnsi="Calibri" w:cs="Calibri" w:eastAsia="Calibri"/>
           <w:b/>
           <w:i w:val="0"/>
-          <w:color w:val="0F2544"/>
-          <w:sz w:val="22"/>
-          <w:u w:val="none"/>
+          <w:color w:val="1B2A4A"/>
+          <w:sz w:val="21"/>
         </w:rPr>
         <w:t xml:space="preserve">Working Capital: </w:t>
       </w:r>
@@ -1142,9 +820,8 @@
           <w:rFonts w:ascii="Calibri" w:hAnsi="Calibri" w:cs="Calibri" w:eastAsia="Calibri"/>
           <w:b w:val="0"/>
           <w:i w:val="0"/>
-          <w:color w:val="1B1B1B"/>
-          <w:sz w:val="22"/>
-          <w:u w:val="none"/>
+          <w:color w:val="2C2C2C"/>
+          <w:sz w:val="21"/>
         </w:rPr>
         <w:t>reduced inventory exposure while maintaining product availability.</w:t>
       </w:r>
@@ -1152,17 +829,16 @@
     <w:p>
       <w:pPr>
         <w:pStyle w:val="ListBullet"/>
-        <w:spacing w:after="40" w:line="283" w:lineRule="auto"/>
-        <w:ind w:left="340"/>
+        <w:spacing w:after="20" w:line="276" w:lineRule="auto"/>
+        <w:ind w:left="283"/>
       </w:pPr>
       <w:r>
         <w:rPr>
           <w:rFonts w:ascii="Calibri" w:hAnsi="Calibri" w:cs="Calibri" w:eastAsia="Calibri"/>
           <w:b/>
           <w:i w:val="0"/>
-          <w:color w:val="0F2544"/>
-          <w:sz w:val="22"/>
-          <w:u w:val="none"/>
+          <w:color w:val="1B2A4A"/>
+          <w:sz w:val="21"/>
         </w:rPr>
         <w:t xml:space="preserve">Governance: </w:t>
       </w:r>
@@ -1171,9 +847,8 @@
           <w:rFonts w:ascii="Calibri" w:hAnsi="Calibri" w:cs="Calibri" w:eastAsia="Calibri"/>
           <w:b w:val="0"/>
           <w:i w:val="0"/>
-          <w:color w:val="1B1B1B"/>
-          <w:sz w:val="22"/>
-          <w:u w:val="none"/>
+          <w:color w:val="2C2C2C"/>
+          <w:sz w:val="21"/>
         </w:rPr>
         <w:t>enhanced procurement controls, strengthening audit readiness and compliance.</w:t>
       </w:r>
@@ -1181,17 +856,16 @@
     <w:p>
       <w:pPr>
         <w:pStyle w:val="ListBullet"/>
-        <w:spacing w:after="40" w:line="283" w:lineRule="auto"/>
-        <w:ind w:left="340"/>
+        <w:spacing w:after="20" w:line="276" w:lineRule="auto"/>
+        <w:ind w:left="283"/>
       </w:pPr>
       <w:r>
         <w:rPr>
           <w:rFonts w:ascii="Calibri" w:hAnsi="Calibri" w:cs="Calibri" w:eastAsia="Calibri"/>
           <w:b/>
           <w:i w:val="0"/>
-          <w:color w:val="0F2544"/>
-          <w:sz w:val="22"/>
-          <w:u w:val="none"/>
+          <w:color w:val="1B2A4A"/>
+          <w:sz w:val="21"/>
         </w:rPr>
         <w:t xml:space="preserve">Visibility: </w:t>
       </w:r>
@@ -1200,9 +874,8 @@
           <w:rFonts w:ascii="Calibri" w:hAnsi="Calibri" w:cs="Calibri" w:eastAsia="Calibri"/>
           <w:b w:val="0"/>
           <w:i w:val="0"/>
-          <w:color w:val="1B1B1B"/>
-          <w:sz w:val="22"/>
-          <w:u w:val="none"/>
+          <w:color w:val="2C2C2C"/>
+          <w:sz w:val="21"/>
         </w:rPr>
         <w:t>launched executive dashboards that improved cross-functional collaboration.</w:t>
       </w:r>
@@ -1212,18 +885,15 @@
         <w:tabs>
           <w:tab w:pos="9638" w:val="right"/>
         </w:tabs>
-        <w:spacing w:before="200" w:after="0" w:line="240" w:lineRule="auto"/>
+        <w:spacing w:before="200" w:after="0"/>
       </w:pPr>
       <w:r>
         <w:rPr>
           <w:rFonts w:ascii="Calibri" w:hAnsi="Calibri" w:cs="Calibri" w:eastAsia="Calibri"/>
           <w:b/>
           <w:i w:val="0"/>
-          <w:color w:val="0F2544"/>
-          <w:sz w:val="26"/>
-          <w:u w:val="none"/>
-          <w:caps w:val="1"/>
-          <w:spacing w:val="60"/>
+          <w:color w:val="1B2A4A"/>
+          <w:sz w:val="24"/>
         </w:rPr>
         <w:t>Ecolab</w:t>
       </w:r>
@@ -1235,9 +905,8 @@
           <w:rFonts w:ascii="Calibri" w:hAnsi="Calibri" w:cs="Calibri" w:eastAsia="Calibri"/>
           <w:b w:val="0"/>
           <w:i/>
-          <w:color w:val="555C66"/>
+          <w:color w:val="6B6B6B"/>
           <w:sz w:val="21"/>
-          <w:u w:val="none"/>
         </w:rPr>
         <w:t>Jan 2020 – Dec 2022</w:t>
       </w:r>
@@ -1247,19 +916,15 @@
         <w:tabs>
           <w:tab w:pos="9638" w:val="right"/>
         </w:tabs>
-        <w:spacing w:before="0" w:after="40" w:line="240" w:lineRule="auto"/>
-        <w:pBdr>
-          <w:bottom w:val="single" w:sz="4" w:space="2" w:color="C0973C"/>
-        </w:pBdr>
+        <w:spacing w:before="0" w:after="60"/>
       </w:pPr>
       <w:r>
         <w:rPr>
           <w:rFonts w:ascii="Calibri" w:hAnsi="Calibri" w:cs="Calibri" w:eastAsia="Calibri"/>
           <w:b/>
           <w:i/>
-          <w:color w:val="C0973C"/>
-          <w:sz w:val="23"/>
-          <w:u w:val="none"/>
+          <w:color w:val="A6832E"/>
+          <w:sz w:val="22"/>
         </w:rPr>
         <w:t>Regional Operations &amp; Supply Chain Manager</w:t>
       </w:r>
@@ -1271,34 +936,30 @@
           <w:rFonts w:ascii="Calibri" w:hAnsi="Calibri" w:cs="Calibri" w:eastAsia="Calibri"/>
           <w:b w:val="0"/>
           <w:i/>
-          <w:color w:val="555C66"/>
+          <w:color w:val="6B6B6B"/>
           <w:sz w:val="20"/>
-          <w:u w:val="none"/>
         </w:rPr>
         <w:t>South Africa</w:t>
       </w:r>
     </w:p>
     <w:p>
       <w:pPr>
-        <w:spacing w:before="80" w:after="20" w:line="240" w:lineRule="auto"/>
+        <w:spacing w:before="80" w:after="20"/>
       </w:pPr>
       <w:r>
         <w:rPr>
           <w:rFonts w:ascii="Calibri" w:hAnsi="Calibri" w:cs="Calibri" w:eastAsia="Calibri"/>
           <w:b/>
           <w:i w:val="0"/>
-          <w:color w:val="0F2544"/>
-          <w:sz w:val="22"/>
-          <w:u w:val="none"/>
-          <w:caps w:val="1"/>
-          <w:spacing w:val="30"/>
+          <w:color w:val="1B2A4A"/>
+          <w:sz w:val="21"/>
         </w:rPr>
         <w:t>Executive Mandate</w:t>
       </w:r>
     </w:p>
     <w:p>
       <w:pPr>
-        <w:spacing w:before="0" w:after="80" w:line="288" w:lineRule="auto"/>
+        <w:spacing w:after="60" w:line="288" w:lineRule="auto"/>
         <w:jc w:val="both"/>
       </w:pPr>
       <w:r>
@@ -1306,27 +967,23 @@
           <w:rFonts w:ascii="Calibri" w:hAnsi="Calibri" w:cs="Calibri" w:eastAsia="Calibri"/>
           <w:b w:val="0"/>
           <w:i w:val="0"/>
-          <w:color w:val="1B1B1B"/>
+          <w:color w:val="2C2C2C"/>
           <w:sz w:val="22"/>
-          <w:u w:val="none"/>
         </w:rPr>
         <w:t>Turn around regional operational performance, service delivery and profitability across multiple sites.</w:t>
       </w:r>
     </w:p>
     <w:p>
       <w:pPr>
-        <w:spacing w:before="80" w:after="20" w:line="240" w:lineRule="auto"/>
+        <w:spacing w:before="80" w:after="20"/>
       </w:pPr>
       <w:r>
         <w:rPr>
           <w:rFonts w:ascii="Calibri" w:hAnsi="Calibri" w:cs="Calibri" w:eastAsia="Calibri"/>
           <w:b/>
           <w:i w:val="0"/>
-          <w:color w:val="0F2544"/>
-          <w:sz w:val="22"/>
-          <w:u w:val="none"/>
-          <w:caps w:val="1"/>
-          <w:spacing w:val="30"/>
+          <w:color w:val="1B2A4A"/>
+          <w:sz w:val="21"/>
         </w:rPr>
         <w:t>Leadership Scope</w:t>
       </w:r>
@@ -1334,17 +991,16 @@
     <w:p>
       <w:pPr>
         <w:pStyle w:val="ListBullet"/>
-        <w:spacing w:after="40" w:line="283" w:lineRule="auto"/>
-        <w:ind w:left="340"/>
+        <w:spacing w:after="20" w:line="276" w:lineRule="auto"/>
+        <w:ind w:left="283"/>
       </w:pPr>
       <w:r>
         <w:rPr>
           <w:rFonts w:ascii="Calibri" w:hAnsi="Calibri" w:cs="Calibri" w:eastAsia="Calibri"/>
           <w:b/>
           <w:i w:val="0"/>
-          <w:color w:val="0F2544"/>
-          <w:sz w:val="22"/>
-          <w:u w:val="none"/>
+          <w:color w:val="1B2A4A"/>
+          <w:sz w:val="21"/>
         </w:rPr>
         <w:t xml:space="preserve">P&amp;L: </w:t>
       </w:r>
@@ -1353,9 +1009,8 @@
           <w:rFonts w:ascii="Calibri" w:hAnsi="Calibri" w:cs="Calibri" w:eastAsia="Calibri"/>
           <w:b w:val="0"/>
           <w:i w:val="0"/>
-          <w:color w:val="1B1B1B"/>
-          <w:sz w:val="22"/>
-          <w:u w:val="none"/>
+          <w:color w:val="2C2C2C"/>
+          <w:sz w:val="21"/>
         </w:rPr>
         <w:t>R15M+ operational budget.</w:t>
       </w:r>
@@ -1363,17 +1018,16 @@
     <w:p>
       <w:pPr>
         <w:pStyle w:val="ListBullet"/>
-        <w:spacing w:after="40" w:line="283" w:lineRule="auto"/>
-        <w:ind w:left="340"/>
+        <w:spacing w:after="20" w:line="276" w:lineRule="auto"/>
+        <w:ind w:left="283"/>
       </w:pPr>
       <w:r>
         <w:rPr>
           <w:rFonts w:ascii="Calibri" w:hAnsi="Calibri" w:cs="Calibri" w:eastAsia="Calibri"/>
           <w:b/>
           <w:i w:val="0"/>
-          <w:color w:val="0F2544"/>
-          <w:sz w:val="22"/>
-          <w:u w:val="none"/>
+          <w:color w:val="1B2A4A"/>
+          <w:sz w:val="21"/>
         </w:rPr>
         <w:t xml:space="preserve">Footprint: </w:t>
       </w:r>
@@ -1382,9 +1036,8 @@
           <w:rFonts w:ascii="Calibri" w:hAnsi="Calibri" w:cs="Calibri" w:eastAsia="Calibri"/>
           <w:b w:val="0"/>
           <w:i w:val="0"/>
-          <w:color w:val="1B1B1B"/>
-          <w:sz w:val="22"/>
-          <w:u w:val="none"/>
+          <w:color w:val="2C2C2C"/>
+          <w:sz w:val="21"/>
         </w:rPr>
         <w:t>multi-site warehousing and distribution operations.</w:t>
       </w:r>
@@ -1392,17 +1045,16 @@
     <w:p>
       <w:pPr>
         <w:pStyle w:val="ListBullet"/>
-        <w:spacing w:after="40" w:line="283" w:lineRule="auto"/>
-        <w:ind w:left="340"/>
+        <w:spacing w:after="20" w:line="276" w:lineRule="auto"/>
+        <w:ind w:left="283"/>
       </w:pPr>
       <w:r>
         <w:rPr>
           <w:rFonts w:ascii="Calibri" w:hAnsi="Calibri" w:cs="Calibri" w:eastAsia="Calibri"/>
           <w:b/>
           <w:i w:val="0"/>
-          <w:color w:val="0F2544"/>
-          <w:sz w:val="22"/>
-          <w:u w:val="none"/>
+          <w:color w:val="1B2A4A"/>
+          <w:sz w:val="21"/>
         </w:rPr>
         <w:t xml:space="preserve">Functions: </w:t>
       </w:r>
@@ -1411,9 +1063,8 @@
           <w:rFonts w:ascii="Calibri" w:hAnsi="Calibri" w:cs="Calibri" w:eastAsia="Calibri"/>
           <w:b w:val="0"/>
           <w:i w:val="0"/>
-          <w:color w:val="1B1B1B"/>
-          <w:sz w:val="22"/>
-          <w:u w:val="none"/>
+          <w:color w:val="2C2C2C"/>
+          <w:sz w:val="21"/>
         </w:rPr>
         <w:t>procurement, inventory, fleet and customer service.</w:t>
       </w:r>
@@ -1421,17 +1072,16 @@
     <w:p>
       <w:pPr>
         <w:pStyle w:val="ListBullet"/>
-        <w:spacing w:after="40" w:line="283" w:lineRule="auto"/>
-        <w:ind w:left="340"/>
+        <w:spacing w:after="20" w:line="276" w:lineRule="auto"/>
+        <w:ind w:left="283"/>
       </w:pPr>
       <w:r>
         <w:rPr>
           <w:rFonts w:ascii="Calibri" w:hAnsi="Calibri" w:cs="Calibri" w:eastAsia="Calibri"/>
           <w:b/>
           <w:i w:val="0"/>
-          <w:color w:val="0F2544"/>
-          <w:sz w:val="22"/>
-          <w:u w:val="none"/>
+          <w:color w:val="1B2A4A"/>
+          <w:sz w:val="21"/>
         </w:rPr>
         <w:t xml:space="preserve">Workforce: </w:t>
       </w:r>
@@ -1440,27 +1090,23 @@
           <w:rFonts w:ascii="Calibri" w:hAnsi="Calibri" w:cs="Calibri" w:eastAsia="Calibri"/>
           <w:b w:val="0"/>
           <w:i w:val="0"/>
-          <w:color w:val="1B1B1B"/>
-          <w:sz w:val="22"/>
-          <w:u w:val="none"/>
+          <w:color w:val="2C2C2C"/>
+          <w:sz w:val="21"/>
         </w:rPr>
         <w:t>75 employees across three operational facilities.</w:t>
       </w:r>
     </w:p>
     <w:p>
       <w:pPr>
-        <w:spacing w:before="80" w:after="20" w:line="240" w:lineRule="auto"/>
+        <w:spacing w:before="80" w:after="20"/>
       </w:pPr>
       <w:r>
         <w:rPr>
           <w:rFonts w:ascii="Calibri" w:hAnsi="Calibri" w:cs="Calibri" w:eastAsia="Calibri"/>
           <w:b/>
           <w:i w:val="0"/>
-          <w:color w:val="0F2544"/>
-          <w:sz w:val="22"/>
-          <w:u w:val="none"/>
-          <w:caps w:val="1"/>
-          <w:spacing w:val="30"/>
+          <w:color w:val="1B2A4A"/>
+          <w:sz w:val="21"/>
         </w:rPr>
         <w:t>Key Contributions</w:t>
       </w:r>
@@ -1468,17 +1114,16 @@
     <w:p>
       <w:pPr>
         <w:pStyle w:val="ListBullet"/>
-        <w:spacing w:after="40" w:line="283" w:lineRule="auto"/>
-        <w:ind w:left="340"/>
+        <w:spacing w:after="20" w:line="276" w:lineRule="auto"/>
+        <w:ind w:left="283"/>
       </w:pPr>
       <w:r>
         <w:rPr>
           <w:rFonts w:ascii="Calibri" w:hAnsi="Calibri" w:cs="Calibri" w:eastAsia="Calibri"/>
           <w:b/>
           <w:i w:val="0"/>
-          <w:color w:val="0F2544"/>
-          <w:sz w:val="22"/>
-          <w:u w:val="none"/>
+          <w:color w:val="1B2A4A"/>
+          <w:sz w:val="21"/>
         </w:rPr>
         <w:t xml:space="preserve">Service: </w:t>
       </w:r>
@@ -1487,9 +1132,8 @@
           <w:rFonts w:ascii="Calibri" w:hAnsi="Calibri" w:cs="Calibri" w:eastAsia="Calibri"/>
           <w:b w:val="0"/>
           <w:i w:val="0"/>
-          <w:color w:val="1B1B1B"/>
-          <w:sz w:val="22"/>
-          <w:u w:val="none"/>
+          <w:color w:val="2C2C2C"/>
+          <w:sz w:val="21"/>
         </w:rPr>
         <w:t>improved OTIF to &gt;95% through process optimisation.</w:t>
       </w:r>
@@ -1497,17 +1141,16 @@
     <w:p>
       <w:pPr>
         <w:pStyle w:val="ListBullet"/>
-        <w:spacing w:after="40" w:line="283" w:lineRule="auto"/>
-        <w:ind w:left="340"/>
+        <w:spacing w:after="20" w:line="276" w:lineRule="auto"/>
+        <w:ind w:left="283"/>
       </w:pPr>
       <w:r>
         <w:rPr>
           <w:rFonts w:ascii="Calibri" w:hAnsi="Calibri" w:cs="Calibri" w:eastAsia="Calibri"/>
           <w:b/>
           <w:i w:val="0"/>
-          <w:color w:val="0F2544"/>
-          <w:sz w:val="22"/>
-          <w:u w:val="none"/>
+          <w:color w:val="1B2A4A"/>
+          <w:sz w:val="21"/>
         </w:rPr>
         <w:t xml:space="preserve">Cost: </w:t>
       </w:r>
@@ -1516,9 +1159,8 @@
           <w:rFonts w:ascii="Calibri" w:hAnsi="Calibri" w:cs="Calibri" w:eastAsia="Calibri"/>
           <w:b w:val="0"/>
           <w:i w:val="0"/>
-          <w:color w:val="1B1B1B"/>
-          <w:sz w:val="22"/>
-          <w:u w:val="none"/>
+          <w:color w:val="2C2C2C"/>
+          <w:sz w:val="21"/>
         </w:rPr>
         <w:t>delivered double-digit procurement savings via strategic sourcing.</w:t>
       </w:r>
@@ -1526,17 +1168,16 @@
     <w:p>
       <w:pPr>
         <w:pStyle w:val="ListBullet"/>
-        <w:spacing w:after="40" w:line="283" w:lineRule="auto"/>
-        <w:ind w:left="340"/>
+        <w:spacing w:after="20" w:line="276" w:lineRule="auto"/>
+        <w:ind w:left="283"/>
       </w:pPr>
       <w:r>
         <w:rPr>
           <w:rFonts w:ascii="Calibri" w:hAnsi="Calibri" w:cs="Calibri" w:eastAsia="Calibri"/>
           <w:b/>
           <w:i w:val="0"/>
-          <w:color w:val="0F2544"/>
-          <w:sz w:val="22"/>
-          <w:u w:val="none"/>
+          <w:color w:val="1B2A4A"/>
+          <w:sz w:val="21"/>
         </w:rPr>
         <w:t xml:space="preserve">Lead Time: </w:t>
       </w:r>
@@ -1545,9 +1186,8 @@
           <w:rFonts w:ascii="Calibri" w:hAnsi="Calibri" w:cs="Calibri" w:eastAsia="Calibri"/>
           <w:b w:val="0"/>
           <w:i w:val="0"/>
-          <w:color w:val="1B1B1B"/>
-          <w:sz w:val="22"/>
-          <w:u w:val="none"/>
+          <w:color w:val="2C2C2C"/>
+          <w:sz w:val="21"/>
         </w:rPr>
         <w:t>reduced fulfilment lead times through workflow redesign.</w:t>
       </w:r>
@@ -1555,17 +1195,16 @@
     <w:p>
       <w:pPr>
         <w:pStyle w:val="ListBullet"/>
-        <w:spacing w:after="40" w:line="283" w:lineRule="auto"/>
-        <w:ind w:left="340"/>
+        <w:spacing w:after="20" w:line="276" w:lineRule="auto"/>
+        <w:ind w:left="283"/>
       </w:pPr>
       <w:r>
         <w:rPr>
           <w:rFonts w:ascii="Calibri" w:hAnsi="Calibri" w:cs="Calibri" w:eastAsia="Calibri"/>
           <w:b/>
           <w:i w:val="0"/>
-          <w:color w:val="0F2544"/>
-          <w:sz w:val="22"/>
-          <w:u w:val="none"/>
+          <w:color w:val="1B2A4A"/>
+          <w:sz w:val="21"/>
         </w:rPr>
         <w:t xml:space="preserve">Inventory: </w:t>
       </w:r>
@@ -1574,9 +1213,8 @@
           <w:rFonts w:ascii="Calibri" w:hAnsi="Calibri" w:cs="Calibri" w:eastAsia="Calibri"/>
           <w:b w:val="0"/>
           <w:i w:val="0"/>
-          <w:color w:val="1B1B1B"/>
-          <w:sz w:val="22"/>
-          <w:u w:val="none"/>
+          <w:color w:val="2C2C2C"/>
+          <w:sz w:val="21"/>
         </w:rPr>
         <w:t>strengthened stock accuracy and visibility.</w:t>
       </w:r>
@@ -1584,28 +1222,26 @@
     <w:p>
       <w:pPr>
         <w:pStyle w:val="ListBullet"/>
-        <w:spacing w:after="40" w:line="283" w:lineRule="auto"/>
-        <w:ind w:left="340"/>
+        <w:spacing w:after="20" w:line="276" w:lineRule="auto"/>
+        <w:ind w:left="283"/>
       </w:pPr>
       <w:r>
         <w:rPr>
           <w:rFonts w:ascii="Calibri" w:hAnsi="Calibri" w:cs="Calibri" w:eastAsia="Calibri"/>
           <w:b/>
           <w:i w:val="0"/>
-          <w:color w:val="0F2544"/>
-          <w:sz w:val="22"/>
-          <w:u w:val="none"/>
+          <w:color w:val="1B2A4A"/>
+          <w:sz w:val="21"/>
         </w:rPr>
-        <w:t xml:space="preserve">3PL Management: </w:t>
+        <w:t xml:space="preserve">3PL: </w:t>
       </w:r>
       <w:r>
         <w:rPr>
           <w:rFonts w:ascii="Calibri" w:hAnsi="Calibri" w:cs="Calibri" w:eastAsia="Calibri"/>
           <w:b w:val="0"/>
           <w:i w:val="0"/>
-          <w:color w:val="1B1B1B"/>
-          <w:sz w:val="22"/>
-          <w:u w:val="none"/>
+          <w:color w:val="2C2C2C"/>
+          <w:sz w:val="21"/>
         </w:rPr>
         <w:t>re-engineered logistics provider performance frameworks.</w:t>
       </w:r>
@@ -1613,17 +1249,16 @@
     <w:p>
       <w:pPr>
         <w:pStyle w:val="ListBullet"/>
-        <w:spacing w:after="40" w:line="283" w:lineRule="auto"/>
-        <w:ind w:left="340"/>
+        <w:spacing w:after="20" w:line="276" w:lineRule="auto"/>
+        <w:ind w:left="283"/>
       </w:pPr>
       <w:r>
         <w:rPr>
           <w:rFonts w:ascii="Calibri" w:hAnsi="Calibri" w:cs="Calibri" w:eastAsia="Calibri"/>
           <w:b/>
           <w:i w:val="0"/>
-          <w:color w:val="0F2544"/>
-          <w:sz w:val="22"/>
-          <w:u w:val="none"/>
+          <w:color w:val="1B2A4A"/>
+          <w:sz w:val="21"/>
         </w:rPr>
         <w:t xml:space="preserve">Compliance: </w:t>
       </w:r>
@@ -1632,9 +1267,8 @@
           <w:rFonts w:ascii="Calibri" w:hAnsi="Calibri" w:cs="Calibri" w:eastAsia="Calibri"/>
           <w:b w:val="0"/>
           <w:i w:val="0"/>
-          <w:color w:val="1B1B1B"/>
-          <w:sz w:val="22"/>
-          <w:u w:val="none"/>
+          <w:color w:val="2C2C2C"/>
+          <w:sz w:val="21"/>
         </w:rPr>
         <w:t>enhanced health, safety and regulatory standards across all sites.</w:t>
       </w:r>
@@ -1642,17 +1276,16 @@
     <w:p>
       <w:pPr>
         <w:pStyle w:val="ListBullet"/>
-        <w:spacing w:after="40" w:line="283" w:lineRule="auto"/>
-        <w:ind w:left="340"/>
+        <w:spacing w:after="20" w:line="276" w:lineRule="auto"/>
+        <w:ind w:left="283"/>
       </w:pPr>
       <w:r>
         <w:rPr>
           <w:rFonts w:ascii="Calibri" w:hAnsi="Calibri" w:cs="Calibri" w:eastAsia="Calibri"/>
           <w:b/>
           <w:i w:val="0"/>
-          <w:color w:val="0F2544"/>
-          <w:sz w:val="22"/>
-          <w:u w:val="none"/>
+          <w:color w:val="1B2A4A"/>
+          <w:sz w:val="21"/>
         </w:rPr>
         <w:t xml:space="preserve">Governance: </w:t>
       </w:r>
@@ -1661,9 +1294,8 @@
           <w:rFonts w:ascii="Calibri" w:hAnsi="Calibri" w:cs="Calibri" w:eastAsia="Calibri"/>
           <w:b w:val="0"/>
           <w:i w:val="0"/>
-          <w:color w:val="1B1B1B"/>
-          <w:sz w:val="22"/>
-          <w:u w:val="none"/>
+          <w:color w:val="2C2C2C"/>
+          <w:sz w:val="21"/>
         </w:rPr>
         <w:t>embedded KPI management systems to drive accountability.</w:t>
       </w:r>
@@ -1673,18 +1305,15 @@
         <w:tabs>
           <w:tab w:pos="9638" w:val="right"/>
         </w:tabs>
-        <w:spacing w:before="200" w:after="0" w:line="240" w:lineRule="auto"/>
+        <w:spacing w:before="200" w:after="0"/>
       </w:pPr>
       <w:r>
         <w:rPr>
           <w:rFonts w:ascii="Calibri" w:hAnsi="Calibri" w:cs="Calibri" w:eastAsia="Calibri"/>
           <w:b/>
           <w:i w:val="0"/>
-          <w:color w:val="0F2544"/>
-          <w:sz w:val="26"/>
-          <w:u w:val="none"/>
-          <w:caps w:val="1"/>
-          <w:spacing w:val="60"/>
+          <w:color w:val="1B2A4A"/>
+          <w:sz w:val="24"/>
         </w:rPr>
         <w:t>Let Me Do I.T.</w:t>
       </w:r>
@@ -1696,9 +1325,8 @@
           <w:rFonts w:ascii="Calibri" w:hAnsi="Calibri" w:cs="Calibri" w:eastAsia="Calibri"/>
           <w:b w:val="0"/>
           <w:i/>
-          <w:color w:val="555C66"/>
+          <w:color w:val="6B6B6B"/>
           <w:sz w:val="21"/>
-          <w:u w:val="none"/>
         </w:rPr>
         <w:t>Sep 2014 – Dec 2019</w:t>
       </w:r>
@@ -1708,19 +1336,15 @@
         <w:tabs>
           <w:tab w:pos="9638" w:val="right"/>
         </w:tabs>
-        <w:spacing w:before="0" w:after="40" w:line="240" w:lineRule="auto"/>
-        <w:pBdr>
-          <w:bottom w:val="single" w:sz="4" w:space="2" w:color="C0973C"/>
-        </w:pBdr>
+        <w:spacing w:before="0" w:after="60"/>
       </w:pPr>
       <w:r>
         <w:rPr>
           <w:rFonts w:ascii="Calibri" w:hAnsi="Calibri" w:cs="Calibri" w:eastAsia="Calibri"/>
           <w:b/>
           <w:i/>
-          <w:color w:val="C0973C"/>
-          <w:sz w:val="23"/>
-          <w:u w:val="none"/>
+          <w:color w:val="A6832E"/>
+          <w:sz w:val="22"/>
         </w:rPr>
         <w:t>Chief of Operations</w:t>
       </w:r>
@@ -1732,34 +1356,30 @@
           <w:rFonts w:ascii="Calibri" w:hAnsi="Calibri" w:cs="Calibri" w:eastAsia="Calibri"/>
           <w:b w:val="0"/>
           <w:i/>
-          <w:color w:val="555C66"/>
+          <w:color w:val="6B6B6B"/>
           <w:sz w:val="20"/>
-          <w:u w:val="none"/>
         </w:rPr>
         <w:t>South Africa</w:t>
       </w:r>
     </w:p>
     <w:p>
       <w:pPr>
-        <w:spacing w:before="80" w:after="20" w:line="240" w:lineRule="auto"/>
+        <w:spacing w:before="80" w:after="20"/>
       </w:pPr>
       <w:r>
         <w:rPr>
           <w:rFonts w:ascii="Calibri" w:hAnsi="Calibri" w:cs="Calibri" w:eastAsia="Calibri"/>
           <w:b/>
           <w:i w:val="0"/>
-          <w:color w:val="0F2544"/>
-          <w:sz w:val="22"/>
-          <w:u w:val="none"/>
-          <w:caps w:val="1"/>
-          <w:spacing w:val="30"/>
+          <w:color w:val="1B2A4A"/>
+          <w:sz w:val="21"/>
         </w:rPr>
         <w:t>Executive Mandate</w:t>
       </w:r>
     </w:p>
     <w:p>
       <w:pPr>
-        <w:spacing w:before="0" w:after="80" w:line="288" w:lineRule="auto"/>
+        <w:spacing w:after="60" w:line="288" w:lineRule="auto"/>
         <w:jc w:val="both"/>
       </w:pPr>
       <w:r>
@@ -1767,27 +1387,23 @@
           <w:rFonts w:ascii="Calibri" w:hAnsi="Calibri" w:cs="Calibri" w:eastAsia="Calibri"/>
           <w:b w:val="0"/>
           <w:i w:val="0"/>
-          <w:color w:val="1B1B1B"/>
+          <w:color w:val="2C2C2C"/>
           <w:sz w:val="22"/>
-          <w:u w:val="none"/>
         </w:rPr>
         <w:t>Transform operational performance, scalability and governance to support business growth.</w:t>
       </w:r>
     </w:p>
     <w:p>
       <w:pPr>
-        <w:spacing w:before="80" w:after="20" w:line="240" w:lineRule="auto"/>
+        <w:spacing w:before="80" w:after="20"/>
       </w:pPr>
       <w:r>
         <w:rPr>
           <w:rFonts w:ascii="Calibri" w:hAnsi="Calibri" w:cs="Calibri" w:eastAsia="Calibri"/>
           <w:b/>
           <w:i w:val="0"/>
-          <w:color w:val="0F2544"/>
-          <w:sz w:val="22"/>
-          <w:u w:val="none"/>
-          <w:caps w:val="1"/>
-          <w:spacing w:val="30"/>
+          <w:color w:val="1B2A4A"/>
+          <w:sz w:val="21"/>
         </w:rPr>
         <w:t>Key Contributions</w:t>
       </w:r>
@@ -1795,17 +1411,16 @@
     <w:p>
       <w:pPr>
         <w:pStyle w:val="ListBullet"/>
-        <w:spacing w:after="40" w:line="283" w:lineRule="auto"/>
-        <w:ind w:left="340"/>
+        <w:spacing w:after="20" w:line="276" w:lineRule="auto"/>
+        <w:ind w:left="283"/>
       </w:pPr>
       <w:r>
         <w:rPr>
           <w:rFonts w:ascii="Calibri" w:hAnsi="Calibri" w:cs="Calibri" w:eastAsia="Calibri"/>
           <w:b w:val="0"/>
           <w:i w:val="0"/>
-          <w:color w:val="1B1B1B"/>
-          <w:sz w:val="22"/>
-          <w:u w:val="none"/>
+          <w:color w:val="2C2C2C"/>
+          <w:sz w:val="21"/>
         </w:rPr>
         <w:t>Led operational transformation initiatives, improving efficiency and profitability.</w:t>
       </w:r>
@@ -1813,17 +1428,16 @@
     <w:p>
       <w:pPr>
         <w:pStyle w:val="ListBullet"/>
-        <w:spacing w:after="40" w:line="283" w:lineRule="auto"/>
-        <w:ind w:left="340"/>
+        <w:spacing w:after="20" w:line="276" w:lineRule="auto"/>
+        <w:ind w:left="283"/>
       </w:pPr>
       <w:r>
         <w:rPr>
           <w:rFonts w:ascii="Calibri" w:hAnsi="Calibri" w:cs="Calibri" w:eastAsia="Calibri"/>
           <w:b w:val="0"/>
           <w:i w:val="0"/>
-          <w:color w:val="1B1B1B"/>
-          <w:sz w:val="22"/>
-          <w:u w:val="none"/>
+          <w:color w:val="2C2C2C"/>
+          <w:sz w:val="21"/>
         </w:rPr>
         <w:t>Implemented ERP-enabled procurement and inventory management frameworks.</w:t>
       </w:r>
@@ -1831,17 +1445,16 @@
     <w:p>
       <w:pPr>
         <w:pStyle w:val="ListBullet"/>
-        <w:spacing w:after="40" w:line="283" w:lineRule="auto"/>
-        <w:ind w:left="340"/>
+        <w:spacing w:after="20" w:line="276" w:lineRule="auto"/>
+        <w:ind w:left="283"/>
       </w:pPr>
       <w:r>
         <w:rPr>
           <w:rFonts w:ascii="Calibri" w:hAnsi="Calibri" w:cs="Calibri" w:eastAsia="Calibri"/>
           <w:b w:val="0"/>
           <w:i w:val="0"/>
-          <w:color w:val="1B1B1B"/>
-          <w:sz w:val="22"/>
-          <w:u w:val="none"/>
+          <w:color w:val="2C2C2C"/>
+          <w:sz w:val="21"/>
         </w:rPr>
         <w:t>Negotiated and managed strategic supplier agreements and service contracts.</w:t>
       </w:r>
@@ -1849,35 +1462,33 @@
     <w:p>
       <w:pPr>
         <w:pStyle w:val="ListBullet"/>
-        <w:spacing w:after="40" w:line="283" w:lineRule="auto"/>
-        <w:ind w:left="340"/>
+        <w:spacing w:after="20" w:line="276" w:lineRule="auto"/>
+        <w:ind w:left="283"/>
       </w:pPr>
       <w:r>
         <w:rPr>
           <w:rFonts w:ascii="Calibri" w:hAnsi="Calibri" w:cs="Calibri" w:eastAsia="Calibri"/>
           <w:b w:val="0"/>
           <w:i w:val="0"/>
-          <w:color w:val="1B1B1B"/>
-          <w:sz w:val="22"/>
-          <w:u w:val="none"/>
+          <w:color w:val="2C2C2C"/>
+          <w:sz w:val="21"/>
         </w:rPr>
-        <w:t>Established performance management systems improving operational visibility and accountability.</w:t>
+        <w:t>Established performance management systems improving operational visibility.</w:t>
       </w:r>
     </w:p>
     <w:p>
       <w:pPr>
         <w:pStyle w:val="ListBullet"/>
-        <w:spacing w:after="40" w:line="283" w:lineRule="auto"/>
-        <w:ind w:left="340"/>
+        <w:spacing w:after="20" w:line="276" w:lineRule="auto"/>
+        <w:ind w:left="283"/>
       </w:pPr>
       <w:r>
         <w:rPr>
           <w:rFonts w:ascii="Calibri" w:hAnsi="Calibri" w:cs="Calibri" w:eastAsia="Calibri"/>
           <w:b w:val="0"/>
           <w:i w:val="0"/>
-          <w:color w:val="1B1B1B"/>
-          <w:sz w:val="22"/>
-          <w:u w:val="none"/>
+          <w:color w:val="2C2C2C"/>
+          <w:sz w:val="21"/>
         </w:rPr>
         <w:t>Reduced operational costs through process redesign and workflow optimisation.</w:t>
       </w:r>
@@ -1885,17 +1496,16 @@
     <w:p>
       <w:pPr>
         <w:pStyle w:val="ListBullet"/>
-        <w:spacing w:after="40" w:line="283" w:lineRule="auto"/>
-        <w:ind w:left="340"/>
+        <w:spacing w:after="20" w:line="276" w:lineRule="auto"/>
+        <w:ind w:left="283"/>
       </w:pPr>
       <w:r>
         <w:rPr>
           <w:rFonts w:ascii="Calibri" w:hAnsi="Calibri" w:cs="Calibri" w:eastAsia="Calibri"/>
           <w:b w:val="0"/>
           <w:i w:val="0"/>
-          <w:color w:val="1B1B1B"/>
-          <w:sz w:val="22"/>
-          <w:u w:val="none"/>
+          <w:color w:val="2C2C2C"/>
+          <w:sz w:val="21"/>
         </w:rPr>
         <w:t>Developed management reporting frameworks supporting strategic decision-making.</w:t>
       </w:r>
@@ -1903,17 +1513,16 @@
     <w:p>
       <w:pPr>
         <w:pStyle w:val="ListBullet"/>
-        <w:spacing w:after="40" w:line="283" w:lineRule="auto"/>
-        <w:ind w:left="340"/>
+        <w:spacing w:after="20" w:line="276" w:lineRule="auto"/>
+        <w:ind w:left="283"/>
       </w:pPr>
       <w:r>
         <w:rPr>
           <w:rFonts w:ascii="Calibri" w:hAnsi="Calibri" w:cs="Calibri" w:eastAsia="Calibri"/>
           <w:b w:val="0"/>
           <w:i w:val="0"/>
-          <w:color w:val="1B1B1B"/>
-          <w:sz w:val="22"/>
-          <w:u w:val="none"/>
+          <w:color w:val="2C2C2C"/>
+          <w:sz w:val="21"/>
         </w:rPr>
         <w:t>Built scalable operational structures that supported business expansion.</w:t>
       </w:r>
@@ -1923,18 +1532,15 @@
         <w:tabs>
           <w:tab w:pos="9638" w:val="right"/>
         </w:tabs>
-        <w:spacing w:before="200" w:after="0" w:line="240" w:lineRule="auto"/>
+        <w:spacing w:before="200" w:after="0"/>
       </w:pPr>
       <w:r>
         <w:rPr>
           <w:rFonts w:ascii="Calibri" w:hAnsi="Calibri" w:cs="Calibri" w:eastAsia="Calibri"/>
           <w:b/>
           <w:i w:val="0"/>
-          <w:color w:val="0F2544"/>
-          <w:sz w:val="26"/>
-          <w:u w:val="none"/>
-          <w:caps w:val="1"/>
-          <w:spacing w:val="60"/>
+          <w:color w:val="1B2A4A"/>
+          <w:sz w:val="24"/>
         </w:rPr>
         <w:t>Unitrans</w:t>
       </w:r>
@@ -1946,9 +1552,8 @@
           <w:rFonts w:ascii="Calibri" w:hAnsi="Calibri" w:cs="Calibri" w:eastAsia="Calibri"/>
           <w:b w:val="0"/>
           <w:i/>
-          <w:color w:val="555C66"/>
+          <w:color w:val="6B6B6B"/>
           <w:sz w:val="21"/>
-          <w:u w:val="none"/>
         </w:rPr>
         <w:t>Jan 2010 – Aug 2014</w:t>
       </w:r>
@@ -1958,19 +1563,15 @@
         <w:tabs>
           <w:tab w:pos="9638" w:val="right"/>
         </w:tabs>
-        <w:spacing w:before="0" w:after="40" w:line="240" w:lineRule="auto"/>
-        <w:pBdr>
-          <w:bottom w:val="single" w:sz="4" w:space="2" w:color="C0973C"/>
-        </w:pBdr>
+        <w:spacing w:before="0" w:after="60"/>
       </w:pPr>
       <w:r>
         <w:rPr>
           <w:rFonts w:ascii="Calibri" w:hAnsi="Calibri" w:cs="Calibri" w:eastAsia="Calibri"/>
           <w:b/>
           <w:i/>
-          <w:color w:val="C0973C"/>
-          <w:sz w:val="23"/>
-          <w:u w:val="none"/>
+          <w:color w:val="A6832E"/>
+          <w:sz w:val="22"/>
         </w:rPr>
         <w:t>Operations &amp; Logistics Manager</w:t>
       </w:r>
@@ -1982,34 +1583,30 @@
           <w:rFonts w:ascii="Calibri" w:hAnsi="Calibri" w:cs="Calibri" w:eastAsia="Calibri"/>
           <w:b w:val="0"/>
           <w:i/>
-          <w:color w:val="555C66"/>
+          <w:color w:val="6B6B6B"/>
           <w:sz w:val="20"/>
-          <w:u w:val="none"/>
         </w:rPr>
         <w:t>Cape Town, South Africa</w:t>
       </w:r>
     </w:p>
     <w:p>
       <w:pPr>
-        <w:spacing w:before="80" w:after="20" w:line="240" w:lineRule="auto"/>
+        <w:spacing w:before="80" w:after="20"/>
       </w:pPr>
       <w:r>
         <w:rPr>
           <w:rFonts w:ascii="Calibri" w:hAnsi="Calibri" w:cs="Calibri" w:eastAsia="Calibri"/>
           <w:b/>
           <w:i w:val="0"/>
-          <w:color w:val="0F2544"/>
-          <w:sz w:val="22"/>
-          <w:u w:val="none"/>
-          <w:caps w:val="1"/>
-          <w:spacing w:val="30"/>
+          <w:color w:val="1B2A4A"/>
+          <w:sz w:val="21"/>
         </w:rPr>
         <w:t>Executive Mandate</w:t>
       </w:r>
     </w:p>
     <w:p>
       <w:pPr>
-        <w:spacing w:before="0" w:after="80" w:line="288" w:lineRule="auto"/>
+        <w:spacing w:after="60" w:line="288" w:lineRule="auto"/>
         <w:jc w:val="both"/>
       </w:pPr>
       <w:r>
@@ -2017,27 +1614,23 @@
           <w:rFonts w:ascii="Calibri" w:hAnsi="Calibri" w:cs="Calibri" w:eastAsia="Calibri"/>
           <w:b w:val="0"/>
           <w:i w:val="0"/>
-          <w:color w:val="1B1B1B"/>
+          <w:color w:val="2C2C2C"/>
           <w:sz w:val="22"/>
-          <w:u w:val="none"/>
         </w:rPr>
         <w:t>Manage large-scale, multi-site warehouse and transport operations in a high-pressure logistics environment.</w:t>
       </w:r>
     </w:p>
     <w:p>
       <w:pPr>
-        <w:spacing w:before="80" w:after="20" w:line="240" w:lineRule="auto"/>
+        <w:spacing w:before="80" w:after="20"/>
       </w:pPr>
       <w:r>
         <w:rPr>
           <w:rFonts w:ascii="Calibri" w:hAnsi="Calibri" w:cs="Calibri" w:eastAsia="Calibri"/>
           <w:b/>
           <w:i w:val="0"/>
-          <w:color w:val="0F2544"/>
-          <w:sz w:val="22"/>
-          <w:u w:val="none"/>
-          <w:caps w:val="1"/>
-          <w:spacing w:val="30"/>
+          <w:color w:val="1B2A4A"/>
+          <w:sz w:val="21"/>
         </w:rPr>
         <w:t>Key Contributions</w:t>
       </w:r>
@@ -2045,17 +1638,16 @@
     <w:p>
       <w:pPr>
         <w:pStyle w:val="ListBullet"/>
-        <w:spacing w:after="40" w:line="283" w:lineRule="auto"/>
-        <w:ind w:left="340"/>
+        <w:spacing w:after="20" w:line="276" w:lineRule="auto"/>
+        <w:ind w:left="283"/>
       </w:pPr>
       <w:r>
         <w:rPr>
           <w:rFonts w:ascii="Calibri" w:hAnsi="Calibri" w:cs="Calibri" w:eastAsia="Calibri"/>
           <w:b/>
           <w:i w:val="0"/>
-          <w:color w:val="0F2544"/>
-          <w:sz w:val="22"/>
-          <w:u w:val="none"/>
+          <w:color w:val="1B2A4A"/>
+          <w:sz w:val="21"/>
         </w:rPr>
         <w:t xml:space="preserve">Team: </w:t>
       </w:r>
@@ -2064,9 +1656,8 @@
           <w:rFonts w:ascii="Calibri" w:hAnsi="Calibri" w:cs="Calibri" w:eastAsia="Calibri"/>
           <w:b w:val="0"/>
           <w:i w:val="0"/>
-          <w:color w:val="1B1B1B"/>
-          <w:sz w:val="22"/>
-          <w:u w:val="none"/>
+          <w:color w:val="2C2C2C"/>
+          <w:sz w:val="21"/>
         </w:rPr>
         <w:t>led 120+ staff across warehouse and fleet operations.</w:t>
       </w:r>
@@ -2074,17 +1665,16 @@
     <w:p>
       <w:pPr>
         <w:pStyle w:val="ListBullet"/>
-        <w:spacing w:after="40" w:line="283" w:lineRule="auto"/>
-        <w:ind w:left="340"/>
+        <w:spacing w:after="20" w:line="276" w:lineRule="auto"/>
+        <w:ind w:left="283"/>
       </w:pPr>
       <w:r>
         <w:rPr>
           <w:rFonts w:ascii="Calibri" w:hAnsi="Calibri" w:cs="Calibri" w:eastAsia="Calibri"/>
           <w:b/>
           <w:i w:val="0"/>
-          <w:color w:val="0F2544"/>
-          <w:sz w:val="22"/>
-          <w:u w:val="none"/>
+          <w:color w:val="1B2A4A"/>
+          <w:sz w:val="21"/>
         </w:rPr>
         <w:t xml:space="preserve">Technology: </w:t>
       </w:r>
@@ -2093,9 +1683,8 @@
           <w:rFonts w:ascii="Calibri" w:hAnsi="Calibri" w:cs="Calibri" w:eastAsia="Calibri"/>
           <w:b w:val="0"/>
           <w:i w:val="0"/>
-          <w:color w:val="1B1B1B"/>
-          <w:sz w:val="22"/>
-          <w:u w:val="none"/>
+          <w:color w:val="2C2C2C"/>
+          <w:sz w:val="21"/>
         </w:rPr>
         <w:t>governed SAP-supported WMS integration — reduced dispatch errors by 30%.</w:t>
       </w:r>
@@ -2103,17 +1692,16 @@
     <w:p>
       <w:pPr>
         <w:pStyle w:val="ListBullet"/>
-        <w:spacing w:after="40" w:line="283" w:lineRule="auto"/>
-        <w:ind w:left="340"/>
+        <w:spacing w:after="20" w:line="276" w:lineRule="auto"/>
+        <w:ind w:left="283"/>
       </w:pPr>
       <w:r>
         <w:rPr>
           <w:rFonts w:ascii="Calibri" w:hAnsi="Calibri" w:cs="Calibri" w:eastAsia="Calibri"/>
           <w:b/>
           <w:i w:val="0"/>
-          <w:color w:val="0F2544"/>
-          <w:sz w:val="22"/>
-          <w:u w:val="none"/>
+          <w:color w:val="1B2A4A"/>
+          <w:sz w:val="21"/>
         </w:rPr>
         <w:t xml:space="preserve">Cost: </w:t>
       </w:r>
@@ -2122,9 +1710,8 @@
           <w:rFonts w:ascii="Calibri" w:hAnsi="Calibri" w:cs="Calibri" w:eastAsia="Calibri"/>
           <w:b w:val="0"/>
           <w:i w:val="0"/>
-          <w:color w:val="1B1B1B"/>
-          <w:sz w:val="22"/>
-          <w:u w:val="none"/>
+          <w:color w:val="2C2C2C"/>
+          <w:sz w:val="21"/>
         </w:rPr>
         <w:t>renegotiated transport and vendor contracts — achieved 10% logistics cost reduction.</w:t>
       </w:r>
@@ -2132,17 +1719,16 @@
     <w:p>
       <w:pPr>
         <w:pStyle w:val="ListBullet"/>
-        <w:spacing w:after="40" w:line="283" w:lineRule="auto"/>
-        <w:ind w:left="340"/>
+        <w:spacing w:after="20" w:line="276" w:lineRule="auto"/>
+        <w:ind w:left="283"/>
       </w:pPr>
       <w:r>
         <w:rPr>
           <w:rFonts w:ascii="Calibri" w:hAnsi="Calibri" w:cs="Calibri" w:eastAsia="Calibri"/>
           <w:b/>
           <w:i w:val="0"/>
-          <w:color w:val="0F2544"/>
-          <w:sz w:val="22"/>
-          <w:u w:val="none"/>
+          <w:color w:val="1B2A4A"/>
+          <w:sz w:val="21"/>
         </w:rPr>
         <w:t xml:space="preserve">Productivity: </w:t>
       </w:r>
@@ -2151,9 +1737,8 @@
           <w:rFonts w:ascii="Calibri" w:hAnsi="Calibri" w:cs="Calibri" w:eastAsia="Calibri"/>
           <w:b w:val="0"/>
           <w:i w:val="0"/>
-          <w:color w:val="1B1B1B"/>
-          <w:sz w:val="22"/>
-          <w:u w:val="none"/>
+          <w:color w:val="2C2C2C"/>
+          <w:sz w:val="21"/>
         </w:rPr>
         <w:t>developed structured KPI frameworks — improved throughput by 18%.</w:t>
       </w:r>
@@ -2161,17 +1746,16 @@
     <w:p>
       <w:pPr>
         <w:pStyle w:val="ListBullet"/>
-        <w:spacing w:after="40" w:line="283" w:lineRule="auto"/>
-        <w:ind w:left="340"/>
+        <w:spacing w:after="20" w:line="276" w:lineRule="auto"/>
+        <w:ind w:left="283"/>
       </w:pPr>
       <w:r>
         <w:rPr>
           <w:rFonts w:ascii="Calibri" w:hAnsi="Calibri" w:cs="Calibri" w:eastAsia="Calibri"/>
           <w:b/>
           <w:i w:val="0"/>
-          <w:color w:val="0F2544"/>
-          <w:sz w:val="22"/>
-          <w:u w:val="none"/>
+          <w:color w:val="1B2A4A"/>
+          <w:sz w:val="21"/>
         </w:rPr>
         <w:t xml:space="preserve">Compliance: </w:t>
       </w:r>
@@ -2180,9 +1764,8 @@
           <w:rFonts w:ascii="Calibri" w:hAnsi="Calibri" w:cs="Calibri" w:eastAsia="Calibri"/>
           <w:b w:val="0"/>
           <w:i w:val="0"/>
-          <w:color w:val="1B1B1B"/>
-          <w:sz w:val="22"/>
-          <w:u w:val="none"/>
+          <w:color w:val="2C2C2C"/>
+          <w:sz w:val="21"/>
         </w:rPr>
         <w:t>enforced OHSA compliance — zero major audit findings.</w:t>
       </w:r>
@@ -2190,17 +1773,16 @@
     <w:p>
       <w:pPr>
         <w:pStyle w:val="ListBullet"/>
-        <w:spacing w:after="40" w:line="283" w:lineRule="auto"/>
-        <w:ind w:left="340"/>
+        <w:spacing w:after="20" w:line="276" w:lineRule="auto"/>
+        <w:ind w:left="283"/>
       </w:pPr>
       <w:r>
         <w:rPr>
           <w:rFonts w:ascii="Calibri" w:hAnsi="Calibri" w:cs="Calibri" w:eastAsia="Calibri"/>
           <w:b/>
           <w:i w:val="0"/>
-          <w:color w:val="0F2544"/>
-          <w:sz w:val="22"/>
-          <w:u w:val="none"/>
+          <w:color w:val="1B2A4A"/>
+          <w:sz w:val="21"/>
         </w:rPr>
         <w:t xml:space="preserve">Labour: </w:t>
       </w:r>
@@ -2209,9 +1791,8 @@
           <w:rFonts w:ascii="Calibri" w:hAnsi="Calibri" w:cs="Calibri" w:eastAsia="Calibri"/>
           <w:b w:val="0"/>
           <w:i w:val="0"/>
-          <w:color w:val="1B1B1B"/>
-          <w:sz w:val="22"/>
-          <w:u w:val="none"/>
+          <w:color w:val="2C2C2C"/>
+          <w:sz w:val="21"/>
         </w:rPr>
         <w:t>chaired disciplinary processes and supported labour alignment.</w:t>
       </w:r>
@@ -2219,17 +1800,16 @@
     <w:p>
       <w:pPr>
         <w:pStyle w:val="ListBullet"/>
-        <w:spacing w:after="40" w:line="283" w:lineRule="auto"/>
-        <w:ind w:left="340"/>
+        <w:spacing w:after="20" w:line="276" w:lineRule="auto"/>
+        <w:ind w:left="283"/>
       </w:pPr>
       <w:r>
         <w:rPr>
           <w:rFonts w:ascii="Calibri" w:hAnsi="Calibri" w:cs="Calibri" w:eastAsia="Calibri"/>
           <w:b/>
           <w:i w:val="0"/>
-          <w:color w:val="0F2544"/>
-          <w:sz w:val="22"/>
-          <w:u w:val="none"/>
+          <w:color w:val="1B2A4A"/>
+          <w:sz w:val="21"/>
         </w:rPr>
         <w:t xml:space="preserve">Service: </w:t>
       </w:r>
@@ -2238,9 +1818,8 @@
           <w:rFonts w:ascii="Calibri" w:hAnsi="Calibri" w:cs="Calibri" w:eastAsia="Calibri"/>
           <w:b w:val="0"/>
           <w:i w:val="0"/>
-          <w:color w:val="1B1B1B"/>
-          <w:sz w:val="22"/>
-          <w:u w:val="none"/>
+          <w:color w:val="2C2C2C"/>
+          <w:sz w:val="21"/>
         </w:rPr>
         <w:t>balanced stock across regional nodes to maintain JIT performance.</w:t>
       </w:r>
@@ -2248,30 +1827,28 @@
     <w:p>
       <w:pPr>
         <w:pStyle w:val="ListBullet"/>
-        <w:spacing w:after="40" w:line="283" w:lineRule="auto"/>
-        <w:ind w:left="340"/>
+        <w:spacing w:after="20" w:line="276" w:lineRule="auto"/>
+        <w:ind w:left="283"/>
       </w:pPr>
       <w:r>
         <w:rPr>
           <w:rFonts w:ascii="Calibri" w:hAnsi="Calibri" w:cs="Calibri" w:eastAsia="Calibri"/>
           <w:b/>
           <w:i w:val="0"/>
-          <w:color w:val="0F2544"/>
-          <w:sz w:val="22"/>
-          <w:u w:val="none"/>
+          <w:color w:val="1B2A4A"/>
+          <w:sz w:val="21"/>
         </w:rPr>
-        <w:t xml:space="preserve">Agile Operations: </w:t>
+        <w:t xml:space="preserve">Agile Ops: </w:t>
       </w:r>
       <w:r>
         <w:rPr>
           <w:rFonts w:ascii="Calibri" w:hAnsi="Calibri" w:cs="Calibri" w:eastAsia="Calibri"/>
           <w:b w:val="0"/>
           <w:i w:val="0"/>
-          <w:color w:val="1B1B1B"/>
-          <w:sz w:val="22"/>
-          <w:u w:val="none"/>
+          <w:color w:val="2C2C2C"/>
+          <w:sz w:val="21"/>
         </w:rPr>
-        <w:t>applied Agile sprint cadence for continuous improvement cycles across multiple sites.</w:t>
+        <w:t>applied Agile sprint cadence for continuous improvement across multiple sites.</w:t>
       </w:r>
     </w:p>
     <w:p>
@@ -2279,18 +1856,15 @@
         <w:tabs>
           <w:tab w:pos="9638" w:val="right"/>
         </w:tabs>
-        <w:spacing w:before="200" w:after="0" w:line="240" w:lineRule="auto"/>
+        <w:spacing w:before="200" w:after="0"/>
       </w:pPr>
       <w:r>
         <w:rPr>
           <w:rFonts w:ascii="Calibri" w:hAnsi="Calibri" w:cs="Calibri" w:eastAsia="Calibri"/>
           <w:b/>
           <w:i w:val="0"/>
-          <w:color w:val="0F2544"/>
-          <w:sz w:val="26"/>
-          <w:u w:val="none"/>
-          <w:caps w:val="1"/>
-          <w:spacing w:val="60"/>
+          <w:color w:val="1B2A4A"/>
+          <w:sz w:val="24"/>
         </w:rPr>
         <w:t>Premier Foods</w:t>
       </w:r>
@@ -2302,9 +1876,8 @@
           <w:rFonts w:ascii="Calibri" w:hAnsi="Calibri" w:cs="Calibri" w:eastAsia="Calibri"/>
           <w:b w:val="0"/>
           <w:i/>
-          <w:color w:val="555C66"/>
+          <w:color w:val="6B6B6B"/>
           <w:sz w:val="21"/>
-          <w:u w:val="none"/>
         </w:rPr>
         <w:t>Jan 2005 – Dec 2009</w:t>
       </w:r>
@@ -2314,19 +1887,15 @@
         <w:tabs>
           <w:tab w:pos="9638" w:val="right"/>
         </w:tabs>
-        <w:spacing w:before="0" w:after="40" w:line="240" w:lineRule="auto"/>
-        <w:pBdr>
-          <w:bottom w:val="single" w:sz="4" w:space="2" w:color="C0973C"/>
-        </w:pBdr>
+        <w:spacing w:before="0" w:after="60"/>
       </w:pPr>
       <w:r>
         <w:rPr>
           <w:rFonts w:ascii="Calibri" w:hAnsi="Calibri" w:cs="Calibri" w:eastAsia="Calibri"/>
           <w:b/>
           <w:i/>
-          <w:color w:val="C0973C"/>
-          <w:sz w:val="23"/>
-          <w:u w:val="none"/>
+          <w:color w:val="A6832E"/>
+          <w:sz w:val="22"/>
         </w:rPr>
         <w:t>Warehouse &amp; Logistics Manager</w:t>
       </w:r>
@@ -2338,34 +1907,30 @@
           <w:rFonts w:ascii="Calibri" w:hAnsi="Calibri" w:cs="Calibri" w:eastAsia="Calibri"/>
           <w:b w:val="0"/>
           <w:i/>
-          <w:color w:val="555C66"/>
+          <w:color w:val="6B6B6B"/>
           <w:sz w:val="20"/>
-          <w:u w:val="none"/>
         </w:rPr>
         <w:t>Cape Town, South Africa</w:t>
       </w:r>
     </w:p>
     <w:p>
       <w:pPr>
-        <w:spacing w:before="80" w:after="20" w:line="240" w:lineRule="auto"/>
+        <w:spacing w:before="80" w:after="20"/>
       </w:pPr>
       <w:r>
         <w:rPr>
           <w:rFonts w:ascii="Calibri" w:hAnsi="Calibri" w:cs="Calibri" w:eastAsia="Calibri"/>
           <w:b/>
           <w:i w:val="0"/>
-          <w:color w:val="0F2544"/>
-          <w:sz w:val="22"/>
-          <w:u w:val="none"/>
-          <w:caps w:val="1"/>
-          <w:spacing w:val="30"/>
+          <w:color w:val="1B2A4A"/>
+          <w:sz w:val="21"/>
         </w:rPr>
         <w:t>Executive Mandate</w:t>
       </w:r>
     </w:p>
     <w:p>
       <w:pPr>
-        <w:spacing w:before="0" w:after="80" w:line="288" w:lineRule="auto"/>
+        <w:spacing w:after="60" w:line="288" w:lineRule="auto"/>
         <w:jc w:val="both"/>
       </w:pPr>
       <w:r>
@@ -2373,27 +1938,23 @@
           <w:rFonts w:ascii="Calibri" w:hAnsi="Calibri" w:cs="Calibri" w:eastAsia="Calibri"/>
           <w:b w:val="0"/>
           <w:i w:val="0"/>
-          <w:color w:val="1B1B1B"/>
+          <w:color w:val="2C2C2C"/>
           <w:sz w:val="22"/>
-          <w:u w:val="none"/>
         </w:rPr>
         <w:t>Lead high-volume national warehousing and distribution operations in a fast-paced FMCG environment.</w:t>
       </w:r>
     </w:p>
     <w:p>
       <w:pPr>
-        <w:spacing w:before="80" w:after="20" w:line="240" w:lineRule="auto"/>
+        <w:spacing w:before="80" w:after="20"/>
       </w:pPr>
       <w:r>
         <w:rPr>
           <w:rFonts w:ascii="Calibri" w:hAnsi="Calibri" w:cs="Calibri" w:eastAsia="Calibri"/>
           <w:b/>
           <w:i w:val="0"/>
-          <w:color w:val="0F2544"/>
-          <w:sz w:val="22"/>
-          <w:u w:val="none"/>
-          <w:caps w:val="1"/>
-          <w:spacing w:val="30"/>
+          <w:color w:val="1B2A4A"/>
+          <w:sz w:val="21"/>
         </w:rPr>
         <w:t>Key Contributions</w:t>
       </w:r>
@@ -2401,17 +1962,16 @@
     <w:p>
       <w:pPr>
         <w:pStyle w:val="ListBullet"/>
-        <w:spacing w:after="40" w:line="283" w:lineRule="auto"/>
-        <w:ind w:left="340"/>
+        <w:spacing w:after="20" w:line="276" w:lineRule="auto"/>
+        <w:ind w:left="283"/>
       </w:pPr>
       <w:r>
         <w:rPr>
           <w:rFonts w:ascii="Calibri" w:hAnsi="Calibri" w:cs="Calibri" w:eastAsia="Calibri"/>
           <w:b/>
           <w:i w:val="0"/>
-          <w:color w:val="0F2544"/>
-          <w:sz w:val="22"/>
-          <w:u w:val="none"/>
+          <w:color w:val="1B2A4A"/>
+          <w:sz w:val="21"/>
         </w:rPr>
         <w:t xml:space="preserve">Scope: </w:t>
       </w:r>
@@ -2420,27 +1980,25 @@
           <w:rFonts w:ascii="Calibri" w:hAnsi="Calibri" w:cs="Calibri" w:eastAsia="Calibri"/>
           <w:b w:val="0"/>
           <w:i w:val="0"/>
-          <w:color w:val="1B1B1B"/>
-          <w:sz w:val="22"/>
-          <w:u w:val="none"/>
+          <w:color w:val="2C2C2C"/>
+          <w:sz w:val="21"/>
         </w:rPr>
-        <w:t>managed 24/7 national distribution — receiving, storage, dispatch and transport coordination.</w:t>
+        <w:t>managed 24/7 national distribution — receiving, storage, dispatch and transport.</w:t>
       </w:r>
     </w:p>
     <w:p>
       <w:pPr>
         <w:pStyle w:val="ListBullet"/>
-        <w:spacing w:after="40" w:line="283" w:lineRule="auto"/>
-        <w:ind w:left="340"/>
+        <w:spacing w:after="20" w:line="276" w:lineRule="auto"/>
+        <w:ind w:left="283"/>
       </w:pPr>
       <w:r>
         <w:rPr>
           <w:rFonts w:ascii="Calibri" w:hAnsi="Calibri" w:cs="Calibri" w:eastAsia="Calibri"/>
           <w:b/>
           <w:i w:val="0"/>
-          <w:color w:val="0F2544"/>
-          <w:sz w:val="22"/>
-          <w:u w:val="none"/>
+          <w:color w:val="1B2A4A"/>
+          <w:sz w:val="21"/>
         </w:rPr>
         <w:t xml:space="preserve">Inventory: </w:t>
       </w:r>
@@ -2449,9 +2007,8 @@
           <w:rFonts w:ascii="Calibri" w:hAnsi="Calibri" w:cs="Calibri" w:eastAsia="Calibri"/>
           <w:b w:val="0"/>
           <w:i w:val="0"/>
-          <w:color w:val="1B1B1B"/>
-          <w:sz w:val="22"/>
-          <w:u w:val="none"/>
+          <w:color w:val="2C2C2C"/>
+          <w:sz w:val="21"/>
         </w:rPr>
         <w:t>implemented ERP-aligned WMS controls — reduced stock loss by 15%.</w:t>
       </w:r>
@@ -2459,17 +2016,16 @@
     <w:p>
       <w:pPr>
         <w:pStyle w:val="ListBullet"/>
-        <w:spacing w:after="40" w:line="283" w:lineRule="auto"/>
-        <w:ind w:left="340"/>
+        <w:spacing w:after="20" w:line="276" w:lineRule="auto"/>
+        <w:ind w:left="283"/>
       </w:pPr>
       <w:r>
         <w:rPr>
           <w:rFonts w:ascii="Calibri" w:hAnsi="Calibri" w:cs="Calibri" w:eastAsia="Calibri"/>
           <w:b/>
           <w:i w:val="0"/>
-          <w:color w:val="0F2544"/>
-          <w:sz w:val="22"/>
-          <w:u w:val="none"/>
+          <w:color w:val="1B2A4A"/>
+          <w:sz w:val="21"/>
         </w:rPr>
         <w:t xml:space="preserve">Cost: </w:t>
       </w:r>
@@ -2478,9 +2034,8 @@
           <w:rFonts w:ascii="Calibri" w:hAnsi="Calibri" w:cs="Calibri" w:eastAsia="Calibri"/>
           <w:b w:val="0"/>
           <w:i w:val="0"/>
-          <w:color w:val="1B1B1B"/>
-          <w:sz w:val="22"/>
-          <w:u w:val="none"/>
+          <w:color w:val="2C2C2C"/>
+          <w:sz w:val="21"/>
         </w:rPr>
         <w:t>redesigned route planning — cut national logistics costs by 10%.</w:t>
       </w:r>
@@ -2488,17 +2043,16 @@
     <w:p>
       <w:pPr>
         <w:pStyle w:val="ListBullet"/>
-        <w:spacing w:after="40" w:line="283" w:lineRule="auto"/>
-        <w:ind w:left="340"/>
+        <w:spacing w:after="20" w:line="276" w:lineRule="auto"/>
+        <w:ind w:left="283"/>
       </w:pPr>
       <w:r>
         <w:rPr>
           <w:rFonts w:ascii="Calibri" w:hAnsi="Calibri" w:cs="Calibri" w:eastAsia="Calibri"/>
           <w:b/>
           <w:i w:val="0"/>
-          <w:color w:val="0F2544"/>
-          <w:sz w:val="22"/>
-          <w:u w:val="none"/>
+          <w:color w:val="1B2A4A"/>
+          <w:sz w:val="21"/>
         </w:rPr>
         <w:t xml:space="preserve">Governance: </w:t>
       </w:r>
@@ -2507,27 +2061,25 @@
           <w:rFonts w:ascii="Calibri" w:hAnsi="Calibri" w:cs="Calibri" w:eastAsia="Calibri"/>
           <w:b w:val="0"/>
           <w:i w:val="0"/>
-          <w:color w:val="1B1B1B"/>
-          <w:sz w:val="22"/>
-          <w:u w:val="none"/>
+          <w:color w:val="2C2C2C"/>
+          <w:sz w:val="21"/>
         </w:rPr>
-        <w:t>led daily operational cadence meetings — tracked OTIF, dispatch variances, fleet utilisation and exceptions.</w:t>
+        <w:t>led daily cadence meetings — tracked OTIF, dispatch variances, fleet utilisation.</w:t>
       </w:r>
     </w:p>
     <w:p>
       <w:pPr>
         <w:pStyle w:val="ListBullet"/>
-        <w:spacing w:after="40" w:line="283" w:lineRule="auto"/>
-        <w:ind w:left="340"/>
+        <w:spacing w:after="20" w:line="276" w:lineRule="auto"/>
+        <w:ind w:left="283"/>
       </w:pPr>
       <w:r>
         <w:rPr>
           <w:rFonts w:ascii="Calibri" w:hAnsi="Calibri" w:cs="Calibri" w:eastAsia="Calibri"/>
           <w:b/>
           <w:i w:val="0"/>
-          <w:color w:val="0F2544"/>
-          <w:sz w:val="22"/>
-          <w:u w:val="none"/>
+          <w:color w:val="1B2A4A"/>
+          <w:sz w:val="21"/>
         </w:rPr>
         <w:t xml:space="preserve">Safety: </w:t>
       </w:r>
@@ -2536,9 +2088,8 @@
           <w:rFonts w:ascii="Calibri" w:hAnsi="Calibri" w:cs="Calibri" w:eastAsia="Calibri"/>
           <w:b w:val="0"/>
           <w:i w:val="0"/>
-          <w:color w:val="1B1B1B"/>
-          <w:sz w:val="22"/>
-          <w:u w:val="none"/>
+          <w:color w:val="2C2C2C"/>
+          <w:sz w:val="21"/>
         </w:rPr>
         <w:t>enforced OHSA compliance — safety audits, risk assessments and incident reporting.</w:t>
       </w:r>
@@ -2546,17 +2097,16 @@
     <w:p>
       <w:pPr>
         <w:pStyle w:val="ListBullet"/>
-        <w:spacing w:after="40" w:line="283" w:lineRule="auto"/>
-        <w:ind w:left="340"/>
+        <w:spacing w:after="20" w:line="276" w:lineRule="auto"/>
+        <w:ind w:left="283"/>
       </w:pPr>
       <w:r>
         <w:rPr>
           <w:rFonts w:ascii="Calibri" w:hAnsi="Calibri" w:cs="Calibri" w:eastAsia="Calibri"/>
           <w:b/>
           <w:i w:val="0"/>
-          <w:color w:val="0F2544"/>
-          <w:sz w:val="22"/>
-          <w:u w:val="none"/>
+          <w:color w:val="1B2A4A"/>
+          <w:sz w:val="21"/>
         </w:rPr>
         <w:t xml:space="preserve">Labour: </w:t>
       </w:r>
@@ -2565,11 +2115,10 @@
           <w:rFonts w:ascii="Calibri" w:hAnsi="Calibri" w:cs="Calibri" w:eastAsia="Calibri"/>
           <w:b w:val="0"/>
           <w:i w:val="0"/>
-          <w:color w:val="1B1B1B"/>
-          <w:sz w:val="22"/>
-          <w:u w:val="none"/>
+          <w:color w:val="2C2C2C"/>
+          <w:sz w:val="21"/>
         </w:rPr>
-        <w:t>managed union engagement and workforce governance — handled grievances and maintained labour compliance.</w:t>
+        <w:t>managed union engagement and workforce governance — maintained compliance.</w:t>
       </w:r>
     </w:p>
     <w:p>
@@ -2577,18 +2126,15 @@
         <w:tabs>
           <w:tab w:pos="9638" w:val="right"/>
         </w:tabs>
-        <w:spacing w:before="200" w:after="0" w:line="240" w:lineRule="auto"/>
+        <w:spacing w:before="200" w:after="0"/>
       </w:pPr>
       <w:r>
         <w:rPr>
           <w:rFonts w:ascii="Calibri" w:hAnsi="Calibri" w:cs="Calibri" w:eastAsia="Calibri"/>
           <w:b/>
           <w:i w:val="0"/>
-          <w:color w:val="0F2544"/>
-          <w:sz w:val="26"/>
-          <w:u w:val="none"/>
-          <w:caps w:val="1"/>
-          <w:spacing w:val="60"/>
+          <w:color w:val="1B2A4A"/>
+          <w:sz w:val="24"/>
         </w:rPr>
         <w:t>Wayne's Constructions</w:t>
       </w:r>
@@ -2600,9 +2146,8 @@
           <w:rFonts w:ascii="Calibri" w:hAnsi="Calibri" w:cs="Calibri" w:eastAsia="Calibri"/>
           <w:b w:val="0"/>
           <w:i/>
-          <w:color w:val="555C66"/>
+          <w:color w:val="6B6B6B"/>
           <w:sz w:val="21"/>
-          <w:u w:val="none"/>
         </w:rPr>
         <w:t>Feb 2001 – Dec 2004</w:t>
       </w:r>
@@ -2612,19 +2157,15 @@
         <w:tabs>
           <w:tab w:pos="9638" w:val="right"/>
         </w:tabs>
-        <w:spacing w:before="0" w:after="40" w:line="240" w:lineRule="auto"/>
-        <w:pBdr>
-          <w:bottom w:val="single" w:sz="4" w:space="2" w:color="C0973C"/>
-        </w:pBdr>
+        <w:spacing w:before="0" w:after="60"/>
       </w:pPr>
       <w:r>
         <w:rPr>
           <w:rFonts w:ascii="Calibri" w:hAnsi="Calibri" w:cs="Calibri" w:eastAsia="Calibri"/>
           <w:b/>
           <w:i/>
-          <w:color w:val="C0973C"/>
-          <w:sz w:val="23"/>
-          <w:u w:val="none"/>
+          <w:color w:val="A6832E"/>
+          <w:sz w:val="22"/>
         </w:rPr>
         <w:t>HR &amp; Operations Systems Generalist</w:t>
       </w:r>
@@ -2636,34 +2177,30 @@
           <w:rFonts w:ascii="Calibri" w:hAnsi="Calibri" w:cs="Calibri" w:eastAsia="Calibri"/>
           <w:b w:val="0"/>
           <w:i/>
-          <w:color w:val="555C66"/>
+          <w:color w:val="6B6B6B"/>
           <w:sz w:val="20"/>
-          <w:u w:val="none"/>
         </w:rPr>
         <w:t>George, South Africa</w:t>
       </w:r>
     </w:p>
     <w:p>
       <w:pPr>
-        <w:spacing w:before="80" w:after="20" w:line="240" w:lineRule="auto"/>
+        <w:spacing w:before="80" w:after="20"/>
       </w:pPr>
       <w:r>
         <w:rPr>
           <w:rFonts w:ascii="Calibri" w:hAnsi="Calibri" w:cs="Calibri" w:eastAsia="Calibri"/>
           <w:b/>
           <w:i w:val="0"/>
-          <w:color w:val="0F2544"/>
-          <w:sz w:val="22"/>
-          <w:u w:val="none"/>
-          <w:caps w:val="1"/>
-          <w:spacing w:val="30"/>
+          <w:color w:val="1B2A4A"/>
+          <w:sz w:val="21"/>
         </w:rPr>
         <w:t>Executive Mandate</w:t>
       </w:r>
     </w:p>
     <w:p>
       <w:pPr>
-        <w:spacing w:before="0" w:after="80" w:line="288" w:lineRule="auto"/>
+        <w:spacing w:after="60" w:line="288" w:lineRule="auto"/>
         <w:jc w:val="both"/>
       </w:pPr>
       <w:r>
@@ -2671,27 +2208,23 @@
           <w:rFonts w:ascii="Calibri" w:hAnsi="Calibri" w:cs="Calibri" w:eastAsia="Calibri"/>
           <w:b w:val="0"/>
           <w:i w:val="0"/>
-          <w:color w:val="1B1B1B"/>
+          <w:color w:val="2C2C2C"/>
           <w:sz w:val="22"/>
-          <w:u w:val="none"/>
         </w:rPr>
         <w:t>Provide HR, workforce governance and operational systems support in a labour-intensive environment.</w:t>
       </w:r>
     </w:p>
     <w:p>
       <w:pPr>
-        <w:spacing w:before="80" w:after="20" w:line="240" w:lineRule="auto"/>
+        <w:spacing w:before="80" w:after="20"/>
       </w:pPr>
       <w:r>
         <w:rPr>
           <w:rFonts w:ascii="Calibri" w:hAnsi="Calibri" w:cs="Calibri" w:eastAsia="Calibri"/>
           <w:b/>
           <w:i w:val="0"/>
-          <w:color w:val="0F2544"/>
-          <w:sz w:val="22"/>
-          <w:u w:val="none"/>
-          <w:caps w:val="1"/>
-          <w:spacing w:val="30"/>
+          <w:color w:val="1B2A4A"/>
+          <w:sz w:val="21"/>
         </w:rPr>
         <w:t>Key Contributions</w:t>
       </w:r>
@@ -2699,17 +2232,16 @@
     <w:p>
       <w:pPr>
         <w:pStyle w:val="ListBullet"/>
-        <w:spacing w:after="40" w:line="283" w:lineRule="auto"/>
-        <w:ind w:left="340"/>
+        <w:spacing w:after="20" w:line="276" w:lineRule="auto"/>
+        <w:ind w:left="283"/>
       </w:pPr>
       <w:r>
         <w:rPr>
           <w:rFonts w:ascii="Calibri" w:hAnsi="Calibri" w:cs="Calibri" w:eastAsia="Calibri"/>
           <w:b/>
           <w:i w:val="0"/>
-          <w:color w:val="0F2544"/>
-          <w:sz w:val="22"/>
-          <w:u w:val="none"/>
+          <w:color w:val="1B2A4A"/>
+          <w:sz w:val="21"/>
         </w:rPr>
         <w:t xml:space="preserve">HR Operations: </w:t>
       </w:r>
@@ -2718,9 +2250,8 @@
           <w:rFonts w:ascii="Calibri" w:hAnsi="Calibri" w:cs="Calibri" w:eastAsia="Calibri"/>
           <w:b w:val="0"/>
           <w:i w:val="0"/>
-          <w:color w:val="1B1B1B"/>
-          <w:sz w:val="22"/>
-          <w:u w:val="none"/>
+          <w:color w:val="2C2C2C"/>
+          <w:sz w:val="21"/>
         </w:rPr>
         <w:t>end-to-end recruitment, workforce planning and labour compliance.</w:t>
       </w:r>
@@ -2728,17 +2259,16 @@
     <w:p>
       <w:pPr>
         <w:pStyle w:val="ListBullet"/>
-        <w:spacing w:after="40" w:line="283" w:lineRule="auto"/>
-        <w:ind w:left="340"/>
+        <w:spacing w:after="20" w:line="276" w:lineRule="auto"/>
+        <w:ind w:left="283"/>
       </w:pPr>
       <w:r>
         <w:rPr>
           <w:rFonts w:ascii="Calibri" w:hAnsi="Calibri" w:cs="Calibri" w:eastAsia="Calibri"/>
           <w:b/>
           <w:i w:val="0"/>
-          <w:color w:val="0F2544"/>
-          <w:sz w:val="22"/>
-          <w:u w:val="none"/>
+          <w:color w:val="1B2A4A"/>
+          <w:sz w:val="21"/>
         </w:rPr>
         <w:t xml:space="preserve">Digitisation: </w:t>
       </w:r>
@@ -2747,27 +2277,25 @@
           <w:rFonts w:ascii="Calibri" w:hAnsi="Calibri" w:cs="Calibri" w:eastAsia="Calibri"/>
           <w:b w:val="0"/>
           <w:i w:val="0"/>
-          <w:color w:val="1B1B1B"/>
-          <w:sz w:val="22"/>
-          <w:u w:val="none"/>
+          <w:color w:val="2C2C2C"/>
+          <w:sz w:val="21"/>
         </w:rPr>
-        <w:t>implemented early HRIS / Workday-aligned processes — digitised employee records, improving control and reporting accuracy.</w:t>
+        <w:t>implemented early HRIS processes — digitised records, improving reporting accuracy.</w:t>
       </w:r>
     </w:p>
     <w:p>
       <w:pPr>
         <w:pStyle w:val="ListBullet"/>
-        <w:spacing w:after="40" w:line="283" w:lineRule="auto"/>
-        <w:ind w:left="340"/>
+        <w:spacing w:after="20" w:line="276" w:lineRule="auto"/>
+        <w:ind w:left="283"/>
       </w:pPr>
       <w:r>
         <w:rPr>
           <w:rFonts w:ascii="Calibri" w:hAnsi="Calibri" w:cs="Calibri" w:eastAsia="Calibri"/>
           <w:b/>
           <w:i w:val="0"/>
-          <w:color w:val="0F2544"/>
-          <w:sz w:val="22"/>
-          <w:u w:val="none"/>
+          <w:color w:val="1B2A4A"/>
+          <w:sz w:val="21"/>
         </w:rPr>
         <w:t xml:space="preserve">Efficiency: </w:t>
       </w:r>
@@ -2776,9 +2304,8 @@
           <w:rFonts w:ascii="Calibri" w:hAnsi="Calibri" w:cs="Calibri" w:eastAsia="Calibri"/>
           <w:b w:val="0"/>
           <w:i w:val="0"/>
-          <w:color w:val="1B1B1B"/>
-          <w:sz w:val="22"/>
-          <w:u w:val="none"/>
+          <w:color w:val="2C2C2C"/>
+          <w:sz w:val="21"/>
         </w:rPr>
         <w:t>reduced hiring lead times by 30% via structured recruitment and onboarding.</w:t>
       </w:r>
@@ -2786,17 +2313,16 @@
     <w:p>
       <w:pPr>
         <w:pStyle w:val="ListBullet"/>
-        <w:spacing w:after="40" w:line="283" w:lineRule="auto"/>
-        <w:ind w:left="340"/>
+        <w:spacing w:after="20" w:line="276" w:lineRule="auto"/>
+        <w:ind w:left="283"/>
       </w:pPr>
       <w:r>
         <w:rPr>
           <w:rFonts w:ascii="Calibri" w:hAnsi="Calibri" w:cs="Calibri" w:eastAsia="Calibri"/>
           <w:b/>
           <w:i w:val="0"/>
-          <w:color w:val="0F2544"/>
-          <w:sz w:val="22"/>
-          <w:u w:val="none"/>
+          <w:color w:val="1B2A4A"/>
+          <w:sz w:val="21"/>
         </w:rPr>
         <w:t xml:space="preserve">Retention: </w:t>
       </w:r>
@@ -2805,121 +2331,111 @@
           <w:rFonts w:ascii="Calibri" w:hAnsi="Calibri" w:cs="Calibri" w:eastAsia="Calibri"/>
           <w:b w:val="0"/>
           <w:i w:val="0"/>
-          <w:color w:val="1B1B1B"/>
-          <w:sz w:val="22"/>
-          <w:u w:val="none"/>
+          <w:color w:val="2C2C2C"/>
+          <w:sz w:val="21"/>
         </w:rPr>
-        <w:t>improved employee retention by 15% through structured engagement and performance alignment.</w:t>
+        <w:t>improved employee retention by 15% through engagement and performance alignment.</w:t>
       </w:r>
     </w:p>
     <w:p>
       <w:pPr>
         <w:pStyle w:val="ListBullet"/>
-        <w:spacing w:after="40" w:line="283" w:lineRule="auto"/>
-        <w:ind w:left="340"/>
+        <w:spacing w:after="20" w:line="276" w:lineRule="auto"/>
+        <w:ind w:left="283"/>
       </w:pPr>
       <w:r>
         <w:rPr>
           <w:rFonts w:ascii="Calibri" w:hAnsi="Calibri" w:cs="Calibri" w:eastAsia="Calibri"/>
           <w:b/>
           <w:i w:val="0"/>
-          <w:color w:val="0F2544"/>
-          <w:sz w:val="22"/>
-          <w:u w:val="none"/>
+          <w:color w:val="1B2A4A"/>
+          <w:sz w:val="21"/>
         </w:rPr>
-        <w:t xml:space="preserve">Safety &amp; Training: </w:t>
+        <w:t xml:space="preserve">Safety: </w:t>
       </w:r>
       <w:r>
         <w:rPr>
           <w:rFonts w:ascii="Calibri" w:hAnsi="Calibri" w:cs="Calibri" w:eastAsia="Calibri"/>
           <w:b w:val="0"/>
           <w:i w:val="0"/>
-          <w:color w:val="1B1B1B"/>
-          <w:sz w:val="22"/>
-          <w:u w:val="none"/>
+          <w:color w:val="2C2C2C"/>
+          <w:sz w:val="21"/>
         </w:rPr>
-        <w:t>delivered OHSA compliance — risk assessments, safety audits and incident investigation frameworks.</w:t>
+        <w:t>delivered OHSA compliance — risk assessments, safety audits, incident frameworks.</w:t>
       </w:r>
     </w:p>
     <w:p>
       <w:pPr>
         <w:pStyle w:val="ListBullet"/>
-        <w:spacing w:after="40" w:line="283" w:lineRule="auto"/>
-        <w:ind w:left="340"/>
+        <w:spacing w:after="20" w:line="276" w:lineRule="auto"/>
+        <w:ind w:left="283"/>
       </w:pPr>
       <w:r>
         <w:rPr>
           <w:rFonts w:ascii="Calibri" w:hAnsi="Calibri" w:cs="Calibri" w:eastAsia="Calibri"/>
           <w:b/>
           <w:i w:val="0"/>
-          <w:color w:val="0F2544"/>
-          <w:sz w:val="22"/>
-          <w:u w:val="none"/>
+          <w:color w:val="1B2A4A"/>
+          <w:sz w:val="21"/>
         </w:rPr>
-        <w:t xml:space="preserve">Cross-Functional Governance: </w:t>
+        <w:t xml:space="preserve">Governance: </w:t>
       </w:r>
       <w:r>
         <w:rPr>
           <w:rFonts w:ascii="Calibri" w:hAnsi="Calibri" w:cs="Calibri" w:eastAsia="Calibri"/>
           <w:b w:val="0"/>
           <w:i w:val="0"/>
-          <w:color w:val="1B1B1B"/>
-          <w:sz w:val="22"/>
-          <w:u w:val="none"/>
+          <w:color w:val="2C2C2C"/>
+          <w:sz w:val="21"/>
         </w:rPr>
         <w:t>supported payroll, procurement and project controls.</w:t>
       </w:r>
     </w:p>
     <w:p>
       <w:pPr>
-        <w:spacing w:before="200" w:after="20" w:line="240" w:lineRule="auto"/>
+        <w:spacing w:before="80" w:after="20"/>
       </w:pPr>
       <w:r>
         <w:rPr>
           <w:rFonts w:ascii="Calibri" w:hAnsi="Calibri" w:cs="Calibri" w:eastAsia="Calibri"/>
           <w:b/>
           <w:i w:val="0"/>
-          <w:color w:val="0F2544"/>
-          <w:sz w:val="22"/>
-          <w:u w:val="none"/>
-          <w:caps w:val="1"/>
-          <w:spacing w:val="30"/>
+          <w:color w:val="1B2A4A"/>
+          <w:sz w:val="21"/>
         </w:rPr>
-        <w:t>Industrial Relations &amp; Workforce Governance — Cross-Role Expertise</w:t>
+        <w:t>Industrial Relations &amp; Workforce Governance (Cross-Role)</w:t>
       </w:r>
     </w:p>
     <w:p>
       <w:pPr>
         <w:pStyle w:val="ListBullet"/>
-        <w:spacing w:after="40" w:line="283" w:lineRule="auto"/>
-        <w:ind w:left="340"/>
+        <w:spacing w:after="20" w:line="276" w:lineRule="auto"/>
+        <w:ind w:left="283"/>
       </w:pPr>
       <w:r>
         <w:rPr>
           <w:rFonts w:ascii="Calibri" w:hAnsi="Calibri" w:cs="Calibri" w:eastAsia="Calibri"/>
           <w:b w:val="0"/>
           <w:i w:val="0"/>
-          <w:color w:val="1B1B1B"/>
-          <w:sz w:val="22"/>
-          <w:u w:val="none"/>
+          <w:color w:val="2C2C2C"/>
+          <w:sz w:val="21"/>
         </w:rPr>
-        <w:t>Led union negotiations and grievance handling processes across multiple operational environments.</w:t>
+        <w:t>Led union negotiations and grievance handling across multiple environments.</w:t>
       </w:r>
     </w:p>
     <w:p>
       <w:pPr>
         <w:pStyle w:val="ListBullet"/>
-        <w:spacing w:after="40" w:line="283" w:lineRule="auto"/>
-        <w:ind w:left="340"/>
+        <w:spacing w:after="20" w:line="276" w:lineRule="auto"/>
+        <w:ind w:left="283"/>
       </w:pPr>
       <w:r>
         <w:rPr>
           <w:rFonts w:ascii="Calibri" w:hAnsi="Calibri" w:cs="Calibri" w:eastAsia="Calibri"/>
           <w:b w:val="0"/>
           <w:i w:val="0"/>
-          <w:color w:val="1B1B1B"/>
-          <w:sz w:val="22"/>
-          <w:u w:val="none"/>
+          <w:color w:val="2C2C2C"/>
+          <w:sz w:val="21"/>
         </w:rPr>
         <w:t>Chaired disciplinary forums aligned with the Labour Relations Act.</w:t>
       </w:r>
@@ -2927,17 +2443,16 @@
     <w:p>
       <w:pPr>
         <w:pStyle w:val="ListBullet"/>
-        <w:spacing w:after="40" w:line="283" w:lineRule="auto"/>
-        <w:ind w:left="340"/>
+        <w:spacing w:after="20" w:line="276" w:lineRule="auto"/>
+        <w:ind w:left="283"/>
       </w:pPr>
       <w:r>
         <w:rPr>
           <w:rFonts w:ascii="Calibri" w:hAnsi="Calibri" w:cs="Calibri" w:eastAsia="Calibri"/>
           <w:b w:val="0"/>
           <w:i w:val="0"/>
-          <w:color w:val="1B1B1B"/>
-          <w:sz w:val="22"/>
-          <w:u w:val="none"/>
+          <w:color w:val="2C2C2C"/>
+          <w:sz w:val="21"/>
         </w:rPr>
         <w:t>Directed workforce planning and productivity modelling across distribution nodes.</w:t>
       </w:r>
@@ -2945,311 +2460,281 @@
     <w:p>
       <w:pPr>
         <w:pStyle w:val="ListBullet"/>
-        <w:spacing w:after="40" w:line="283" w:lineRule="auto"/>
-        <w:ind w:left="340"/>
+        <w:spacing w:after="20" w:line="276" w:lineRule="auto"/>
+        <w:ind w:left="283"/>
       </w:pPr>
       <w:r>
         <w:rPr>
           <w:rFonts w:ascii="Calibri" w:hAnsi="Calibri" w:cs="Calibri" w:eastAsia="Calibri"/>
           <w:b w:val="0"/>
           <w:i w:val="0"/>
-          <w:color w:val="1B1B1B"/>
-          <w:sz w:val="22"/>
-          <w:u w:val="none"/>
+          <w:color w:val="2C2C2C"/>
+          <w:sz w:val="21"/>
         </w:rPr>
-        <w:t>Enforced OHSA compliance through formal risk assessments, safety audits and incident investigations — zero major audit findings across roles.</w:t>
+        <w:t>Zero major audit findings — OHSA compliance via formal risk assessments and safety audits.</w:t>
       </w:r>
     </w:p>
     <w:p>
       <w:pPr>
-        <w:spacing w:before="240" w:after="80" w:line="276" w:lineRule="auto"/>
-        <w:ind w:left="142"/>
-        <w:shd w:val="clear" w:color="auto" w:fill="0F2544"/>
+        <w:spacing w:before="280" w:after="60"/>
+        <w:pBdr>
+          <w:bottom w:val="single" w:sz="6" w:space="1" w:color="A6832E"/>
+        </w:pBdr>
       </w:pPr>
       <w:r>
         <w:rPr>
           <w:rFonts w:ascii="Calibri" w:hAnsi="Calibri" w:cs="Calibri" w:eastAsia="Calibri"/>
           <w:b/>
           <w:i w:val="0"/>
-          <w:color w:val="FFFFFF"/>
-          <w:sz w:val="25"/>
-          <w:u w:val="none"/>
+          <w:color w:val="1B2A4A"/>
+          <w:sz w:val="24"/>
           <w:caps w:val="1"/>
-          <w:spacing w:val="80"/>
+          <w:spacing w:val="60"/>
         </w:rPr>
-        <w:t>Enterprise Achievements — Roll-up of Metrics</w:t>
+        <w:t>Enterprise Achievements</w:t>
       </w:r>
     </w:p>
     <w:p>
       <w:pPr>
-        <w:spacing w:before="40" w:after="60" w:line="300" w:lineRule="auto"/>
+        <w:spacing w:before="40" w:after="60" w:line="288" w:lineRule="auto"/>
       </w:pPr>
       <w:r>
         <w:rPr>
           <w:rFonts w:ascii="Calibri" w:hAnsi="Calibri" w:cs="Calibri" w:eastAsia="Calibri"/>
           <w:b/>
           <w:i w:val="0"/>
-          <w:color w:val="0F2544"/>
-          <w:sz w:val="22"/>
-          <w:u w:val="none"/>
-          <w:caps w:val="1"/>
-          <w:spacing w:val="30"/>
+          <w:color w:val="1B2A4A"/>
+          <w:sz w:val="21"/>
         </w:rPr>
-        <w:t xml:space="preserve">Financial Performance — </w:t>
+        <w:t xml:space="preserve">Financial:  </w:t>
       </w:r>
       <w:r>
         <w:rPr>
           <w:rFonts w:ascii="Calibri" w:hAnsi="Calibri" w:cs="Calibri" w:eastAsia="Calibri"/>
           <w:b w:val="0"/>
           <w:i w:val="0"/>
-          <w:color w:val="1B1B1B"/>
-          <w:sz w:val="22"/>
-          <w:u w:val="none"/>
+          <w:color w:val="2C2C2C"/>
+          <w:sz w:val="21"/>
         </w:rPr>
-        <w:t>Managed budgets exceeding R25M; delivered recurring procurement savings; reduced OPEX via process optimisation; improved inventory efficiency and working capital.</w:t>
+        <w:t>Managed budgets exceeding R25M; recurring procurement savings; reduced OPEX; improved working capital.</w:t>
       </w:r>
     </w:p>
     <w:p>
       <w:pPr>
-        <w:spacing w:before="40" w:after="60" w:line="300" w:lineRule="auto"/>
+        <w:spacing w:before="40" w:after="60" w:line="288" w:lineRule="auto"/>
       </w:pPr>
       <w:r>
         <w:rPr>
           <w:rFonts w:ascii="Calibri" w:hAnsi="Calibri" w:cs="Calibri" w:eastAsia="Calibri"/>
           <w:b/>
           <w:i w:val="0"/>
-          <w:color w:val="0F2544"/>
-          <w:sz w:val="22"/>
-          <w:u w:val="none"/>
-          <w:caps w:val="1"/>
-          <w:spacing w:val="30"/>
+          <w:color w:val="1B2A4A"/>
+          <w:sz w:val="21"/>
         </w:rPr>
-        <w:t xml:space="preserve">Operational Excellence — </w:t>
+        <w:t xml:space="preserve">Operational:  </w:t>
       </w:r>
       <w:r>
         <w:rPr>
           <w:rFonts w:ascii="Calibri" w:hAnsi="Calibri" w:cs="Calibri" w:eastAsia="Calibri"/>
           <w:b w:val="0"/>
           <w:i w:val="0"/>
-          <w:color w:val="1B1B1B"/>
-          <w:sz w:val="22"/>
-          <w:u w:val="none"/>
+          <w:color w:val="2C2C2C"/>
+          <w:sz w:val="21"/>
         </w:rPr>
-        <w:t>Achieved &gt;95% OTIF; improved inventory accuracy; reduced logistics lead times; optimised multi-site warehouse and distribution operations.</w:t>
+        <w:t>Achieved &gt;95% OTIF; improved inventory accuracy; reduced lead times; optimised multi-site operations.</w:t>
       </w:r>
     </w:p>
     <w:p>
       <w:pPr>
-        <w:spacing w:before="40" w:after="60" w:line="300" w:lineRule="auto"/>
+        <w:spacing w:before="40" w:after="60" w:line="288" w:lineRule="auto"/>
       </w:pPr>
       <w:r>
         <w:rPr>
           <w:rFonts w:ascii="Calibri" w:hAnsi="Calibri" w:cs="Calibri" w:eastAsia="Calibri"/>
           <w:b/>
           <w:i w:val="0"/>
-          <w:color w:val="0F2544"/>
-          <w:sz w:val="22"/>
-          <w:u w:val="none"/>
-          <w:caps w:val="1"/>
-          <w:spacing w:val="30"/>
+          <w:color w:val="1B2A4A"/>
+          <w:sz w:val="21"/>
         </w:rPr>
-        <w:t xml:space="preserve">Leadership &amp; Governance — </w:t>
+        <w:t xml:space="preserve">Leadership:  </w:t>
       </w:r>
       <w:r>
         <w:rPr>
           <w:rFonts w:ascii="Calibri" w:hAnsi="Calibri" w:cs="Calibri" w:eastAsia="Calibri"/>
           <w:b w:val="0"/>
           <w:i w:val="0"/>
-          <w:color w:val="1B1B1B"/>
-          <w:sz w:val="22"/>
-          <w:u w:val="none"/>
+          <w:color w:val="2C2C2C"/>
+          <w:sz w:val="21"/>
         </w:rPr>
-        <w:t>Led teams of 120+; managed unionised workforces; implemented audit-ready governance frameworks; built KPI-driven accountability cultures.</w:t>
+        <w:t>Led 120+ teams; managed unionised workforces; audit-ready governance; KPI-driven cultures.</w:t>
       </w:r>
     </w:p>
     <w:p>
       <w:pPr>
-        <w:spacing w:before="40" w:after="60" w:line="300" w:lineRule="auto"/>
+        <w:spacing w:before="40" w:after="60" w:line="288" w:lineRule="auto"/>
       </w:pPr>
       <w:r>
         <w:rPr>
           <w:rFonts w:ascii="Calibri" w:hAnsi="Calibri" w:cs="Calibri" w:eastAsia="Calibri"/>
           <w:b/>
           <w:i w:val="0"/>
-          <w:color w:val="0F2544"/>
-          <w:sz w:val="22"/>
-          <w:u w:val="none"/>
-          <w:caps w:val="1"/>
-          <w:spacing w:val="30"/>
+          <w:color w:val="1B2A4A"/>
+          <w:sz w:val="21"/>
         </w:rPr>
-        <w:t xml:space="preserve">Strategic Transformation — </w:t>
+        <w:t xml:space="preserve">Transformation:  </w:t>
       </w:r>
       <w:r>
         <w:rPr>
           <w:rFonts w:ascii="Calibri" w:hAnsi="Calibri" w:cs="Calibri" w:eastAsia="Calibri"/>
           <w:b w:val="0"/>
           <w:i w:val="0"/>
-          <w:color w:val="1B1B1B"/>
-          <w:sz w:val="22"/>
-          <w:u w:val="none"/>
+          <w:color w:val="2C2C2C"/>
+          <w:sz w:val="21"/>
         </w:rPr>
-        <w:t>Led enterprise improvement programmes; deployed ERP-enabled processes; improved executive visibility via performance reporting; strengthened supplier and operational resilience.</w:t>
+        <w:t>Enterprise improvement programmes; ERP deployment; executive reporting; supplier resilience.</w:t>
       </w:r>
     </w:p>
     <w:p>
       <w:pPr>
-        <w:spacing w:before="240" w:after="80" w:line="276" w:lineRule="auto"/>
-        <w:ind w:left="142"/>
-        <w:shd w:val="clear" w:color="auto" w:fill="0F2544"/>
+        <w:spacing w:before="280" w:after="60"/>
+        <w:pBdr>
+          <w:bottom w:val="single" w:sz="6" w:space="1" w:color="A6832E"/>
+        </w:pBdr>
       </w:pPr>
       <w:r>
         <w:rPr>
           <w:rFonts w:ascii="Calibri" w:hAnsi="Calibri" w:cs="Calibri" w:eastAsia="Calibri"/>
           <w:b/>
           <w:i w:val="0"/>
-          <w:color w:val="FFFFFF"/>
-          <w:sz w:val="25"/>
-          <w:u w:val="none"/>
+          <w:color w:val="1B2A4A"/>
+          <w:sz w:val="24"/>
           <w:caps w:val="1"/>
-          <w:spacing w:val="80"/>
+          <w:spacing w:val="60"/>
         </w:rPr>
         <w:t>Education &amp; Certifications</w:t>
       </w:r>
     </w:p>
     <w:p>
       <w:pPr>
-        <w:spacing w:before="80" w:after="20" w:line="240" w:lineRule="auto"/>
+        <w:spacing w:before="80" w:after="20"/>
       </w:pPr>
       <w:r>
         <w:rPr>
           <w:rFonts w:ascii="Calibri" w:hAnsi="Calibri" w:cs="Calibri" w:eastAsia="Calibri"/>
           <w:b/>
           <w:i w:val="0"/>
-          <w:color w:val="0F2544"/>
-          <w:sz w:val="22"/>
-          <w:u w:val="none"/>
-          <w:caps w:val="1"/>
-          <w:spacing w:val="30"/>
+          <w:color w:val="1B2A4A"/>
+          <w:sz w:val="21"/>
         </w:rPr>
         <w:t>Supply Chain &amp; Operations</w:t>
       </w:r>
     </w:p>
     <w:p>
       <w:pPr>
-        <w:spacing w:before="0" w:after="80" w:line="288" w:lineRule="auto"/>
+        <w:spacing w:after="80" w:line="288" w:lineRule="auto"/>
       </w:pPr>
       <w:r>
         <w:rPr>
           <w:rFonts w:ascii="Calibri" w:hAnsi="Calibri" w:cs="Calibri" w:eastAsia="Calibri"/>
           <w:b w:val="0"/>
           <w:i w:val="0"/>
-          <w:color w:val="1B1B1B"/>
+          <w:color w:val="2C2C2C"/>
           <w:sz w:val="22"/>
-          <w:u w:val="none"/>
         </w:rPr>
         <w:t>APICS CSCP (Certified Supply Chain Professional)  ·  Lean Six Sigma Black Belt  ·  Diploma in Supply Chain Management (Coursera).</w:t>
       </w:r>
     </w:p>
     <w:p>
       <w:pPr>
-        <w:spacing w:before="80" w:after="20" w:line="240" w:lineRule="auto"/>
+        <w:spacing w:before="80" w:after="20"/>
       </w:pPr>
       <w:r>
         <w:rPr>
           <w:rFonts w:ascii="Calibri" w:hAnsi="Calibri" w:cs="Calibri" w:eastAsia="Calibri"/>
           <w:b/>
           <w:i w:val="0"/>
-          <w:color w:val="0F2544"/>
-          <w:sz w:val="22"/>
-          <w:u w:val="none"/>
-          <w:caps w:val="1"/>
-          <w:spacing w:val="30"/>
+          <w:color w:val="1B2A4A"/>
+          <w:sz w:val="21"/>
         </w:rPr>
         <w:t>Business &amp; Compliance</w:t>
       </w:r>
     </w:p>
     <w:p>
       <w:pPr>
-        <w:spacing w:before="0" w:after="80" w:line="288" w:lineRule="auto"/>
+        <w:spacing w:after="80" w:line="288" w:lineRule="auto"/>
       </w:pPr>
       <w:r>
         <w:rPr>
           <w:rFonts w:ascii="Calibri" w:hAnsi="Calibri" w:cs="Calibri" w:eastAsia="Calibri"/>
           <w:b w:val="0"/>
           <w:i w:val="0"/>
-          <w:color w:val="1B1B1B"/>
+          <w:color w:val="2C2C2C"/>
           <w:sz w:val="22"/>
-          <w:u w:val="none"/>
         </w:rPr>
-        <w:t>Diploma in Project Management  ·  Diploma in Health &amp; Safety  ·  Diploma in Human Resources Management  (all Coursera).</w:t>
+        <w:t>Diploma in Project Management  ·  Diploma in Health &amp; Safety  ·  Diploma in Human Resources Management (all Coursera).</w:t>
       </w:r>
     </w:p>
     <w:p>
       <w:pPr>
-        <w:spacing w:before="80" w:after="20" w:line="240" w:lineRule="auto"/>
+        <w:spacing w:before="80" w:after="20"/>
       </w:pPr>
       <w:r>
         <w:rPr>
           <w:rFonts w:ascii="Calibri" w:hAnsi="Calibri" w:cs="Calibri" w:eastAsia="Calibri"/>
           <w:b/>
           <w:i w:val="0"/>
-          <w:color w:val="0F2544"/>
-          <w:sz w:val="22"/>
-          <w:u w:val="none"/>
-          <w:caps w:val="1"/>
-          <w:spacing w:val="30"/>
+          <w:color w:val="1B2A4A"/>
+          <w:sz w:val="21"/>
         </w:rPr>
         <w:t>Technology &amp; Engineering</w:t>
       </w:r>
     </w:p>
     <w:p>
       <w:pPr>
-        <w:spacing w:before="0" w:after="80" w:line="288" w:lineRule="auto"/>
+        <w:spacing w:after="80" w:line="288" w:lineRule="auto"/>
       </w:pPr>
       <w:r>
         <w:rPr>
           <w:rFonts w:ascii="Calibri" w:hAnsi="Calibri" w:cs="Calibri" w:eastAsia="Calibri"/>
           <w:b w:val="0"/>
           <w:i w:val="0"/>
-          <w:color w:val="1B1B1B"/>
+          <w:color w:val="2C2C2C"/>
           <w:sz w:val="22"/>
-          <w:u w:val="none"/>
         </w:rPr>
-        <w:t>Computer Science Certificate (Harvard CS50)  ·  Ethical Hacker (Cisco Networking Academy)  ·  AI for Everyone + Deep Learning Specialisation (Andrew Ng / DeepLearning.AI)  ·  FNB App Development Programme  ·  Full Stack Development, Back End &amp; APIs, Machine Learning with Python, Web Design (freeCodeCamp).</w:t>
+        <w:t>Computer Science (Harvard CS50)  ·  Ethical Hacker (Cisco)  ·  AI + Deep Learning (Andrew Ng)  ·  FNB App Development  ·  Full Stack, Back End, ML, Web Design (freeCodeCamp).</w:t>
       </w:r>
     </w:p>
     <w:p>
       <w:pPr>
-        <w:spacing w:before="240" w:after="80" w:line="276" w:lineRule="auto"/>
-        <w:ind w:left="142"/>
-        <w:shd w:val="clear" w:color="auto" w:fill="0F2544"/>
+        <w:spacing w:before="280" w:after="60"/>
+        <w:pBdr>
+          <w:bottom w:val="single" w:sz="6" w:space="1" w:color="A6832E"/>
+        </w:pBdr>
       </w:pPr>
       <w:r>
         <w:rPr>
           <w:rFonts w:ascii="Calibri" w:hAnsi="Calibri" w:cs="Calibri" w:eastAsia="Calibri"/>
           <w:b/>
           <w:i w:val="0"/>
-          <w:color w:val="FFFFFF"/>
-          <w:sz w:val="25"/>
-          <w:u w:val="none"/>
+          <w:color w:val="1B2A4A"/>
+          <w:sz w:val="24"/>
           <w:caps w:val="1"/>
-          <w:spacing w:val="80"/>
+          <w:spacing w:val="60"/>
         </w:rPr>
         <w:t>Languages &amp; Work Rights</w:t>
       </w:r>
     </w:p>
     <w:p>
       <w:pPr>
-        <w:spacing w:before="0" w:after="40" w:line="288" w:lineRule="auto"/>
+        <w:spacing w:after="40"/>
       </w:pPr>
       <w:r>
         <w:rPr>
           <w:rFonts w:ascii="Calibri" w:hAnsi="Calibri" w:cs="Calibri" w:eastAsia="Calibri"/>
           <w:b/>
           <w:i w:val="0"/>
-          <w:color w:val="0F2544"/>
-          <w:sz w:val="22"/>
-          <w:u w:val="none"/>
+          <w:color w:val="1B2A4A"/>
+          <w:sz w:val="21"/>
         </w:rPr>
         <w:t xml:space="preserve">Languages:  </w:t>
       </w:r>
@@ -3258,25 +2743,23 @@
           <w:rFonts w:ascii="Calibri" w:hAnsi="Calibri" w:cs="Calibri" w:eastAsia="Calibri"/>
           <w:b w:val="0"/>
           <w:i w:val="0"/>
-          <w:color w:val="1B1B1B"/>
-          <w:sz w:val="22"/>
-          <w:u w:val="none"/>
+          <w:color w:val="2C2C2C"/>
+          <w:sz w:val="21"/>
         </w:rPr>
         <w:t>English (Native)  ·  Afrikaans (Native)  ·  German (Conversational)</w:t>
       </w:r>
     </w:p>
     <w:p>
       <w:pPr>
-        <w:spacing w:before="0" w:after="40" w:line="288" w:lineRule="auto"/>
+        <w:spacing w:after="40"/>
       </w:pPr>
       <w:r>
         <w:rPr>
           <w:rFonts w:ascii="Calibri" w:hAnsi="Calibri" w:cs="Calibri" w:eastAsia="Calibri"/>
           <w:b/>
           <w:i w:val="0"/>
-          <w:color w:val="0F2544"/>
-          <w:sz w:val="22"/>
-          <w:u w:val="none"/>
+          <w:color w:val="1B2A4A"/>
+          <w:sz w:val="21"/>
         </w:rPr>
         <w:t xml:space="preserve">Residency:  </w:t>
       </w:r>
@@ -3285,79 +2768,48 @@
           <w:rFonts w:ascii="Calibri" w:hAnsi="Calibri" w:cs="Calibri" w:eastAsia="Calibri"/>
           <w:b w:val="0"/>
           <w:i w:val="0"/>
-          <w:color w:val="1B1B1B"/>
-          <w:sz w:val="22"/>
-          <w:u w:val="none"/>
+          <w:color w:val="2C2C2C"/>
+          <w:sz w:val="21"/>
         </w:rPr>
-        <w:t>Dual South African / German citizenship.</w:t>
+        <w:t>Dual South African / German</w:t>
       </w:r>
     </w:p>
     <w:p>
       <w:pPr>
-        <w:spacing w:before="0" w:after="40" w:line="288" w:lineRule="auto"/>
+        <w:spacing w:after="40"/>
       </w:pPr>
       <w:r>
         <w:rPr>
           <w:rFonts w:ascii="Calibri" w:hAnsi="Calibri" w:cs="Calibri" w:eastAsia="Calibri"/>
           <w:b/>
           <w:i w:val="0"/>
-          <w:color w:val="0F2544"/>
-          <w:sz w:val="22"/>
-          <w:u w:val="none"/>
+          <w:color w:val="1B2A4A"/>
+          <w:sz w:val="21"/>
         </w:rPr>
-        <w:t xml:space="preserve">Cape Town:  </w:t>
+        <w:t xml:space="preserve">Addresses:  </w:t>
       </w:r>
       <w:r>
         <w:rPr>
           <w:rFonts w:ascii="Calibri" w:hAnsi="Calibri" w:cs="Calibri" w:eastAsia="Calibri"/>
           <w:b w:val="0"/>
           <w:i w:val="0"/>
-          <w:color w:val="1B1B1B"/>
-          <w:sz w:val="22"/>
-          <w:u w:val="none"/>
+          <w:color w:val="2C2C2C"/>
+          <w:sz w:val="21"/>
         </w:rPr>
-        <w:t>10 Anysberg Crescent, Durbanville, ZA</w:t>
+        <w:t>Cape Town: 10 Anysberg Crescent, Durbanville  |  Germany: Uerdinger Str. 44, Moers</w:t>
       </w:r>
     </w:p>
     <w:p>
       <w:pPr>
-        <w:spacing w:before="0" w:after="40" w:line="288" w:lineRule="auto"/>
+        <w:spacing w:after="40"/>
       </w:pPr>
       <w:r>
         <w:rPr>
           <w:rFonts w:ascii="Calibri" w:hAnsi="Calibri" w:cs="Calibri" w:eastAsia="Calibri"/>
           <w:b/>
           <w:i w:val="0"/>
-          <w:color w:val="0F2544"/>
-          <w:sz w:val="22"/>
-          <w:u w:val="none"/>
-        </w:rPr>
-        <w:t xml:space="preserve">Germany:  </w:t>
-      </w:r>
-      <w:r>
-        <w:rPr>
-          <w:rFonts w:ascii="Calibri" w:hAnsi="Calibri" w:cs="Calibri" w:eastAsia="Calibri"/>
-          <w:b w:val="0"/>
-          <w:i w:val="0"/>
-          <w:color w:val="1B1B1B"/>
-          <w:sz w:val="22"/>
-          <w:u w:val="none"/>
-        </w:rPr>
-        <w:t>Uerdinger Straße 44, Moers, DE</w:t>
-      </w:r>
-    </w:p>
-    <w:p>
-      <w:pPr>
-        <w:spacing w:before="0" w:after="40" w:line="288" w:lineRule="auto"/>
-      </w:pPr>
-      <w:r>
-        <w:rPr>
-          <w:rFonts w:ascii="Calibri" w:hAnsi="Calibri" w:cs="Calibri" w:eastAsia="Calibri"/>
-          <w:b/>
-          <w:i w:val="0"/>
-          <w:color w:val="0F2544"/>
-          <w:sz w:val="22"/>
-          <w:u w:val="none"/>
+          <w:color w:val="1B2A4A"/>
+          <w:sz w:val="21"/>
         </w:rPr>
         <w:t xml:space="preserve">Work Mode:  </w:t>
       </w:r>
@@ -3366,52 +2818,48 @@
           <w:rFonts w:ascii="Calibri" w:hAnsi="Calibri" w:cs="Calibri" w:eastAsia="Calibri"/>
           <w:b w:val="0"/>
           <w:i w:val="0"/>
-          <w:color w:val="1B1B1B"/>
-          <w:sz w:val="22"/>
-          <w:u w:val="none"/>
+          <w:color w:val="2C2C2C"/>
+          <w:sz w:val="21"/>
         </w:rPr>
         <w:t>Remote, Hybrid or On-Site</w:t>
       </w:r>
     </w:p>
     <w:p>
       <w:pPr>
-        <w:spacing w:before="0" w:after="40" w:line="288" w:lineRule="auto"/>
+        <w:spacing w:after="40"/>
       </w:pPr>
       <w:r>
         <w:rPr>
           <w:rFonts w:ascii="Calibri" w:hAnsi="Calibri" w:cs="Calibri" w:eastAsia="Calibri"/>
           <w:b/>
           <w:i w:val="0"/>
-          <w:color w:val="0F2544"/>
-          <w:sz w:val="22"/>
-          <w:u w:val="none"/>
+          <w:color w:val="1B2A4A"/>
+          <w:sz w:val="21"/>
         </w:rPr>
-        <w:t xml:space="preserve">Notice Period:  </w:t>
+        <w:t xml:space="preserve">Notice:  </w:t>
       </w:r>
       <w:r>
         <w:rPr>
           <w:rFonts w:ascii="Calibri" w:hAnsi="Calibri" w:cs="Calibri" w:eastAsia="Calibri"/>
           <w:b w:val="0"/>
           <w:i w:val="0"/>
-          <w:color w:val="1B1B1B"/>
-          <w:sz w:val="22"/>
-          <w:u w:val="none"/>
+          <w:color w:val="2C2C2C"/>
+          <w:sz w:val="21"/>
         </w:rPr>
         <w:t>Immediate</w:t>
       </w:r>
     </w:p>
     <w:p>
       <w:pPr>
-        <w:spacing w:before="0" w:after="40" w:line="288" w:lineRule="auto"/>
+        <w:spacing w:after="40"/>
       </w:pPr>
       <w:r>
         <w:rPr>
           <w:rFonts w:ascii="Calibri" w:hAnsi="Calibri" w:cs="Calibri" w:eastAsia="Calibri"/>
           <w:b/>
           <w:i w:val="0"/>
-          <w:color w:val="0F2544"/>
-          <w:sz w:val="22"/>
-          <w:u w:val="none"/>
+          <w:color w:val="1B2A4A"/>
+          <w:sz w:val="21"/>
         </w:rPr>
         <w:t xml:space="preserve">Licences:  </w:t>
       </w:r>
@@ -3420,29 +2868,28 @@
           <w:rFonts w:ascii="Calibri" w:hAnsi="Calibri" w:cs="Calibri" w:eastAsia="Calibri"/>
           <w:b w:val="0"/>
           <w:i w:val="0"/>
-          <w:color w:val="1B1B1B"/>
-          <w:sz w:val="22"/>
-          <w:u w:val="none"/>
+          <w:color w:val="2C2C2C"/>
+          <w:sz w:val="21"/>
         </w:rPr>
         <w:t>Code C1 Driver's Licence  ·  Own Vehicle</w:t>
       </w:r>
     </w:p>
     <w:p>
       <w:pPr>
-        <w:spacing w:before="240" w:after="80" w:line="276" w:lineRule="auto"/>
-        <w:ind w:left="142"/>
-        <w:shd w:val="clear" w:color="auto" w:fill="0F2544"/>
+        <w:spacing w:before="280" w:after="60"/>
+        <w:pBdr>
+          <w:bottom w:val="single" w:sz="6" w:space="1" w:color="A6832E"/>
+        </w:pBdr>
       </w:pPr>
       <w:r>
         <w:rPr>
           <w:rFonts w:ascii="Calibri" w:hAnsi="Calibri" w:cs="Calibri" w:eastAsia="Calibri"/>
           <w:b/>
           <w:i w:val="0"/>
-          <w:color w:val="FFFFFF"/>
-          <w:sz w:val="25"/>
-          <w:u w:val="none"/>
+          <w:color w:val="1B2A4A"/>
+          <w:sz w:val="24"/>
           <w:caps w:val="1"/>
-          <w:spacing w:val="80"/>
+          <w:spacing w:val="60"/>
         </w:rPr>
         <w:t>Leadership &amp; Community Engagement</w:t>
       </w:r>
@@ -3450,17 +2897,16 @@
     <w:p>
       <w:pPr>
         <w:pStyle w:val="ListBullet"/>
-        <w:spacing w:after="40" w:line="283" w:lineRule="auto"/>
-        <w:ind w:left="340"/>
+        <w:spacing w:after="20" w:line="276" w:lineRule="auto"/>
+        <w:ind w:left="283"/>
       </w:pPr>
       <w:r>
         <w:rPr>
           <w:rFonts w:ascii="Calibri" w:hAnsi="Calibri" w:cs="Calibri" w:eastAsia="Calibri"/>
           <w:b/>
           <w:i w:val="0"/>
-          <w:color w:val="0F2544"/>
-          <w:sz w:val="22"/>
-          <w:u w:val="none"/>
+          <w:color w:val="1B2A4A"/>
+          <w:sz w:val="21"/>
         </w:rPr>
         <w:t xml:space="preserve">Tech-for-Good Mentor — </w:t>
       </w:r>
@@ -3469,9 +2915,8 @@
           <w:rFonts w:ascii="Calibri" w:hAnsi="Calibri" w:cs="Calibri" w:eastAsia="Calibri"/>
           <w:b w:val="0"/>
           <w:i w:val="0"/>
-          <w:color w:val="1B1B1B"/>
-          <w:sz w:val="22"/>
-          <w:u w:val="none"/>
+          <w:color w:val="2C2C2C"/>
+          <w:sz w:val="21"/>
         </w:rPr>
         <w:t>AI and supply chain upskilling for underserved communities.</w:t>
       </w:r>
@@ -3479,17 +2924,16 @@
     <w:p>
       <w:pPr>
         <w:pStyle w:val="ListBullet"/>
-        <w:spacing w:after="40" w:line="283" w:lineRule="auto"/>
-        <w:ind w:left="340"/>
+        <w:spacing w:after="20" w:line="276" w:lineRule="auto"/>
+        <w:ind w:left="283"/>
       </w:pPr>
       <w:r>
         <w:rPr>
           <w:rFonts w:ascii="Calibri" w:hAnsi="Calibri" w:cs="Calibri" w:eastAsia="Calibri"/>
           <w:b/>
           <w:i w:val="0"/>
-          <w:color w:val="0F2544"/>
-          <w:sz w:val="22"/>
-          <w:u w:val="none"/>
+          <w:color w:val="1B2A4A"/>
+          <w:sz w:val="21"/>
         </w:rPr>
         <w:t xml:space="preserve">Open-Source Contributor — </w:t>
       </w:r>
@@ -3498,9 +2942,8 @@
           <w:rFonts w:ascii="Calibri" w:hAnsi="Calibri" w:cs="Calibri" w:eastAsia="Calibri"/>
           <w:b w:val="0"/>
           <w:i w:val="0"/>
-          <w:color w:val="1B1B1B"/>
-          <w:sz w:val="22"/>
-          <w:u w:val="none"/>
+          <w:color w:val="2C2C2C"/>
+          <w:sz w:val="21"/>
         </w:rPr>
         <w:t>logistics automations, dashboards and backend tools.</w:t>
       </w:r>
@@ -3508,17 +2951,16 @@
     <w:p>
       <w:pPr>
         <w:pStyle w:val="ListBullet"/>
-        <w:spacing w:after="40" w:line="283" w:lineRule="auto"/>
-        <w:ind w:left="340"/>
+        <w:spacing w:after="20" w:line="276" w:lineRule="auto"/>
+        <w:ind w:left="283"/>
       </w:pPr>
       <w:r>
         <w:rPr>
           <w:rFonts w:ascii="Calibri" w:hAnsi="Calibri" w:cs="Calibri" w:eastAsia="Calibri"/>
           <w:b/>
           <w:i w:val="0"/>
-          <w:color w:val="0F2544"/>
-          <w:sz w:val="22"/>
-          <w:u w:val="none"/>
+          <w:color w:val="1B2A4A"/>
+          <w:sz w:val="21"/>
         </w:rPr>
         <w:t xml:space="preserve">Cross-Cultural Advocate — </w:t>
       </w:r>
@@ -3527,9 +2969,8 @@
           <w:rFonts w:ascii="Calibri" w:hAnsi="Calibri" w:cs="Calibri" w:eastAsia="Calibri"/>
           <w:b w:val="0"/>
           <w:i w:val="0"/>
-          <w:color w:val="1B1B1B"/>
-          <w:sz w:val="22"/>
-          <w:u w:val="none"/>
+          <w:color w:val="2C2C2C"/>
+          <w:sz w:val="21"/>
         </w:rPr>
         <w:t>bridging EU and SA teams and stakeholder communication.</w:t>
       </w:r>
@@ -3537,17 +2978,16 @@
     <w:p>
       <w:pPr>
         <w:pStyle w:val="ListBullet"/>
-        <w:spacing w:after="40" w:line="283" w:lineRule="auto"/>
-        <w:ind w:left="340"/>
+        <w:spacing w:after="20" w:line="276" w:lineRule="auto"/>
+        <w:ind w:left="283"/>
       </w:pPr>
       <w:r>
         <w:rPr>
           <w:rFonts w:ascii="Calibri" w:hAnsi="Calibri" w:cs="Calibri" w:eastAsia="Calibri"/>
           <w:b/>
           <w:i w:val="0"/>
-          <w:color w:val="0F2544"/>
-          <w:sz w:val="22"/>
-          <w:u w:val="none"/>
+          <w:color w:val="1B2A4A"/>
+          <w:sz w:val="21"/>
         </w:rPr>
         <w:t xml:space="preserve">Discipline-Driven Leader — </w:t>
       </w:r>
@@ -3556,36 +2996,40 @@
           <w:rFonts w:ascii="Calibri" w:hAnsi="Calibri" w:cs="Calibri" w:eastAsia="Calibri"/>
           <w:b w:val="0"/>
           <w:i w:val="0"/>
-          <w:color w:val="1B1B1B"/>
-          <w:sz w:val="22"/>
-          <w:u w:val="none"/>
+          <w:color w:val="2C2C2C"/>
+          <w:sz w:val="21"/>
         </w:rPr>
-        <w:t>calisthenics and high-discipline daily routines, demonstrating resilience and consistency.</w:t>
+        <w:t>calisthenics and high-discipline routines demonstrating resilience.</w:t>
       </w:r>
     </w:p>
     <w:p>
       <w:pPr>
-        <w:spacing w:before="280" w:after="0" w:line="240" w:lineRule="auto"/>
+        <w:spacing w:before="320" w:after="0"/>
         <w:jc w:val="center"/>
         <w:pBdr>
-          <w:bottom w:val="single" w:sz="8" w:space="2" w:color="C0973C"/>
+          <w:bottom w:val="single" w:sz="6" w:space="1" w:color="A6832E"/>
         </w:pBdr>
+      </w:pPr>
+    </w:p>
+    <w:p>
+      <w:pPr>
+        <w:spacing w:before="80"/>
+        <w:jc w:val="center"/>
       </w:pPr>
       <w:r>
         <w:rPr>
           <w:rFonts w:ascii="Calibri" w:hAnsi="Calibri" w:cs="Calibri" w:eastAsia="Calibri"/>
           <w:b w:val="0"/>
           <w:i/>
-          <w:color w:val="555C66"/>
+          <w:color w:val="6B6B6B"/>
           <w:sz w:val="20"/>
-          <w:u w:val="none"/>
         </w:rPr>
         <w:t>References available on request</w:t>
       </w:r>
     </w:p>
     <w:sectPr>
       <w:pgSz w:w="12240" w:h="15840"/>
-      <w:pgMar w:top="680" w:right="1134" w:bottom="794" w:left="1134" w:header="720" w:footer="720" w:gutter="0"/>
+      <w:pgMar w:top="1020" w:right="1247" w:bottom="1020" w:left="1247" w:header="720" w:footer="720" w:gutter="0"/>
       <w:cols w:space="720"/>
       <w:docGrid w:linePitch="360"/>
     </w:sectPr>
@@ -3956,13 +3400,10 @@
     <w:name w:val="Normal"/>
     <w:qFormat/>
     <w:rsid w:val="00FC693F"/>
-    <w:pPr>
-      <w:spacing w:line="283" w:lineRule="auto"/>
-    </w:pPr>
     <w:rPr>
       <w:rFonts w:ascii="Calibri" w:hAnsi="Calibri"/>
-      <w:color w:val="1B1B1B"/>
-      <w:sz w:val="22"/>
+      <w:color w:val="2C2C2C"/>
+      <w:sz w:val="21"/>
     </w:rPr>
   </w:style>
   <w:style w:type="paragraph" w:styleId="Header">
@@ -4495,7 +3936,7 @@
     </w:pPr>
     <w:rPr>
       <w:rFonts w:ascii="Calibri" w:hAnsi="Calibri"/>
-      <w:sz w:val="22"/>
+      <w:sz w:val="21"/>
     </w:rPr>
   </w:style>
   <w:style w:type="paragraph" w:styleId="ListBullet2">

</xml_diff>